<commit_message>
feat: Slide finalized tinggal report je
</commit_message>
<xml_diff>
--- a/Doc/Academic/Proposal/report_fyp1.docx
+++ b/Doc/Academic/Proposal/report_fyp1.docx
@@ -189,76 +189,32 @@
         <w:rPr>
           <w:rFonts w:ascii="Arial" w:hAnsi="Arial" w:cs="Arial"/>
         </w:rPr>
-        <w:t xml:space="preserve">Authentication in messaging systems has been studied in </w:t>
+        <w:t xml:space="preserve">Authentication in messaging systems has been studied in a number of different ways. Traditional methods rely on hashing and salting passwords stored in a central database. However, research shows that centralized storage remains a single point of failure. Attackers can exploit stolen session tokens to bypass Multi-Factor Authentication (MFA) and expose internal communications (Threat modeling for enterprise secure messaging applications, 2025). To solve this, researchers have looked at Zero-Knowledge Proofs (ZKPs). For example, </w:t>
+      </w:r>
+      <w:r>
+        <w:rPr>
+          <w:rFonts w:ascii="Arial" w:hAnsi="Arial" w:cs="Arial"/>
+        </w:rPr>
+        <w:t>enhancing</w:t>
+      </w:r>
+      <w:r>
+        <w:rPr>
+          <w:rFonts w:ascii="Arial" w:hAnsi="Arial" w:cs="Arial"/>
+        </w:rPr>
+        <w:t xml:space="preserve"> digital privacy: The application of zero-knowledge proofs in authentication systems (2024) proposes using zk-SNARKs to verify users without data transmission. This allows a user to prove they know a password without </w:t>
       </w:r>
       <w:proofErr w:type="gramStart"/>
       <w:r>
         <w:rPr>
           <w:rFonts w:ascii="Arial" w:hAnsi="Arial" w:cs="Arial"/>
         </w:rPr>
-        <w:t>a number of</w:t>
+        <w:t>actually revealing</w:t>
       </w:r>
       <w:proofErr w:type="gramEnd"/>
       <w:r>
         <w:rPr>
           <w:rFonts w:ascii="Arial" w:hAnsi="Arial" w:cs="Arial"/>
         </w:rPr>
-        <w:t xml:space="preserve"> different ways. Traditional methods rely on hashing and salting passwords stored in a central database. However, research shows that centralized storage remains a single point of failure. Attackers can exploit stolen session tokens </w:t>
-      </w:r>
-      <w:proofErr w:type="gramStart"/>
-      <w:r>
-        <w:rPr>
-          <w:rFonts w:ascii="Arial" w:hAnsi="Arial" w:cs="Arial"/>
-        </w:rPr>
-        <w:t>to bypass</w:t>
-      </w:r>
-      <w:proofErr w:type="gramEnd"/>
-      <w:r>
-        <w:rPr>
-          <w:rFonts w:ascii="Arial" w:hAnsi="Arial" w:cs="Arial"/>
-        </w:rPr>
-        <w:t xml:space="preserve"> Multi-Factor Authentication (MFA) and expose internal communications (Threat modeling for enterprise secure messaging applications, 2025). To solve this, researchers have looked at Zero-Knowledge Proofs (ZKPs). For example, </w:t>
-      </w:r>
-      <w:proofErr w:type="gramStart"/>
-      <w:r>
-        <w:rPr>
-          <w:rFonts w:ascii="Arial" w:hAnsi="Arial" w:cs="Arial"/>
-        </w:rPr>
-        <w:t>Enhancing</w:t>
-      </w:r>
-      <w:proofErr w:type="gramEnd"/>
-      <w:r>
-        <w:rPr>
-          <w:rFonts w:ascii="Arial" w:hAnsi="Arial" w:cs="Arial"/>
-        </w:rPr>
-        <w:t xml:space="preserve"> digital privacy: The application of zero-knowledge proofs in authentication systems (2024) proposes using </w:t>
-      </w:r>
-      <w:proofErr w:type="spellStart"/>
-      <w:r>
-        <w:rPr>
-          <w:rFonts w:ascii="Arial" w:hAnsi="Arial" w:cs="Arial"/>
-        </w:rPr>
-        <w:t>zk</w:t>
-      </w:r>
-      <w:proofErr w:type="spellEnd"/>
-      <w:r>
-        <w:rPr>
-          <w:rFonts w:ascii="Arial" w:hAnsi="Arial" w:cs="Arial"/>
-        </w:rPr>
-        <w:t xml:space="preserve">-SNARKs to verify users without data transmission. This allows a user to prove they know a password without </w:t>
-      </w:r>
-      <w:proofErr w:type="gramStart"/>
-      <w:r>
-        <w:rPr>
-          <w:rFonts w:ascii="Arial" w:hAnsi="Arial" w:cs="Arial"/>
-        </w:rPr>
-        <w:t>actually revealing</w:t>
-      </w:r>
-      <w:proofErr w:type="gramEnd"/>
-      <w:r>
-        <w:rPr>
-          <w:rFonts w:ascii="Arial" w:hAnsi="Arial" w:cs="Arial"/>
-        </w:rPr>
         <w:t xml:space="preserve"> it to the server.</w:t>
       </w:r>
     </w:p>
@@ -305,14 +261,12 @@
         </w:rPr>
         <w:t xml:space="preserve">Some research looks at things more generally by moving detection to the "edge" or the device itself. AI-driven smishing detection in Android devices using </w:t>
       </w:r>
-      <w:proofErr w:type="spellStart"/>
-      <w:r>
-        <w:rPr>
-          <w:rFonts w:ascii="Arial" w:hAnsi="Arial" w:cs="Arial"/>
-        </w:rPr>
-        <w:t>TinyBERT</w:t>
-      </w:r>
-      <w:proofErr w:type="spellEnd"/>
+      <w:r>
+        <w:rPr>
+          <w:rFonts w:ascii="Arial" w:hAnsi="Arial" w:cs="Arial"/>
+        </w:rPr>
+        <w:t>Tiny BERT</w:t>
+      </w:r>
       <w:r>
         <w:rPr>
           <w:rFonts w:ascii="Arial" w:hAnsi="Arial" w:cs="Arial"/>
@@ -364,14 +318,12 @@
         </w:rPr>
         <w:t xml:space="preserve">The background shows that while ZKP and Edge AI are powerful individual technologies, they are rarely combined in SME messaging apps. Many existing systems either prioritize security (encryption) but lose visibility on </w:t>
       </w:r>
-      <w:proofErr w:type="gramStart"/>
-      <w:r>
-        <w:rPr>
-          <w:rFonts w:ascii="Arial" w:hAnsi="Arial" w:cs="Arial"/>
-        </w:rPr>
-        <w:t>threats, or</w:t>
-      </w:r>
-      <w:proofErr w:type="gramEnd"/>
+      <w:r>
+        <w:rPr>
+          <w:rFonts w:ascii="Arial" w:hAnsi="Arial" w:cs="Arial"/>
+        </w:rPr>
+        <w:t>threats or</w:t>
+      </w:r>
       <w:r>
         <w:rPr>
           <w:rFonts w:ascii="Arial" w:hAnsi="Arial" w:cs="Arial"/>
@@ -776,21 +728,7 @@
         <w:rPr>
           <w:rFonts w:ascii="Arial" w:hAnsi="Arial" w:cs="Arial"/>
         </w:rPr>
-        <w:t>System Functions: The project features two main components. First, ZKP Authentication, which allows password-less login using cryptographic circuits (</w:t>
-      </w:r>
-      <w:proofErr w:type="spellStart"/>
-      <w:r>
-        <w:rPr>
-          <w:rFonts w:ascii="Arial" w:hAnsi="Arial" w:cs="Arial"/>
-        </w:rPr>
-        <w:t>Circom</w:t>
-      </w:r>
-      <w:proofErr w:type="spellEnd"/>
-      <w:r>
-        <w:rPr>
-          <w:rFonts w:ascii="Arial" w:hAnsi="Arial" w:cs="Arial"/>
-        </w:rPr>
-        <w:t>). Second, On-Device AI, which uses a TensorFlow Lite model to analyze message metadata and patterns (e.g., link frequency, timing) to detect anomalies.</w:t>
+        <w:t>System Functions: The project features two main components. First, ZKP Authentication, which allows password-less login using cryptographic circuits (Circom). Second, On-Device AI, which uses a TensorFlow Lite model to analyze message metadata and patterns (e.g., link frequency, timing) to detect anomalies.</w:t>
       </w:r>
     </w:p>
     <w:p>
@@ -828,21 +766,7 @@
         <w:rPr>
           <w:rFonts w:ascii="Arial" w:hAnsi="Arial" w:cs="Arial"/>
         </w:rPr>
-        <w:t xml:space="preserve">Security Elements: The security core relies on the Groth16 </w:t>
-      </w:r>
-      <w:proofErr w:type="spellStart"/>
-      <w:r>
-        <w:rPr>
-          <w:rFonts w:ascii="Arial" w:hAnsi="Arial" w:cs="Arial"/>
-        </w:rPr>
-        <w:t>zk</w:t>
-      </w:r>
-      <w:proofErr w:type="spellEnd"/>
-      <w:r>
-        <w:rPr>
-          <w:rFonts w:ascii="Arial" w:hAnsi="Arial" w:cs="Arial"/>
-        </w:rPr>
-        <w:t>-SNARK protocol for authentication and AES-256 encryption for local storage</w:t>
+        <w:t>Security Elements: The security core relies on the Groth16 zk-SNARK protocol for authentication and AES-256 encryption for local storage</w:t>
       </w:r>
     </w:p>
     <w:p>
@@ -1021,21 +945,7 @@
           <w:rFonts w:ascii="Arial" w:hAnsi="Arial" w:cs="Arial"/>
         </w:rPr>
         <w:lastRenderedPageBreak/>
-        <w:t>Unlike expensive enterprise security suites, this project utilizes open-source tools (</w:t>
-      </w:r>
-      <w:proofErr w:type="spellStart"/>
-      <w:r>
-        <w:rPr>
-          <w:rFonts w:ascii="Arial" w:hAnsi="Arial" w:cs="Arial"/>
-        </w:rPr>
-        <w:t>SnarkJS</w:t>
-      </w:r>
-      <w:proofErr w:type="spellEnd"/>
-      <w:r>
-        <w:rPr>
-          <w:rFonts w:ascii="Arial" w:hAnsi="Arial" w:cs="Arial"/>
-        </w:rPr>
-        <w:t>, TensorFlow Lite) to provide high-grade security on standard mobile hardware, making advanced security accessible to smaller companies.</w:t>
+        <w:t>Unlike expensive enterprise security suites, this project utilizes open-source tools (SnarkJS, TensorFlow Lite) to provide high-grade security on standard mobile hardware, making advanced security accessible to smaller companies.</w:t>
       </w:r>
     </w:p>
     <w:p>
@@ -1238,49 +1148,7 @@
         <w:rPr>
           <w:rFonts w:ascii="Arial" w:hAnsi="Arial" w:cs="Arial"/>
         </w:rPr>
-        <w:t xml:space="preserve">Presents the implementation details, including the coding of </w:t>
-      </w:r>
-      <w:proofErr w:type="spellStart"/>
-      <w:r>
-        <w:rPr>
-          <w:rFonts w:ascii="Arial" w:hAnsi="Arial" w:cs="Arial"/>
-        </w:rPr>
-        <w:t>Circom</w:t>
-      </w:r>
-      <w:proofErr w:type="spellEnd"/>
-      <w:r>
-        <w:rPr>
-          <w:rFonts w:ascii="Arial" w:hAnsi="Arial" w:cs="Arial"/>
-        </w:rPr>
-        <w:t xml:space="preserve"> circuits and the integration of </w:t>
-      </w:r>
-      <w:proofErr w:type="spellStart"/>
-      <w:r>
-        <w:rPr>
-          <w:rFonts w:ascii="Arial" w:hAnsi="Arial" w:cs="Arial"/>
-        </w:rPr>
-        <w:t>TFLite</w:t>
-      </w:r>
-      <w:proofErr w:type="spellEnd"/>
-      <w:r>
-        <w:rPr>
-          <w:rFonts w:ascii="Arial" w:hAnsi="Arial" w:cs="Arial"/>
-        </w:rPr>
-        <w:t xml:space="preserve">. It reports </w:t>
-      </w:r>
-      <w:proofErr w:type="gramStart"/>
-      <w:r>
-        <w:rPr>
-          <w:rFonts w:ascii="Arial" w:hAnsi="Arial" w:cs="Arial"/>
-        </w:rPr>
-        <w:t>the experimental</w:t>
-      </w:r>
-      <w:proofErr w:type="gramEnd"/>
-      <w:r>
-        <w:rPr>
-          <w:rFonts w:ascii="Arial" w:hAnsi="Arial" w:cs="Arial"/>
-        </w:rPr>
-        <w:t xml:space="preserve"> results, such as proof generation time and anomaly detection accuracy.</w:t>
+        <w:t>Presents the implementation details, including the coding of Circom circuits and the integration of TFLite. It reports the experimental results, such as proof generation time and anomaly detection accuracy.</w:t>
       </w:r>
     </w:p>
     <w:p>
@@ -1431,7 +1299,6 @@
         </w:rPr>
         <w:t xml:space="preserve">This chapter reviews the current state of research regarding secure messaging systems, authentication mechanisms, and anomaly detection. To provide a theoretical foundation for the </w:t>
       </w:r>
-      <w:proofErr w:type="spellStart"/>
       <w:r>
         <w:rPr>
           <w:rFonts w:ascii="Arial" w:hAnsi="Arial" w:cs="Arial"/>
@@ -1440,7 +1307,6 @@
         </w:rPr>
         <w:t>SentriZK</w:t>
       </w:r>
-      <w:proofErr w:type="spellEnd"/>
       <w:r>
         <w:rPr>
           <w:rFonts w:ascii="Arial" w:hAnsi="Arial" w:cs="Arial"/>
@@ -1497,21 +1363,7 @@
         <w:rPr>
           <w:rFonts w:ascii="Arial" w:hAnsi="Arial" w:cs="Arial"/>
         </w:rPr>
-        <w:t xml:space="preserve"> Evaluating the shift from password-based authentication to privacy-preserving cryptographic protocols like </w:t>
-      </w:r>
-      <w:proofErr w:type="spellStart"/>
-      <w:r>
-        <w:rPr>
-          <w:rFonts w:ascii="Arial" w:hAnsi="Arial" w:cs="Arial"/>
-        </w:rPr>
-        <w:t>zk</w:t>
-      </w:r>
-      <w:proofErr w:type="spellEnd"/>
-      <w:r>
-        <w:rPr>
-          <w:rFonts w:ascii="Arial" w:hAnsi="Arial" w:cs="Arial"/>
-        </w:rPr>
-        <w:t>-SNARKs.</w:t>
+        <w:t xml:space="preserve"> Evaluating the shift from password-based authentication to privacy-preserving cryptographic protocols like zk-SNARKs.</w:t>
       </w:r>
     </w:p>
     <w:p>
@@ -1654,21 +1506,7 @@
         <w:rPr>
           <w:rFonts w:ascii="Arial" w:hAnsi="Arial" w:cs="Arial"/>
         </w:rPr>
-        <w:t xml:space="preserve">End-to-End Encryption (E2EE) is widely regarded as the gold standard for data privacy. However, </w:t>
-      </w:r>
-      <w:proofErr w:type="spellStart"/>
-      <w:r>
-        <w:rPr>
-          <w:rFonts w:ascii="Arial" w:hAnsi="Arial" w:cs="Arial"/>
-        </w:rPr>
-        <w:t>Alatawi</w:t>
-      </w:r>
-      <w:proofErr w:type="spellEnd"/>
-      <w:r>
-        <w:rPr>
-          <w:rFonts w:ascii="Arial" w:hAnsi="Arial" w:cs="Arial"/>
-        </w:rPr>
-        <w:t xml:space="preserve"> and Saxena (2023), in their paper </w:t>
+        <w:t xml:space="preserve">End-to-End Encryption (E2EE) is widely regarded as the gold standard for data privacy. However, Alatawi and Saxena (2023), in their paper </w:t>
       </w:r>
       <w:r>
         <w:rPr>
@@ -1676,141 +1514,196 @@
           <w:i/>
           <w:iCs/>
         </w:rPr>
-        <w:t>"</w:t>
-      </w:r>
-      <w:proofErr w:type="spellStart"/>
+        <w:t>"SoK: An Analysis of End-to-End Encryption and Authentication Ceremonies in Secure Messaging Systems,"</w:t>
+      </w:r>
+      <w:r>
+        <w:rPr>
+          <w:rFonts w:ascii="Arial" w:hAnsi="Arial" w:cs="Arial"/>
+        </w:rPr>
+        <w:t xml:space="preserve"> argue that encryption alone is insufficient against active attacks. Their analysis of 17 popular messaging applications revealed that while "opportunistic" encryption protects against passive eavesdropping, it fails to prevent Man-in-the-Middle (MitM) attacks effectively.</w:t>
+      </w:r>
+    </w:p>
+    <w:p>
+      <w:pPr>
+        <w:spacing w:line="360" w:lineRule="auto"/>
+        <w:rPr>
+          <w:rFonts w:ascii="Arial" w:hAnsi="Arial" w:cs="Arial"/>
+        </w:rPr>
+      </w:pPr>
+      <w:r>
+        <w:rPr>
+          <w:rFonts w:ascii="Arial" w:hAnsi="Arial" w:cs="Arial"/>
+        </w:rPr>
+        <w:t>The primary weakness lies in "Authentication Ceremonies"</w:t>
+      </w:r>
+      <w:r>
+        <w:rPr>
+          <w:rFonts w:ascii="Arial" w:hAnsi="Arial" w:cs="Arial"/>
+        </w:rPr>
+        <w:t xml:space="preserve"> </w:t>
+      </w:r>
+      <w:r>
+        <w:rPr>
+          <w:rFonts w:ascii="Arial" w:hAnsi="Arial" w:cs="Arial"/>
+        </w:rPr>
+        <w:t xml:space="preserve">manual processes where users verify keys (e.g., scanning QR codes). The study found these ceremonies are often optional, hidden in sub-menus, and prone to human error. Users consistently fail to verify long hexadecimal strings correctly. As demonstrated by Alatawi and Saxena (2023), reliance on manual verification leaves major platforms vulnerable. This highlights the need for automated trust verification, a gap </w:t>
+      </w:r>
       <w:r>
         <w:rPr>
           <w:rFonts w:ascii="Arial" w:hAnsi="Arial" w:cs="Arial"/>
           <w:i/>
           <w:iCs/>
         </w:rPr>
-        <w:t>SoK</w:t>
-      </w:r>
-      <w:proofErr w:type="spellEnd"/>
+        <w:t>SentriZK</w:t>
+      </w:r>
+      <w:r>
+        <w:rPr>
+          <w:rFonts w:ascii="Arial" w:hAnsi="Arial" w:cs="Arial"/>
+        </w:rPr>
+        <w:t xml:space="preserve"> addresses by utilizing Zero-Knowledge Proofs to eliminate the burden of human verification.</w:t>
+      </w:r>
+    </w:p>
+    <w:p>
+      <w:pPr>
+        <w:spacing w:line="360" w:lineRule="auto"/>
+        <w:rPr>
+          <w:rFonts w:ascii="Arial" w:hAnsi="Arial" w:cs="Arial"/>
+        </w:rPr>
+      </w:pPr>
+    </w:p>
+    <w:p>
+      <w:pPr>
+        <w:spacing w:line="360" w:lineRule="auto"/>
+        <w:rPr>
+          <w:rFonts w:ascii="Arial" w:hAnsi="Arial" w:cs="Arial"/>
+          <w:b/>
+          <w:bCs/>
+        </w:rPr>
+      </w:pPr>
+      <w:r>
+        <w:rPr>
+          <w:rFonts w:ascii="Arial" w:hAnsi="Arial" w:cs="Arial"/>
+          <w:b/>
+          <w:bCs/>
+        </w:rPr>
+        <w:t>2.2.2 The Insider Threat Landscape</w:t>
+      </w:r>
+    </w:p>
+    <w:p>
+      <w:pPr>
+        <w:spacing w:line="360" w:lineRule="auto"/>
+        <w:rPr>
+          <w:rFonts w:ascii="Arial" w:hAnsi="Arial" w:cs="Arial"/>
+        </w:rPr>
+      </w:pPr>
+      <w:r>
+        <w:rPr>
+          <w:rFonts w:ascii="Arial" w:hAnsi="Arial" w:cs="Arial"/>
+        </w:rPr>
+        <w:t>While encryption protects data in transit, it creates a "blind spot" for detecting malicious activity originating from within the organization. Traditional firewalls and intrusion detection systems (IDS) focus on external threats, often missing employees who misuse their legitimate access.</w:t>
+      </w:r>
+    </w:p>
+    <w:p>
+      <w:pPr>
+        <w:spacing w:line="360" w:lineRule="auto"/>
+        <w:rPr>
+          <w:rFonts w:ascii="Arial" w:hAnsi="Arial" w:cs="Arial"/>
+        </w:rPr>
+      </w:pPr>
+      <w:r>
+        <w:rPr>
+          <w:rFonts w:ascii="Arial" w:hAnsi="Arial" w:cs="Arial"/>
+        </w:rPr>
+        <w:t xml:space="preserve">Several studies have addressed this specific issue. In </w:t>
+      </w:r>
       <w:r>
         <w:rPr>
           <w:rFonts w:ascii="Arial" w:hAnsi="Arial" w:cs="Arial"/>
           <w:i/>
           <w:iCs/>
         </w:rPr>
-        <w:t>: An Analysis of End-to-End Encryption and Authentication Ceremonies in Secure Messaging Systems,"</w:t>
-      </w:r>
-      <w:r>
-        <w:rPr>
-          <w:rFonts w:ascii="Arial" w:hAnsi="Arial" w:cs="Arial"/>
-        </w:rPr>
-        <w:t xml:space="preserve"> argue that encryption alone is insufficient against active attacks. Their analysis of 17 popular messaging applications revealed that while "opportunistic" encryption protects against passive eavesdropping, it fails to prevent Man-in-the-Middle (MitM) attacks effectively.</w:t>
-      </w:r>
-    </w:p>
-    <w:p>
-      <w:pPr>
-        <w:spacing w:line="360" w:lineRule="auto"/>
-        <w:rPr>
-          <w:rFonts w:ascii="Arial" w:hAnsi="Arial" w:cs="Arial"/>
-        </w:rPr>
-      </w:pPr>
-      <w:r>
-        <w:rPr>
-          <w:rFonts w:ascii="Arial" w:hAnsi="Arial" w:cs="Arial"/>
-        </w:rPr>
-        <w:t>The primary weakness lies in "Authentication Ceremonies"</w:t>
-      </w:r>
-      <w:r>
-        <w:rPr>
-          <w:rFonts w:ascii="Arial" w:hAnsi="Arial" w:cs="Arial"/>
-        </w:rPr>
-        <w:t xml:space="preserve"> </w:t>
-      </w:r>
-      <w:r>
-        <w:rPr>
-          <w:rFonts w:ascii="Arial" w:hAnsi="Arial" w:cs="Arial"/>
-        </w:rPr>
-        <w:t xml:space="preserve">manual processes where users verify keys (e.g., scanning QR codes). The study found these ceremonies are often optional, hidden in sub-menus, and prone to human error. Users consistently fail to verify long hexadecimal strings correctly. As demonstrated by </w:t>
-      </w:r>
-      <w:proofErr w:type="spellStart"/>
-      <w:r>
-        <w:rPr>
-          <w:rFonts w:ascii="Arial" w:hAnsi="Arial" w:cs="Arial"/>
-        </w:rPr>
-        <w:t>Alatawi</w:t>
-      </w:r>
-      <w:proofErr w:type="spellEnd"/>
-      <w:r>
-        <w:rPr>
-          <w:rFonts w:ascii="Arial" w:hAnsi="Arial" w:cs="Arial"/>
-        </w:rPr>
-        <w:t xml:space="preserve"> and Saxena (2023), reliance on manual verification leaves major platforms vulnerable. This highlights the need for automated trust verification, a gap </w:t>
-      </w:r>
-      <w:proofErr w:type="spellStart"/>
+        <w:t>"Insider Threat Detection and Secure Data Transfer Leveraging Bidirectional LSTM" (2025)</w:t>
+      </w:r>
+      <w:r>
+        <w:rPr>
+          <w:rFonts w:ascii="Arial" w:hAnsi="Arial" w:cs="Arial"/>
+        </w:rPr>
+        <w:t>, researchers proposed using Deep Learning, specifically Bidirectional Long Short-Term Memory (Bi-LSTM) networks. This method analyzes sequences of user behavior (forward and backward in time) rather than isolated events, achieving higher accuracy than standard machine learning models because it understands the "context" of user actions.</w:t>
+      </w:r>
+    </w:p>
+    <w:p>
+      <w:pPr>
+        <w:spacing w:line="360" w:lineRule="auto"/>
+        <w:rPr>
+          <w:rFonts w:ascii="Arial" w:hAnsi="Arial" w:cs="Arial"/>
+        </w:rPr>
+      </w:pPr>
+      <w:r>
+        <w:rPr>
+          <w:rFonts w:ascii="Arial" w:hAnsi="Arial" w:cs="Arial"/>
+        </w:rPr>
+        <w:t xml:space="preserve">Complementing this, </w:t>
+      </w:r>
       <w:r>
         <w:rPr>
           <w:rFonts w:ascii="Arial" w:hAnsi="Arial" w:cs="Arial"/>
           <w:i/>
           <w:iCs/>
         </w:rPr>
-        <w:t>SentriZK</w:t>
-      </w:r>
-      <w:proofErr w:type="spellEnd"/>
-      <w:r>
-        <w:rPr>
-          <w:rFonts w:ascii="Arial" w:hAnsi="Arial" w:cs="Arial"/>
-        </w:rPr>
-        <w:t xml:space="preserve"> addresses by utilizing Zero-Knowledge Proofs to eliminate the burden of human verification.</w:t>
-      </w:r>
-    </w:p>
-    <w:p>
-      <w:pPr>
-        <w:spacing w:line="360" w:lineRule="auto"/>
-        <w:rPr>
-          <w:rFonts w:ascii="Arial" w:hAnsi="Arial" w:cs="Arial"/>
-        </w:rPr>
-      </w:pPr>
-    </w:p>
-    <w:p>
-      <w:pPr>
-        <w:spacing w:line="360" w:lineRule="auto"/>
-        <w:rPr>
-          <w:rFonts w:ascii="Arial" w:hAnsi="Arial" w:cs="Arial"/>
-          <w:b/>
-          <w:bCs/>
-        </w:rPr>
-      </w:pPr>
-      <w:r>
-        <w:rPr>
-          <w:rFonts w:ascii="Arial" w:hAnsi="Arial" w:cs="Arial"/>
-          <w:b/>
-          <w:bCs/>
-        </w:rPr>
-        <w:t>2.2.2 The Insider Threat Landscape</w:t>
-      </w:r>
-    </w:p>
-    <w:p>
-      <w:pPr>
-        <w:spacing w:line="360" w:lineRule="auto"/>
-        <w:rPr>
-          <w:rFonts w:ascii="Arial" w:hAnsi="Arial" w:cs="Arial"/>
-        </w:rPr>
-      </w:pPr>
-      <w:r>
-        <w:rPr>
-          <w:rFonts w:ascii="Arial" w:hAnsi="Arial" w:cs="Arial"/>
-        </w:rPr>
-        <w:t>While encryption protects data in transit, it creates a "blind spot" for detecting malicious activity originating from within the organization. Traditional firewalls and intrusion detection systems (IDS) focus on external threats, often missing employees who misuse their legitimate access.</w:t>
-      </w:r>
-    </w:p>
-    <w:p>
-      <w:pPr>
-        <w:spacing w:line="360" w:lineRule="auto"/>
-        <w:rPr>
-          <w:rFonts w:ascii="Arial" w:hAnsi="Arial" w:cs="Arial"/>
-        </w:rPr>
-      </w:pPr>
-      <w:r>
-        <w:rPr>
-          <w:rFonts w:ascii="Arial" w:hAnsi="Arial" w:cs="Arial"/>
-        </w:rPr>
-        <w:t xml:space="preserve">Several studies have addressed this specific issue. In </w:t>
+        <w:t>"A Review of Recent Advances, Challenges, and Opportunities in Malicious Insider Threat Detection Using Machine Learning Methods" (2024)</w:t>
+      </w:r>
+      <w:r>
+        <w:rPr>
+          <w:rFonts w:ascii="Arial" w:hAnsi="Arial" w:cs="Arial"/>
+        </w:rPr>
+        <w:t xml:space="preserve"> provided a </w:t>
+      </w:r>
+      <w:r>
+        <w:rPr>
+          <w:rFonts w:ascii="Arial" w:hAnsi="Arial" w:cs="Arial"/>
+        </w:rPr>
+        <w:lastRenderedPageBreak/>
+        <w:t>systematic survey of ML techniques. The authors categorized dozens of papers and concluded that while Deep Learning is becoming the standard for high-dimensional data, it suffers from a lack of "explainability" and struggles with data imbalance (too few examples of actual attacks). This review justifies the need for pre-trained or specialized models to handle the nuanced nature of insider threats.</w:t>
+      </w:r>
+    </w:p>
+    <w:p>
+      <w:pPr>
+        <w:spacing w:line="360" w:lineRule="auto"/>
+        <w:rPr>
+          <w:rFonts w:ascii="Arial" w:hAnsi="Arial" w:cs="Arial"/>
+        </w:rPr>
+      </w:pPr>
+    </w:p>
+    <w:p>
+      <w:pPr>
+        <w:spacing w:line="360" w:lineRule="auto"/>
+        <w:rPr>
+          <w:rFonts w:ascii="Arial" w:hAnsi="Arial" w:cs="Arial"/>
+          <w:b/>
+          <w:bCs/>
+        </w:rPr>
+      </w:pPr>
+      <w:r>
+        <w:rPr>
+          <w:rFonts w:ascii="Arial" w:hAnsi="Arial" w:cs="Arial"/>
+          <w:b/>
+          <w:bCs/>
+        </w:rPr>
+        <w:t>2.2.3 Endpoint Vulnerabilities</w:t>
+      </w:r>
+    </w:p>
+    <w:p>
+      <w:pPr>
+        <w:spacing w:line="360" w:lineRule="auto"/>
+        <w:rPr>
+          <w:rFonts w:ascii="Arial" w:hAnsi="Arial" w:cs="Arial"/>
+        </w:rPr>
+      </w:pPr>
+      <w:r>
+        <w:rPr>
+          <w:rFonts w:ascii="Arial" w:hAnsi="Arial" w:cs="Arial"/>
+        </w:rPr>
+        <w:t xml:space="preserve">The importance of securing the endpoint (the user's device) was further emphasized in </w:t>
       </w:r>
       <w:r>
         <w:rPr>
@@ -1818,27 +1711,13 @@
           <w:i/>
           <w:iCs/>
         </w:rPr>
-        <w:t>"Insider Threat Detection and Secure Data Transfer Leveraging Bidirectional LSTM" (2025)</w:t>
-      </w:r>
-      <w:r>
-        <w:rPr>
-          <w:rFonts w:ascii="Arial" w:hAnsi="Arial" w:cs="Arial"/>
-        </w:rPr>
-        <w:t>, researchers proposed using Deep Learning, specifically Bidirectional Long Short-Term Memory (Bi-LSTM) networks. This method analyzes sequences of user behavior (forward and backward in time) rather than isolated events, achieving higher accuracy than standard machine learning models because it understands the "context" of user actions.</w:t>
-      </w:r>
-    </w:p>
-    <w:p>
-      <w:pPr>
-        <w:spacing w:line="360" w:lineRule="auto"/>
-        <w:rPr>
-          <w:rFonts w:ascii="Arial" w:hAnsi="Arial" w:cs="Arial"/>
-        </w:rPr>
-      </w:pPr>
-      <w:r>
-        <w:rPr>
-          <w:rFonts w:ascii="Arial" w:hAnsi="Arial" w:cs="Arial"/>
-        </w:rPr>
-        <w:t xml:space="preserve">Complementing this, </w:t>
+        <w:t>"Threat Modeling for Enterprise Secure Messaging Applications" (2025)</w:t>
+      </w:r>
+      <w:r>
+        <w:rPr>
+          <w:rFonts w:ascii="Arial" w:hAnsi="Arial" w:cs="Arial"/>
+        </w:rPr>
+        <w:t xml:space="preserve">. The authors used threat modeling frameworks (like STRIDE) to map architectures of apps such as Slack and Teams. They concluded that while the network layer is encrypted, the endpoint remains vulnerable to session hijacking and metadata analysis. Following this threat model analysis, </w:t>
       </w:r>
       <w:r>
         <w:rPr>
@@ -1846,60 +1725,93 @@
           <w:i/>
           <w:iCs/>
         </w:rPr>
-        <w:t>"A Review of Recent Advances, Challenges, and Opportunities in Malicious Insider Threat Detection Using Machine Learning Methods" (2024)</w:t>
-      </w:r>
-      <w:r>
-        <w:rPr>
-          <w:rFonts w:ascii="Arial" w:hAnsi="Arial" w:cs="Arial"/>
-        </w:rPr>
-        <w:t xml:space="preserve"> provided a </w:t>
-      </w:r>
-      <w:r>
-        <w:rPr>
-          <w:rFonts w:ascii="Arial" w:hAnsi="Arial" w:cs="Arial"/>
-        </w:rPr>
-        <w:lastRenderedPageBreak/>
-        <w:t>systematic survey of ML techniques. The authors categorized dozens of papers and concluded that while Deep Learning is becoming the standard for high-dimensional data, it suffers from a lack of "explainability" and struggles with data imbalance (too few examples of actual attacks). This review justifies the need for pre-trained or specialized models to handle the nuanced nature of insider threats.</w:t>
-      </w:r>
-    </w:p>
-    <w:p>
-      <w:pPr>
-        <w:spacing w:line="360" w:lineRule="auto"/>
-        <w:rPr>
-          <w:rFonts w:ascii="Arial" w:hAnsi="Arial" w:cs="Arial"/>
-        </w:rPr>
-      </w:pPr>
-    </w:p>
-    <w:p>
-      <w:pPr>
-        <w:spacing w:line="360" w:lineRule="auto"/>
-        <w:rPr>
-          <w:rFonts w:ascii="Arial" w:hAnsi="Arial" w:cs="Arial"/>
-          <w:b/>
-          <w:bCs/>
-        </w:rPr>
-      </w:pPr>
-      <w:r>
-        <w:rPr>
-          <w:rFonts w:ascii="Arial" w:hAnsi="Arial" w:cs="Arial"/>
-          <w:b/>
-          <w:bCs/>
-        </w:rPr>
-        <w:t>2.2.3 Endpoint Vulnerabilities</w:t>
-      </w:r>
-    </w:p>
-    <w:p>
-      <w:pPr>
-        <w:spacing w:line="360" w:lineRule="auto"/>
-        <w:rPr>
-          <w:rFonts w:ascii="Arial" w:hAnsi="Arial" w:cs="Arial"/>
-        </w:rPr>
-      </w:pPr>
-      <w:r>
-        <w:rPr>
-          <w:rFonts w:ascii="Arial" w:hAnsi="Arial" w:cs="Arial"/>
-        </w:rPr>
-        <w:t xml:space="preserve">The importance of securing the endpoint (the user's device) was further emphasized in </w:t>
+        <w:t>SentriZK</w:t>
+      </w:r>
+      <w:r>
+        <w:rPr>
+          <w:rFonts w:ascii="Arial" w:hAnsi="Arial" w:cs="Arial"/>
+        </w:rPr>
+        <w:t xml:space="preserve"> focuses on securing the mobile app itself, moving the detection logic from the server to the client device.</w:t>
+      </w:r>
+    </w:p>
+    <w:p>
+      <w:pPr>
+        <w:spacing w:line="360" w:lineRule="auto"/>
+        <w:rPr>
+          <w:rFonts w:ascii="Arial" w:hAnsi="Arial" w:cs="Arial"/>
+        </w:rPr>
+      </w:pPr>
+    </w:p>
+    <w:p>
+      <w:pPr>
+        <w:spacing w:line="360" w:lineRule="auto"/>
+        <w:rPr>
+          <w:rFonts w:ascii="Arial" w:hAnsi="Arial" w:cs="Arial"/>
+          <w:b/>
+          <w:bCs/>
+        </w:rPr>
+      </w:pPr>
+      <w:r>
+        <w:rPr>
+          <w:rFonts w:ascii="Arial" w:hAnsi="Arial" w:cs="Arial"/>
+          <w:b/>
+          <w:bCs/>
+        </w:rPr>
+        <w:t>2.3 Zero-Knowledge Proofs (Authentication)</w:t>
+      </w:r>
+    </w:p>
+    <w:p>
+      <w:pPr>
+        <w:spacing w:line="360" w:lineRule="auto"/>
+        <w:rPr>
+          <w:rFonts w:ascii="Arial" w:hAnsi="Arial" w:cs="Arial"/>
+        </w:rPr>
+      </w:pPr>
+      <w:r>
+        <w:rPr>
+          <w:rFonts w:ascii="Arial" w:hAnsi="Arial" w:cs="Arial"/>
+        </w:rPr>
+        <w:t>To address the vulnerabilities of centralized credential storage, researchers have increasingly turned to Zero-Knowledge Proofs (ZKPs). ZKP allows a user to prove they know a secret (like a password) without revealing the secret itself to the server.</w:t>
+      </w:r>
+    </w:p>
+    <w:p>
+      <w:pPr>
+        <w:spacing w:line="360" w:lineRule="auto"/>
+        <w:rPr>
+          <w:rFonts w:ascii="Arial" w:hAnsi="Arial" w:cs="Arial"/>
+        </w:rPr>
+      </w:pPr>
+    </w:p>
+    <w:p>
+      <w:pPr>
+        <w:spacing w:line="360" w:lineRule="auto"/>
+        <w:rPr>
+          <w:rFonts w:ascii="Arial" w:hAnsi="Arial" w:cs="Arial"/>
+          <w:b/>
+          <w:bCs/>
+        </w:rPr>
+      </w:pPr>
+      <w:r>
+        <w:rPr>
+          <w:rFonts w:ascii="Arial" w:hAnsi="Arial" w:cs="Arial"/>
+          <w:b/>
+          <w:bCs/>
+        </w:rPr>
+        <w:t>2.3.1 Privacy-Preserving Authentication</w:t>
+      </w:r>
+    </w:p>
+    <w:p>
+      <w:pPr>
+        <w:spacing w:line="360" w:lineRule="auto"/>
+        <w:rPr>
+          <w:rFonts w:ascii="Arial" w:hAnsi="Arial" w:cs="Arial"/>
+        </w:rPr>
+      </w:pPr>
+      <w:r>
+        <w:rPr>
+          <w:rFonts w:ascii="Arial" w:hAnsi="Arial" w:cs="Arial"/>
+        </w:rPr>
+        <w:t xml:space="preserve">Bhattacharya et al. (2024), in </w:t>
       </w:r>
       <w:r>
         <w:rPr>
@@ -1907,15 +1819,33 @@
           <w:i/>
           <w:iCs/>
         </w:rPr>
-        <w:t>"Threat Modeling for Enterprise Secure Messaging Applications" (2025)</w:t>
-      </w:r>
-      <w:r>
-        <w:rPr>
-          <w:rFonts w:ascii="Arial" w:hAnsi="Arial" w:cs="Arial"/>
-        </w:rPr>
-        <w:t xml:space="preserve">. The authors used threat modeling frameworks (like STRIDE) to map architectures of apps such as Slack and Teams. They concluded that while the network layer is encrypted, the endpoint remains vulnerable to session hijacking and metadata analysis. Following this threat model analysis, </w:t>
-      </w:r>
-      <w:proofErr w:type="spellStart"/>
+        <w:t>"Enhancing Digital Privacy: The Application of Zero-Knowledge Proofs in Authentication Systems,"</w:t>
+      </w:r>
+      <w:r>
+        <w:rPr>
+          <w:rFonts w:ascii="Arial" w:hAnsi="Arial" w:cs="Arial"/>
+        </w:rPr>
+        <w:t xml:space="preserve"> conducted a comparative analysis between traditional password hashing and ZKP-based systems. Their findings confirm that ZKPs offer superior privacy by eliminating the transmission of credentials. The study distinguishes between zk-SNARKs (efficient, small proofs) and zk-STARKs (quantum-resistant but larger proofs). They emphasized that while ZKPs provide superior privacy, widespread adoption is hindered by complexity, recommending future </w:t>
+      </w:r>
+      <w:r>
+        <w:rPr>
+          <w:rFonts w:ascii="Arial" w:hAnsi="Arial" w:cs="Arial"/>
+        </w:rPr>
+        <w:lastRenderedPageBreak/>
+        <w:t>work focus on wrapping these protocols in user-friendly interfaces</w:t>
+      </w:r>
+      <w:r>
+        <w:rPr>
+          <w:rFonts w:ascii="Arial" w:hAnsi="Arial" w:cs="Arial"/>
+        </w:rPr>
+        <w:t xml:space="preserve"> </w:t>
+      </w:r>
+      <w:r>
+        <w:rPr>
+          <w:rFonts w:ascii="Arial" w:hAnsi="Arial" w:cs="Arial"/>
+        </w:rPr>
+        <w:t xml:space="preserve">an approach adopted by </w:t>
+      </w:r>
       <w:r>
         <w:rPr>
           <w:rFonts w:ascii="Arial" w:hAnsi="Arial" w:cs="Arial"/>
@@ -1924,92 +1854,51 @@
         </w:rPr>
         <w:t>SentriZK</w:t>
       </w:r>
-      <w:proofErr w:type="spellEnd"/>
-      <w:r>
-        <w:rPr>
-          <w:rFonts w:ascii="Arial" w:hAnsi="Arial" w:cs="Arial"/>
-        </w:rPr>
-        <w:t xml:space="preserve"> focuses on securing the mobile app itself, moving the detection logic from the server to the client device.</w:t>
-      </w:r>
-    </w:p>
-    <w:p>
-      <w:pPr>
-        <w:spacing w:line="360" w:lineRule="auto"/>
-        <w:rPr>
-          <w:rFonts w:ascii="Arial" w:hAnsi="Arial" w:cs="Arial"/>
-        </w:rPr>
-      </w:pPr>
-    </w:p>
-    <w:p>
-      <w:pPr>
-        <w:spacing w:line="360" w:lineRule="auto"/>
-        <w:rPr>
-          <w:rFonts w:ascii="Arial" w:hAnsi="Arial" w:cs="Arial"/>
-          <w:b/>
-          <w:bCs/>
-        </w:rPr>
-      </w:pPr>
-      <w:r>
-        <w:rPr>
-          <w:rFonts w:ascii="Arial" w:hAnsi="Arial" w:cs="Arial"/>
-          <w:b/>
-          <w:bCs/>
-        </w:rPr>
-        <w:t>2.3 Zero-Knowledge Proofs (Authentication)</w:t>
-      </w:r>
-    </w:p>
-    <w:p>
-      <w:pPr>
-        <w:spacing w:line="360" w:lineRule="auto"/>
-        <w:rPr>
-          <w:rFonts w:ascii="Arial" w:hAnsi="Arial" w:cs="Arial"/>
-        </w:rPr>
-      </w:pPr>
-      <w:r>
-        <w:rPr>
-          <w:rFonts w:ascii="Arial" w:hAnsi="Arial" w:cs="Arial"/>
-        </w:rPr>
-        <w:t>To address the vulnerabilities of centralized credential storage, researchers have increasingly turned to Zero-Knowledge Proofs (ZKPs). ZKP allows a user to prove they know a secret (like a password) without revealing the secret itself to the server.</w:t>
-      </w:r>
-    </w:p>
-    <w:p>
-      <w:pPr>
-        <w:spacing w:line="360" w:lineRule="auto"/>
-        <w:rPr>
-          <w:rFonts w:ascii="Arial" w:hAnsi="Arial" w:cs="Arial"/>
-        </w:rPr>
-      </w:pPr>
-    </w:p>
-    <w:p>
-      <w:pPr>
-        <w:spacing w:line="360" w:lineRule="auto"/>
-        <w:rPr>
-          <w:rFonts w:ascii="Arial" w:hAnsi="Arial" w:cs="Arial"/>
-          <w:b/>
-          <w:bCs/>
-        </w:rPr>
-      </w:pPr>
-      <w:r>
-        <w:rPr>
-          <w:rFonts w:ascii="Arial" w:hAnsi="Arial" w:cs="Arial"/>
-          <w:b/>
-          <w:bCs/>
-        </w:rPr>
-        <w:t>2.3.1 Privacy-Preserving Authentication</w:t>
-      </w:r>
-    </w:p>
-    <w:p>
-      <w:pPr>
-        <w:spacing w:line="360" w:lineRule="auto"/>
-        <w:rPr>
-          <w:rFonts w:ascii="Arial" w:hAnsi="Arial" w:cs="Arial"/>
-        </w:rPr>
-      </w:pPr>
-      <w:r>
-        <w:rPr>
-          <w:rFonts w:ascii="Arial" w:hAnsi="Arial" w:cs="Arial"/>
-        </w:rPr>
-        <w:t xml:space="preserve">Bhattacharya et al. (2024), in </w:t>
+      <w:r>
+        <w:rPr>
+          <w:rFonts w:ascii="Arial" w:hAnsi="Arial" w:cs="Arial"/>
+        </w:rPr>
+        <w:t>.</w:t>
+      </w:r>
+    </w:p>
+    <w:p>
+      <w:pPr>
+        <w:spacing w:line="360" w:lineRule="auto"/>
+        <w:rPr>
+          <w:rFonts w:ascii="Arial" w:hAnsi="Arial" w:cs="Arial"/>
+        </w:rPr>
+      </w:pPr>
+    </w:p>
+    <w:p>
+      <w:pPr>
+        <w:spacing w:line="360" w:lineRule="auto"/>
+        <w:rPr>
+          <w:rFonts w:ascii="Arial" w:hAnsi="Arial" w:cs="Arial"/>
+          <w:b/>
+          <w:bCs/>
+        </w:rPr>
+      </w:pPr>
+      <w:r>
+        <w:rPr>
+          <w:rFonts w:ascii="Arial" w:hAnsi="Arial" w:cs="Arial"/>
+          <w:b/>
+          <w:bCs/>
+        </w:rPr>
+        <w:t>2.3.2 ZKP in Resource-Constrained Environments</w:t>
+      </w:r>
+    </w:p>
+    <w:p>
+      <w:pPr>
+        <w:spacing w:line="360" w:lineRule="auto"/>
+        <w:rPr>
+          <w:rFonts w:ascii="Arial" w:hAnsi="Arial" w:cs="Arial"/>
+        </w:rPr>
+      </w:pPr>
+      <w:r>
+        <w:rPr>
+          <w:rFonts w:ascii="Arial" w:hAnsi="Arial" w:cs="Arial"/>
+        </w:rPr>
+        <w:t xml:space="preserve">A critical challenge for mobile implementations is the computational intensity of generating cryptographic proofs. However, </w:t>
       </w:r>
       <w:r>
         <w:rPr>
@@ -2017,62 +1906,14 @@
           <w:i/>
           <w:iCs/>
         </w:rPr>
-        <w:t>"Enhancing Digital Privacy: The Application of Zero-Knowledge Proofs in Authentication Systems,"</w:t>
-      </w:r>
-      <w:r>
-        <w:rPr>
-          <w:rFonts w:ascii="Arial" w:hAnsi="Arial" w:cs="Arial"/>
-        </w:rPr>
-        <w:t xml:space="preserve"> conducted a comparative analysis between traditional password hashing and ZKP-based systems. Their findings confirm that ZKPs offer superior privacy by eliminating the transmission of credentials. The study distinguishes between </w:t>
-      </w:r>
-      <w:proofErr w:type="spellStart"/>
-      <w:r>
-        <w:rPr>
-          <w:rFonts w:ascii="Arial" w:hAnsi="Arial" w:cs="Arial"/>
-        </w:rPr>
-        <w:t>zk</w:t>
-      </w:r>
-      <w:proofErr w:type="spellEnd"/>
-      <w:r>
-        <w:rPr>
-          <w:rFonts w:ascii="Arial" w:hAnsi="Arial" w:cs="Arial"/>
-        </w:rPr>
-        <w:t xml:space="preserve">-SNARKs (efficient, small proofs) and </w:t>
-      </w:r>
-      <w:proofErr w:type="spellStart"/>
-      <w:r>
-        <w:rPr>
-          <w:rFonts w:ascii="Arial" w:hAnsi="Arial" w:cs="Arial"/>
-        </w:rPr>
-        <w:t>zk</w:t>
-      </w:r>
-      <w:proofErr w:type="spellEnd"/>
-      <w:r>
-        <w:rPr>
-          <w:rFonts w:ascii="Arial" w:hAnsi="Arial" w:cs="Arial"/>
-        </w:rPr>
-        <w:t xml:space="preserve">-STARKs (quantum-resistant but larger proofs). They emphasized that while ZKPs provide superior privacy, widespread adoption is hindered by complexity, recommending future </w:t>
-      </w:r>
-      <w:r>
-        <w:rPr>
-          <w:rFonts w:ascii="Arial" w:hAnsi="Arial" w:cs="Arial"/>
-        </w:rPr>
-        <w:lastRenderedPageBreak/>
-        <w:t>work focus on wrapping these protocols in user-friendly interfaces</w:t>
-      </w:r>
-      <w:r>
-        <w:rPr>
-          <w:rFonts w:ascii="Arial" w:hAnsi="Arial" w:cs="Arial"/>
-        </w:rPr>
-        <w:t xml:space="preserve"> </w:t>
-      </w:r>
-      <w:r>
-        <w:rPr>
-          <w:rFonts w:ascii="Arial" w:hAnsi="Arial" w:cs="Arial"/>
-        </w:rPr>
-        <w:t xml:space="preserve">an approach adopted by </w:t>
-      </w:r>
-      <w:proofErr w:type="spellStart"/>
+        <w:t>"A Survey on Zero-Knowledge Authentication for Internet of Things" (2023)</w:t>
+      </w:r>
+      <w:r>
+        <w:rPr>
+          <w:rFonts w:ascii="Arial" w:hAnsi="Arial" w:cs="Arial"/>
+        </w:rPr>
+        <w:t xml:space="preserve"> validates the feasibility of ZKPs on weak devices. The survey found that Non-Interactive ZKPs (NI-ZKP), particularly the Groth16 protocol, are highly efficient due to their small proof size. Since mobile devices share similar resource constraints with IoT sensors, </w:t>
+      </w:r>
       <w:r>
         <w:rPr>
           <w:rFonts w:ascii="Arial" w:hAnsi="Arial" w:cs="Arial"/>
@@ -2081,52 +1922,51 @@
         </w:rPr>
         <w:t>SentriZK</w:t>
       </w:r>
-      <w:proofErr w:type="spellEnd"/>
-      <w:r>
-        <w:rPr>
-          <w:rFonts w:ascii="Arial" w:hAnsi="Arial" w:cs="Arial"/>
-        </w:rPr>
-        <w:t>.</w:t>
-      </w:r>
-    </w:p>
-    <w:p>
-      <w:pPr>
-        <w:spacing w:line="360" w:lineRule="auto"/>
-        <w:rPr>
-          <w:rFonts w:ascii="Arial" w:hAnsi="Arial" w:cs="Arial"/>
-        </w:rPr>
-      </w:pPr>
-    </w:p>
-    <w:p>
-      <w:pPr>
-        <w:spacing w:line="360" w:lineRule="auto"/>
-        <w:rPr>
-          <w:rFonts w:ascii="Arial" w:hAnsi="Arial" w:cs="Arial"/>
-          <w:b/>
-          <w:bCs/>
-        </w:rPr>
-      </w:pPr>
-      <w:r>
-        <w:rPr>
-          <w:rFonts w:ascii="Arial" w:hAnsi="Arial" w:cs="Arial"/>
-          <w:b/>
-          <w:bCs/>
-        </w:rPr>
-        <w:t>2.3.2 ZKP in Resource-Constrained Environments</w:t>
-      </w:r>
-    </w:p>
-    <w:p>
-      <w:pPr>
-        <w:spacing w:line="360" w:lineRule="auto"/>
-        <w:rPr>
-          <w:rFonts w:ascii="Arial" w:hAnsi="Arial" w:cs="Arial"/>
-        </w:rPr>
-      </w:pPr>
-      <w:r>
-        <w:rPr>
-          <w:rFonts w:ascii="Arial" w:hAnsi="Arial" w:cs="Arial"/>
-        </w:rPr>
-        <w:t xml:space="preserve">A critical challenge for mobile implementations is the computational intensity of generating cryptographic proofs. However, </w:t>
+      <w:r>
+        <w:rPr>
+          <w:rFonts w:ascii="Arial" w:hAnsi="Arial" w:cs="Arial"/>
+        </w:rPr>
+        <w:t xml:space="preserve"> adopts these efficiency recommendations, utilizing Groth16 to minimize battery impact.</w:t>
+      </w:r>
+    </w:p>
+    <w:p>
+      <w:pPr>
+        <w:spacing w:line="360" w:lineRule="auto"/>
+        <w:rPr>
+          <w:rFonts w:ascii="Arial" w:hAnsi="Arial" w:cs="Arial"/>
+        </w:rPr>
+      </w:pPr>
+    </w:p>
+    <w:p>
+      <w:pPr>
+        <w:spacing w:line="360" w:lineRule="auto"/>
+        <w:rPr>
+          <w:rFonts w:ascii="Arial" w:hAnsi="Arial" w:cs="Arial"/>
+          <w:b/>
+          <w:bCs/>
+        </w:rPr>
+      </w:pPr>
+      <w:r>
+        <w:rPr>
+          <w:rFonts w:ascii="Arial" w:hAnsi="Arial" w:cs="Arial"/>
+          <w:b/>
+          <w:bCs/>
+        </w:rPr>
+        <w:t>2.3.3 Identity and Data Integrity</w:t>
+      </w:r>
+    </w:p>
+    <w:p>
+      <w:pPr>
+        <w:spacing w:line="360" w:lineRule="auto"/>
+        <w:rPr>
+          <w:rFonts w:ascii="Arial" w:hAnsi="Arial" w:cs="Arial"/>
+        </w:rPr>
+      </w:pPr>
+      <w:r>
+        <w:rPr>
+          <w:rFonts w:ascii="Arial" w:hAnsi="Arial" w:cs="Arial"/>
+        </w:rPr>
+        <w:t xml:space="preserve">The practical application of ZKP extends beyond basic login. In </w:t>
       </w:r>
       <w:r>
         <w:rPr>
@@ -2134,29 +1974,14 @@
           <w:i/>
           <w:iCs/>
         </w:rPr>
-        <w:t>"A Survey on Zero-Knowledge Authentication for Internet of Things" (2023)</w:t>
-      </w:r>
-      <w:r>
-        <w:rPr>
-          <w:rFonts w:ascii="Arial" w:hAnsi="Arial" w:cs="Arial"/>
-        </w:rPr>
-        <w:t xml:space="preserve"> validates the feasibility of ZKPs on weak devices. The survey found that </w:t>
-      </w:r>
-      <w:proofErr w:type="gramStart"/>
-      <w:r>
-        <w:rPr>
-          <w:rFonts w:ascii="Arial" w:hAnsi="Arial" w:cs="Arial"/>
-        </w:rPr>
-        <w:t>Non-Interactive</w:t>
-      </w:r>
-      <w:proofErr w:type="gramEnd"/>
-      <w:r>
-        <w:rPr>
-          <w:rFonts w:ascii="Arial" w:hAnsi="Arial" w:cs="Arial"/>
-        </w:rPr>
-        <w:t xml:space="preserve"> ZKPs (NI-ZKP), particularly the Groth16 protocol, are highly efficient due to their small proof size. Since mobile devices share similar resource constraints with IoT sensors, </w:t>
-      </w:r>
-      <w:proofErr w:type="spellStart"/>
+        <w:t>"Privacy-Preserving Identity Management System on Blockchain Using zk-SNARK" (2023)</w:t>
+      </w:r>
+      <w:r>
+        <w:rPr>
+          <w:rFonts w:ascii="Arial" w:hAnsi="Arial" w:cs="Arial"/>
+        </w:rPr>
+        <w:t xml:space="preserve">, researchers built a prototype using Ethereum and Circom. They successfully verified users without storing passwords, proving that "Self-Sovereign Identity" is possible. While their use of Blockchain incurred gas costs, the core ZKP implementation demonstrated absolute privacy preservation, a concept </w:t>
+      </w:r>
       <w:r>
         <w:rPr>
           <w:rFonts w:ascii="Arial" w:hAnsi="Arial" w:cs="Arial"/>
@@ -2165,52 +1990,25 @@
         </w:rPr>
         <w:t>SentriZK</w:t>
       </w:r>
-      <w:proofErr w:type="spellEnd"/>
-      <w:r>
-        <w:rPr>
-          <w:rFonts w:ascii="Arial" w:hAnsi="Arial" w:cs="Arial"/>
-        </w:rPr>
-        <w:t xml:space="preserve"> adopts these efficiency recommendations, utilizing Groth16 to minimize battery impact.</w:t>
-      </w:r>
-    </w:p>
-    <w:p>
-      <w:pPr>
-        <w:spacing w:line="360" w:lineRule="auto"/>
-        <w:rPr>
-          <w:rFonts w:ascii="Arial" w:hAnsi="Arial" w:cs="Arial"/>
-        </w:rPr>
-      </w:pPr>
-    </w:p>
-    <w:p>
-      <w:pPr>
-        <w:spacing w:line="360" w:lineRule="auto"/>
-        <w:rPr>
-          <w:rFonts w:ascii="Arial" w:hAnsi="Arial" w:cs="Arial"/>
-          <w:b/>
-          <w:bCs/>
-        </w:rPr>
-      </w:pPr>
-      <w:r>
-        <w:rPr>
-          <w:rFonts w:ascii="Arial" w:hAnsi="Arial" w:cs="Arial"/>
-          <w:b/>
-          <w:bCs/>
-        </w:rPr>
-        <w:t>2.3.3 Identity and Data Integrity</w:t>
-      </w:r>
-    </w:p>
-    <w:p>
-      <w:pPr>
-        <w:spacing w:line="360" w:lineRule="auto"/>
-        <w:rPr>
-          <w:rFonts w:ascii="Arial" w:hAnsi="Arial" w:cs="Arial"/>
-        </w:rPr>
-      </w:pPr>
-      <w:r>
-        <w:rPr>
-          <w:rFonts w:ascii="Arial" w:hAnsi="Arial" w:cs="Arial"/>
-        </w:rPr>
-        <w:t xml:space="preserve">The practical application of ZKP extends beyond basic login. In </w:t>
+      <w:r>
+        <w:rPr>
+          <w:rFonts w:ascii="Arial" w:hAnsi="Arial" w:cs="Arial"/>
+        </w:rPr>
+        <w:t xml:space="preserve"> adapts for chat authentication.</w:t>
+      </w:r>
+    </w:p>
+    <w:p>
+      <w:pPr>
+        <w:spacing w:line="360" w:lineRule="auto"/>
+        <w:rPr>
+          <w:rFonts w:ascii="Arial" w:hAnsi="Arial" w:cs="Arial"/>
+        </w:rPr>
+      </w:pPr>
+      <w:r>
+        <w:rPr>
+          <w:rFonts w:ascii="Arial" w:hAnsi="Arial" w:cs="Arial"/>
+        </w:rPr>
+        <w:t xml:space="preserve">Similarly, </w:t>
       </w:r>
       <w:r>
         <w:rPr>
@@ -2218,47 +2016,153 @@
           <w:i/>
           <w:iCs/>
         </w:rPr>
-        <w:t xml:space="preserve">"Privacy-Preserving Identity Management System on Blockchain Using </w:t>
-      </w:r>
-      <w:proofErr w:type="spellStart"/>
+        <w:t>"A Secure Framework for Privacy-Preserving Analytics in Healthcare Records Using Zero-Knowledge Proofs" (2025)</w:t>
+      </w:r>
+      <w:r>
+        <w:rPr>
+          <w:rFonts w:ascii="Arial" w:hAnsi="Arial" w:cs="Arial"/>
+        </w:rPr>
+        <w:t xml:space="preserve"> demonstrated a system where sensitive medical data could be verified for research without being exposed. This concept of "Auditability without Visibility" is directly applicable to secure messaging. It proves that a system can verify a user's authorization status without ever storing or seeing their credentials.</w:t>
+      </w:r>
+    </w:p>
+    <w:p>
+      <w:pPr>
+        <w:spacing w:line="360" w:lineRule="auto"/>
+        <w:rPr>
+          <w:rFonts w:ascii="Arial" w:hAnsi="Arial" w:cs="Arial"/>
+        </w:rPr>
+      </w:pPr>
+    </w:p>
+    <w:p>
+      <w:pPr>
+        <w:spacing w:line="360" w:lineRule="auto"/>
+        <w:rPr>
+          <w:rFonts w:ascii="Arial" w:hAnsi="Arial" w:cs="Arial"/>
+        </w:rPr>
+      </w:pPr>
+    </w:p>
+    <w:p>
+      <w:pPr>
+        <w:spacing w:line="360" w:lineRule="auto"/>
+        <w:rPr>
+          <w:rFonts w:ascii="Arial" w:hAnsi="Arial" w:cs="Arial"/>
+        </w:rPr>
+      </w:pPr>
+    </w:p>
+    <w:p>
+      <w:pPr>
+        <w:spacing w:line="360" w:lineRule="auto"/>
+        <w:rPr>
+          <w:rFonts w:ascii="Arial" w:hAnsi="Arial" w:cs="Arial"/>
+          <w:b/>
+          <w:bCs/>
+        </w:rPr>
+      </w:pPr>
+      <w:r>
+        <w:rPr>
+          <w:rFonts w:ascii="Arial" w:hAnsi="Arial" w:cs="Arial"/>
+          <w:b/>
+          <w:bCs/>
+        </w:rPr>
+        <w:lastRenderedPageBreak/>
+        <w:t>2.4 On-Device AI Anomaly Detection</w:t>
+      </w:r>
+    </w:p>
+    <w:p>
+      <w:pPr>
+        <w:spacing w:line="360" w:lineRule="auto"/>
+        <w:rPr>
+          <w:rFonts w:ascii="Arial" w:hAnsi="Arial" w:cs="Arial"/>
+        </w:rPr>
+      </w:pPr>
+      <w:r>
+        <w:rPr>
+          <w:rFonts w:ascii="Arial" w:hAnsi="Arial" w:cs="Arial"/>
+        </w:rPr>
+        <w:t>The final component of the proposed framework is the ability to detect threats locally on the device, bypassing the need for server-side scanning of decrypted messages.</w:t>
+      </w:r>
+    </w:p>
+    <w:p>
+      <w:pPr>
+        <w:spacing w:line="360" w:lineRule="auto"/>
+        <w:rPr>
+          <w:rFonts w:ascii="Arial" w:hAnsi="Arial" w:cs="Arial"/>
+        </w:rPr>
+      </w:pPr>
+    </w:p>
+    <w:p>
+      <w:pPr>
+        <w:spacing w:line="360" w:lineRule="auto"/>
+        <w:rPr>
+          <w:rFonts w:ascii="Arial" w:hAnsi="Arial" w:cs="Arial"/>
+          <w:b/>
+          <w:bCs/>
+        </w:rPr>
+      </w:pPr>
+      <w:r>
+        <w:rPr>
+          <w:rFonts w:ascii="Arial" w:hAnsi="Arial" w:cs="Arial"/>
+          <w:b/>
+          <w:bCs/>
+        </w:rPr>
+        <w:t>2.4.1 Shift from Cloud to Edge AI</w:t>
+      </w:r>
+    </w:p>
+    <w:p>
+      <w:pPr>
+        <w:spacing w:line="360" w:lineRule="auto"/>
+        <w:rPr>
+          <w:rFonts w:ascii="Arial" w:hAnsi="Arial" w:cs="Arial"/>
+        </w:rPr>
+      </w:pPr>
+      <w:r>
+        <w:rPr>
+          <w:rFonts w:ascii="Arial" w:hAnsi="Arial" w:cs="Arial"/>
+        </w:rPr>
+        <w:t xml:space="preserve">Natha et al. (2022), in </w:t>
+      </w:r>
       <w:r>
         <w:rPr>
           <w:rFonts w:ascii="Arial" w:hAnsi="Arial" w:cs="Arial"/>
           <w:i/>
           <w:iCs/>
         </w:rPr>
-        <w:t>zk</w:t>
-      </w:r>
-      <w:proofErr w:type="spellEnd"/>
+        <w:t>"A Systematic Review of Anomaly detection using Machine and Deep Learning Techniques,"</w:t>
+      </w:r>
+      <w:r>
+        <w:rPr>
+          <w:rFonts w:ascii="Arial" w:hAnsi="Arial" w:cs="Arial"/>
+        </w:rPr>
+        <w:t xml:space="preserve"> highlighted that while traditional machine learning (like SVM) is faster, it often underfits complex, noisy real-world data. Deep Learning is required for high accuracy but traditionally relies on cloud computing.</w:t>
+      </w:r>
+    </w:p>
+    <w:p>
+      <w:pPr>
+        <w:spacing w:line="360" w:lineRule="auto"/>
+        <w:rPr>
+          <w:rFonts w:ascii="Arial" w:hAnsi="Arial" w:cs="Arial"/>
+        </w:rPr>
+      </w:pPr>
+      <w:r>
+        <w:rPr>
+          <w:rFonts w:ascii="Arial" w:hAnsi="Arial" w:cs="Arial"/>
+        </w:rPr>
+        <w:t xml:space="preserve">However, recent advancements have made "Edge AI" viable. The paper </w:t>
+      </w:r>
       <w:r>
         <w:rPr>
           <w:rFonts w:ascii="Arial" w:hAnsi="Arial" w:cs="Arial"/>
           <w:i/>
           <w:iCs/>
         </w:rPr>
-        <w:t>-SNARK" (2023)</w:t>
-      </w:r>
-      <w:r>
-        <w:rPr>
-          <w:rFonts w:ascii="Arial" w:hAnsi="Arial" w:cs="Arial"/>
-        </w:rPr>
-        <w:t xml:space="preserve">, researchers built a prototype using Ethereum and </w:t>
-      </w:r>
-      <w:proofErr w:type="spellStart"/>
-      <w:r>
-        <w:rPr>
-          <w:rFonts w:ascii="Arial" w:hAnsi="Arial" w:cs="Arial"/>
-        </w:rPr>
-        <w:t>Circom</w:t>
-      </w:r>
-      <w:proofErr w:type="spellEnd"/>
-      <w:r>
-        <w:rPr>
-          <w:rFonts w:ascii="Arial" w:hAnsi="Arial" w:cs="Arial"/>
-        </w:rPr>
-        <w:t xml:space="preserve">. They successfully verified users without storing passwords, proving that "Self-Sovereign Identity" is possible. While their use of Blockchain incurred gas costs, the core ZKP implementation demonstrated absolute privacy preservation, a concept </w:t>
-      </w:r>
-      <w:proofErr w:type="spellStart"/>
+        <w:t>"PHILDER: Lightweight Framework for Intelligent Phishing Detection on Resource-Limited Devices" (2025)</w:t>
+      </w:r>
+      <w:r>
+        <w:rPr>
+          <w:rFonts w:ascii="Arial" w:hAnsi="Arial" w:cs="Arial"/>
+        </w:rPr>
+        <w:t xml:space="preserve"> demonstrated a compressed Deep Learning model capable of running on ARM-based mobile processors. They achieved over 90% accuracy in detecting phishing URLs with less than 100ms latency. This validates the architectural decision of </w:t>
+      </w:r>
       <w:r>
         <w:rPr>
           <w:rFonts w:ascii="Arial" w:hAnsi="Arial" w:cs="Arial"/>
@@ -2267,26 +2171,51 @@
         </w:rPr>
         <w:t>SentriZK</w:t>
       </w:r>
-      <w:proofErr w:type="spellEnd"/>
-      <w:r>
-        <w:rPr>
-          <w:rFonts w:ascii="Arial" w:hAnsi="Arial" w:cs="Arial"/>
-        </w:rPr>
-        <w:t xml:space="preserve"> adapts for chat authentication.</w:t>
-      </w:r>
-    </w:p>
-    <w:p>
-      <w:pPr>
-        <w:spacing w:line="360" w:lineRule="auto"/>
-        <w:rPr>
-          <w:rFonts w:ascii="Arial" w:hAnsi="Arial" w:cs="Arial"/>
-        </w:rPr>
-      </w:pPr>
-      <w:r>
-        <w:rPr>
-          <w:rFonts w:ascii="Arial" w:hAnsi="Arial" w:cs="Arial"/>
-        </w:rPr>
-        <w:t xml:space="preserve">Similarly, </w:t>
+      <w:r>
+        <w:rPr>
+          <w:rFonts w:ascii="Arial" w:hAnsi="Arial" w:cs="Arial"/>
+        </w:rPr>
+        <w:t xml:space="preserve"> to deploy models locally, eliminating the latency and privacy risks associated with cloud-based scanning.</w:t>
+      </w:r>
+    </w:p>
+    <w:p>
+      <w:pPr>
+        <w:spacing w:line="360" w:lineRule="auto"/>
+        <w:rPr>
+          <w:rFonts w:ascii="Arial" w:hAnsi="Arial" w:cs="Arial"/>
+        </w:rPr>
+      </w:pPr>
+    </w:p>
+    <w:p>
+      <w:pPr>
+        <w:spacing w:line="360" w:lineRule="auto"/>
+        <w:rPr>
+          <w:rFonts w:ascii="Arial" w:hAnsi="Arial" w:cs="Arial"/>
+          <w:b/>
+          <w:bCs/>
+        </w:rPr>
+      </w:pPr>
+      <w:r>
+        <w:rPr>
+          <w:rFonts w:ascii="Arial" w:hAnsi="Arial" w:cs="Arial"/>
+          <w:b/>
+          <w:bCs/>
+        </w:rPr>
+        <w:t>2.4.2 Optimization for Mobile Architecture</w:t>
+      </w:r>
+    </w:p>
+    <w:p>
+      <w:pPr>
+        <w:spacing w:line="360" w:lineRule="auto"/>
+        <w:rPr>
+          <w:rFonts w:ascii="Arial" w:hAnsi="Arial" w:cs="Arial"/>
+        </w:rPr>
+      </w:pPr>
+      <w:r>
+        <w:rPr>
+          <w:rFonts w:ascii="Arial" w:hAnsi="Arial" w:cs="Arial"/>
+        </w:rPr>
+        <w:t xml:space="preserve">Further supporting this approach, Gaurav et al. (2025) presented </w:t>
       </w:r>
       <w:r>
         <w:rPr>
@@ -2294,124 +2223,27 @@
           <w:i/>
           <w:iCs/>
         </w:rPr>
-        <w:t>"A Secure Framework for Privacy-Preserving Analytics in Healthcare Records Using Zero-Knowledge Proofs" (2025)</w:t>
-      </w:r>
-      <w:r>
-        <w:rPr>
-          <w:rFonts w:ascii="Arial" w:hAnsi="Arial" w:cs="Arial"/>
-        </w:rPr>
-        <w:t xml:space="preserve"> demonstrated a system where sensitive medical data could be verified for research without being exposed. This concept of "Auditability without Visibility" is directly applicable to secure messaging. It proves that a system can verify a user's authorization status without ever storing or seeing their credentials.</w:t>
-      </w:r>
-    </w:p>
-    <w:p>
-      <w:pPr>
-        <w:spacing w:line="360" w:lineRule="auto"/>
-        <w:rPr>
-          <w:rFonts w:ascii="Arial" w:hAnsi="Arial" w:cs="Arial"/>
-        </w:rPr>
-      </w:pPr>
-    </w:p>
-    <w:p>
-      <w:pPr>
-        <w:spacing w:line="360" w:lineRule="auto"/>
-        <w:rPr>
-          <w:rFonts w:ascii="Arial" w:hAnsi="Arial" w:cs="Arial"/>
-        </w:rPr>
-      </w:pPr>
-    </w:p>
-    <w:p>
-      <w:pPr>
-        <w:spacing w:line="360" w:lineRule="auto"/>
-        <w:rPr>
-          <w:rFonts w:ascii="Arial" w:hAnsi="Arial" w:cs="Arial"/>
-        </w:rPr>
-      </w:pPr>
-    </w:p>
-    <w:p>
-      <w:pPr>
-        <w:spacing w:line="360" w:lineRule="auto"/>
-        <w:rPr>
-          <w:rFonts w:ascii="Arial" w:hAnsi="Arial" w:cs="Arial"/>
-          <w:b/>
-          <w:bCs/>
-        </w:rPr>
-      </w:pPr>
-      <w:r>
-        <w:rPr>
-          <w:rFonts w:ascii="Arial" w:hAnsi="Arial" w:cs="Arial"/>
-          <w:b/>
-          <w:bCs/>
-        </w:rPr>
-        <w:lastRenderedPageBreak/>
-        <w:t>2.4 On-Device AI Anomaly Detection</w:t>
-      </w:r>
-    </w:p>
-    <w:p>
-      <w:pPr>
-        <w:spacing w:line="360" w:lineRule="auto"/>
-        <w:rPr>
-          <w:rFonts w:ascii="Arial" w:hAnsi="Arial" w:cs="Arial"/>
-        </w:rPr>
-      </w:pPr>
-      <w:r>
-        <w:rPr>
-          <w:rFonts w:ascii="Arial" w:hAnsi="Arial" w:cs="Arial"/>
-        </w:rPr>
-        <w:t xml:space="preserve">The final component of the proposed framework is the ability to detect threats locally on the device, </w:t>
-      </w:r>
-      <w:proofErr w:type="gramStart"/>
-      <w:r>
-        <w:rPr>
-          <w:rFonts w:ascii="Arial" w:hAnsi="Arial" w:cs="Arial"/>
-        </w:rPr>
-        <w:t>bypassing</w:t>
-      </w:r>
-      <w:proofErr w:type="gramEnd"/>
-      <w:r>
-        <w:rPr>
-          <w:rFonts w:ascii="Arial" w:hAnsi="Arial" w:cs="Arial"/>
-        </w:rPr>
-        <w:t xml:space="preserve"> the need for server-side scanning of decrypted messages.</w:t>
-      </w:r>
-    </w:p>
-    <w:p>
-      <w:pPr>
-        <w:spacing w:line="360" w:lineRule="auto"/>
-        <w:rPr>
-          <w:rFonts w:ascii="Arial" w:hAnsi="Arial" w:cs="Arial"/>
-        </w:rPr>
-      </w:pPr>
-    </w:p>
-    <w:p>
-      <w:pPr>
-        <w:spacing w:line="360" w:lineRule="auto"/>
-        <w:rPr>
-          <w:rFonts w:ascii="Arial" w:hAnsi="Arial" w:cs="Arial"/>
-          <w:b/>
-          <w:bCs/>
-        </w:rPr>
-      </w:pPr>
-      <w:r>
-        <w:rPr>
-          <w:rFonts w:ascii="Arial" w:hAnsi="Arial" w:cs="Arial"/>
-          <w:b/>
-          <w:bCs/>
-        </w:rPr>
-        <w:t>2.4.1 Shift from Cloud to Edge AI</w:t>
-      </w:r>
-    </w:p>
-    <w:p>
-      <w:pPr>
-        <w:spacing w:line="360" w:lineRule="auto"/>
-        <w:rPr>
-          <w:rFonts w:ascii="Arial" w:hAnsi="Arial" w:cs="Arial"/>
-        </w:rPr>
-      </w:pPr>
-      <w:r>
-        <w:rPr>
-          <w:rFonts w:ascii="Arial" w:hAnsi="Arial" w:cs="Arial"/>
-        </w:rPr>
-        <w:t xml:space="preserve">Natha et al. (2022), in </w:t>
+        <w:t>"AI-Driven Smishing Detection in Android Devices Using TinyBERT and Aquila Optimization."</w:t>
+      </w:r>
+      <w:r>
+        <w:rPr>
+          <w:rFonts w:ascii="Arial" w:hAnsi="Arial" w:cs="Arial"/>
+        </w:rPr>
+        <w:t xml:space="preserve"> By using a transformer model optimized for Android (TinyBERT), they achieved 96.81% accuracy, significantly outperforming traditional models like Random Forest on mobile hardware. This proves that heavy models can be distilled for mobile use without a drastic loss in accuracy.</w:t>
+      </w:r>
+    </w:p>
+    <w:p>
+      <w:pPr>
+        <w:spacing w:line="360" w:lineRule="auto"/>
+        <w:rPr>
+          <w:rFonts w:ascii="Arial" w:hAnsi="Arial" w:cs="Arial"/>
+        </w:rPr>
+      </w:pPr>
+      <w:r>
+        <w:rPr>
+          <w:rFonts w:ascii="Arial" w:hAnsi="Arial" w:cs="Arial"/>
+        </w:rPr>
+        <w:t xml:space="preserve">Additionally, </w:t>
       </w:r>
       <w:r>
         <w:rPr>
@@ -2419,27 +2251,20 @@
           <w:i/>
           <w:iCs/>
         </w:rPr>
-        <w:t>"A Systematic Review of Anomaly detection using Machine and Deep Learning Techniques,"</w:t>
-      </w:r>
-      <w:r>
-        <w:rPr>
-          <w:rFonts w:ascii="Arial" w:hAnsi="Arial" w:cs="Arial"/>
-        </w:rPr>
-        <w:t xml:space="preserve"> highlighted that while traditional machine learning (like SVM) is faster, it often underfits complex, noisy real-world data. Deep Learning is required for high accuracy but traditionally relies on cloud computing.</w:t>
-      </w:r>
-    </w:p>
-    <w:p>
-      <w:pPr>
-        <w:spacing w:line="360" w:lineRule="auto"/>
-        <w:rPr>
-          <w:rFonts w:ascii="Arial" w:hAnsi="Arial" w:cs="Arial"/>
-        </w:rPr>
-      </w:pPr>
-      <w:r>
-        <w:rPr>
-          <w:rFonts w:ascii="Arial" w:hAnsi="Arial" w:cs="Arial"/>
-        </w:rPr>
-        <w:t xml:space="preserve">However, recent advancements have made "Edge AI" viable. The paper </w:t>
+        <w:t>"Phishing Detection System Through Hybrid Machine Learning Based on URL" (2023)</w:t>
+      </w:r>
+      <w:r>
+        <w:rPr>
+          <w:rFonts w:ascii="Arial" w:hAnsi="Arial" w:cs="Arial"/>
+        </w:rPr>
+        <w:t xml:space="preserve"> explored combining different algorithms to improve detection. Their hybrid model experiment showed that combining "shallow" learning (Random Forest) with "deep" learning features extracted lexical patterns (like URL length and special </w:t>
+      </w:r>
+      <w:r>
+        <w:rPr>
+          <w:rFonts w:ascii="Arial" w:hAnsi="Arial" w:cs="Arial"/>
+        </w:rPr>
+        <w:lastRenderedPageBreak/>
+        <w:t xml:space="preserve">characters) more effectively than single models. Drawing on these feature extraction techniques, </w:t>
       </w:r>
       <w:r>
         <w:rPr>
@@ -2447,161 +2272,8 @@
           <w:i/>
           <w:iCs/>
         </w:rPr>
-        <w:t>"PHILDER: Lightweight Framework for Intelligent Phishing Detection on Resource-Limited Devices" (2025)</w:t>
-      </w:r>
-      <w:r>
-        <w:rPr>
-          <w:rFonts w:ascii="Arial" w:hAnsi="Arial" w:cs="Arial"/>
-        </w:rPr>
-        <w:t xml:space="preserve"> demonstrated a compressed Deep Learning model capable of running on ARM-based mobile processors. They achieved over 90% accuracy in detecting phishing URLs with less than 100ms latency. This validates the architectural decision of </w:t>
-      </w:r>
-      <w:proofErr w:type="spellStart"/>
-      <w:r>
-        <w:rPr>
-          <w:rFonts w:ascii="Arial" w:hAnsi="Arial" w:cs="Arial"/>
-          <w:i/>
-          <w:iCs/>
-        </w:rPr>
         <w:t>SentriZK</w:t>
       </w:r>
-      <w:proofErr w:type="spellEnd"/>
-      <w:r>
-        <w:rPr>
-          <w:rFonts w:ascii="Arial" w:hAnsi="Arial" w:cs="Arial"/>
-        </w:rPr>
-        <w:t xml:space="preserve"> to deploy models locally, eliminating the latency and privacy risks associated with cloud-based scanning.</w:t>
-      </w:r>
-    </w:p>
-    <w:p>
-      <w:pPr>
-        <w:spacing w:line="360" w:lineRule="auto"/>
-        <w:rPr>
-          <w:rFonts w:ascii="Arial" w:hAnsi="Arial" w:cs="Arial"/>
-        </w:rPr>
-      </w:pPr>
-    </w:p>
-    <w:p>
-      <w:pPr>
-        <w:spacing w:line="360" w:lineRule="auto"/>
-        <w:rPr>
-          <w:rFonts w:ascii="Arial" w:hAnsi="Arial" w:cs="Arial"/>
-          <w:b/>
-          <w:bCs/>
-        </w:rPr>
-      </w:pPr>
-      <w:r>
-        <w:rPr>
-          <w:rFonts w:ascii="Arial" w:hAnsi="Arial" w:cs="Arial"/>
-          <w:b/>
-          <w:bCs/>
-        </w:rPr>
-        <w:t>2.4.2 Optimization for Mobile Architecture</w:t>
-      </w:r>
-    </w:p>
-    <w:p>
-      <w:pPr>
-        <w:spacing w:line="360" w:lineRule="auto"/>
-        <w:rPr>
-          <w:rFonts w:ascii="Arial" w:hAnsi="Arial" w:cs="Arial"/>
-        </w:rPr>
-      </w:pPr>
-      <w:r>
-        <w:rPr>
-          <w:rFonts w:ascii="Arial" w:hAnsi="Arial" w:cs="Arial"/>
-        </w:rPr>
-        <w:t xml:space="preserve">Further supporting this approach, Gaurav et al. (2025) presented </w:t>
-      </w:r>
-      <w:r>
-        <w:rPr>
-          <w:rFonts w:ascii="Arial" w:hAnsi="Arial" w:cs="Arial"/>
-          <w:i/>
-          <w:iCs/>
-        </w:rPr>
-        <w:t xml:space="preserve">"AI-Driven Smishing Detection in Android Devices Using </w:t>
-      </w:r>
-      <w:proofErr w:type="spellStart"/>
-      <w:r>
-        <w:rPr>
-          <w:rFonts w:ascii="Arial" w:hAnsi="Arial" w:cs="Arial"/>
-          <w:i/>
-          <w:iCs/>
-        </w:rPr>
-        <w:t>TinyBERT</w:t>
-      </w:r>
-      <w:proofErr w:type="spellEnd"/>
-      <w:r>
-        <w:rPr>
-          <w:rFonts w:ascii="Arial" w:hAnsi="Arial" w:cs="Arial"/>
-          <w:i/>
-          <w:iCs/>
-        </w:rPr>
-        <w:t xml:space="preserve"> and Aquila Optimization."</w:t>
-      </w:r>
-      <w:r>
-        <w:rPr>
-          <w:rFonts w:ascii="Arial" w:hAnsi="Arial" w:cs="Arial"/>
-        </w:rPr>
-        <w:t xml:space="preserve"> By using a transformer model optimized for Android (</w:t>
-      </w:r>
-      <w:proofErr w:type="spellStart"/>
-      <w:r>
-        <w:rPr>
-          <w:rFonts w:ascii="Arial" w:hAnsi="Arial" w:cs="Arial"/>
-        </w:rPr>
-        <w:t>TinyBERT</w:t>
-      </w:r>
-      <w:proofErr w:type="spellEnd"/>
-      <w:r>
-        <w:rPr>
-          <w:rFonts w:ascii="Arial" w:hAnsi="Arial" w:cs="Arial"/>
-        </w:rPr>
-        <w:t>), they achieved 96.81% accuracy, significantly outperforming traditional models like Random Forest on mobile hardware. This proves that heavy models can be distilled for mobile use without a drastic loss in accuracy.</w:t>
-      </w:r>
-    </w:p>
-    <w:p>
-      <w:pPr>
-        <w:spacing w:line="360" w:lineRule="auto"/>
-        <w:rPr>
-          <w:rFonts w:ascii="Arial" w:hAnsi="Arial" w:cs="Arial"/>
-        </w:rPr>
-      </w:pPr>
-      <w:r>
-        <w:rPr>
-          <w:rFonts w:ascii="Arial" w:hAnsi="Arial" w:cs="Arial"/>
-        </w:rPr>
-        <w:t xml:space="preserve">Additionally, </w:t>
-      </w:r>
-      <w:r>
-        <w:rPr>
-          <w:rFonts w:ascii="Arial" w:hAnsi="Arial" w:cs="Arial"/>
-          <w:i/>
-          <w:iCs/>
-        </w:rPr>
-        <w:t>"Phishing Detection System Through Hybrid Machine Learning Based on URL" (2023)</w:t>
-      </w:r>
-      <w:r>
-        <w:rPr>
-          <w:rFonts w:ascii="Arial" w:hAnsi="Arial" w:cs="Arial"/>
-        </w:rPr>
-        <w:t xml:space="preserve"> explored combining different algorithms to improve detection. Their hybrid model experiment showed that combining "shallow" learning (Random Forest) with "deep" learning features extracted lexical patterns (like URL length and special </w:t>
-      </w:r>
-      <w:r>
-        <w:rPr>
-          <w:rFonts w:ascii="Arial" w:hAnsi="Arial" w:cs="Arial"/>
-        </w:rPr>
-        <w:lastRenderedPageBreak/>
-        <w:t xml:space="preserve">characters) more effectively than single models. Drawing on these feature extraction techniques, </w:t>
-      </w:r>
-      <w:proofErr w:type="spellStart"/>
-      <w:r>
-        <w:rPr>
-          <w:rFonts w:ascii="Arial" w:hAnsi="Arial" w:cs="Arial"/>
-          <w:i/>
-          <w:iCs/>
-        </w:rPr>
-        <w:t>SentriZK</w:t>
-      </w:r>
-      <w:proofErr w:type="spellEnd"/>
       <w:r>
         <w:rPr>
           <w:rFonts w:ascii="Arial" w:hAnsi="Arial" w:cs="Arial"/>
@@ -2672,21 +2344,7 @@
         <w:rPr>
           <w:rFonts w:ascii="Arial" w:hAnsi="Arial" w:cs="Arial"/>
         </w:rPr>
-        <w:t xml:space="preserve"> While </w:t>
-      </w:r>
-      <w:proofErr w:type="spellStart"/>
-      <w:r>
-        <w:rPr>
-          <w:rFonts w:ascii="Arial" w:hAnsi="Arial" w:cs="Arial"/>
-        </w:rPr>
-        <w:t>Alatawi</w:t>
-      </w:r>
-      <w:proofErr w:type="spellEnd"/>
-      <w:r>
-        <w:rPr>
-          <w:rFonts w:ascii="Arial" w:hAnsi="Arial" w:cs="Arial"/>
-        </w:rPr>
-        <w:t xml:space="preserve"> and Saxena (2023) proved that manual authentication ceremonies in E2EE apps are failing, ZKP solutions (Bhattacharya et al., 2024; IoT Survey, 2023) are largely restricted to theoretical Blockchain or IoT studies, rarely applied to standard chat applications.</w:t>
+        <w:t xml:space="preserve"> While Alatawi and Saxena (2023) proved that manual authentication ceremonies in E2EE apps are failing, ZKP solutions (Bhattacharya et al., 2024; IoT Survey, 2023) are largely restricted to theoretical Blockchain or IoT studies, rarely applied to standard chat applications.</w:t>
       </w:r>
     </w:p>
     <w:p>
@@ -2712,21 +2370,7 @@
         <w:rPr>
           <w:rFonts w:ascii="Arial" w:hAnsi="Arial" w:cs="Arial"/>
         </w:rPr>
-        <w:t xml:space="preserve"> While Deep Learning is effective for insider threat detection (Bi-LSTM papers), it is traditionally server-dependent. Conversely, mobile-optimized AI (</w:t>
-      </w:r>
-      <w:proofErr w:type="spellStart"/>
-      <w:r>
-        <w:rPr>
-          <w:rFonts w:ascii="Arial" w:hAnsi="Arial" w:cs="Arial"/>
-        </w:rPr>
-        <w:t>TinyBERT</w:t>
-      </w:r>
-      <w:proofErr w:type="spellEnd"/>
-      <w:r>
-        <w:rPr>
-          <w:rFonts w:ascii="Arial" w:hAnsi="Arial" w:cs="Arial"/>
-        </w:rPr>
-        <w:t>/PHILDER) is currently focused heavily on SMS/Phishing rather than real-time behavioral anomalies within encrypted chat sessions.</w:t>
+        <w:t xml:space="preserve"> While Deep Learning is effective for insider threat detection (Bi-LSTM papers), it is traditionally server-dependent. Conversely, mobile-optimized AI (TinyBERT/PHILDER) is currently focused heavily on SMS/Phishing rather than real-time behavioral anomalies within encrypted chat sessions.</w:t>
       </w:r>
     </w:p>
     <w:p>
@@ -2786,7 +2430,6 @@
         </w:rPr>
         <w:t xml:space="preserve"> for behavioral anomaly detection in a mobile messaging environment. Existing solutions force a trade-off: either encrypt data and lose visibility on threats, or scan for threats and compromise privacy. </w:t>
       </w:r>
-      <w:proofErr w:type="spellStart"/>
       <w:r>
         <w:rPr>
           <w:rFonts w:ascii="Arial" w:hAnsi="Arial" w:cs="Arial"/>
@@ -2795,26 +2438,11 @@
         </w:rPr>
         <w:t>SentriZK</w:t>
       </w:r>
-      <w:proofErr w:type="spellEnd"/>
-      <w:r>
-        <w:rPr>
-          <w:rFonts w:ascii="Arial" w:hAnsi="Arial" w:cs="Arial"/>
-        </w:rPr>
-        <w:t xml:space="preserve"> aims to bridge this gap by integrating Groth16 </w:t>
-      </w:r>
-      <w:proofErr w:type="spellStart"/>
-      <w:r>
-        <w:rPr>
-          <w:rFonts w:ascii="Arial" w:hAnsi="Arial" w:cs="Arial"/>
-        </w:rPr>
-        <w:t>zk</w:t>
-      </w:r>
-      <w:proofErr w:type="spellEnd"/>
-      <w:r>
-        <w:rPr>
-          <w:rFonts w:ascii="Arial" w:hAnsi="Arial" w:cs="Arial"/>
-        </w:rPr>
-        <w:t>-SNARKs and TensorFlow Lite to provide a secure, private, and intelligent messaging solution for SMEs.</w:t>
+      <w:r>
+        <w:rPr>
+          <w:rFonts w:ascii="Arial" w:hAnsi="Arial" w:cs="Arial"/>
+        </w:rPr>
+        <w:t xml:space="preserve"> aims to bridge this gap by integrating Groth16 zk-SNARKs and TensorFlow Lite to provide a secure, private, and intelligent messaging solution for SMEs.</w:t>
       </w:r>
     </w:p>
     <w:p>
@@ -2921,21 +2549,7 @@
         <w:rPr>
           <w:rFonts w:ascii="Arial" w:hAnsi="Arial" w:cs="Arial"/>
         </w:rPr>
-        <w:t xml:space="preserve">This chapter explains the methodology and the steps taken to develop the </w:t>
-      </w:r>
-      <w:proofErr w:type="spellStart"/>
-      <w:r>
-        <w:rPr>
-          <w:rFonts w:ascii="Arial" w:hAnsi="Arial" w:cs="Arial"/>
-        </w:rPr>
-        <w:t>SentriZK</w:t>
-      </w:r>
-      <w:proofErr w:type="spellEnd"/>
-      <w:r>
-        <w:rPr>
-          <w:rFonts w:ascii="Arial" w:hAnsi="Arial" w:cs="Arial"/>
-        </w:rPr>
-        <w:t xml:space="preserve"> project. The main purpose of this chapter is to define the structured approach used to design, build, and test the secure messaging application. It begins by looking at different software development models and justifies why the Rapid Application Development (RAD) model was chosen for this project.</w:t>
+        <w:t>This chapter explains the methodology and the steps taken to develop the SentriZK project. The main purpose of this chapter is to define the structured approach used to design, build, and test the secure messaging application. It begins by looking at different software development models and justifies why the Rapid Application Development (RAD) model was chosen for this project.</w:t>
       </w:r>
     </w:p>
     <w:p>
@@ -2959,7 +2573,6 @@
         </w:rPr>
         <w:t xml:space="preserve">After that, the chapter explains the specific activities done in each phase of the development, such as gathering requirements and designing the system prototypes. It also presents the detailed technical design of the system, which includes the System Architecture Diagram, Flow Chart, Activity Diagram, Sitemap, and Threat Model Diagram. These diagrams are used to visualize how the system functions and secures user data. Finally, the chapter outlines the hardware and software requirements, the budget and costing, and the project planning schedule to ensure the project is completed on </w:t>
       </w:r>
-      <w:proofErr w:type="spellStart"/>
       <w:r>
         <w:rPr>
           <w:rFonts w:ascii="Arial" w:hAnsi="Arial" w:cs="Arial"/>
@@ -2970,9 +2583,8 @@
         <w:rPr>
           <w:rFonts w:ascii="Arial" w:hAnsi="Arial" w:cs="Arial"/>
         </w:rPr>
-        <w:t>the</w:t>
-      </w:r>
-      <w:proofErr w:type="spellEnd"/>
+        <w:t xml:space="preserve"> The</w:t>
+      </w:r>
       <w:r>
         <w:rPr>
           <w:rFonts w:ascii="Arial" w:hAnsi="Arial" w:cs="Arial"/>
@@ -3852,7 +3464,6 @@
         </w:rPr>
         <w:t xml:space="preserve">The development of </w:t>
       </w:r>
-      <w:proofErr w:type="spellStart"/>
       <w:r>
         <w:rPr>
           <w:rFonts w:ascii="Arial" w:hAnsi="Arial" w:cs="Arial"/>
@@ -3861,7 +3472,6 @@
         </w:rPr>
         <w:t>SentriZK</w:t>
       </w:r>
-      <w:proofErr w:type="spellEnd"/>
       <w:r>
         <w:rPr>
           <w:rFonts w:ascii="Arial" w:hAnsi="Arial" w:cs="Arial"/>
@@ -4244,21 +3854,7 @@
         <w:rPr>
           <w:rFonts w:ascii="Arial" w:hAnsi="Arial" w:cs="Arial"/>
         </w:rPr>
-        <w:t xml:space="preserve">Figure 3.1: </w:t>
-      </w:r>
-      <w:proofErr w:type="spellStart"/>
-      <w:r>
-        <w:rPr>
-          <w:rFonts w:ascii="Arial" w:hAnsi="Arial" w:cs="Arial"/>
-        </w:rPr>
-        <w:t>SentriZK</w:t>
-      </w:r>
-      <w:proofErr w:type="spellEnd"/>
-      <w:r>
-        <w:rPr>
-          <w:rFonts w:ascii="Arial" w:hAnsi="Arial" w:cs="Arial"/>
-        </w:rPr>
-        <w:t xml:space="preserve"> System Architecture</w:t>
+        <w:t>Figure 3.1: SentriZK System Architecture</w:t>
       </w:r>
     </w:p>
     <w:p>
@@ -4392,7 +3988,7 @@
           <w:noProof/>
         </w:rPr>
         <w:drawing>
-          <wp:inline distT="0" distB="0" distL="0" distR="0" wp14:anchorId="03F6A903" wp14:editId="61DEF530">
+          <wp:inline distT="0" distB="0" distL="0" distR="0" wp14:anchorId="03F6A903" wp14:editId="51AA3F4D">
             <wp:extent cx="5943600" cy="3032125"/>
             <wp:effectExtent l="0" t="0" r="0" b="0"/>
             <wp:docPr id="573649057" name="Picture 6" descr="A screenshot of a computer screen"/>
@@ -5191,21 +4787,7 @@
         <w:rPr>
           <w:rFonts w:ascii="Arial" w:hAnsi="Arial" w:cs="Arial"/>
         </w:rPr>
-        <w:t xml:space="preserve"> On mobile, the </w:t>
-      </w:r>
-      <w:proofErr w:type="spellStart"/>
-      <w:r>
-        <w:rPr>
-          <w:rFonts w:ascii="Arial" w:hAnsi="Arial" w:cs="Arial"/>
-        </w:rPr>
-        <w:t>flutter_secure_storage</w:t>
-      </w:r>
-      <w:proofErr w:type="spellEnd"/>
-      <w:r>
-        <w:rPr>
-          <w:rFonts w:ascii="Arial" w:hAnsi="Arial" w:cs="Arial"/>
-        </w:rPr>
-        <w:t xml:space="preserve"> library was used to store the user's private keys in the hardware-backed KeyStore/Keychain.</w:t>
+        <w:t xml:space="preserve"> On mobile, the flutter_secure_storage library was used to store the user's private keys in the hardware-backed KeyStore/Keychain.</w:t>
       </w:r>
     </w:p>
     <w:p>
@@ -5668,6 +5250,552 @@
         <w:spacing w:line="360" w:lineRule="auto"/>
         <w:rPr>
           <w:rFonts w:ascii="Arial" w:hAnsi="Arial" w:cs="Arial"/>
+        </w:rPr>
+      </w:pPr>
+      <w:r>
+        <w:rPr>
+          <w:rFonts w:ascii="Arial" w:hAnsi="Arial" w:cs="Arial"/>
+        </w:rPr>
+        <w:t>To ensure the successful development and deployment of the SentriZK framework, specific hardware and software resources are required. The system relies on a "Privacy-First" ecosystem where heavy computation (ZKP generation and AI inference) occurs on the client side.</w:t>
+      </w:r>
+    </w:p>
+    <w:p>
+      <w:pPr>
+        <w:spacing w:line="360" w:lineRule="auto"/>
+        <w:rPr>
+          <w:rFonts w:ascii="Arial" w:hAnsi="Arial" w:cs="Arial"/>
+        </w:rPr>
+      </w:pPr>
+      <w:r>
+        <w:rPr>
+          <w:rFonts w:ascii="Arial" w:hAnsi="Arial" w:cs="Arial"/>
+          <w:b/>
+          <w:bCs/>
+        </w:rPr>
+        <w:lastRenderedPageBreak/>
+        <w:t>3.5.1 Hardware Requirements</w:t>
+      </w:r>
+    </w:p>
+    <w:p>
+      <w:pPr>
+        <w:spacing w:line="360" w:lineRule="auto"/>
+        <w:rPr>
+          <w:rFonts w:ascii="Arial" w:hAnsi="Arial" w:cs="Arial"/>
+        </w:rPr>
+      </w:pPr>
+      <w:r>
+        <w:rPr>
+          <w:rFonts w:ascii="Arial" w:hAnsi="Arial" w:cs="Arial"/>
+        </w:rPr>
+        <w:t>The development and testing environments require robust hardware to handle emulator execution, model training, and server hosting.</w:t>
+      </w:r>
+    </w:p>
+    <w:p>
+      <w:pPr>
+        <w:numPr>
+          <w:ilvl w:val="0"/>
+          <w:numId w:val="40"/>
+        </w:numPr>
+        <w:spacing w:line="360" w:lineRule="auto"/>
+        <w:rPr>
+          <w:rFonts w:ascii="Arial" w:hAnsi="Arial" w:cs="Arial"/>
+        </w:rPr>
+      </w:pPr>
+      <w:r>
+        <w:rPr>
+          <w:rFonts w:ascii="Arial" w:hAnsi="Arial" w:cs="Arial"/>
+          <w:b/>
+          <w:bCs/>
+        </w:rPr>
+        <w:t>Development Environment:</w:t>
+      </w:r>
+    </w:p>
+    <w:p>
+      <w:pPr>
+        <w:numPr>
+          <w:ilvl w:val="1"/>
+          <w:numId w:val="40"/>
+        </w:numPr>
+        <w:spacing w:line="360" w:lineRule="auto"/>
+        <w:rPr>
+          <w:rFonts w:ascii="Arial" w:hAnsi="Arial" w:cs="Arial"/>
+        </w:rPr>
+      </w:pPr>
+      <w:r>
+        <w:rPr>
+          <w:rFonts w:ascii="Arial" w:hAnsi="Arial" w:cs="Arial"/>
+          <w:b/>
+          <w:bCs/>
+        </w:rPr>
+        <w:t>Laptop/Workstation:</w:t>
+      </w:r>
+      <w:r>
+        <w:rPr>
+          <w:rFonts w:ascii="Arial" w:hAnsi="Arial" w:cs="Arial"/>
+        </w:rPr>
+        <w:t xml:space="preserve"> Lenovo Legion (High-performance processor and GPU required for training TensorFlow models and running Android Studio emulators).</w:t>
+      </w:r>
+    </w:p>
+    <w:p>
+      <w:pPr>
+        <w:numPr>
+          <w:ilvl w:val="1"/>
+          <w:numId w:val="40"/>
+        </w:numPr>
+        <w:spacing w:line="360" w:lineRule="auto"/>
+        <w:rPr>
+          <w:rFonts w:ascii="Arial" w:hAnsi="Arial" w:cs="Arial"/>
+        </w:rPr>
+      </w:pPr>
+      <w:r>
+        <w:rPr>
+          <w:rFonts w:ascii="Arial" w:hAnsi="Arial" w:cs="Arial"/>
+          <w:b/>
+          <w:bCs/>
+        </w:rPr>
+        <w:t>Memory (RAM):</w:t>
+      </w:r>
+      <w:r>
+        <w:rPr>
+          <w:rFonts w:ascii="Arial" w:hAnsi="Arial" w:cs="Arial"/>
+        </w:rPr>
+        <w:t xml:space="preserve"> Minimum 16GB (Recommended to run Flutter and Node.js concurrently).</w:t>
+      </w:r>
+    </w:p>
+    <w:p>
+      <w:pPr>
+        <w:numPr>
+          <w:ilvl w:val="1"/>
+          <w:numId w:val="40"/>
+        </w:numPr>
+        <w:spacing w:line="360" w:lineRule="auto"/>
+        <w:rPr>
+          <w:rFonts w:ascii="Arial" w:hAnsi="Arial" w:cs="Arial"/>
+        </w:rPr>
+      </w:pPr>
+      <w:r>
+        <w:rPr>
+          <w:rFonts w:ascii="Arial" w:hAnsi="Arial" w:cs="Arial"/>
+          <w:b/>
+          <w:bCs/>
+        </w:rPr>
+        <w:t>Test Device:</w:t>
+      </w:r>
+      <w:r>
+        <w:rPr>
+          <w:rFonts w:ascii="Arial" w:hAnsi="Arial" w:cs="Arial"/>
+        </w:rPr>
+        <w:t xml:space="preserve"> Physical Android Device (Required to test real-world biometric integration and Camera/AI performance).</w:t>
+      </w:r>
+    </w:p>
+    <w:p>
+      <w:pPr>
+        <w:spacing w:line="360" w:lineRule="auto"/>
+        <w:rPr>
+          <w:rFonts w:ascii="Arial" w:hAnsi="Arial" w:cs="Arial"/>
+        </w:rPr>
+      </w:pPr>
+      <w:r>
+        <w:rPr>
+          <w:rFonts w:ascii="Arial" w:hAnsi="Arial" w:cs="Arial"/>
+          <w:b/>
+          <w:bCs/>
+        </w:rPr>
+        <w:t>Server/Deployment Environment:</w:t>
+      </w:r>
+    </w:p>
+    <w:p>
+      <w:pPr>
+        <w:numPr>
+          <w:ilvl w:val="0"/>
+          <w:numId w:val="41"/>
+        </w:numPr>
+        <w:spacing w:line="360" w:lineRule="auto"/>
+        <w:rPr>
+          <w:rFonts w:ascii="Arial" w:hAnsi="Arial" w:cs="Arial"/>
+        </w:rPr>
+      </w:pPr>
+      <w:r>
+        <w:rPr>
+          <w:rFonts w:ascii="Arial" w:hAnsi="Arial" w:cs="Arial"/>
+          <w:b/>
+          <w:bCs/>
+        </w:rPr>
+        <w:t>Primary Server Node:</w:t>
+      </w:r>
+      <w:r>
+        <w:rPr>
+          <w:rFonts w:ascii="Arial" w:hAnsi="Arial" w:cs="Arial"/>
+        </w:rPr>
+        <w:t xml:space="preserve"> Raspberry Pi 5 (8GB RAM/Quad-core). This acts as the self-hosted backend to verify </w:t>
+      </w:r>
+      <w:proofErr w:type="gramStart"/>
+      <w:r>
+        <w:rPr>
+          <w:rFonts w:ascii="Arial" w:hAnsi="Arial" w:cs="Arial"/>
+        </w:rPr>
+        <w:t>proofs</w:t>
+      </w:r>
+      <w:proofErr w:type="gramEnd"/>
+      <w:r>
+        <w:rPr>
+          <w:rFonts w:ascii="Arial" w:hAnsi="Arial" w:cs="Arial"/>
+        </w:rPr>
+        <w:t xml:space="preserve"> without relying on expensive cloud infrastructure.</w:t>
+      </w:r>
+    </w:p>
+    <w:p>
+      <w:pPr>
+        <w:numPr>
+          <w:ilvl w:val="0"/>
+          <w:numId w:val="41"/>
+        </w:numPr>
+        <w:spacing w:line="360" w:lineRule="auto"/>
+        <w:rPr>
+          <w:rFonts w:ascii="Arial" w:hAnsi="Arial" w:cs="Arial"/>
+        </w:rPr>
+      </w:pPr>
+      <w:r>
+        <w:rPr>
+          <w:rFonts w:ascii="Arial" w:hAnsi="Arial" w:cs="Arial"/>
+          <w:b/>
+          <w:bCs/>
+        </w:rPr>
+        <w:t>Network:</w:t>
+      </w:r>
+      <w:r>
+        <w:rPr>
+          <w:rFonts w:ascii="Arial" w:hAnsi="Arial" w:cs="Arial"/>
+        </w:rPr>
+        <w:t xml:space="preserve"> Stable internet connection with Cloudflare Tunnels configured for public access.</w:t>
+      </w:r>
+    </w:p>
+    <w:p>
+      <w:pPr>
+        <w:spacing w:line="360" w:lineRule="auto"/>
+        <w:rPr>
+          <w:rFonts w:ascii="Arial" w:hAnsi="Arial" w:cs="Arial"/>
+        </w:rPr>
+      </w:pPr>
+    </w:p>
+    <w:p>
+      <w:pPr>
+        <w:spacing w:line="360" w:lineRule="auto"/>
+        <w:rPr>
+          <w:rFonts w:ascii="Arial" w:hAnsi="Arial" w:cs="Arial"/>
+        </w:rPr>
+      </w:pPr>
+      <w:r>
+        <w:rPr>
+          <w:rFonts w:ascii="Arial" w:hAnsi="Arial" w:cs="Arial"/>
+          <w:b/>
+          <w:bCs/>
+        </w:rPr>
+        <w:t>3.5.2 Software Requirements</w:t>
+      </w:r>
+    </w:p>
+    <w:p>
+      <w:pPr>
+        <w:spacing w:line="360" w:lineRule="auto"/>
+        <w:rPr>
+          <w:rFonts w:ascii="Arial" w:hAnsi="Arial" w:cs="Arial"/>
+        </w:rPr>
+      </w:pPr>
+      <w:r>
+        <w:rPr>
+          <w:rFonts w:ascii="Arial" w:hAnsi="Arial" w:cs="Arial"/>
+        </w:rPr>
+        <w:t>The project utilizes a modern tech stack to support cross-platform compatibility and cryptographic operations.</w:t>
+      </w:r>
+    </w:p>
+    <w:p>
+      <w:pPr>
+        <w:numPr>
+          <w:ilvl w:val="0"/>
+          <w:numId w:val="42"/>
+        </w:numPr>
+        <w:spacing w:line="360" w:lineRule="auto"/>
+        <w:rPr>
+          <w:rFonts w:ascii="Arial" w:hAnsi="Arial" w:cs="Arial"/>
+        </w:rPr>
+      </w:pPr>
+      <w:r>
+        <w:rPr>
+          <w:rFonts w:ascii="Arial" w:hAnsi="Arial" w:cs="Arial"/>
+          <w:b/>
+          <w:bCs/>
+        </w:rPr>
+        <w:t>Frontend Development:</w:t>
+      </w:r>
+    </w:p>
+    <w:p>
+      <w:pPr>
+        <w:numPr>
+          <w:ilvl w:val="1"/>
+          <w:numId w:val="42"/>
+        </w:numPr>
+        <w:spacing w:line="360" w:lineRule="auto"/>
+        <w:rPr>
+          <w:rFonts w:ascii="Arial" w:hAnsi="Arial" w:cs="Arial"/>
+        </w:rPr>
+      </w:pPr>
+      <w:r>
+        <w:rPr>
+          <w:rFonts w:ascii="Arial" w:hAnsi="Arial" w:cs="Arial"/>
+          <w:b/>
+          <w:bCs/>
+        </w:rPr>
+        <w:t>Framework:</w:t>
+      </w:r>
+      <w:r>
+        <w:rPr>
+          <w:rFonts w:ascii="Arial" w:hAnsi="Arial" w:cs="Arial"/>
+        </w:rPr>
+        <w:t xml:space="preserve"> Flutter (Android focus) for </w:t>
+      </w:r>
+      <w:r>
+        <w:rPr>
+          <w:rFonts w:ascii="Arial" w:hAnsi="Arial" w:cs="Arial"/>
+        </w:rPr>
+        <w:t>mobile applications</w:t>
+      </w:r>
+      <w:r>
+        <w:rPr>
+          <w:rFonts w:ascii="Arial" w:hAnsi="Arial" w:cs="Arial"/>
+        </w:rPr>
+        <w:t>.</w:t>
+      </w:r>
+    </w:p>
+    <w:p>
+      <w:pPr>
+        <w:numPr>
+          <w:ilvl w:val="1"/>
+          <w:numId w:val="42"/>
+        </w:numPr>
+        <w:spacing w:line="360" w:lineRule="auto"/>
+        <w:rPr>
+          <w:rFonts w:ascii="Arial" w:hAnsi="Arial" w:cs="Arial"/>
+        </w:rPr>
+      </w:pPr>
+      <w:r>
+        <w:rPr>
+          <w:rFonts w:ascii="Arial" w:hAnsi="Arial" w:cs="Arial"/>
+          <w:b/>
+          <w:bCs/>
+        </w:rPr>
+        <w:t>Web Auth:</w:t>
+      </w:r>
+      <w:r>
+        <w:rPr>
+          <w:rFonts w:ascii="Arial" w:hAnsi="Arial" w:cs="Arial"/>
+        </w:rPr>
+        <w:t xml:space="preserve"> Next.js / React for the web-based authentication interface.</w:t>
+      </w:r>
+    </w:p>
+    <w:p>
+      <w:pPr>
+        <w:numPr>
+          <w:ilvl w:val="0"/>
+          <w:numId w:val="42"/>
+        </w:numPr>
+        <w:spacing w:line="360" w:lineRule="auto"/>
+        <w:rPr>
+          <w:rFonts w:ascii="Arial" w:hAnsi="Arial" w:cs="Arial"/>
+          <w:b/>
+          <w:bCs/>
+        </w:rPr>
+      </w:pPr>
+      <w:r>
+        <w:rPr>
+          <w:rFonts w:ascii="Arial" w:hAnsi="Arial" w:cs="Arial"/>
+          <w:b/>
+          <w:bCs/>
+        </w:rPr>
+        <w:t>Backend &amp; Database:</w:t>
+      </w:r>
+    </w:p>
+    <w:p>
+      <w:pPr>
+        <w:pStyle w:val="ListParagraph"/>
+        <w:numPr>
+          <w:ilvl w:val="1"/>
+          <w:numId w:val="42"/>
+        </w:numPr>
+        <w:rPr>
+          <w:rFonts w:ascii="Arial" w:hAnsi="Arial" w:cs="Arial"/>
+        </w:rPr>
+      </w:pPr>
+      <w:r>
+        <w:rPr>
+          <w:rFonts w:ascii="Arial" w:hAnsi="Arial" w:cs="Arial"/>
+          <w:b/>
+          <w:bCs/>
+        </w:rPr>
+        <w:lastRenderedPageBreak/>
+        <w:t>Runtime Environment:</w:t>
+      </w:r>
+      <w:r>
+        <w:rPr>
+          <w:rFonts w:ascii="Arial" w:hAnsi="Arial" w:cs="Arial"/>
+        </w:rPr>
+        <w:t xml:space="preserve"> Node.js for the verification API.</w:t>
+      </w:r>
+    </w:p>
+    <w:p>
+      <w:pPr>
+        <w:numPr>
+          <w:ilvl w:val="1"/>
+          <w:numId w:val="42"/>
+        </w:numPr>
+        <w:spacing w:line="360" w:lineRule="auto"/>
+        <w:rPr>
+          <w:rFonts w:ascii="Arial" w:hAnsi="Arial" w:cs="Arial"/>
+        </w:rPr>
+      </w:pPr>
+      <w:r>
+        <w:rPr>
+          <w:rFonts w:ascii="Arial" w:hAnsi="Arial" w:cs="Arial"/>
+          <w:b/>
+          <w:bCs/>
+        </w:rPr>
+        <w:t>Signaling/Queueing:</w:t>
+      </w:r>
+      <w:r>
+        <w:rPr>
+          <w:rFonts w:ascii="Arial" w:hAnsi="Arial" w:cs="Arial"/>
+        </w:rPr>
+        <w:t xml:space="preserve"> Google Firebase (used for temporary message signaling).</w:t>
+      </w:r>
+    </w:p>
+    <w:p>
+      <w:pPr>
+        <w:numPr>
+          <w:ilvl w:val="1"/>
+          <w:numId w:val="42"/>
+        </w:numPr>
+        <w:spacing w:line="360" w:lineRule="auto"/>
+        <w:rPr>
+          <w:rFonts w:ascii="Arial" w:hAnsi="Arial" w:cs="Arial"/>
+        </w:rPr>
+      </w:pPr>
+      <w:r>
+        <w:rPr>
+          <w:rFonts w:ascii="Arial" w:hAnsi="Arial" w:cs="Arial"/>
+          <w:b/>
+          <w:bCs/>
+        </w:rPr>
+        <w:t>Local Storage</w:t>
+      </w:r>
+      <w:r>
+        <w:rPr>
+          <w:rFonts w:ascii="Arial" w:hAnsi="Arial" w:cs="Arial"/>
+        </w:rPr>
+        <w:t>: Hive DB and Android KeyStore for secure on-device storage of cryptographic keys.</w:t>
+      </w:r>
+    </w:p>
+    <w:p>
+      <w:pPr>
+        <w:numPr>
+          <w:ilvl w:val="0"/>
+          <w:numId w:val="42"/>
+        </w:numPr>
+        <w:spacing w:line="360" w:lineRule="auto"/>
+        <w:rPr>
+          <w:rFonts w:ascii="Arial" w:hAnsi="Arial" w:cs="Arial"/>
+          <w:b/>
+          <w:bCs/>
+        </w:rPr>
+      </w:pPr>
+      <w:r>
+        <w:rPr>
+          <w:rFonts w:ascii="Arial" w:hAnsi="Arial" w:cs="Arial"/>
+          <w:b/>
+          <w:bCs/>
+        </w:rPr>
+        <w:t>AI &amp; Security Libraries:</w:t>
+      </w:r>
+    </w:p>
+    <w:p>
+      <w:pPr>
+        <w:numPr>
+          <w:ilvl w:val="1"/>
+          <w:numId w:val="42"/>
+        </w:numPr>
+        <w:spacing w:line="360" w:lineRule="auto"/>
+        <w:rPr>
+          <w:rFonts w:ascii="Arial" w:hAnsi="Arial" w:cs="Arial"/>
+        </w:rPr>
+      </w:pPr>
+      <w:r>
+        <w:rPr>
+          <w:rFonts w:ascii="Arial" w:hAnsi="Arial" w:cs="Arial"/>
+        </w:rPr>
+        <w:t>Machine Learning: TensorFlow Lite (Isolation Forest model) for on-device anomaly detection.</w:t>
+      </w:r>
+    </w:p>
+    <w:p>
+      <w:pPr>
+        <w:numPr>
+          <w:ilvl w:val="1"/>
+          <w:numId w:val="42"/>
+        </w:numPr>
+        <w:spacing w:line="360" w:lineRule="auto"/>
+        <w:rPr>
+          <w:rFonts w:ascii="Arial" w:hAnsi="Arial" w:cs="Arial"/>
+        </w:rPr>
+      </w:pPr>
+      <w:r>
+        <w:rPr>
+          <w:rFonts w:ascii="Arial" w:hAnsi="Arial" w:cs="Arial"/>
+        </w:rPr>
+        <w:t>Cryptography: SnarkJS and Circom for Zero-Knowledge Proof generation and verification.</w:t>
+      </w:r>
+    </w:p>
+    <w:p>
+      <w:pPr>
+        <w:numPr>
+          <w:ilvl w:val="1"/>
+          <w:numId w:val="42"/>
+        </w:numPr>
+        <w:spacing w:line="360" w:lineRule="auto"/>
+        <w:rPr>
+          <w:rFonts w:ascii="Arial" w:hAnsi="Arial" w:cs="Arial"/>
+        </w:rPr>
+      </w:pPr>
+      <w:r>
+        <w:rPr>
+          <w:rFonts w:ascii="Arial" w:hAnsi="Arial" w:cs="Arial"/>
+        </w:rPr>
+        <w:t>Encryption: AES-256 implementation via crypto-</w:t>
+      </w:r>
+      <w:proofErr w:type="spellStart"/>
+      <w:r>
+        <w:rPr>
+          <w:rFonts w:ascii="Arial" w:hAnsi="Arial" w:cs="Arial"/>
+        </w:rPr>
+        <w:t>js</w:t>
+      </w:r>
+      <w:proofErr w:type="spellEnd"/>
+      <w:r>
+        <w:rPr>
+          <w:rFonts w:ascii="Arial" w:hAnsi="Arial" w:cs="Arial"/>
+        </w:rPr>
+        <w:t xml:space="preserve"> and the Signal Protocol for End-to-End Encryption.</w:t>
+      </w:r>
+    </w:p>
+    <w:p>
+      <w:pPr>
+        <w:spacing w:line="360" w:lineRule="auto"/>
+        <w:rPr>
+          <w:rFonts w:ascii="Arial" w:hAnsi="Arial" w:cs="Arial"/>
+        </w:rPr>
+      </w:pPr>
+    </w:p>
+    <w:p>
+      <w:pPr>
+        <w:spacing w:line="360" w:lineRule="auto"/>
+        <w:rPr>
+          <w:rFonts w:ascii="Arial" w:hAnsi="Arial" w:cs="Arial"/>
           <w:b/>
           <w:bCs/>
         </w:rPr>
@@ -5680,6 +5808,889 @@
         </w:rPr>
         <w:t>3.6 Project Planning</w:t>
       </w:r>
+    </w:p>
+    <w:p>
+      <w:pPr>
+        <w:spacing w:line="360" w:lineRule="auto"/>
+        <w:rPr>
+          <w:rFonts w:ascii="Arial" w:hAnsi="Arial" w:cs="Arial"/>
+        </w:rPr>
+      </w:pPr>
+      <w:r>
+        <w:rPr>
+          <w:rFonts w:ascii="Arial" w:hAnsi="Arial" w:cs="Arial"/>
+        </w:rPr>
+        <w:t>This project follows the Rapid Application Development (RAD) methodology, which emphasizes iterative cycles. The planning includes a defined timeline and a cost assessment to ensure feasibility for SMEs</w:t>
+      </w:r>
+    </w:p>
+    <w:p>
+      <w:pPr>
+        <w:spacing w:line="360" w:lineRule="auto"/>
+        <w:rPr>
+          <w:rFonts w:ascii="Arial" w:hAnsi="Arial" w:cs="Arial"/>
+        </w:rPr>
+      </w:pPr>
+    </w:p>
+    <w:p>
+      <w:pPr>
+        <w:spacing w:line="360" w:lineRule="auto"/>
+        <w:rPr>
+          <w:rFonts w:ascii="Arial" w:hAnsi="Arial" w:cs="Arial"/>
+        </w:rPr>
+      </w:pPr>
+      <w:r>
+        <w:rPr>
+          <w:rFonts w:ascii="Arial" w:hAnsi="Arial" w:cs="Arial"/>
+          <w:b/>
+          <w:bCs/>
+        </w:rPr>
+        <w:t>3.6.1 Project Costing and Budget</w:t>
+      </w:r>
+    </w:p>
+    <w:p>
+      <w:pPr>
+        <w:spacing w:line="360" w:lineRule="auto"/>
+        <w:rPr>
+          <w:rFonts w:ascii="Arial" w:hAnsi="Arial" w:cs="Arial"/>
+        </w:rPr>
+      </w:pPr>
+      <w:r>
+        <w:rPr>
+          <w:rFonts w:ascii="Arial" w:hAnsi="Arial" w:cs="Arial"/>
+        </w:rPr>
+        <w:t xml:space="preserve">A key objective of this study is to provide a cost-effective solution for SMEs. The project utilizes </w:t>
+      </w:r>
+      <w:proofErr w:type="gramStart"/>
+      <w:r>
+        <w:rPr>
+          <w:rFonts w:ascii="Arial" w:hAnsi="Arial" w:cs="Arial"/>
+        </w:rPr>
+        <w:t>a 100</w:t>
+      </w:r>
+      <w:proofErr w:type="gramEnd"/>
+      <w:r>
+        <w:rPr>
+          <w:rFonts w:ascii="Arial" w:hAnsi="Arial" w:cs="Arial"/>
+        </w:rPr>
+        <w:t>% self-hosted architecture to minimize operational expenses (OpEx).</w:t>
+      </w:r>
+    </w:p>
+    <w:tbl>
+      <w:tblPr>
+        <w:tblStyle w:val="PlainTable1"/>
+        <w:tblW w:w="0" w:type="auto"/>
+        <w:tblLook w:val="04A0" w:firstRow="1" w:lastRow="0" w:firstColumn="1" w:lastColumn="0" w:noHBand="0" w:noVBand="1"/>
+      </w:tblPr>
+      <w:tblGrid>
+        <w:gridCol w:w="2757"/>
+        <w:gridCol w:w="1497"/>
+        <w:gridCol w:w="1345"/>
+        <w:gridCol w:w="3751"/>
+      </w:tblGrid>
+      <w:tr>
+        <w:trPr>
+          <w:cnfStyle w:val="100000000000" w:firstRow="1" w:lastRow="0" w:firstColumn="0" w:lastColumn="0" w:oddVBand="0" w:evenVBand="0" w:oddHBand="0" w:evenHBand="0" w:firstRowFirstColumn="0" w:firstRowLastColumn="0" w:lastRowFirstColumn="0" w:lastRowLastColumn="0"/>
+        </w:trPr>
+        <w:tc>
+          <w:tcPr>
+            <w:cnfStyle w:val="001000000000" w:firstRow="0" w:lastRow="0" w:firstColumn="1" w:lastColumn="0" w:oddVBand="0" w:evenVBand="0" w:oddHBand="0" w:evenHBand="0" w:firstRowFirstColumn="0" w:firstRowLastColumn="0" w:lastRowFirstColumn="0" w:lastRowLastColumn="0"/>
+            <w:tcW w:w="0" w:type="auto"/>
+            <w:hideMark/>
+          </w:tcPr>
+          <w:p>
+            <w:pPr>
+              <w:spacing w:after="160" w:line="360" w:lineRule="auto"/>
+              <w:rPr>
+                <w:rFonts w:ascii="Arial" w:hAnsi="Arial" w:cs="Arial"/>
+              </w:rPr>
+            </w:pPr>
+            <w:r>
+              <w:rPr>
+                <w:rFonts w:ascii="Arial" w:hAnsi="Arial" w:cs="Arial"/>
+              </w:rPr>
+              <w:t>Item</w:t>
+            </w:r>
+          </w:p>
+        </w:tc>
+        <w:tc>
+          <w:tcPr>
+            <w:tcW w:w="0" w:type="auto"/>
+            <w:hideMark/>
+          </w:tcPr>
+          <w:p>
+            <w:pPr>
+              <w:spacing w:after="160" w:line="360" w:lineRule="auto"/>
+              <w:cnfStyle w:val="100000000000" w:firstRow="1" w:lastRow="0" w:firstColumn="0" w:lastColumn="0" w:oddVBand="0" w:evenVBand="0" w:oddHBand="0" w:evenHBand="0" w:firstRowFirstColumn="0" w:firstRowLastColumn="0" w:lastRowFirstColumn="0" w:lastRowLastColumn="0"/>
+              <w:rPr>
+                <w:rFonts w:ascii="Arial" w:hAnsi="Arial" w:cs="Arial"/>
+              </w:rPr>
+            </w:pPr>
+            <w:r>
+              <w:rPr>
+                <w:rFonts w:ascii="Arial" w:hAnsi="Arial" w:cs="Arial"/>
+              </w:rPr>
+              <w:t>Category</w:t>
+            </w:r>
+          </w:p>
+        </w:tc>
+        <w:tc>
+          <w:tcPr>
+            <w:tcW w:w="0" w:type="auto"/>
+            <w:hideMark/>
+          </w:tcPr>
+          <w:p>
+            <w:pPr>
+              <w:spacing w:after="160" w:line="360" w:lineRule="auto"/>
+              <w:cnfStyle w:val="100000000000" w:firstRow="1" w:lastRow="0" w:firstColumn="0" w:lastColumn="0" w:oddVBand="0" w:evenVBand="0" w:oddHBand="0" w:evenHBand="0" w:firstRowFirstColumn="0" w:firstRowLastColumn="0" w:lastRowFirstColumn="0" w:lastRowLastColumn="0"/>
+              <w:rPr>
+                <w:rFonts w:ascii="Arial" w:hAnsi="Arial" w:cs="Arial"/>
+              </w:rPr>
+            </w:pPr>
+            <w:r>
+              <w:rPr>
+                <w:rFonts w:ascii="Arial" w:hAnsi="Arial" w:cs="Arial"/>
+              </w:rPr>
+              <w:t>Cost (RM)</w:t>
+            </w:r>
+          </w:p>
+        </w:tc>
+        <w:tc>
+          <w:tcPr>
+            <w:tcW w:w="0" w:type="auto"/>
+            <w:hideMark/>
+          </w:tcPr>
+          <w:p>
+            <w:pPr>
+              <w:spacing w:after="160" w:line="360" w:lineRule="auto"/>
+              <w:cnfStyle w:val="100000000000" w:firstRow="1" w:lastRow="0" w:firstColumn="0" w:lastColumn="0" w:oddVBand="0" w:evenVBand="0" w:oddHBand="0" w:evenHBand="0" w:firstRowFirstColumn="0" w:firstRowLastColumn="0" w:lastRowFirstColumn="0" w:lastRowLastColumn="0"/>
+              <w:rPr>
+                <w:rFonts w:ascii="Arial" w:hAnsi="Arial" w:cs="Arial"/>
+              </w:rPr>
+            </w:pPr>
+            <w:r>
+              <w:rPr>
+                <w:rFonts w:ascii="Arial" w:hAnsi="Arial" w:cs="Arial"/>
+              </w:rPr>
+              <w:t>Notes</w:t>
+            </w:r>
+          </w:p>
+        </w:tc>
+      </w:tr>
+      <w:tr>
+        <w:trPr>
+          <w:cnfStyle w:val="000000100000" w:firstRow="0" w:lastRow="0" w:firstColumn="0" w:lastColumn="0" w:oddVBand="0" w:evenVBand="0" w:oddHBand="1" w:evenHBand="0" w:firstRowFirstColumn="0" w:firstRowLastColumn="0" w:lastRowFirstColumn="0" w:lastRowLastColumn="0"/>
+        </w:trPr>
+        <w:tc>
+          <w:tcPr>
+            <w:cnfStyle w:val="001000000000" w:firstRow="0" w:lastRow="0" w:firstColumn="1" w:lastColumn="0" w:oddVBand="0" w:evenVBand="0" w:oddHBand="0" w:evenHBand="0" w:firstRowFirstColumn="0" w:firstRowLastColumn="0" w:lastRowFirstColumn="0" w:lastRowLastColumn="0"/>
+            <w:tcW w:w="0" w:type="auto"/>
+            <w:hideMark/>
+          </w:tcPr>
+          <w:p>
+            <w:pPr>
+              <w:spacing w:after="160" w:line="360" w:lineRule="auto"/>
+              <w:rPr>
+                <w:rFonts w:ascii="Arial" w:hAnsi="Arial" w:cs="Arial"/>
+              </w:rPr>
+            </w:pPr>
+            <w:r>
+              <w:rPr>
+                <w:rFonts w:ascii="Arial" w:hAnsi="Arial" w:cs="Arial"/>
+              </w:rPr>
+              <w:t>Lenovo Legion Laptop</w:t>
+            </w:r>
+          </w:p>
+        </w:tc>
+        <w:tc>
+          <w:tcPr>
+            <w:tcW w:w="0" w:type="auto"/>
+            <w:hideMark/>
+          </w:tcPr>
+          <w:p>
+            <w:pPr>
+              <w:spacing w:after="160" w:line="360" w:lineRule="auto"/>
+              <w:cnfStyle w:val="000000100000" w:firstRow="0" w:lastRow="0" w:firstColumn="0" w:lastColumn="0" w:oddVBand="0" w:evenVBand="0" w:oddHBand="1" w:evenHBand="0" w:firstRowFirstColumn="0" w:firstRowLastColumn="0" w:lastRowFirstColumn="0" w:lastRowLastColumn="0"/>
+              <w:rPr>
+                <w:rFonts w:ascii="Arial" w:hAnsi="Arial" w:cs="Arial"/>
+              </w:rPr>
+            </w:pPr>
+            <w:r>
+              <w:rPr>
+                <w:rFonts w:ascii="Arial" w:hAnsi="Arial" w:cs="Arial"/>
+              </w:rPr>
+              <w:t>Asset</w:t>
+            </w:r>
+          </w:p>
+        </w:tc>
+        <w:tc>
+          <w:tcPr>
+            <w:tcW w:w="0" w:type="auto"/>
+            <w:hideMark/>
+          </w:tcPr>
+          <w:p>
+            <w:pPr>
+              <w:spacing w:after="160" w:line="360" w:lineRule="auto"/>
+              <w:cnfStyle w:val="000000100000" w:firstRow="0" w:lastRow="0" w:firstColumn="0" w:lastColumn="0" w:oddVBand="0" w:evenVBand="0" w:oddHBand="1" w:evenHBand="0" w:firstRowFirstColumn="0" w:firstRowLastColumn="0" w:lastRowFirstColumn="0" w:lastRowLastColumn="0"/>
+              <w:rPr>
+                <w:rFonts w:ascii="Arial" w:hAnsi="Arial" w:cs="Arial"/>
+              </w:rPr>
+            </w:pPr>
+            <w:r>
+              <w:rPr>
+                <w:rFonts w:ascii="Arial" w:hAnsi="Arial" w:cs="Arial"/>
+              </w:rPr>
+              <w:t>4,500.00</w:t>
+            </w:r>
+          </w:p>
+        </w:tc>
+        <w:tc>
+          <w:tcPr>
+            <w:tcW w:w="0" w:type="auto"/>
+            <w:hideMark/>
+          </w:tcPr>
+          <w:p>
+            <w:pPr>
+              <w:spacing w:after="160" w:line="360" w:lineRule="auto"/>
+              <w:cnfStyle w:val="000000100000" w:firstRow="0" w:lastRow="0" w:firstColumn="0" w:lastColumn="0" w:oddVBand="0" w:evenVBand="0" w:oddHBand="1" w:evenHBand="0" w:firstRowFirstColumn="0" w:firstRowLastColumn="0" w:lastRowFirstColumn="0" w:lastRowLastColumn="0"/>
+              <w:rPr>
+                <w:rFonts w:ascii="Arial" w:hAnsi="Arial" w:cs="Arial"/>
+              </w:rPr>
+            </w:pPr>
+            <w:r>
+              <w:rPr>
+                <w:rFonts w:ascii="Arial" w:hAnsi="Arial" w:cs="Arial"/>
+              </w:rPr>
+              <w:t>Developer Environment</w:t>
+            </w:r>
+          </w:p>
+        </w:tc>
+      </w:tr>
+      <w:tr>
+        <w:tc>
+          <w:tcPr>
+            <w:cnfStyle w:val="001000000000" w:firstRow="0" w:lastRow="0" w:firstColumn="1" w:lastColumn="0" w:oddVBand="0" w:evenVBand="0" w:oddHBand="0" w:evenHBand="0" w:firstRowFirstColumn="0" w:firstRowLastColumn="0" w:lastRowFirstColumn="0" w:lastRowLastColumn="0"/>
+            <w:tcW w:w="0" w:type="auto"/>
+            <w:hideMark/>
+          </w:tcPr>
+          <w:p>
+            <w:pPr>
+              <w:spacing w:after="160" w:line="360" w:lineRule="auto"/>
+              <w:rPr>
+                <w:rFonts w:ascii="Arial" w:hAnsi="Arial" w:cs="Arial"/>
+              </w:rPr>
+            </w:pPr>
+            <w:r>
+              <w:rPr>
+                <w:rFonts w:ascii="Arial" w:hAnsi="Arial" w:cs="Arial"/>
+              </w:rPr>
+              <w:lastRenderedPageBreak/>
+              <w:t>Android Test Device</w:t>
+            </w:r>
+          </w:p>
+        </w:tc>
+        <w:tc>
+          <w:tcPr>
+            <w:tcW w:w="0" w:type="auto"/>
+            <w:hideMark/>
+          </w:tcPr>
+          <w:p>
+            <w:pPr>
+              <w:spacing w:after="160" w:line="360" w:lineRule="auto"/>
+              <w:cnfStyle w:val="000000000000" w:firstRow="0" w:lastRow="0" w:firstColumn="0" w:lastColumn="0" w:oddVBand="0" w:evenVBand="0" w:oddHBand="0" w:evenHBand="0" w:firstRowFirstColumn="0" w:firstRowLastColumn="0" w:lastRowFirstColumn="0" w:lastRowLastColumn="0"/>
+              <w:rPr>
+                <w:rFonts w:ascii="Arial" w:hAnsi="Arial" w:cs="Arial"/>
+              </w:rPr>
+            </w:pPr>
+            <w:r>
+              <w:rPr>
+                <w:rFonts w:ascii="Arial" w:hAnsi="Arial" w:cs="Arial"/>
+              </w:rPr>
+              <w:t>Asset</w:t>
+            </w:r>
+          </w:p>
+        </w:tc>
+        <w:tc>
+          <w:tcPr>
+            <w:tcW w:w="0" w:type="auto"/>
+            <w:hideMark/>
+          </w:tcPr>
+          <w:p>
+            <w:pPr>
+              <w:spacing w:after="160" w:line="360" w:lineRule="auto"/>
+              <w:cnfStyle w:val="000000000000" w:firstRow="0" w:lastRow="0" w:firstColumn="0" w:lastColumn="0" w:oddVBand="0" w:evenVBand="0" w:oddHBand="0" w:evenHBand="0" w:firstRowFirstColumn="0" w:firstRowLastColumn="0" w:lastRowFirstColumn="0" w:lastRowLastColumn="0"/>
+              <w:rPr>
+                <w:rFonts w:ascii="Arial" w:hAnsi="Arial" w:cs="Arial"/>
+              </w:rPr>
+            </w:pPr>
+            <w:r>
+              <w:rPr>
+                <w:rFonts w:ascii="Arial" w:hAnsi="Arial" w:cs="Arial"/>
+              </w:rPr>
+              <w:t>800.00</w:t>
+            </w:r>
+          </w:p>
+        </w:tc>
+        <w:tc>
+          <w:tcPr>
+            <w:tcW w:w="0" w:type="auto"/>
+            <w:hideMark/>
+          </w:tcPr>
+          <w:p>
+            <w:pPr>
+              <w:spacing w:after="160" w:line="360" w:lineRule="auto"/>
+              <w:cnfStyle w:val="000000000000" w:firstRow="0" w:lastRow="0" w:firstColumn="0" w:lastColumn="0" w:oddVBand="0" w:evenVBand="0" w:oddHBand="0" w:evenHBand="0" w:firstRowFirstColumn="0" w:firstRowLastColumn="0" w:lastRowFirstColumn="0" w:lastRowLastColumn="0"/>
+              <w:rPr>
+                <w:rFonts w:ascii="Arial" w:hAnsi="Arial" w:cs="Arial"/>
+              </w:rPr>
+            </w:pPr>
+            <w:r>
+              <w:rPr>
+                <w:rFonts w:ascii="Arial" w:hAnsi="Arial" w:cs="Arial"/>
+              </w:rPr>
+              <w:t>Physical Testing Unit</w:t>
+            </w:r>
+          </w:p>
+        </w:tc>
+      </w:tr>
+      <w:tr>
+        <w:trPr>
+          <w:cnfStyle w:val="000000100000" w:firstRow="0" w:lastRow="0" w:firstColumn="0" w:lastColumn="0" w:oddVBand="0" w:evenVBand="0" w:oddHBand="1" w:evenHBand="0" w:firstRowFirstColumn="0" w:firstRowLastColumn="0" w:lastRowFirstColumn="0" w:lastRowLastColumn="0"/>
+        </w:trPr>
+        <w:tc>
+          <w:tcPr>
+            <w:cnfStyle w:val="001000000000" w:firstRow="0" w:lastRow="0" w:firstColumn="1" w:lastColumn="0" w:oddVBand="0" w:evenVBand="0" w:oddHBand="0" w:evenHBand="0" w:firstRowFirstColumn="0" w:firstRowLastColumn="0" w:lastRowFirstColumn="0" w:lastRowLastColumn="0"/>
+            <w:tcW w:w="0" w:type="auto"/>
+            <w:hideMark/>
+          </w:tcPr>
+          <w:p>
+            <w:pPr>
+              <w:spacing w:after="160" w:line="360" w:lineRule="auto"/>
+              <w:rPr>
+                <w:rFonts w:ascii="Arial" w:hAnsi="Arial" w:cs="Arial"/>
+              </w:rPr>
+            </w:pPr>
+            <w:r>
+              <w:rPr>
+                <w:rFonts w:ascii="Arial" w:hAnsi="Arial" w:cs="Arial"/>
+              </w:rPr>
+              <w:t>Raspberry Pi 5</w:t>
+            </w:r>
+          </w:p>
+        </w:tc>
+        <w:tc>
+          <w:tcPr>
+            <w:tcW w:w="0" w:type="auto"/>
+            <w:hideMark/>
+          </w:tcPr>
+          <w:p>
+            <w:pPr>
+              <w:spacing w:after="160" w:line="360" w:lineRule="auto"/>
+              <w:cnfStyle w:val="000000100000" w:firstRow="0" w:lastRow="0" w:firstColumn="0" w:lastColumn="0" w:oddVBand="0" w:evenVBand="0" w:oddHBand="1" w:evenHBand="0" w:firstRowFirstColumn="0" w:firstRowLastColumn="0" w:lastRowFirstColumn="0" w:lastRowLastColumn="0"/>
+              <w:rPr>
+                <w:rFonts w:ascii="Arial" w:hAnsi="Arial" w:cs="Arial"/>
+              </w:rPr>
+            </w:pPr>
+            <w:r>
+              <w:rPr>
+                <w:rFonts w:ascii="Arial" w:hAnsi="Arial" w:cs="Arial"/>
+              </w:rPr>
+              <w:t>Asset</w:t>
+            </w:r>
+          </w:p>
+        </w:tc>
+        <w:tc>
+          <w:tcPr>
+            <w:tcW w:w="0" w:type="auto"/>
+            <w:hideMark/>
+          </w:tcPr>
+          <w:p>
+            <w:pPr>
+              <w:spacing w:after="160" w:line="360" w:lineRule="auto"/>
+              <w:cnfStyle w:val="000000100000" w:firstRow="0" w:lastRow="0" w:firstColumn="0" w:lastColumn="0" w:oddVBand="0" w:evenVBand="0" w:oddHBand="1" w:evenHBand="0" w:firstRowFirstColumn="0" w:firstRowLastColumn="0" w:lastRowFirstColumn="0" w:lastRowLastColumn="0"/>
+              <w:rPr>
+                <w:rFonts w:ascii="Arial" w:hAnsi="Arial" w:cs="Arial"/>
+              </w:rPr>
+            </w:pPr>
+            <w:r>
+              <w:rPr>
+                <w:rFonts w:ascii="Arial" w:hAnsi="Arial" w:cs="Arial"/>
+              </w:rPr>
+              <w:t>400.00</w:t>
+            </w:r>
+          </w:p>
+        </w:tc>
+        <w:tc>
+          <w:tcPr>
+            <w:tcW w:w="0" w:type="auto"/>
+            <w:hideMark/>
+          </w:tcPr>
+          <w:p>
+            <w:pPr>
+              <w:spacing w:after="160" w:line="360" w:lineRule="auto"/>
+              <w:cnfStyle w:val="000000100000" w:firstRow="0" w:lastRow="0" w:firstColumn="0" w:lastColumn="0" w:oddVBand="0" w:evenVBand="0" w:oddHBand="1" w:evenHBand="0" w:firstRowFirstColumn="0" w:firstRowLastColumn="0" w:lastRowFirstColumn="0" w:lastRowLastColumn="0"/>
+              <w:rPr>
+                <w:rFonts w:ascii="Arial" w:hAnsi="Arial" w:cs="Arial"/>
+              </w:rPr>
+            </w:pPr>
+            <w:r>
+              <w:rPr>
+                <w:rFonts w:ascii="Arial" w:hAnsi="Arial" w:cs="Arial"/>
+              </w:rPr>
+              <w:t>Primary Server Node</w:t>
+            </w:r>
+          </w:p>
+        </w:tc>
+      </w:tr>
+      <w:tr>
+        <w:tc>
+          <w:tcPr>
+            <w:cnfStyle w:val="001000000000" w:firstRow="0" w:lastRow="0" w:firstColumn="1" w:lastColumn="0" w:oddVBand="0" w:evenVBand="0" w:oddHBand="0" w:evenHBand="0" w:firstRowFirstColumn="0" w:firstRowLastColumn="0" w:lastRowFirstColumn="0" w:lastRowLastColumn="0"/>
+            <w:tcW w:w="0" w:type="auto"/>
+            <w:hideMark/>
+          </w:tcPr>
+          <w:p>
+            <w:pPr>
+              <w:spacing w:after="160" w:line="360" w:lineRule="auto"/>
+              <w:rPr>
+                <w:rFonts w:ascii="Arial" w:hAnsi="Arial" w:cs="Arial"/>
+              </w:rPr>
+            </w:pPr>
+            <w:r>
+              <w:rPr>
+                <w:rFonts w:ascii="Arial" w:hAnsi="Arial" w:cs="Arial"/>
+              </w:rPr>
+              <w:t>Domain Name</w:t>
+            </w:r>
+          </w:p>
+        </w:tc>
+        <w:tc>
+          <w:tcPr>
+            <w:tcW w:w="0" w:type="auto"/>
+            <w:hideMark/>
+          </w:tcPr>
+          <w:p>
+            <w:pPr>
+              <w:spacing w:after="160" w:line="360" w:lineRule="auto"/>
+              <w:cnfStyle w:val="000000000000" w:firstRow="0" w:lastRow="0" w:firstColumn="0" w:lastColumn="0" w:oddVBand="0" w:evenVBand="0" w:oddHBand="0" w:evenHBand="0" w:firstRowFirstColumn="0" w:firstRowLastColumn="0" w:lastRowFirstColumn="0" w:lastRowLastColumn="0"/>
+              <w:rPr>
+                <w:rFonts w:ascii="Arial" w:hAnsi="Arial" w:cs="Arial"/>
+              </w:rPr>
+            </w:pPr>
+            <w:r>
+              <w:rPr>
+                <w:rFonts w:ascii="Arial" w:hAnsi="Arial" w:cs="Arial"/>
+              </w:rPr>
+              <w:t>Expenditure</w:t>
+            </w:r>
+          </w:p>
+        </w:tc>
+        <w:tc>
+          <w:tcPr>
+            <w:tcW w:w="0" w:type="auto"/>
+            <w:hideMark/>
+          </w:tcPr>
+          <w:p>
+            <w:pPr>
+              <w:spacing w:after="160" w:line="360" w:lineRule="auto"/>
+              <w:cnfStyle w:val="000000000000" w:firstRow="0" w:lastRow="0" w:firstColumn="0" w:lastColumn="0" w:oddVBand="0" w:evenVBand="0" w:oddHBand="0" w:evenHBand="0" w:firstRowFirstColumn="0" w:firstRowLastColumn="0" w:lastRowFirstColumn="0" w:lastRowLastColumn="0"/>
+              <w:rPr>
+                <w:rFonts w:ascii="Arial" w:hAnsi="Arial" w:cs="Arial"/>
+              </w:rPr>
+            </w:pPr>
+            <w:r>
+              <w:rPr>
+                <w:rFonts w:ascii="Arial" w:hAnsi="Arial" w:cs="Arial"/>
+              </w:rPr>
+              <w:t>80.00</w:t>
+            </w:r>
+          </w:p>
+        </w:tc>
+        <w:tc>
+          <w:tcPr>
+            <w:tcW w:w="0" w:type="auto"/>
+            <w:hideMark/>
+          </w:tcPr>
+          <w:p>
+            <w:pPr>
+              <w:spacing w:after="160" w:line="360" w:lineRule="auto"/>
+              <w:cnfStyle w:val="000000000000" w:firstRow="0" w:lastRow="0" w:firstColumn="0" w:lastColumn="0" w:oddVBand="0" w:evenVBand="0" w:oddHBand="0" w:evenHBand="0" w:firstRowFirstColumn="0" w:firstRowLastColumn="0" w:lastRowFirstColumn="0" w:lastRowLastColumn="0"/>
+              <w:rPr>
+                <w:rFonts w:ascii="Arial" w:hAnsi="Arial" w:cs="Arial"/>
+              </w:rPr>
+            </w:pPr>
+            <w:r>
+              <w:rPr>
+                <w:rFonts w:ascii="Arial" w:hAnsi="Arial" w:cs="Arial"/>
+              </w:rPr>
+              <w:t>1 Year Registration</w:t>
+            </w:r>
+          </w:p>
+        </w:tc>
+      </w:tr>
+      <w:tr>
+        <w:trPr>
+          <w:cnfStyle w:val="000000100000" w:firstRow="0" w:lastRow="0" w:firstColumn="0" w:lastColumn="0" w:oddVBand="0" w:evenVBand="0" w:oddHBand="1" w:evenHBand="0" w:firstRowFirstColumn="0" w:firstRowLastColumn="0" w:lastRowFirstColumn="0" w:lastRowLastColumn="0"/>
+        </w:trPr>
+        <w:tc>
+          <w:tcPr>
+            <w:cnfStyle w:val="001000000000" w:firstRow="0" w:lastRow="0" w:firstColumn="1" w:lastColumn="0" w:oddVBand="0" w:evenVBand="0" w:oddHBand="0" w:evenHBand="0" w:firstRowFirstColumn="0" w:firstRowLastColumn="0" w:lastRowFirstColumn="0" w:lastRowLastColumn="0"/>
+            <w:tcW w:w="0" w:type="auto"/>
+            <w:hideMark/>
+          </w:tcPr>
+          <w:p>
+            <w:pPr>
+              <w:spacing w:after="160" w:line="360" w:lineRule="auto"/>
+              <w:rPr>
+                <w:rFonts w:ascii="Arial" w:hAnsi="Arial" w:cs="Arial"/>
+              </w:rPr>
+            </w:pPr>
+            <w:r>
+              <w:rPr>
+                <w:rFonts w:ascii="Arial" w:hAnsi="Arial" w:cs="Arial"/>
+              </w:rPr>
+              <w:t>SSL Certificate</w:t>
+            </w:r>
+          </w:p>
+        </w:tc>
+        <w:tc>
+          <w:tcPr>
+            <w:tcW w:w="0" w:type="auto"/>
+            <w:hideMark/>
+          </w:tcPr>
+          <w:p>
+            <w:pPr>
+              <w:spacing w:after="160" w:line="360" w:lineRule="auto"/>
+              <w:cnfStyle w:val="000000100000" w:firstRow="0" w:lastRow="0" w:firstColumn="0" w:lastColumn="0" w:oddVBand="0" w:evenVBand="0" w:oddHBand="1" w:evenHBand="0" w:firstRowFirstColumn="0" w:firstRowLastColumn="0" w:lastRowFirstColumn="0" w:lastRowLastColumn="0"/>
+              <w:rPr>
+                <w:rFonts w:ascii="Arial" w:hAnsi="Arial" w:cs="Arial"/>
+              </w:rPr>
+            </w:pPr>
+            <w:r>
+              <w:rPr>
+                <w:rFonts w:ascii="Arial" w:hAnsi="Arial" w:cs="Arial"/>
+              </w:rPr>
+              <w:t>-</w:t>
+            </w:r>
+          </w:p>
+        </w:tc>
+        <w:tc>
+          <w:tcPr>
+            <w:tcW w:w="0" w:type="auto"/>
+            <w:hideMark/>
+          </w:tcPr>
+          <w:p>
+            <w:pPr>
+              <w:spacing w:after="160" w:line="360" w:lineRule="auto"/>
+              <w:cnfStyle w:val="000000100000" w:firstRow="0" w:lastRow="0" w:firstColumn="0" w:lastColumn="0" w:oddVBand="0" w:evenVBand="0" w:oddHBand="1" w:evenHBand="0" w:firstRowFirstColumn="0" w:firstRowLastColumn="0" w:lastRowFirstColumn="0" w:lastRowLastColumn="0"/>
+              <w:rPr>
+                <w:rFonts w:ascii="Arial" w:hAnsi="Arial" w:cs="Arial"/>
+              </w:rPr>
+            </w:pPr>
+            <w:r>
+              <w:rPr>
+                <w:rFonts w:ascii="Arial" w:hAnsi="Arial" w:cs="Arial"/>
+              </w:rPr>
+              <w:t>0.00</w:t>
+            </w:r>
+          </w:p>
+        </w:tc>
+        <w:tc>
+          <w:tcPr>
+            <w:tcW w:w="0" w:type="auto"/>
+            <w:hideMark/>
+          </w:tcPr>
+          <w:p>
+            <w:pPr>
+              <w:spacing w:after="160" w:line="360" w:lineRule="auto"/>
+              <w:cnfStyle w:val="000000100000" w:firstRow="0" w:lastRow="0" w:firstColumn="0" w:lastColumn="0" w:oddVBand="0" w:evenVBand="0" w:oddHBand="1" w:evenHBand="0" w:firstRowFirstColumn="0" w:firstRowLastColumn="0" w:lastRowFirstColumn="0" w:lastRowLastColumn="0"/>
+              <w:rPr>
+                <w:rFonts w:ascii="Arial" w:hAnsi="Arial" w:cs="Arial"/>
+              </w:rPr>
+            </w:pPr>
+            <w:r>
+              <w:rPr>
+                <w:rFonts w:ascii="Arial" w:hAnsi="Arial" w:cs="Arial"/>
+              </w:rPr>
+              <w:t>Included via Cloudflare Edge Cert</w:t>
+            </w:r>
+          </w:p>
+        </w:tc>
+      </w:tr>
+      <w:tr>
+        <w:tc>
+          <w:tcPr>
+            <w:cnfStyle w:val="001000000000" w:firstRow="0" w:lastRow="0" w:firstColumn="1" w:lastColumn="0" w:oddVBand="0" w:evenVBand="0" w:oddHBand="0" w:evenHBand="0" w:firstRowFirstColumn="0" w:firstRowLastColumn="0" w:lastRowFirstColumn="0" w:lastRowLastColumn="0"/>
+            <w:tcW w:w="0" w:type="auto"/>
+            <w:hideMark/>
+          </w:tcPr>
+          <w:p>
+            <w:pPr>
+              <w:spacing w:after="160" w:line="360" w:lineRule="auto"/>
+              <w:rPr>
+                <w:rFonts w:ascii="Arial" w:hAnsi="Arial" w:cs="Arial"/>
+              </w:rPr>
+            </w:pPr>
+            <w:r>
+              <w:rPr>
+                <w:rFonts w:ascii="Arial" w:hAnsi="Arial" w:cs="Arial"/>
+              </w:rPr>
+              <w:t>Cloudflare Tunnel</w:t>
+            </w:r>
+          </w:p>
+        </w:tc>
+        <w:tc>
+          <w:tcPr>
+            <w:tcW w:w="0" w:type="auto"/>
+            <w:hideMark/>
+          </w:tcPr>
+          <w:p>
+            <w:pPr>
+              <w:spacing w:after="160" w:line="360" w:lineRule="auto"/>
+              <w:cnfStyle w:val="000000000000" w:firstRow="0" w:lastRow="0" w:firstColumn="0" w:lastColumn="0" w:oddVBand="0" w:evenVBand="0" w:oddHBand="0" w:evenHBand="0" w:firstRowFirstColumn="0" w:firstRowLastColumn="0" w:lastRowFirstColumn="0" w:lastRowLastColumn="0"/>
+              <w:rPr>
+                <w:rFonts w:ascii="Arial" w:hAnsi="Arial" w:cs="Arial"/>
+              </w:rPr>
+            </w:pPr>
+            <w:r>
+              <w:rPr>
+                <w:rFonts w:ascii="Arial" w:hAnsi="Arial" w:cs="Arial"/>
+              </w:rPr>
+              <w:t>-</w:t>
+            </w:r>
+          </w:p>
+        </w:tc>
+        <w:tc>
+          <w:tcPr>
+            <w:tcW w:w="0" w:type="auto"/>
+            <w:hideMark/>
+          </w:tcPr>
+          <w:p>
+            <w:pPr>
+              <w:spacing w:after="160" w:line="360" w:lineRule="auto"/>
+              <w:cnfStyle w:val="000000000000" w:firstRow="0" w:lastRow="0" w:firstColumn="0" w:lastColumn="0" w:oddVBand="0" w:evenVBand="0" w:oddHBand="0" w:evenHBand="0" w:firstRowFirstColumn="0" w:firstRowLastColumn="0" w:lastRowFirstColumn="0" w:lastRowLastColumn="0"/>
+              <w:rPr>
+                <w:rFonts w:ascii="Arial" w:hAnsi="Arial" w:cs="Arial"/>
+              </w:rPr>
+            </w:pPr>
+            <w:r>
+              <w:rPr>
+                <w:rFonts w:ascii="Arial" w:hAnsi="Arial" w:cs="Arial"/>
+              </w:rPr>
+              <w:t>0.00</w:t>
+            </w:r>
+          </w:p>
+        </w:tc>
+        <w:tc>
+          <w:tcPr>
+            <w:tcW w:w="0" w:type="auto"/>
+            <w:hideMark/>
+          </w:tcPr>
+          <w:p>
+            <w:pPr>
+              <w:spacing w:after="160" w:line="360" w:lineRule="auto"/>
+              <w:cnfStyle w:val="000000000000" w:firstRow="0" w:lastRow="0" w:firstColumn="0" w:lastColumn="0" w:oddVBand="0" w:evenVBand="0" w:oddHBand="0" w:evenHBand="0" w:firstRowFirstColumn="0" w:firstRowLastColumn="0" w:lastRowFirstColumn="0" w:lastRowLastColumn="0"/>
+              <w:rPr>
+                <w:rFonts w:ascii="Arial" w:hAnsi="Arial" w:cs="Arial"/>
+              </w:rPr>
+            </w:pPr>
+            <w:r>
+              <w:rPr>
+                <w:rFonts w:ascii="Arial" w:hAnsi="Arial" w:cs="Arial"/>
+              </w:rPr>
+              <w:t xml:space="preserve">Free Tier (Zero Trust) </w:t>
+            </w:r>
+          </w:p>
+        </w:tc>
+      </w:tr>
+      <w:tr>
+        <w:trPr>
+          <w:cnfStyle w:val="000000100000" w:firstRow="0" w:lastRow="0" w:firstColumn="0" w:lastColumn="0" w:oddVBand="0" w:evenVBand="0" w:oddHBand="1" w:evenHBand="0" w:firstRowFirstColumn="0" w:firstRowLastColumn="0" w:lastRowFirstColumn="0" w:lastRowLastColumn="0"/>
+        </w:trPr>
+        <w:tc>
+          <w:tcPr>
+            <w:cnfStyle w:val="001000000000" w:firstRow="0" w:lastRow="0" w:firstColumn="1" w:lastColumn="0" w:oddVBand="0" w:evenVBand="0" w:oddHBand="0" w:evenHBand="0" w:firstRowFirstColumn="0" w:firstRowLastColumn="0" w:lastRowFirstColumn="0" w:lastRowLastColumn="0"/>
+            <w:tcW w:w="0" w:type="auto"/>
+            <w:hideMark/>
+          </w:tcPr>
+          <w:p>
+            <w:pPr>
+              <w:spacing w:after="160" w:line="360" w:lineRule="auto"/>
+              <w:rPr>
+                <w:rFonts w:ascii="Arial" w:hAnsi="Arial" w:cs="Arial"/>
+              </w:rPr>
+            </w:pPr>
+            <w:r>
+              <w:rPr>
+                <w:rFonts w:ascii="Arial" w:hAnsi="Arial" w:cs="Arial"/>
+              </w:rPr>
+              <w:t>Firebase</w:t>
+            </w:r>
+          </w:p>
+        </w:tc>
+        <w:tc>
+          <w:tcPr>
+            <w:tcW w:w="0" w:type="auto"/>
+            <w:hideMark/>
+          </w:tcPr>
+          <w:p>
+            <w:pPr>
+              <w:spacing w:after="160" w:line="360" w:lineRule="auto"/>
+              <w:cnfStyle w:val="000000100000" w:firstRow="0" w:lastRow="0" w:firstColumn="0" w:lastColumn="0" w:oddVBand="0" w:evenVBand="0" w:oddHBand="1" w:evenHBand="0" w:firstRowFirstColumn="0" w:firstRowLastColumn="0" w:lastRowFirstColumn="0" w:lastRowLastColumn="0"/>
+              <w:rPr>
+                <w:rFonts w:ascii="Arial" w:hAnsi="Arial" w:cs="Arial"/>
+              </w:rPr>
+            </w:pPr>
+            <w:r>
+              <w:rPr>
+                <w:rFonts w:ascii="Arial" w:hAnsi="Arial" w:cs="Arial"/>
+              </w:rPr>
+              <w:t>-</w:t>
+            </w:r>
+          </w:p>
+        </w:tc>
+        <w:tc>
+          <w:tcPr>
+            <w:tcW w:w="0" w:type="auto"/>
+            <w:hideMark/>
+          </w:tcPr>
+          <w:p>
+            <w:pPr>
+              <w:spacing w:after="160" w:line="360" w:lineRule="auto"/>
+              <w:cnfStyle w:val="000000100000" w:firstRow="0" w:lastRow="0" w:firstColumn="0" w:lastColumn="0" w:oddVBand="0" w:evenVBand="0" w:oddHBand="1" w:evenHBand="0" w:firstRowFirstColumn="0" w:firstRowLastColumn="0" w:lastRowFirstColumn="0" w:lastRowLastColumn="0"/>
+              <w:rPr>
+                <w:rFonts w:ascii="Arial" w:hAnsi="Arial" w:cs="Arial"/>
+              </w:rPr>
+            </w:pPr>
+            <w:r>
+              <w:rPr>
+                <w:rFonts w:ascii="Arial" w:hAnsi="Arial" w:cs="Arial"/>
+              </w:rPr>
+              <w:t>0.00</w:t>
+            </w:r>
+          </w:p>
+        </w:tc>
+        <w:tc>
+          <w:tcPr>
+            <w:tcW w:w="0" w:type="auto"/>
+            <w:hideMark/>
+          </w:tcPr>
+          <w:p>
+            <w:pPr>
+              <w:spacing w:after="160" w:line="360" w:lineRule="auto"/>
+              <w:cnfStyle w:val="000000100000" w:firstRow="0" w:lastRow="0" w:firstColumn="0" w:lastColumn="0" w:oddVBand="0" w:evenVBand="0" w:oddHBand="1" w:evenHBand="0" w:firstRowFirstColumn="0" w:firstRowLastColumn="0" w:lastRowFirstColumn="0" w:lastRowLastColumn="0"/>
+              <w:rPr>
+                <w:rFonts w:ascii="Arial" w:hAnsi="Arial" w:cs="Arial"/>
+              </w:rPr>
+            </w:pPr>
+            <w:r>
+              <w:rPr>
+                <w:rFonts w:ascii="Arial" w:hAnsi="Arial" w:cs="Arial"/>
+              </w:rPr>
+              <w:t>Spark Plan (Free Tier)</w:t>
+            </w:r>
+          </w:p>
+        </w:tc>
+      </w:tr>
+      <w:tr>
+        <w:tc>
+          <w:tcPr>
+            <w:cnfStyle w:val="001000000000" w:firstRow="0" w:lastRow="0" w:firstColumn="1" w:lastColumn="0" w:oddVBand="0" w:evenVBand="0" w:oddHBand="0" w:evenHBand="0" w:firstRowFirstColumn="0" w:firstRowLastColumn="0" w:lastRowFirstColumn="0" w:lastRowLastColumn="0"/>
+            <w:tcW w:w="0" w:type="auto"/>
+            <w:hideMark/>
+          </w:tcPr>
+          <w:p>
+            <w:pPr>
+              <w:spacing w:after="160" w:line="360" w:lineRule="auto"/>
+              <w:rPr>
+                <w:rFonts w:ascii="Arial" w:hAnsi="Arial" w:cs="Arial"/>
+              </w:rPr>
+            </w:pPr>
+            <w:r>
+              <w:rPr>
+                <w:rFonts w:ascii="Arial" w:hAnsi="Arial" w:cs="Arial"/>
+              </w:rPr>
+              <w:t>Total Project Cost</w:t>
+            </w:r>
+          </w:p>
+        </w:tc>
+        <w:tc>
+          <w:tcPr>
+            <w:tcW w:w="0" w:type="auto"/>
+            <w:hideMark/>
+          </w:tcPr>
+          <w:p>
+            <w:pPr>
+              <w:spacing w:after="160" w:line="360" w:lineRule="auto"/>
+              <w:cnfStyle w:val="000000000000" w:firstRow="0" w:lastRow="0" w:firstColumn="0" w:lastColumn="0" w:oddVBand="0" w:evenVBand="0" w:oddHBand="0" w:evenHBand="0" w:firstRowFirstColumn="0" w:firstRowLastColumn="0" w:lastRowFirstColumn="0" w:lastRowLastColumn="0"/>
+              <w:rPr>
+                <w:rFonts w:ascii="Arial" w:hAnsi="Arial" w:cs="Arial"/>
+              </w:rPr>
+            </w:pPr>
+            <w:r>
+              <w:rPr>
+                <w:rFonts w:ascii="Arial" w:hAnsi="Arial" w:cs="Arial"/>
+                <w:b/>
+                <w:bCs/>
+              </w:rPr>
+              <w:t>(Cash Out)</w:t>
+            </w:r>
+          </w:p>
+        </w:tc>
+        <w:tc>
+          <w:tcPr>
+            <w:tcW w:w="0" w:type="auto"/>
+            <w:hideMark/>
+          </w:tcPr>
+          <w:p>
+            <w:pPr>
+              <w:spacing w:after="160" w:line="360" w:lineRule="auto"/>
+              <w:cnfStyle w:val="000000000000" w:firstRow="0" w:lastRow="0" w:firstColumn="0" w:lastColumn="0" w:oddVBand="0" w:evenVBand="0" w:oddHBand="0" w:evenHBand="0" w:firstRowFirstColumn="0" w:firstRowLastColumn="0" w:lastRowFirstColumn="0" w:lastRowLastColumn="0"/>
+              <w:rPr>
+                <w:rFonts w:ascii="Arial" w:hAnsi="Arial" w:cs="Arial"/>
+              </w:rPr>
+            </w:pPr>
+            <w:r>
+              <w:rPr>
+                <w:rFonts w:ascii="Arial" w:hAnsi="Arial" w:cs="Arial"/>
+                <w:b/>
+                <w:bCs/>
+              </w:rPr>
+              <w:t>RM 80.00</w:t>
+            </w:r>
+          </w:p>
+        </w:tc>
+        <w:tc>
+          <w:tcPr>
+            <w:tcW w:w="0" w:type="auto"/>
+            <w:hideMark/>
+          </w:tcPr>
+          <w:p>
+            <w:pPr>
+              <w:spacing w:after="160" w:line="360" w:lineRule="auto"/>
+              <w:cnfStyle w:val="000000000000" w:firstRow="0" w:lastRow="0" w:firstColumn="0" w:lastColumn="0" w:oddVBand="0" w:evenVBand="0" w:oddHBand="0" w:evenHBand="0" w:firstRowFirstColumn="0" w:firstRowLastColumn="0" w:lastRowFirstColumn="0" w:lastRowLastColumn="0"/>
+              <w:rPr>
+                <w:rFonts w:ascii="Arial" w:hAnsi="Arial" w:cs="Arial"/>
+              </w:rPr>
+            </w:pPr>
+            <w:r>
+              <w:rPr>
+                <w:rFonts w:ascii="Arial" w:hAnsi="Arial" w:cs="Arial"/>
+                <w:b/>
+                <w:bCs/>
+              </w:rPr>
+              <w:t>One-time expenditure</w:t>
+            </w:r>
+          </w:p>
+        </w:tc>
+      </w:tr>
+    </w:tbl>
+    <w:p>
+      <w:pPr>
+        <w:spacing w:line="360" w:lineRule="auto"/>
+        <w:rPr>
+          <w:rFonts w:ascii="Arial" w:hAnsi="Arial" w:cs="Arial"/>
+        </w:rPr>
+      </w:pPr>
     </w:p>
     <w:p>
       <w:pPr>
@@ -5861,6 +6872,304 @@
     </w:lvl>
   </w:abstractNum>
   <w:abstractNum w:abstractNumId="1" w15:restartNumberingAfterBreak="0">
+    <w:nsid w:val="03E33C5B"/>
+    <w:multiLevelType w:val="multilevel"/>
+    <w:tmpl w:val="57FE0F6C"/>
+    <w:lvl w:ilvl="0">
+      <w:start w:val="1"/>
+      <w:numFmt w:val="bullet"/>
+      <w:lvlText w:val=""/>
+      <w:lvlJc w:val="left"/>
+      <w:pPr>
+        <w:tabs>
+          <w:tab w:val="num" w:pos="720"/>
+        </w:tabs>
+        <w:ind w:left="720" w:hanging="360"/>
+      </w:pPr>
+      <w:rPr>
+        <w:rFonts w:ascii="Symbol" w:hAnsi="Symbol" w:hint="default"/>
+        <w:sz w:val="20"/>
+      </w:rPr>
+    </w:lvl>
+    <w:lvl w:ilvl="1">
+      <w:start w:val="1"/>
+      <w:numFmt w:val="bullet"/>
+      <w:lvlText w:val="o"/>
+      <w:lvlJc w:val="left"/>
+      <w:pPr>
+        <w:tabs>
+          <w:tab w:val="num" w:pos="1440"/>
+        </w:tabs>
+        <w:ind w:left="1440" w:hanging="360"/>
+      </w:pPr>
+      <w:rPr>
+        <w:rFonts w:ascii="Courier New" w:hAnsi="Courier New" w:hint="default"/>
+        <w:sz w:val="20"/>
+      </w:rPr>
+    </w:lvl>
+    <w:lvl w:ilvl="2" w:tentative="1">
+      <w:start w:val="1"/>
+      <w:numFmt w:val="bullet"/>
+      <w:lvlText w:val=""/>
+      <w:lvlJc w:val="left"/>
+      <w:pPr>
+        <w:tabs>
+          <w:tab w:val="num" w:pos="2160"/>
+        </w:tabs>
+        <w:ind w:left="2160" w:hanging="360"/>
+      </w:pPr>
+      <w:rPr>
+        <w:rFonts w:ascii="Wingdings" w:hAnsi="Wingdings" w:hint="default"/>
+        <w:sz w:val="20"/>
+      </w:rPr>
+    </w:lvl>
+    <w:lvl w:ilvl="3" w:tentative="1">
+      <w:start w:val="1"/>
+      <w:numFmt w:val="bullet"/>
+      <w:lvlText w:val=""/>
+      <w:lvlJc w:val="left"/>
+      <w:pPr>
+        <w:tabs>
+          <w:tab w:val="num" w:pos="2880"/>
+        </w:tabs>
+        <w:ind w:left="2880" w:hanging="360"/>
+      </w:pPr>
+      <w:rPr>
+        <w:rFonts w:ascii="Wingdings" w:hAnsi="Wingdings" w:hint="default"/>
+        <w:sz w:val="20"/>
+      </w:rPr>
+    </w:lvl>
+    <w:lvl w:ilvl="4" w:tentative="1">
+      <w:start w:val="1"/>
+      <w:numFmt w:val="bullet"/>
+      <w:lvlText w:val=""/>
+      <w:lvlJc w:val="left"/>
+      <w:pPr>
+        <w:tabs>
+          <w:tab w:val="num" w:pos="3600"/>
+        </w:tabs>
+        <w:ind w:left="3600" w:hanging="360"/>
+      </w:pPr>
+      <w:rPr>
+        <w:rFonts w:ascii="Wingdings" w:hAnsi="Wingdings" w:hint="default"/>
+        <w:sz w:val="20"/>
+      </w:rPr>
+    </w:lvl>
+    <w:lvl w:ilvl="5" w:tentative="1">
+      <w:start w:val="1"/>
+      <w:numFmt w:val="bullet"/>
+      <w:lvlText w:val=""/>
+      <w:lvlJc w:val="left"/>
+      <w:pPr>
+        <w:tabs>
+          <w:tab w:val="num" w:pos="4320"/>
+        </w:tabs>
+        <w:ind w:left="4320" w:hanging="360"/>
+      </w:pPr>
+      <w:rPr>
+        <w:rFonts w:ascii="Wingdings" w:hAnsi="Wingdings" w:hint="default"/>
+        <w:sz w:val="20"/>
+      </w:rPr>
+    </w:lvl>
+    <w:lvl w:ilvl="6" w:tentative="1">
+      <w:start w:val="1"/>
+      <w:numFmt w:val="bullet"/>
+      <w:lvlText w:val=""/>
+      <w:lvlJc w:val="left"/>
+      <w:pPr>
+        <w:tabs>
+          <w:tab w:val="num" w:pos="5040"/>
+        </w:tabs>
+        <w:ind w:left="5040" w:hanging="360"/>
+      </w:pPr>
+      <w:rPr>
+        <w:rFonts w:ascii="Wingdings" w:hAnsi="Wingdings" w:hint="default"/>
+        <w:sz w:val="20"/>
+      </w:rPr>
+    </w:lvl>
+    <w:lvl w:ilvl="7" w:tentative="1">
+      <w:start w:val="1"/>
+      <w:numFmt w:val="bullet"/>
+      <w:lvlText w:val=""/>
+      <w:lvlJc w:val="left"/>
+      <w:pPr>
+        <w:tabs>
+          <w:tab w:val="num" w:pos="5760"/>
+        </w:tabs>
+        <w:ind w:left="5760" w:hanging="360"/>
+      </w:pPr>
+      <w:rPr>
+        <w:rFonts w:ascii="Wingdings" w:hAnsi="Wingdings" w:hint="default"/>
+        <w:sz w:val="20"/>
+      </w:rPr>
+    </w:lvl>
+    <w:lvl w:ilvl="8" w:tentative="1">
+      <w:start w:val="1"/>
+      <w:numFmt w:val="bullet"/>
+      <w:lvlText w:val=""/>
+      <w:lvlJc w:val="left"/>
+      <w:pPr>
+        <w:tabs>
+          <w:tab w:val="num" w:pos="6480"/>
+        </w:tabs>
+        <w:ind w:left="6480" w:hanging="360"/>
+      </w:pPr>
+      <w:rPr>
+        <w:rFonts w:ascii="Wingdings" w:hAnsi="Wingdings" w:hint="default"/>
+        <w:sz w:val="20"/>
+      </w:rPr>
+    </w:lvl>
+  </w:abstractNum>
+  <w:abstractNum w:abstractNumId="2" w15:restartNumberingAfterBreak="0">
+    <w:nsid w:val="046B3ADA"/>
+    <w:multiLevelType w:val="multilevel"/>
+    <w:tmpl w:val="ECBECD7E"/>
+    <w:lvl w:ilvl="0">
+      <w:start w:val="1"/>
+      <w:numFmt w:val="bullet"/>
+      <w:lvlText w:val=""/>
+      <w:lvlJc w:val="left"/>
+      <w:pPr>
+        <w:tabs>
+          <w:tab w:val="num" w:pos="720"/>
+        </w:tabs>
+        <w:ind w:left="720" w:hanging="360"/>
+      </w:pPr>
+      <w:rPr>
+        <w:rFonts w:ascii="Symbol" w:hAnsi="Symbol" w:hint="default"/>
+        <w:sz w:val="20"/>
+      </w:rPr>
+    </w:lvl>
+    <w:lvl w:ilvl="1">
+      <w:start w:val="1"/>
+      <w:numFmt w:val="bullet"/>
+      <w:lvlText w:val="o"/>
+      <w:lvlJc w:val="left"/>
+      <w:pPr>
+        <w:tabs>
+          <w:tab w:val="num" w:pos="1440"/>
+        </w:tabs>
+        <w:ind w:left="1440" w:hanging="360"/>
+      </w:pPr>
+      <w:rPr>
+        <w:rFonts w:ascii="Courier New" w:hAnsi="Courier New" w:hint="default"/>
+        <w:sz w:val="20"/>
+      </w:rPr>
+    </w:lvl>
+    <w:lvl w:ilvl="2" w:tentative="1">
+      <w:start w:val="1"/>
+      <w:numFmt w:val="bullet"/>
+      <w:lvlText w:val=""/>
+      <w:lvlJc w:val="left"/>
+      <w:pPr>
+        <w:tabs>
+          <w:tab w:val="num" w:pos="2160"/>
+        </w:tabs>
+        <w:ind w:left="2160" w:hanging="360"/>
+      </w:pPr>
+      <w:rPr>
+        <w:rFonts w:ascii="Wingdings" w:hAnsi="Wingdings" w:hint="default"/>
+        <w:sz w:val="20"/>
+      </w:rPr>
+    </w:lvl>
+    <w:lvl w:ilvl="3" w:tentative="1">
+      <w:start w:val="1"/>
+      <w:numFmt w:val="bullet"/>
+      <w:lvlText w:val=""/>
+      <w:lvlJc w:val="left"/>
+      <w:pPr>
+        <w:tabs>
+          <w:tab w:val="num" w:pos="2880"/>
+        </w:tabs>
+        <w:ind w:left="2880" w:hanging="360"/>
+      </w:pPr>
+      <w:rPr>
+        <w:rFonts w:ascii="Wingdings" w:hAnsi="Wingdings" w:hint="default"/>
+        <w:sz w:val="20"/>
+      </w:rPr>
+    </w:lvl>
+    <w:lvl w:ilvl="4" w:tentative="1">
+      <w:start w:val="1"/>
+      <w:numFmt w:val="bullet"/>
+      <w:lvlText w:val=""/>
+      <w:lvlJc w:val="left"/>
+      <w:pPr>
+        <w:tabs>
+          <w:tab w:val="num" w:pos="3600"/>
+        </w:tabs>
+        <w:ind w:left="3600" w:hanging="360"/>
+      </w:pPr>
+      <w:rPr>
+        <w:rFonts w:ascii="Wingdings" w:hAnsi="Wingdings" w:hint="default"/>
+        <w:sz w:val="20"/>
+      </w:rPr>
+    </w:lvl>
+    <w:lvl w:ilvl="5" w:tentative="1">
+      <w:start w:val="1"/>
+      <w:numFmt w:val="bullet"/>
+      <w:lvlText w:val=""/>
+      <w:lvlJc w:val="left"/>
+      <w:pPr>
+        <w:tabs>
+          <w:tab w:val="num" w:pos="4320"/>
+        </w:tabs>
+        <w:ind w:left="4320" w:hanging="360"/>
+      </w:pPr>
+      <w:rPr>
+        <w:rFonts w:ascii="Wingdings" w:hAnsi="Wingdings" w:hint="default"/>
+        <w:sz w:val="20"/>
+      </w:rPr>
+    </w:lvl>
+    <w:lvl w:ilvl="6" w:tentative="1">
+      <w:start w:val="1"/>
+      <w:numFmt w:val="bullet"/>
+      <w:lvlText w:val=""/>
+      <w:lvlJc w:val="left"/>
+      <w:pPr>
+        <w:tabs>
+          <w:tab w:val="num" w:pos="5040"/>
+        </w:tabs>
+        <w:ind w:left="5040" w:hanging="360"/>
+      </w:pPr>
+      <w:rPr>
+        <w:rFonts w:ascii="Wingdings" w:hAnsi="Wingdings" w:hint="default"/>
+        <w:sz w:val="20"/>
+      </w:rPr>
+    </w:lvl>
+    <w:lvl w:ilvl="7" w:tentative="1">
+      <w:start w:val="1"/>
+      <w:numFmt w:val="bullet"/>
+      <w:lvlText w:val=""/>
+      <w:lvlJc w:val="left"/>
+      <w:pPr>
+        <w:tabs>
+          <w:tab w:val="num" w:pos="5760"/>
+        </w:tabs>
+        <w:ind w:left="5760" w:hanging="360"/>
+      </w:pPr>
+      <w:rPr>
+        <w:rFonts w:ascii="Wingdings" w:hAnsi="Wingdings" w:hint="default"/>
+        <w:sz w:val="20"/>
+      </w:rPr>
+    </w:lvl>
+    <w:lvl w:ilvl="8" w:tentative="1">
+      <w:start w:val="1"/>
+      <w:numFmt w:val="bullet"/>
+      <w:lvlText w:val=""/>
+      <w:lvlJc w:val="left"/>
+      <w:pPr>
+        <w:tabs>
+          <w:tab w:val="num" w:pos="6480"/>
+        </w:tabs>
+        <w:ind w:left="6480" w:hanging="360"/>
+      </w:pPr>
+      <w:rPr>
+        <w:rFonts w:ascii="Wingdings" w:hAnsi="Wingdings" w:hint="default"/>
+        <w:sz w:val="20"/>
+      </w:rPr>
+    </w:lvl>
+  </w:abstractNum>
+  <w:abstractNum w:abstractNumId="3" w15:restartNumberingAfterBreak="0">
     <w:nsid w:val="05CA453D"/>
     <w:multiLevelType w:val="multilevel"/>
     <w:tmpl w:val="1F52FEE8"/>
@@ -5973,7 +7282,7 @@
       </w:rPr>
     </w:lvl>
   </w:abstractNum>
-  <w:abstractNum w:abstractNumId="2" w15:restartNumberingAfterBreak="0">
+  <w:abstractNum w:abstractNumId="4" w15:restartNumberingAfterBreak="0">
     <w:nsid w:val="07561952"/>
     <w:multiLevelType w:val="multilevel"/>
     <w:tmpl w:val="1A6632FA"/>
@@ -6122,7 +7431,7 @@
       </w:rPr>
     </w:lvl>
   </w:abstractNum>
-  <w:abstractNum w:abstractNumId="3" w15:restartNumberingAfterBreak="0">
+  <w:abstractNum w:abstractNumId="5" w15:restartNumberingAfterBreak="0">
     <w:nsid w:val="078D4B9B"/>
     <w:multiLevelType w:val="multilevel"/>
     <w:tmpl w:val="56D0E850"/>
@@ -6271,7 +7580,7 @@
       </w:rPr>
     </w:lvl>
   </w:abstractNum>
-  <w:abstractNum w:abstractNumId="4" w15:restartNumberingAfterBreak="0">
+  <w:abstractNum w:abstractNumId="6" w15:restartNumberingAfterBreak="0">
     <w:nsid w:val="0B5155B6"/>
     <w:multiLevelType w:val="hybridMultilevel"/>
     <w:tmpl w:val="F552E1F6"/>
@@ -6361,7 +7670,7 @@
       </w:pPr>
     </w:lvl>
   </w:abstractNum>
-  <w:abstractNum w:abstractNumId="5" w15:restartNumberingAfterBreak="0">
+  <w:abstractNum w:abstractNumId="7" w15:restartNumberingAfterBreak="0">
     <w:nsid w:val="0FCD59BF"/>
     <w:multiLevelType w:val="hybridMultilevel"/>
     <w:tmpl w:val="0FD269C0"/>
@@ -6475,7 +7784,7 @@
       </w:rPr>
     </w:lvl>
   </w:abstractNum>
-  <w:abstractNum w:abstractNumId="6" w15:restartNumberingAfterBreak="0">
+  <w:abstractNum w:abstractNumId="8" w15:restartNumberingAfterBreak="0">
     <w:nsid w:val="1C7C0AE7"/>
     <w:multiLevelType w:val="multilevel"/>
     <w:tmpl w:val="FFB44B82"/>
@@ -6588,7 +7897,7 @@
       </w:pPr>
     </w:lvl>
   </w:abstractNum>
-  <w:abstractNum w:abstractNumId="7" w15:restartNumberingAfterBreak="0">
+  <w:abstractNum w:abstractNumId="9" w15:restartNumberingAfterBreak="0">
     <w:nsid w:val="1F6E6393"/>
     <w:multiLevelType w:val="multilevel"/>
     <w:tmpl w:val="6636B452"/>
@@ -6698,7 +8007,7 @@
       </w:rPr>
     </w:lvl>
   </w:abstractNum>
-  <w:abstractNum w:abstractNumId="8" w15:restartNumberingAfterBreak="0">
+  <w:abstractNum w:abstractNumId="10" w15:restartNumberingAfterBreak="0">
     <w:nsid w:val="25B36A92"/>
     <w:multiLevelType w:val="hybridMultilevel"/>
     <w:tmpl w:val="6EB0EE82"/>
@@ -6811,7 +8120,7 @@
       </w:rPr>
     </w:lvl>
   </w:abstractNum>
-  <w:abstractNum w:abstractNumId="9" w15:restartNumberingAfterBreak="0">
+  <w:abstractNum w:abstractNumId="11" w15:restartNumberingAfterBreak="0">
     <w:nsid w:val="262B7DBD"/>
     <w:multiLevelType w:val="hybridMultilevel"/>
     <w:tmpl w:val="CEC60150"/>
@@ -6924,7 +8233,156 @@
       </w:rPr>
     </w:lvl>
   </w:abstractNum>
-  <w:abstractNum w:abstractNumId="10" w15:restartNumberingAfterBreak="0">
+  <w:abstractNum w:abstractNumId="12" w15:restartNumberingAfterBreak="0">
+    <w:nsid w:val="27B46C10"/>
+    <w:multiLevelType w:val="multilevel"/>
+    <w:tmpl w:val="EBCC7DB0"/>
+    <w:lvl w:ilvl="0">
+      <w:start w:val="1"/>
+      <w:numFmt w:val="bullet"/>
+      <w:lvlText w:val=""/>
+      <w:lvlJc w:val="left"/>
+      <w:pPr>
+        <w:tabs>
+          <w:tab w:val="num" w:pos="720"/>
+        </w:tabs>
+        <w:ind w:left="720" w:hanging="360"/>
+      </w:pPr>
+      <w:rPr>
+        <w:rFonts w:ascii="Symbol" w:hAnsi="Symbol" w:hint="default"/>
+        <w:sz w:val="20"/>
+      </w:rPr>
+    </w:lvl>
+    <w:lvl w:ilvl="1" w:tentative="1">
+      <w:start w:val="1"/>
+      <w:numFmt w:val="bullet"/>
+      <w:lvlText w:val="o"/>
+      <w:lvlJc w:val="left"/>
+      <w:pPr>
+        <w:tabs>
+          <w:tab w:val="num" w:pos="1440"/>
+        </w:tabs>
+        <w:ind w:left="1440" w:hanging="360"/>
+      </w:pPr>
+      <w:rPr>
+        <w:rFonts w:ascii="Courier New" w:hAnsi="Courier New" w:hint="default"/>
+        <w:sz w:val="20"/>
+      </w:rPr>
+    </w:lvl>
+    <w:lvl w:ilvl="2" w:tentative="1">
+      <w:start w:val="1"/>
+      <w:numFmt w:val="bullet"/>
+      <w:lvlText w:val=""/>
+      <w:lvlJc w:val="left"/>
+      <w:pPr>
+        <w:tabs>
+          <w:tab w:val="num" w:pos="2160"/>
+        </w:tabs>
+        <w:ind w:left="2160" w:hanging="360"/>
+      </w:pPr>
+      <w:rPr>
+        <w:rFonts w:ascii="Wingdings" w:hAnsi="Wingdings" w:hint="default"/>
+        <w:sz w:val="20"/>
+      </w:rPr>
+    </w:lvl>
+    <w:lvl w:ilvl="3" w:tentative="1">
+      <w:start w:val="1"/>
+      <w:numFmt w:val="bullet"/>
+      <w:lvlText w:val=""/>
+      <w:lvlJc w:val="left"/>
+      <w:pPr>
+        <w:tabs>
+          <w:tab w:val="num" w:pos="2880"/>
+        </w:tabs>
+        <w:ind w:left="2880" w:hanging="360"/>
+      </w:pPr>
+      <w:rPr>
+        <w:rFonts w:ascii="Wingdings" w:hAnsi="Wingdings" w:hint="default"/>
+        <w:sz w:val="20"/>
+      </w:rPr>
+    </w:lvl>
+    <w:lvl w:ilvl="4" w:tentative="1">
+      <w:start w:val="1"/>
+      <w:numFmt w:val="bullet"/>
+      <w:lvlText w:val=""/>
+      <w:lvlJc w:val="left"/>
+      <w:pPr>
+        <w:tabs>
+          <w:tab w:val="num" w:pos="3600"/>
+        </w:tabs>
+        <w:ind w:left="3600" w:hanging="360"/>
+      </w:pPr>
+      <w:rPr>
+        <w:rFonts w:ascii="Wingdings" w:hAnsi="Wingdings" w:hint="default"/>
+        <w:sz w:val="20"/>
+      </w:rPr>
+    </w:lvl>
+    <w:lvl w:ilvl="5" w:tentative="1">
+      <w:start w:val="1"/>
+      <w:numFmt w:val="bullet"/>
+      <w:lvlText w:val=""/>
+      <w:lvlJc w:val="left"/>
+      <w:pPr>
+        <w:tabs>
+          <w:tab w:val="num" w:pos="4320"/>
+        </w:tabs>
+        <w:ind w:left="4320" w:hanging="360"/>
+      </w:pPr>
+      <w:rPr>
+        <w:rFonts w:ascii="Wingdings" w:hAnsi="Wingdings" w:hint="default"/>
+        <w:sz w:val="20"/>
+      </w:rPr>
+    </w:lvl>
+    <w:lvl w:ilvl="6" w:tentative="1">
+      <w:start w:val="1"/>
+      <w:numFmt w:val="bullet"/>
+      <w:lvlText w:val=""/>
+      <w:lvlJc w:val="left"/>
+      <w:pPr>
+        <w:tabs>
+          <w:tab w:val="num" w:pos="5040"/>
+        </w:tabs>
+        <w:ind w:left="5040" w:hanging="360"/>
+      </w:pPr>
+      <w:rPr>
+        <w:rFonts w:ascii="Wingdings" w:hAnsi="Wingdings" w:hint="default"/>
+        <w:sz w:val="20"/>
+      </w:rPr>
+    </w:lvl>
+    <w:lvl w:ilvl="7" w:tentative="1">
+      <w:start w:val="1"/>
+      <w:numFmt w:val="bullet"/>
+      <w:lvlText w:val=""/>
+      <w:lvlJc w:val="left"/>
+      <w:pPr>
+        <w:tabs>
+          <w:tab w:val="num" w:pos="5760"/>
+        </w:tabs>
+        <w:ind w:left="5760" w:hanging="360"/>
+      </w:pPr>
+      <w:rPr>
+        <w:rFonts w:ascii="Wingdings" w:hAnsi="Wingdings" w:hint="default"/>
+        <w:sz w:val="20"/>
+      </w:rPr>
+    </w:lvl>
+    <w:lvl w:ilvl="8" w:tentative="1">
+      <w:start w:val="1"/>
+      <w:numFmt w:val="bullet"/>
+      <w:lvlText w:val=""/>
+      <w:lvlJc w:val="left"/>
+      <w:pPr>
+        <w:tabs>
+          <w:tab w:val="num" w:pos="6480"/>
+        </w:tabs>
+        <w:ind w:left="6480" w:hanging="360"/>
+      </w:pPr>
+      <w:rPr>
+        <w:rFonts w:ascii="Wingdings" w:hAnsi="Wingdings" w:hint="default"/>
+        <w:sz w:val="20"/>
+      </w:rPr>
+    </w:lvl>
+  </w:abstractNum>
+  <w:abstractNum w:abstractNumId="13" w15:restartNumberingAfterBreak="0">
     <w:nsid w:val="299A4095"/>
     <w:multiLevelType w:val="multilevel"/>
     <w:tmpl w:val="ADF88108"/>
@@ -7073,7 +8531,7 @@
       </w:rPr>
     </w:lvl>
   </w:abstractNum>
-  <w:abstractNum w:abstractNumId="11" w15:restartNumberingAfterBreak="0">
+  <w:abstractNum w:abstractNumId="14" w15:restartNumberingAfterBreak="0">
     <w:nsid w:val="2B075B54"/>
     <w:multiLevelType w:val="multilevel"/>
     <w:tmpl w:val="E48A250E"/>
@@ -7222,7 +8680,7 @@
       </w:rPr>
     </w:lvl>
   </w:abstractNum>
-  <w:abstractNum w:abstractNumId="12" w15:restartNumberingAfterBreak="0">
+  <w:abstractNum w:abstractNumId="15" w15:restartNumberingAfterBreak="0">
     <w:nsid w:val="33335930"/>
     <w:multiLevelType w:val="multilevel"/>
     <w:tmpl w:val="BC90753A"/>
@@ -7371,7 +8829,7 @@
       </w:rPr>
     </w:lvl>
   </w:abstractNum>
-  <w:abstractNum w:abstractNumId="13" w15:restartNumberingAfterBreak="0">
+  <w:abstractNum w:abstractNumId="16" w15:restartNumberingAfterBreak="0">
     <w:nsid w:val="3B6A185A"/>
     <w:multiLevelType w:val="multilevel"/>
     <w:tmpl w:val="D5129832"/>
@@ -7520,7 +8978,7 @@
       </w:rPr>
     </w:lvl>
   </w:abstractNum>
-  <w:abstractNum w:abstractNumId="14" w15:restartNumberingAfterBreak="0">
+  <w:abstractNum w:abstractNumId="17" w15:restartNumberingAfterBreak="0">
     <w:nsid w:val="3B7544F7"/>
     <w:multiLevelType w:val="multilevel"/>
     <w:tmpl w:val="190AD7D0"/>
@@ -7669,7 +9127,7 @@
       </w:rPr>
     </w:lvl>
   </w:abstractNum>
-  <w:abstractNum w:abstractNumId="15" w15:restartNumberingAfterBreak="0">
+  <w:abstractNum w:abstractNumId="18" w15:restartNumberingAfterBreak="0">
     <w:nsid w:val="3EE4667F"/>
     <w:multiLevelType w:val="multilevel"/>
     <w:tmpl w:val="A5A05E0E"/>
@@ -7818,7 +9276,7 @@
       </w:rPr>
     </w:lvl>
   </w:abstractNum>
-  <w:abstractNum w:abstractNumId="16" w15:restartNumberingAfterBreak="0">
+  <w:abstractNum w:abstractNumId="19" w15:restartNumberingAfterBreak="0">
     <w:nsid w:val="420578DB"/>
     <w:multiLevelType w:val="hybridMultilevel"/>
     <w:tmpl w:val="6BBA156E"/>
@@ -7904,7 +9362,7 @@
       </w:pPr>
     </w:lvl>
   </w:abstractNum>
-  <w:abstractNum w:abstractNumId="17" w15:restartNumberingAfterBreak="0">
+  <w:abstractNum w:abstractNumId="20" w15:restartNumberingAfterBreak="0">
     <w:nsid w:val="435025E1"/>
     <w:multiLevelType w:val="hybridMultilevel"/>
     <w:tmpl w:val="B372AC66"/>
@@ -8017,7 +9475,7 @@
       </w:rPr>
     </w:lvl>
   </w:abstractNum>
-  <w:abstractNum w:abstractNumId="18" w15:restartNumberingAfterBreak="0">
+  <w:abstractNum w:abstractNumId="21" w15:restartNumberingAfterBreak="0">
     <w:nsid w:val="45866578"/>
     <w:multiLevelType w:val="multilevel"/>
     <w:tmpl w:val="DE72758E"/>
@@ -8166,7 +9624,7 @@
       </w:rPr>
     </w:lvl>
   </w:abstractNum>
-  <w:abstractNum w:abstractNumId="19" w15:restartNumberingAfterBreak="0">
+  <w:abstractNum w:abstractNumId="22" w15:restartNumberingAfterBreak="0">
     <w:nsid w:val="47780687"/>
     <w:multiLevelType w:val="multilevel"/>
     <w:tmpl w:val="58062EAE"/>
@@ -8315,7 +9773,7 @@
       </w:rPr>
     </w:lvl>
   </w:abstractNum>
-  <w:abstractNum w:abstractNumId="20" w15:restartNumberingAfterBreak="0">
+  <w:abstractNum w:abstractNumId="23" w15:restartNumberingAfterBreak="0">
     <w:nsid w:val="4C437148"/>
     <w:multiLevelType w:val="hybridMultilevel"/>
     <w:tmpl w:val="63088B1E"/>
@@ -8428,7 +9886,7 @@
       </w:rPr>
     </w:lvl>
   </w:abstractNum>
-  <w:abstractNum w:abstractNumId="21" w15:restartNumberingAfterBreak="0">
+  <w:abstractNum w:abstractNumId="24" w15:restartNumberingAfterBreak="0">
     <w:nsid w:val="4F6470C3"/>
     <w:multiLevelType w:val="multilevel"/>
     <w:tmpl w:val="5560D8E4"/>
@@ -8573,7 +10031,7 @@
       </w:rPr>
     </w:lvl>
   </w:abstractNum>
-  <w:abstractNum w:abstractNumId="22" w15:restartNumberingAfterBreak="0">
+  <w:abstractNum w:abstractNumId="25" w15:restartNumberingAfterBreak="0">
     <w:nsid w:val="504A7838"/>
     <w:multiLevelType w:val="multilevel"/>
     <w:tmpl w:val="90F47674"/>
@@ -8686,7 +10144,7 @@
       </w:pPr>
     </w:lvl>
   </w:abstractNum>
-  <w:abstractNum w:abstractNumId="23" w15:restartNumberingAfterBreak="0">
+  <w:abstractNum w:abstractNumId="26" w15:restartNumberingAfterBreak="0">
     <w:nsid w:val="50C15572"/>
     <w:multiLevelType w:val="multilevel"/>
     <w:tmpl w:val="5AF85BAE"/>
@@ -8803,7 +10261,7 @@
       </w:pPr>
     </w:lvl>
   </w:abstractNum>
-  <w:abstractNum w:abstractNumId="24" w15:restartNumberingAfterBreak="0">
+  <w:abstractNum w:abstractNumId="27" w15:restartNumberingAfterBreak="0">
     <w:nsid w:val="554804DD"/>
     <w:multiLevelType w:val="multilevel"/>
     <w:tmpl w:val="8DC89790"/>
@@ -8948,7 +10406,7 @@
       </w:rPr>
     </w:lvl>
   </w:abstractNum>
-  <w:abstractNum w:abstractNumId="25" w15:restartNumberingAfterBreak="0">
+  <w:abstractNum w:abstractNumId="28" w15:restartNumberingAfterBreak="0">
     <w:nsid w:val="58C96EE8"/>
     <w:multiLevelType w:val="multilevel"/>
     <w:tmpl w:val="329CFC80"/>
@@ -9097,7 +10555,7 @@
       </w:rPr>
     </w:lvl>
   </w:abstractNum>
-  <w:abstractNum w:abstractNumId="26" w15:restartNumberingAfterBreak="0">
+  <w:abstractNum w:abstractNumId="29" w15:restartNumberingAfterBreak="0">
     <w:nsid w:val="5A524C01"/>
     <w:multiLevelType w:val="multilevel"/>
     <w:tmpl w:val="285E0278"/>
@@ -9246,7 +10704,7 @@
       </w:rPr>
     </w:lvl>
   </w:abstractNum>
-  <w:abstractNum w:abstractNumId="27" w15:restartNumberingAfterBreak="0">
+  <w:abstractNum w:abstractNumId="30" w15:restartNumberingAfterBreak="0">
     <w:nsid w:val="5DE44A80"/>
     <w:multiLevelType w:val="multilevel"/>
     <w:tmpl w:val="8E4219FC"/>
@@ -9395,7 +10853,7 @@
       </w:rPr>
     </w:lvl>
   </w:abstractNum>
-  <w:abstractNum w:abstractNumId="28" w15:restartNumberingAfterBreak="0">
+  <w:abstractNum w:abstractNumId="31" w15:restartNumberingAfterBreak="0">
     <w:nsid w:val="5E0A5EF6"/>
     <w:multiLevelType w:val="multilevel"/>
     <w:tmpl w:val="A1E8BEBE"/>
@@ -9541,7 +10999,7 @@
       </w:rPr>
     </w:lvl>
   </w:abstractNum>
-  <w:abstractNum w:abstractNumId="29" w15:restartNumberingAfterBreak="0">
+  <w:abstractNum w:abstractNumId="32" w15:restartNumberingAfterBreak="0">
     <w:nsid w:val="64525B87"/>
     <w:multiLevelType w:val="hybridMultilevel"/>
     <w:tmpl w:val="3D32252A"/>
@@ -9654,7 +11112,7 @@
       </w:rPr>
     </w:lvl>
   </w:abstractNum>
-  <w:abstractNum w:abstractNumId="30" w15:restartNumberingAfterBreak="0">
+  <w:abstractNum w:abstractNumId="33" w15:restartNumberingAfterBreak="0">
     <w:nsid w:val="651776DD"/>
     <w:multiLevelType w:val="hybridMultilevel"/>
     <w:tmpl w:val="63DA2664"/>
@@ -9768,7 +11226,7 @@
       </w:rPr>
     </w:lvl>
   </w:abstractNum>
-  <w:abstractNum w:abstractNumId="31" w15:restartNumberingAfterBreak="0">
+  <w:abstractNum w:abstractNumId="34" w15:restartNumberingAfterBreak="0">
     <w:nsid w:val="6A8E1259"/>
     <w:multiLevelType w:val="multilevel"/>
     <w:tmpl w:val="4126A8C2"/>
@@ -9917,7 +11375,7 @@
       </w:rPr>
     </w:lvl>
   </w:abstractNum>
-  <w:abstractNum w:abstractNumId="32" w15:restartNumberingAfterBreak="0">
+  <w:abstractNum w:abstractNumId="35" w15:restartNumberingAfterBreak="0">
     <w:nsid w:val="6EA46BF3"/>
     <w:multiLevelType w:val="multilevel"/>
     <w:tmpl w:val="24E4C6B0"/>
@@ -10066,7 +11524,7 @@
       </w:rPr>
     </w:lvl>
   </w:abstractNum>
-  <w:abstractNum w:abstractNumId="33" w15:restartNumberingAfterBreak="0">
+  <w:abstractNum w:abstractNumId="36" w15:restartNumberingAfterBreak="0">
     <w:nsid w:val="6F8B05CB"/>
     <w:multiLevelType w:val="multilevel"/>
     <w:tmpl w:val="D8109F6E"/>
@@ -10179,7 +11637,7 @@
       </w:pPr>
     </w:lvl>
   </w:abstractNum>
-  <w:abstractNum w:abstractNumId="34" w15:restartNumberingAfterBreak="0">
+  <w:abstractNum w:abstractNumId="37" w15:restartNumberingAfterBreak="0">
     <w:nsid w:val="72DD66D9"/>
     <w:multiLevelType w:val="multilevel"/>
     <w:tmpl w:val="CA6640D8"/>
@@ -10292,7 +11750,7 @@
       </w:pPr>
     </w:lvl>
   </w:abstractNum>
-  <w:abstractNum w:abstractNumId="35" w15:restartNumberingAfterBreak="0">
+  <w:abstractNum w:abstractNumId="38" w15:restartNumberingAfterBreak="0">
     <w:nsid w:val="764C0FC4"/>
     <w:multiLevelType w:val="multilevel"/>
     <w:tmpl w:val="16A652D0"/>
@@ -10405,7 +11863,7 @@
       </w:pPr>
     </w:lvl>
   </w:abstractNum>
-  <w:abstractNum w:abstractNumId="36" w15:restartNumberingAfterBreak="0">
+  <w:abstractNum w:abstractNumId="39" w15:restartNumberingAfterBreak="0">
     <w:nsid w:val="7A5322FC"/>
     <w:multiLevelType w:val="multilevel"/>
     <w:tmpl w:val="97C4E85E"/>
@@ -10518,7 +11976,7 @@
       </w:pPr>
     </w:lvl>
   </w:abstractNum>
-  <w:abstractNum w:abstractNumId="37" w15:restartNumberingAfterBreak="0">
+  <w:abstractNum w:abstractNumId="40" w15:restartNumberingAfterBreak="0">
     <w:nsid w:val="7F971D73"/>
     <w:multiLevelType w:val="multilevel"/>
     <w:tmpl w:val="FA508268"/>
@@ -10667,7 +12125,7 @@
       </w:rPr>
     </w:lvl>
   </w:abstractNum>
-  <w:abstractNum w:abstractNumId="38" w15:restartNumberingAfterBreak="0">
+  <w:abstractNum w:abstractNumId="41" w15:restartNumberingAfterBreak="0">
     <w:nsid w:val="7FAA6304"/>
     <w:multiLevelType w:val="multilevel"/>
     <w:tmpl w:val="975E6EAE"/>
@@ -10817,121 +12275,130 @@
     </w:lvl>
   </w:abstractNum>
   <w:num w:numId="1" w16cid:durableId="1792548442">
-    <w:abstractNumId w:val="1"/>
+    <w:abstractNumId w:val="3"/>
   </w:num>
   <w:num w:numId="2" w16cid:durableId="885802013">
+    <w:abstractNumId w:val="31"/>
+  </w:num>
+  <w:num w:numId="3" w16cid:durableId="2090033940">
+    <w:abstractNumId w:val="19"/>
+  </w:num>
+  <w:num w:numId="4" w16cid:durableId="179897294">
+    <w:abstractNumId w:val="10"/>
+  </w:num>
+  <w:num w:numId="5" w16cid:durableId="941840374">
+    <w:abstractNumId w:val="9"/>
+  </w:num>
+  <w:num w:numId="6" w16cid:durableId="1228145484">
+    <w:abstractNumId w:val="11"/>
+  </w:num>
+  <w:num w:numId="7" w16cid:durableId="619998457">
+    <w:abstractNumId w:val="8"/>
+  </w:num>
+  <w:num w:numId="8" w16cid:durableId="1605919402">
+    <w:abstractNumId w:val="25"/>
+  </w:num>
+  <w:num w:numId="9" w16cid:durableId="47993447">
+    <w:abstractNumId w:val="37"/>
+  </w:num>
+  <w:num w:numId="10" w16cid:durableId="847019638">
+    <w:abstractNumId w:val="38"/>
+  </w:num>
+  <w:num w:numId="11" w16cid:durableId="1508786412">
+    <w:abstractNumId w:val="36"/>
+  </w:num>
+  <w:num w:numId="12" w16cid:durableId="659192386">
     <w:abstractNumId w:val="28"/>
   </w:num>
-  <w:num w:numId="3" w16cid:durableId="2090033940">
+  <w:num w:numId="13" w16cid:durableId="2147164673">
+    <w:abstractNumId w:val="5"/>
+  </w:num>
+  <w:num w:numId="14" w16cid:durableId="2095855817">
+    <w:abstractNumId w:val="17"/>
+  </w:num>
+  <w:num w:numId="15" w16cid:durableId="1837720053">
+    <w:abstractNumId w:val="14"/>
+  </w:num>
+  <w:num w:numId="16" w16cid:durableId="1386372614">
+    <w:abstractNumId w:val="18"/>
+  </w:num>
+  <w:num w:numId="17" w16cid:durableId="995259442">
+    <w:abstractNumId w:val="26"/>
+  </w:num>
+  <w:num w:numId="18" w16cid:durableId="1998459646">
+    <w:abstractNumId w:val="39"/>
+  </w:num>
+  <w:num w:numId="19" w16cid:durableId="575626314">
+    <w:abstractNumId w:val="30"/>
+  </w:num>
+  <w:num w:numId="20" w16cid:durableId="93482261">
+    <w:abstractNumId w:val="27"/>
+  </w:num>
+  <w:num w:numId="21" w16cid:durableId="546533731">
+    <w:abstractNumId w:val="40"/>
+  </w:num>
+  <w:num w:numId="22" w16cid:durableId="699862888">
     <w:abstractNumId w:val="16"/>
   </w:num>
-  <w:num w:numId="4" w16cid:durableId="179897294">
-    <w:abstractNumId w:val="8"/>
+  <w:num w:numId="23" w16cid:durableId="1800414490">
+    <w:abstractNumId w:val="15"/>
   </w:num>
-  <w:num w:numId="5" w16cid:durableId="941840374">
+  <w:num w:numId="24" w16cid:durableId="701320795">
+    <w:abstractNumId w:val="23"/>
+  </w:num>
+  <w:num w:numId="25" w16cid:durableId="1024357608">
+    <w:abstractNumId w:val="20"/>
+  </w:num>
+  <w:num w:numId="26" w16cid:durableId="2049674">
+    <w:abstractNumId w:val="29"/>
+  </w:num>
+  <w:num w:numId="27" w16cid:durableId="1137184905">
+    <w:abstractNumId w:val="13"/>
+  </w:num>
+  <w:num w:numId="28" w16cid:durableId="1017998617">
+    <w:abstractNumId w:val="41"/>
+  </w:num>
+  <w:num w:numId="29" w16cid:durableId="1503278735">
+    <w:abstractNumId w:val="6"/>
+  </w:num>
+  <w:num w:numId="30" w16cid:durableId="915163199">
+    <w:abstractNumId w:val="32"/>
+  </w:num>
+  <w:num w:numId="31" w16cid:durableId="1091468857">
+    <w:abstractNumId w:val="33"/>
+  </w:num>
+  <w:num w:numId="32" w16cid:durableId="1131628224">
     <w:abstractNumId w:val="7"/>
   </w:num>
-  <w:num w:numId="6" w16cid:durableId="1228145484">
-    <w:abstractNumId w:val="9"/>
+  <w:num w:numId="33" w16cid:durableId="362904672">
+    <w:abstractNumId w:val="4"/>
   </w:num>
-  <w:num w:numId="7" w16cid:durableId="619998457">
-    <w:abstractNumId w:val="6"/>
+  <w:num w:numId="34" w16cid:durableId="649015568">
+    <w:abstractNumId w:val="24"/>
   </w:num>
-  <w:num w:numId="8" w16cid:durableId="1605919402">
-    <w:abstractNumId w:val="22"/>
+  <w:num w:numId="35" w16cid:durableId="1701738275">
+    <w:abstractNumId w:val="35"/>
   </w:num>
-  <w:num w:numId="9" w16cid:durableId="47993447">
+  <w:num w:numId="36" w16cid:durableId="541135855">
+    <w:abstractNumId w:val="21"/>
+  </w:num>
+  <w:num w:numId="37" w16cid:durableId="1226069449">
     <w:abstractNumId w:val="34"/>
   </w:num>
-  <w:num w:numId="10" w16cid:durableId="847019638">
-    <w:abstractNumId w:val="35"/>
-  </w:num>
-  <w:num w:numId="11" w16cid:durableId="1508786412">
-    <w:abstractNumId w:val="33"/>
-  </w:num>
-  <w:num w:numId="12" w16cid:durableId="659192386">
-    <w:abstractNumId w:val="25"/>
-  </w:num>
-  <w:num w:numId="13" w16cid:durableId="2147164673">
-    <w:abstractNumId w:val="3"/>
-  </w:num>
-  <w:num w:numId="14" w16cid:durableId="2095855817">
-    <w:abstractNumId w:val="14"/>
-  </w:num>
-  <w:num w:numId="15" w16cid:durableId="1837720053">
-    <w:abstractNumId w:val="11"/>
-  </w:num>
-  <w:num w:numId="16" w16cid:durableId="1386372614">
-    <w:abstractNumId w:val="15"/>
-  </w:num>
-  <w:num w:numId="17" w16cid:durableId="995259442">
-    <w:abstractNumId w:val="23"/>
-  </w:num>
-  <w:num w:numId="18" w16cid:durableId="1998459646">
-    <w:abstractNumId w:val="36"/>
-  </w:num>
-  <w:num w:numId="19" w16cid:durableId="575626314">
-    <w:abstractNumId w:val="27"/>
-  </w:num>
-  <w:num w:numId="20" w16cid:durableId="93482261">
-    <w:abstractNumId w:val="24"/>
-  </w:num>
-  <w:num w:numId="21" w16cid:durableId="546533731">
-    <w:abstractNumId w:val="37"/>
-  </w:num>
-  <w:num w:numId="22" w16cid:durableId="699862888">
-    <w:abstractNumId w:val="13"/>
-  </w:num>
-  <w:num w:numId="23" w16cid:durableId="1800414490">
-    <w:abstractNumId w:val="12"/>
-  </w:num>
-  <w:num w:numId="24" w16cid:durableId="701320795">
-    <w:abstractNumId w:val="20"/>
-  </w:num>
-  <w:num w:numId="25" w16cid:durableId="1024357608">
-    <w:abstractNumId w:val="17"/>
-  </w:num>
-  <w:num w:numId="26" w16cid:durableId="2049674">
-    <w:abstractNumId w:val="26"/>
-  </w:num>
-  <w:num w:numId="27" w16cid:durableId="1137184905">
-    <w:abstractNumId w:val="10"/>
-  </w:num>
-  <w:num w:numId="28" w16cid:durableId="1017998617">
-    <w:abstractNumId w:val="38"/>
-  </w:num>
-  <w:num w:numId="29" w16cid:durableId="1503278735">
-    <w:abstractNumId w:val="4"/>
-  </w:num>
-  <w:num w:numId="30" w16cid:durableId="915163199">
-    <w:abstractNumId w:val="29"/>
-  </w:num>
-  <w:num w:numId="31" w16cid:durableId="1091468857">
-    <w:abstractNumId w:val="30"/>
-  </w:num>
-  <w:num w:numId="32" w16cid:durableId="1131628224">
-    <w:abstractNumId w:val="5"/>
-  </w:num>
-  <w:num w:numId="33" w16cid:durableId="362904672">
-    <w:abstractNumId w:val="2"/>
-  </w:num>
-  <w:num w:numId="34" w16cid:durableId="649015568">
-    <w:abstractNumId w:val="21"/>
-  </w:num>
-  <w:num w:numId="35" w16cid:durableId="1701738275">
-    <w:abstractNumId w:val="32"/>
-  </w:num>
-  <w:num w:numId="36" w16cid:durableId="541135855">
-    <w:abstractNumId w:val="18"/>
-  </w:num>
-  <w:num w:numId="37" w16cid:durableId="1226069449">
-    <w:abstractNumId w:val="31"/>
-  </w:num>
   <w:num w:numId="38" w16cid:durableId="362902522">
-    <w:abstractNumId w:val="19"/>
+    <w:abstractNumId w:val="22"/>
   </w:num>
   <w:num w:numId="39" w16cid:durableId="1358850521">
     <w:abstractNumId w:val="0"/>
+  </w:num>
+  <w:num w:numId="40" w16cid:durableId="48653226">
+    <w:abstractNumId w:val="2"/>
+  </w:num>
+  <w:num w:numId="41" w16cid:durableId="416757884">
+    <w:abstractNumId w:val="12"/>
+  </w:num>
+  <w:num w:numId="42" w16cid:durableId="32579297">
+    <w:abstractNumId w:val="1"/>
   </w:num>
 </w:numbering>
 </file>
@@ -11539,6 +13006,7 @@
   <w:style w:type="character" w:default="1" w:styleId="DefaultParagraphFont">
     <w:name w:val="Default Paragraph Font"/>
     <w:uiPriority w:val="1"/>
+    <w:semiHidden/>
     <w:unhideWhenUsed/>
   </w:style>
   <w:style w:type="table" w:default="1" w:styleId="TableNormal">

</xml_diff>

<commit_message>
Finalized slide design and need to prepare for presentation
</commit_message>
<xml_diff>
--- a/Doc/Academic/Proposal/report_fyp1.docx
+++ b/Doc/Academic/Proposal/report_fyp1.docx
@@ -918,17 +918,15 @@
         <w:spacing w:line="360" w:lineRule="auto"/>
         <w:rPr>
           <w:rFonts w:ascii="Arial" w:hAnsi="Arial" w:cs="Arial"/>
-          <w:b/>
-          <w:bCs/>
-        </w:rPr>
-      </w:pPr>
-      <w:r>
-        <w:rPr>
-          <w:rFonts w:ascii="Arial" w:hAnsi="Arial" w:cs="Arial"/>
-          <w:b/>
-          <w:bCs/>
-        </w:rPr>
-        <w:t xml:space="preserve">Provides a cost-effective solution for SMEs. </w:t>
+        </w:rPr>
+      </w:pPr>
+      <w:r>
+        <w:rPr>
+          <w:rFonts w:ascii="Arial" w:hAnsi="Arial" w:cs="Arial"/>
+          <w:b/>
+          <w:bCs/>
+        </w:rPr>
+        <w:t>Benchmarks High-Grade Security on Resource-Limited Hardware.</w:t>
       </w:r>
     </w:p>
     <w:p>
@@ -945,7 +943,35 @@
           <w:rFonts w:ascii="Arial" w:hAnsi="Arial" w:cs="Arial"/>
         </w:rPr>
         <w:lastRenderedPageBreak/>
-        <w:t>Unlike expensive enterprise security suites, this project utilizes open-source tools (SnarkJS, TensorFlow Lite) to provide high-grade security on standard mobile hardware, making advanced security accessible to smaller companies.</w:t>
+        <w:t xml:space="preserve">This project demonstrates that enterprise-level protocols like </w:t>
+      </w:r>
+      <w:proofErr w:type="spellStart"/>
+      <w:r>
+        <w:rPr>
+          <w:rFonts w:ascii="Arial" w:hAnsi="Arial" w:cs="Arial"/>
+        </w:rPr>
+        <w:t>zk</w:t>
+      </w:r>
+      <w:proofErr w:type="spellEnd"/>
+      <w:r>
+        <w:rPr>
+          <w:rFonts w:ascii="Arial" w:hAnsi="Arial" w:cs="Arial"/>
+        </w:rPr>
+        <w:t>-SNARKs and AI anomaly detection can be successfully optimized for standard mobile processors. It provides a research benchmark for the feasibility of "Heavy Cryptography" on consumer-grade devices using open-source frameworks (</w:t>
+      </w:r>
+      <w:proofErr w:type="spellStart"/>
+      <w:r>
+        <w:rPr>
+          <w:rFonts w:ascii="Arial" w:hAnsi="Arial" w:cs="Arial"/>
+        </w:rPr>
+        <w:t>SnarkJS</w:t>
+      </w:r>
+      <w:proofErr w:type="spellEnd"/>
+      <w:r>
+        <w:rPr>
+          <w:rFonts w:ascii="Arial" w:hAnsi="Arial" w:cs="Arial"/>
+        </w:rPr>
+        <w:t xml:space="preserve"> and TensorFlow Lite).</w:t>
       </w:r>
     </w:p>
     <w:p>
@@ -1242,7 +1268,6 @@
           <w:bCs/>
           <w:color w:val="auto"/>
         </w:rPr>
-        <w:lastRenderedPageBreak/>
         <w:t>CHAPTER 2</w:t>
       </w:r>
     </w:p>
@@ -1491,7 +1516,6 @@
           <w:b/>
           <w:bCs/>
         </w:rPr>
-        <w:lastRenderedPageBreak/>
         <w:t>2.2.1 Vulnerabilities in E2EE Authentication</w:t>
       </w:r>
     </w:p>
@@ -1642,6 +1666,7 @@
         <w:rPr>
           <w:rFonts w:ascii="Arial" w:hAnsi="Arial" w:cs="Arial"/>
         </w:rPr>
+        <w:lastRenderedPageBreak/>
         <w:t xml:space="preserve">Complementing this, </w:t>
       </w:r>
       <w:r>
@@ -1656,14 +1681,7 @@
         <w:rPr>
           <w:rFonts w:ascii="Arial" w:hAnsi="Arial" w:cs="Arial"/>
         </w:rPr>
-        <w:t xml:space="preserve"> provided a </w:t>
-      </w:r>
-      <w:r>
-        <w:rPr>
-          <w:rFonts w:ascii="Arial" w:hAnsi="Arial" w:cs="Arial"/>
-        </w:rPr>
-        <w:lastRenderedPageBreak/>
-        <w:t>systematic survey of ML techniques. The authors categorized dozens of papers and concluded that while Deep Learning is becoming the standard for high-dimensional data, it suffers from a lack of "explainability" and struggles with data imbalance (too few examples of actual attacks). This review justifies the need for pre-trained or specialized models to handle the nuanced nature of insider threats.</w:t>
+        <w:t xml:space="preserve"> provided a systematic survey of ML techniques. The authors categorized dozens of papers and concluded that while Deep Learning is becoming the standard for high-dimensional data, it suffers from a lack of "explainability" and struggles with data imbalance (too few examples of actual attacks). This review justifies the need for pre-trained or specialized models to handle the nuanced nature of insider threats.</w:t>
       </w:r>
     </w:p>
     <w:p>
@@ -1825,14 +1843,14 @@
         <w:rPr>
           <w:rFonts w:ascii="Arial" w:hAnsi="Arial" w:cs="Arial"/>
         </w:rPr>
-        <w:t xml:space="preserve"> conducted a comparative analysis between traditional password hashing and ZKP-based systems. Their findings confirm that ZKPs offer superior privacy by eliminating the transmission of credentials. The study distinguishes between zk-SNARKs (efficient, small proofs) and zk-STARKs (quantum-resistant but larger proofs). They emphasized that while ZKPs provide superior privacy, widespread adoption is hindered by complexity, recommending future </w:t>
+        <w:t xml:space="preserve"> conducted a comparative analysis between traditional password hashing and ZKP-based systems. Their findings confirm that ZKPs offer superior privacy by eliminating the transmission of credentials. The study distinguishes between zk-SNARKs (efficient, small proofs) and zk-STARKs </w:t>
       </w:r>
       <w:r>
         <w:rPr>
           <w:rFonts w:ascii="Arial" w:hAnsi="Arial" w:cs="Arial"/>
         </w:rPr>
         <w:lastRenderedPageBreak/>
-        <w:t>work focus on wrapping these protocols in user-friendly interfaces</w:t>
+        <w:t>(quantum-resistant but larger proofs). They emphasized that while ZKPs provide superior privacy, widespread adoption is hindered by complexity, recommending future work focus on wrapping these protocols in user-friendly interfaces</w:t>
       </w:r>
       <w:r>
         <w:rPr>
@@ -2064,7 +2082,6 @@
           <w:b/>
           <w:bCs/>
         </w:rPr>
-        <w:lastRenderedPageBreak/>
         <w:t>2.4 On-Device AI Anomaly Detection</w:t>
       </w:r>
     </w:p>
@@ -2257,14 +2274,14 @@
         <w:rPr>
           <w:rFonts w:ascii="Arial" w:hAnsi="Arial" w:cs="Arial"/>
         </w:rPr>
-        <w:t xml:space="preserve"> explored combining different algorithms to improve detection. Their hybrid model experiment showed that combining "shallow" learning (Random Forest) with "deep" learning features extracted lexical patterns (like URL length and special </w:t>
+        <w:t xml:space="preserve"> explored combining different algorithms to improve detection. Their hybrid </w:t>
       </w:r>
       <w:r>
         <w:rPr>
           <w:rFonts w:ascii="Arial" w:hAnsi="Arial" w:cs="Arial"/>
         </w:rPr>
         <w:lastRenderedPageBreak/>
-        <w:t xml:space="preserve">characters) more effectively than single models. Drawing on these feature extraction techniques, </w:t>
+        <w:t xml:space="preserve">model experiment showed that combining "shallow" learning (Random Forest) with "deep" learning features extracted lexical patterns (like URL length and special characters) more effectively than single models. Drawing on these feature extraction techniques, </w:t>
       </w:r>
       <w:r>
         <w:rPr>
@@ -2499,155 +2516,160 @@
           <w:rFonts w:ascii="Arial" w:hAnsi="Arial" w:cs="Arial"/>
           <w:color w:val="auto"/>
         </w:rPr>
+        <w:t>CHAPTER 3</w:t>
+      </w:r>
+    </w:p>
+    <w:p>
+      <w:pPr>
+        <w:pStyle w:val="Heading2"/>
+        <w:spacing w:line="360" w:lineRule="auto"/>
+        <w:rPr>
+          <w:rFonts w:ascii="Arial" w:hAnsi="Arial" w:cs="Arial"/>
+          <w:color w:val="auto"/>
+        </w:rPr>
+      </w:pPr>
+      <w:r>
+        <w:rPr>
+          <w:rFonts w:ascii="Arial" w:hAnsi="Arial" w:cs="Arial"/>
+          <w:color w:val="auto"/>
+        </w:rPr>
+        <w:t>METHODOLOGY</w:t>
+      </w:r>
+    </w:p>
+    <w:p>
+      <w:pPr>
+        <w:spacing w:line="360" w:lineRule="auto"/>
+        <w:rPr>
+          <w:rFonts w:ascii="Arial" w:hAnsi="Arial" w:cs="Arial"/>
+          <w:b/>
+          <w:bCs/>
+        </w:rPr>
+      </w:pPr>
+      <w:r>
+        <w:rPr>
+          <w:rFonts w:ascii="Arial" w:hAnsi="Arial" w:cs="Arial"/>
+          <w:b/>
+          <w:bCs/>
+        </w:rPr>
+        <w:t>3.1 Introduction</w:t>
+      </w:r>
+    </w:p>
+    <w:p>
+      <w:pPr>
+        <w:spacing w:line="360" w:lineRule="auto"/>
+        <w:rPr>
+          <w:rFonts w:ascii="Arial" w:hAnsi="Arial" w:cs="Arial"/>
+        </w:rPr>
+      </w:pPr>
+      <w:r>
+        <w:rPr>
+          <w:rFonts w:ascii="Arial" w:hAnsi="Arial" w:cs="Arial"/>
+        </w:rPr>
+        <w:t>This chapter explains the methodology and the steps taken to develop the SentriZK project. The main purpose of this chapter is to define the structured approach used to design, build, and test the secure messaging application. It begins by looking at different software development models and justifies why the Rapid Application Development (RAD) model was chosen for this project.</w:t>
+      </w:r>
+    </w:p>
+    <w:p>
+      <w:pPr>
+        <w:spacing w:line="360" w:lineRule="auto"/>
+        <w:rPr>
+          <w:rFonts w:ascii="Arial" w:hAnsi="Arial" w:cs="Arial"/>
+        </w:rPr>
+      </w:pPr>
+    </w:p>
+    <w:p>
+      <w:pPr>
+        <w:spacing w:line="360" w:lineRule="auto"/>
+        <w:rPr>
+          <w:rFonts w:ascii="Arial" w:hAnsi="Arial" w:cs="Arial"/>
+        </w:rPr>
+      </w:pPr>
+      <w:r>
+        <w:rPr>
+          <w:rFonts w:ascii="Arial" w:hAnsi="Arial" w:cs="Arial"/>
+        </w:rPr>
+        <w:t xml:space="preserve">After that, the chapter explains the specific activities done in each phase of the development, such as gathering requirements and designing the system prototypes. It also presents the detailed technical design of the system, which includes the System Architecture Diagram, Flow Chart, Activity Diagram, Sitemap, and Threat Model Diagram. These diagrams are used to visualize how the system functions and secures user data. Finally, the chapter outlines the hardware and software requirements, the budget and costing, and the project planning schedule to ensure the project is completed on </w:t>
+      </w:r>
+      <w:r>
+        <w:rPr>
+          <w:rFonts w:ascii="Arial" w:hAnsi="Arial" w:cs="Arial"/>
+        </w:rPr>
+        <w:t>time.</w:t>
+      </w:r>
+      <w:r>
+        <w:rPr>
+          <w:rFonts w:ascii="Arial" w:hAnsi="Arial" w:cs="Arial"/>
+        </w:rPr>
+        <w:t xml:space="preserve"> The</w:t>
+      </w:r>
+      <w:r>
+        <w:rPr>
+          <w:rFonts w:ascii="Arial" w:hAnsi="Arial" w:cs="Arial"/>
+        </w:rPr>
+        <w:t xml:space="preserve"> specific hardware and software tools utilized in the implementation.</w:t>
+      </w:r>
+    </w:p>
+    <w:p>
+      <w:pPr>
+        <w:spacing w:line="360" w:lineRule="auto"/>
+        <w:rPr>
+          <w:rFonts w:ascii="Arial" w:hAnsi="Arial" w:cs="Arial"/>
+        </w:rPr>
+      </w:pPr>
+    </w:p>
+    <w:p>
+      <w:pPr>
+        <w:spacing w:line="360" w:lineRule="auto"/>
+        <w:rPr>
+          <w:rFonts w:ascii="Arial" w:hAnsi="Arial" w:cs="Arial"/>
+          <w:b/>
+          <w:bCs/>
+        </w:rPr>
+      </w:pPr>
+      <w:r>
+        <w:rPr>
+          <w:rFonts w:ascii="Arial" w:hAnsi="Arial" w:cs="Arial"/>
+          <w:b/>
+          <w:bCs/>
+        </w:rPr>
+        <w:t>3.2 Overview of Software Development Models</w:t>
+      </w:r>
+    </w:p>
+    <w:p>
+      <w:pPr>
+        <w:spacing w:line="360" w:lineRule="auto"/>
+        <w:rPr>
+          <w:rFonts w:ascii="Arial" w:hAnsi="Arial" w:cs="Arial"/>
+        </w:rPr>
+      </w:pPr>
+      <w:r>
+        <w:rPr>
+          <w:rFonts w:ascii="Arial" w:hAnsi="Arial" w:cs="Arial"/>
+        </w:rPr>
+        <w:t xml:space="preserve">The Software Development Life Cycle (SDLC) refers to a collection of methodologies that outline the process of developing software applications. Choosing an appropriate SDLC model is crucial to the success of a project, as it influences how requirements are identified, how the system is designed, and how testing is performed. For this project, </w:t>
+      </w:r>
+      <w:r>
+        <w:rPr>
+          <w:rFonts w:ascii="Arial" w:hAnsi="Arial" w:cs="Arial"/>
+        </w:rPr>
         <w:lastRenderedPageBreak/>
-        <w:t>CHAPTER 3</w:t>
-      </w:r>
-    </w:p>
-    <w:p>
-      <w:pPr>
-        <w:pStyle w:val="Heading2"/>
-        <w:spacing w:line="360" w:lineRule="auto"/>
-        <w:rPr>
-          <w:rFonts w:ascii="Arial" w:hAnsi="Arial" w:cs="Arial"/>
-          <w:color w:val="auto"/>
-        </w:rPr>
-      </w:pPr>
-      <w:r>
-        <w:rPr>
-          <w:rFonts w:ascii="Arial" w:hAnsi="Arial" w:cs="Arial"/>
-          <w:color w:val="auto"/>
-        </w:rPr>
-        <w:t>METHODOLOGY</w:t>
-      </w:r>
-    </w:p>
-    <w:p>
-      <w:pPr>
-        <w:spacing w:line="360" w:lineRule="auto"/>
-        <w:rPr>
-          <w:rFonts w:ascii="Arial" w:hAnsi="Arial" w:cs="Arial"/>
-          <w:b/>
-          <w:bCs/>
-        </w:rPr>
-      </w:pPr>
-      <w:r>
-        <w:rPr>
-          <w:rFonts w:ascii="Arial" w:hAnsi="Arial" w:cs="Arial"/>
-          <w:b/>
-          <w:bCs/>
-        </w:rPr>
-        <w:t>3.1 Introduction</w:t>
-      </w:r>
-    </w:p>
-    <w:p>
-      <w:pPr>
-        <w:spacing w:line="360" w:lineRule="auto"/>
-        <w:rPr>
-          <w:rFonts w:ascii="Arial" w:hAnsi="Arial" w:cs="Arial"/>
-        </w:rPr>
-      </w:pPr>
-      <w:r>
-        <w:rPr>
-          <w:rFonts w:ascii="Arial" w:hAnsi="Arial" w:cs="Arial"/>
-        </w:rPr>
-        <w:t>This chapter explains the methodology and the steps taken to develop the SentriZK project. The main purpose of this chapter is to define the structured approach used to design, build, and test the secure messaging application. It begins by looking at different software development models and justifies why the Rapid Application Development (RAD) model was chosen for this project.</w:t>
-      </w:r>
-    </w:p>
-    <w:p>
-      <w:pPr>
-        <w:spacing w:line="360" w:lineRule="auto"/>
-        <w:rPr>
-          <w:rFonts w:ascii="Arial" w:hAnsi="Arial" w:cs="Arial"/>
-        </w:rPr>
-      </w:pPr>
-    </w:p>
-    <w:p>
-      <w:pPr>
-        <w:spacing w:line="360" w:lineRule="auto"/>
-        <w:rPr>
-          <w:rFonts w:ascii="Arial" w:hAnsi="Arial" w:cs="Arial"/>
-        </w:rPr>
-      </w:pPr>
-      <w:r>
-        <w:rPr>
-          <w:rFonts w:ascii="Arial" w:hAnsi="Arial" w:cs="Arial"/>
-        </w:rPr>
-        <w:t xml:space="preserve">After that, the chapter explains the specific activities done in each phase of the development, such as gathering requirements and designing the system prototypes. It also presents the detailed technical design of the system, which includes the System Architecture Diagram, Flow Chart, Activity Diagram, Sitemap, and Threat Model Diagram. These diagrams are used to visualize how the system functions and secures user data. Finally, the chapter outlines the hardware and software requirements, the budget and costing, and the project planning schedule to ensure the project is completed on </w:t>
-      </w:r>
-      <w:r>
-        <w:rPr>
-          <w:rFonts w:ascii="Arial" w:hAnsi="Arial" w:cs="Arial"/>
-        </w:rPr>
-        <w:t>time.</w:t>
-      </w:r>
-      <w:r>
-        <w:rPr>
-          <w:rFonts w:ascii="Arial" w:hAnsi="Arial" w:cs="Arial"/>
-        </w:rPr>
-        <w:t xml:space="preserve"> The</w:t>
-      </w:r>
-      <w:r>
-        <w:rPr>
-          <w:rFonts w:ascii="Arial" w:hAnsi="Arial" w:cs="Arial"/>
-        </w:rPr>
-        <w:t xml:space="preserve"> specific hardware and software tools utilized in the implementation.</w:t>
-      </w:r>
-    </w:p>
-    <w:p>
-      <w:pPr>
-        <w:spacing w:line="360" w:lineRule="auto"/>
-        <w:rPr>
-          <w:rFonts w:ascii="Arial" w:hAnsi="Arial" w:cs="Arial"/>
-        </w:rPr>
-      </w:pPr>
-    </w:p>
-    <w:p>
-      <w:pPr>
-        <w:spacing w:line="360" w:lineRule="auto"/>
-        <w:rPr>
-          <w:rFonts w:ascii="Arial" w:hAnsi="Arial" w:cs="Arial"/>
-          <w:b/>
-          <w:bCs/>
-        </w:rPr>
-      </w:pPr>
-      <w:r>
-        <w:rPr>
-          <w:rFonts w:ascii="Arial" w:hAnsi="Arial" w:cs="Arial"/>
-          <w:b/>
-          <w:bCs/>
-        </w:rPr>
-        <w:t>3.2 Overview of Software Development Models</w:t>
-      </w:r>
-    </w:p>
-    <w:p>
-      <w:pPr>
-        <w:spacing w:line="360" w:lineRule="auto"/>
-        <w:rPr>
-          <w:rFonts w:ascii="Arial" w:hAnsi="Arial" w:cs="Arial"/>
-        </w:rPr>
-      </w:pPr>
-      <w:r>
-        <w:rPr>
-          <w:rFonts w:ascii="Arial" w:hAnsi="Arial" w:cs="Arial"/>
-        </w:rPr>
-        <w:t>The Software Development Life Cycle (SDLC) refers to a collection of methodologies that outline the process of developing software applications. Choosing an appropriate SDLC model is crucial to the success of a project, as it influences how requirements are identified, how the system is designed, and how testing is performed. For this project, three development methodologies were evaluated to determine the most suitable approach: the Waterfall Model, the Agile Model, and Rapid Application Development (RAD).</w:t>
-      </w:r>
-    </w:p>
-    <w:p>
-      <w:pPr>
-        <w:spacing w:line="360" w:lineRule="auto"/>
-        <w:rPr>
-          <w:rFonts w:ascii="Arial" w:hAnsi="Arial" w:cs="Arial"/>
-          <w:b/>
-          <w:bCs/>
-        </w:rPr>
-      </w:pPr>
-      <w:r>
-        <w:rPr>
-          <w:rFonts w:ascii="Arial" w:hAnsi="Arial" w:cs="Arial"/>
-          <w:b/>
-          <w:bCs/>
-        </w:rPr>
-        <w:lastRenderedPageBreak/>
+        <w:t>three development methodologies were evaluated to determine the most suitable approach: the Waterfall Model, the Agile Model, and Rapid Application Development (RAD).</w:t>
+      </w:r>
+    </w:p>
+    <w:p>
+      <w:pPr>
+        <w:spacing w:line="360" w:lineRule="auto"/>
+        <w:rPr>
+          <w:rFonts w:ascii="Arial" w:hAnsi="Arial" w:cs="Arial"/>
+          <w:b/>
+          <w:bCs/>
+        </w:rPr>
+      </w:pPr>
+      <w:r>
+        <w:rPr>
+          <w:rFonts w:ascii="Arial" w:hAnsi="Arial" w:cs="Arial"/>
+          <w:b/>
+          <w:bCs/>
+        </w:rPr>
         <w:t>3.2.1 Waterfall Model</w:t>
       </w:r>
     </w:p>
@@ -2753,6 +2775,7 @@
           <w:rFonts w:ascii="Arial" w:hAnsi="Arial" w:cs="Arial"/>
           <w:noProof/>
         </w:rPr>
+        <w:lastRenderedPageBreak/>
         <w:drawing>
           <wp:anchor distT="0" distB="0" distL="114300" distR="114300" simplePos="0" relativeHeight="251658240" behindDoc="0" locked="0" layoutInCell="1" allowOverlap="1" wp14:anchorId="3FFA3D46" wp14:editId="21D907AC">
             <wp:simplePos x="0" y="0"/>
@@ -2833,7 +2856,6 @@
           <w:b/>
           <w:bCs/>
         </w:rPr>
-        <w:lastRenderedPageBreak/>
         <w:t>3.2.2 Agile Model</w:t>
       </w:r>
     </w:p>
@@ -2917,6 +2939,7 @@
           <w:rFonts w:ascii="Arial" w:hAnsi="Arial" w:cs="Arial"/>
           <w:noProof/>
         </w:rPr>
+        <w:lastRenderedPageBreak/>
         <w:drawing>
           <wp:anchor distT="0" distB="0" distL="114300" distR="114300" simplePos="0" relativeHeight="251659264" behindDoc="0" locked="0" layoutInCell="1" allowOverlap="1" wp14:anchorId="66ECC6E6" wp14:editId="6F40BE7F">
             <wp:simplePos x="0" y="0"/>
@@ -3003,7 +3026,6 @@
           <w:b/>
           <w:bCs/>
         </w:rPr>
-        <w:lastRenderedPageBreak/>
         <w:t>3.2.3 Rapid Application Development (RAD)</w:t>
       </w:r>
     </w:p>
@@ -3088,6 +3110,7 @@
           <w:b/>
           <w:bCs/>
         </w:rPr>
+        <w:lastRenderedPageBreak/>
         <w:t>Weaknesses:</w:t>
       </w:r>
       <w:r>
@@ -3183,75 +3206,75 @@
           <w:b/>
           <w:bCs/>
         </w:rPr>
+        <w:t>3.3 Proposed Methodology</w:t>
+      </w:r>
+    </w:p>
+    <w:p>
+      <w:pPr>
+        <w:spacing w:line="360" w:lineRule="auto"/>
+        <w:rPr>
+          <w:rFonts w:ascii="Arial" w:hAnsi="Arial" w:cs="Arial"/>
+        </w:rPr>
+      </w:pPr>
+      <w:r>
+        <w:rPr>
+          <w:rFonts w:ascii="Arial" w:hAnsi="Arial" w:cs="Arial"/>
+        </w:rPr>
+        <w:t>Based on the comparative analysis of the software development models discussed in Section 3.2, the Rapid Application Development (RAD) model has been selected as the proposed methodology for this project.</w:t>
+      </w:r>
+    </w:p>
+    <w:p>
+      <w:pPr>
+        <w:spacing w:line="360" w:lineRule="auto"/>
+        <w:rPr>
+          <w:rFonts w:ascii="Arial" w:hAnsi="Arial" w:cs="Arial"/>
+        </w:rPr>
+      </w:pPr>
+      <w:r>
+        <w:rPr>
+          <w:rFonts w:ascii="Arial" w:hAnsi="Arial" w:cs="Arial"/>
+        </w:rPr>
+        <w:t>The RAD approach was chosen because it emphasizes rapid prototyping and iterative development rather than rigid, sequential planning. This methodology is particularly suitable for the project as it supports modular system development, allowing continuous testing, evaluation, and refinement throughout the lifecycle. The RAD phases applied in this project include Requirements Planning, User Design, Construction, and Cutover.</w:t>
+      </w:r>
+    </w:p>
+    <w:p>
+      <w:pPr>
+        <w:spacing w:line="360" w:lineRule="auto"/>
+        <w:rPr>
+          <w:rFonts w:ascii="Arial" w:hAnsi="Arial" w:cs="Arial"/>
+        </w:rPr>
+      </w:pPr>
+    </w:p>
+    <w:p>
+      <w:pPr>
+        <w:spacing w:line="360" w:lineRule="auto"/>
+        <w:rPr>
+          <w:rFonts w:ascii="Arial" w:hAnsi="Arial" w:cs="Arial"/>
+          <w:b/>
+          <w:bCs/>
+        </w:rPr>
+      </w:pPr>
+      <w:r>
+        <w:rPr>
+          <w:rFonts w:ascii="Arial" w:hAnsi="Arial" w:cs="Arial"/>
+          <w:b/>
+          <w:bCs/>
+        </w:rPr>
+        <w:t>Justification for Choosing RAD</w:t>
+      </w:r>
+    </w:p>
+    <w:p>
+      <w:pPr>
+        <w:spacing w:line="360" w:lineRule="auto"/>
+        <w:rPr>
+          <w:rFonts w:ascii="Arial" w:hAnsi="Arial" w:cs="Arial"/>
+        </w:rPr>
+      </w:pPr>
+      <w:r>
+        <w:rPr>
+          <w:rFonts w:ascii="Arial" w:hAnsi="Arial" w:cs="Arial"/>
+        </w:rPr>
         <w:lastRenderedPageBreak/>
-        <w:t>3.3 Proposed Methodology</w:t>
-      </w:r>
-    </w:p>
-    <w:p>
-      <w:pPr>
-        <w:spacing w:line="360" w:lineRule="auto"/>
-        <w:rPr>
-          <w:rFonts w:ascii="Arial" w:hAnsi="Arial" w:cs="Arial"/>
-        </w:rPr>
-      </w:pPr>
-      <w:r>
-        <w:rPr>
-          <w:rFonts w:ascii="Arial" w:hAnsi="Arial" w:cs="Arial"/>
-        </w:rPr>
-        <w:t>Based on the comparative analysis of the software development models discussed in Section 3.2, the Rapid Application Development (RAD) model has been selected as the proposed methodology for this project.</w:t>
-      </w:r>
-    </w:p>
-    <w:p>
-      <w:pPr>
-        <w:spacing w:line="360" w:lineRule="auto"/>
-        <w:rPr>
-          <w:rFonts w:ascii="Arial" w:hAnsi="Arial" w:cs="Arial"/>
-        </w:rPr>
-      </w:pPr>
-      <w:r>
-        <w:rPr>
-          <w:rFonts w:ascii="Arial" w:hAnsi="Arial" w:cs="Arial"/>
-        </w:rPr>
-        <w:t>The RAD approach was chosen because it emphasizes rapid prototyping and iterative development rather than rigid, sequential planning. This methodology is particularly suitable for the project as it supports modular system development, allowing continuous testing, evaluation, and refinement throughout the lifecycle. The RAD phases applied in this project include Requirements Planning, User Design, Construction, and Cutover.</w:t>
-      </w:r>
-    </w:p>
-    <w:p>
-      <w:pPr>
-        <w:spacing w:line="360" w:lineRule="auto"/>
-        <w:rPr>
-          <w:rFonts w:ascii="Arial" w:hAnsi="Arial" w:cs="Arial"/>
-        </w:rPr>
-      </w:pPr>
-    </w:p>
-    <w:p>
-      <w:pPr>
-        <w:spacing w:line="360" w:lineRule="auto"/>
-        <w:rPr>
-          <w:rFonts w:ascii="Arial" w:hAnsi="Arial" w:cs="Arial"/>
-          <w:b/>
-          <w:bCs/>
-        </w:rPr>
-      </w:pPr>
-      <w:r>
-        <w:rPr>
-          <w:rFonts w:ascii="Arial" w:hAnsi="Arial" w:cs="Arial"/>
-          <w:b/>
-          <w:bCs/>
-        </w:rPr>
-        <w:t>Justification for Choosing RAD</w:t>
-      </w:r>
-    </w:p>
-    <w:p>
-      <w:pPr>
-        <w:spacing w:line="360" w:lineRule="auto"/>
-        <w:rPr>
-          <w:rFonts w:ascii="Arial" w:hAnsi="Arial" w:cs="Arial"/>
-        </w:rPr>
-      </w:pPr>
-      <w:r>
-        <w:rPr>
-          <w:rFonts w:ascii="Arial" w:hAnsi="Arial" w:cs="Arial"/>
-        </w:rPr>
         <w:t>The selection of the RAD model is justified based on the following considerations:</w:t>
       </w:r>
     </w:p>
@@ -3354,14 +3377,7 @@
         <w:rPr>
           <w:rFonts w:ascii="Arial" w:hAnsi="Arial" w:cs="Arial"/>
         </w:rPr>
-        <w:t xml:space="preserve">During development, it is expected that minor changes to requirements or design elements may arise from testing results or feedback. The RAD </w:t>
-      </w:r>
-      <w:r>
-        <w:rPr>
-          <w:rFonts w:ascii="Arial" w:hAnsi="Arial" w:cs="Arial"/>
-        </w:rPr>
-        <w:lastRenderedPageBreak/>
-        <w:t>model provides inherent flexibility, allowing such changes to be incorporated during the construction phase without significantly affecting the overall project schedule. This adaptability is a clear advantage over more rigid models such as Waterfall.</w:t>
+        <w:t>During development, it is expected that minor changes to requirements or design elements may arise from testing results or feedback. The RAD model provides inherent flexibility, allowing such changes to be incorporated during the construction phase without significantly affecting the overall project schedule. This adaptability is a clear advantage over more rigid models such as Waterfall.</w:t>
       </w:r>
     </w:p>
     <w:p>
@@ -3462,6 +3478,7 @@
         <w:rPr>
           <w:rFonts w:ascii="Arial" w:hAnsi="Arial" w:cs="Arial"/>
         </w:rPr>
+        <w:lastRenderedPageBreak/>
         <w:t xml:space="preserve">The development of </w:t>
       </w:r>
       <w:r>
@@ -3642,7 +3659,6 @@
           <w:b/>
           <w:bCs/>
         </w:rPr>
-        <w:lastRenderedPageBreak/>
         <w:t>Dataset Acquisition (For ML):</w:t>
       </w:r>
       <w:r>
@@ -3742,7 +3758,14 @@
         <w:rPr>
           <w:rFonts w:ascii="Arial" w:hAnsi="Arial" w:cs="Arial"/>
         </w:rPr>
-        <w:t xml:space="preserve"> The architecture is designed as a "Privacy-First" ecosystem. The diagram below illustrates the Client-Side processing, showing how the </w:t>
+        <w:t xml:space="preserve"> The architecture is designed as a "Privacy-First" ecosystem. The diagram below illustrates the Client-Side processing, </w:t>
+      </w:r>
+      <w:r>
+        <w:rPr>
+          <w:rFonts w:ascii="Arial" w:hAnsi="Arial" w:cs="Arial"/>
+        </w:rPr>
+        <w:lastRenderedPageBreak/>
+        <w:t xml:space="preserve">showing how the </w:t>
       </w:r>
       <w:r>
         <w:rPr>
@@ -3884,7 +3907,6 @@
           <w:b/>
           <w:bCs/>
         </w:rPr>
-        <w:lastRenderedPageBreak/>
         <w:t>Component Interaction Diagrams</w:t>
       </w:r>
       <w:r>
@@ -3987,8 +4009,9 @@
           <w:rFonts w:ascii="Arial" w:hAnsi="Arial" w:cs="Arial"/>
           <w:noProof/>
         </w:rPr>
+        <w:lastRenderedPageBreak/>
         <w:drawing>
-          <wp:inline distT="0" distB="0" distL="0" distR="0" wp14:anchorId="03F6A903" wp14:editId="51AA3F4D">
+          <wp:inline distT="0" distB="0" distL="0" distR="0" wp14:anchorId="03F6A903" wp14:editId="4B0D54C1">
             <wp:extent cx="5943600" cy="3032125"/>
             <wp:effectExtent l="0" t="0" r="0" b="0"/>
             <wp:docPr id="573649057" name="Picture 6" descr="A screenshot of a computer screen"/>
@@ -13006,7 +13029,6 @@
   <w:style w:type="character" w:default="1" w:styleId="DefaultParagraphFont">
     <w:name w:val="Default Paragraph Font"/>
     <w:uiPriority w:val="1"/>
-    <w:semiHidden/>
     <w:unhideWhenUsed/>
   </w:style>
   <w:style w:type="table" w:default="1" w:styleId="TableNormal">

</xml_diff>

<commit_message>
Added one more dataset
</commit_message>
<xml_diff>
--- a/Doc/Academic/Proposal/report_fyp1.docx
+++ b/Doc/Academic/Proposal/report_fyp1.docx
@@ -80,58 +80,125 @@
         <w:rPr>
           <w:rFonts w:ascii="Arial" w:hAnsi="Arial" w:cs="Arial"/>
         </w:rPr>
-        <w:t>One of the most critical challenges in modern business communication is securing internal messaging platforms. Organizations, especially Small and Medium Enterprises (SMEs), rely heavily on tools like Slack and Microsoft Teams for daily collaboration. However, these systems often depend on centralized servers to store user credentials, making them a prime target for cyberattacks. If a central database is breached, attackers can steal password hashes or session tokens to impersonate employees and access sensitive data. These attacks have changed from simple brute-force attempts to sophisticated session hijacking, as seen in recent major data breaches.</w:t>
-      </w:r>
-    </w:p>
-    <w:p>
-      <w:pPr>
-        <w:spacing w:line="360" w:lineRule="auto"/>
-        <w:rPr>
-          <w:rFonts w:ascii="Arial" w:hAnsi="Arial" w:cs="Arial"/>
-        </w:rPr>
-      </w:pPr>
-    </w:p>
-    <w:p>
-      <w:pPr>
-        <w:spacing w:line="360" w:lineRule="auto"/>
-        <w:rPr>
-          <w:rFonts w:ascii="Arial" w:hAnsi="Arial" w:cs="Arial"/>
-        </w:rPr>
-      </w:pPr>
-      <w:r>
-        <w:rPr>
-          <w:rFonts w:ascii="Arial" w:hAnsi="Arial" w:cs="Arial"/>
-        </w:rPr>
-        <w:t>Insider threats and malware distribution are also growing problems. While End-to-End Encryption (E2EE) protects data while it moves across the network, it creates a "blind spot" for security teams. Traditional server-side scanners cannot see inside encrypted messages to find malware or suspicious behavior. This means that malicious insiders or compromised accounts can send harmful links or files without being detected by the server.</w:t>
-      </w:r>
-    </w:p>
-    <w:p>
-      <w:pPr>
-        <w:spacing w:line="360" w:lineRule="auto"/>
-        <w:rPr>
-          <w:rFonts w:ascii="Arial" w:hAnsi="Arial" w:cs="Arial"/>
-        </w:rPr>
-      </w:pPr>
-    </w:p>
-    <w:p>
-      <w:pPr>
-        <w:spacing w:line="360" w:lineRule="auto"/>
-        <w:rPr>
-          <w:rFonts w:ascii="Arial" w:hAnsi="Arial" w:cs="Arial"/>
-        </w:rPr>
-      </w:pPr>
-      <w:r>
-        <w:rPr>
-          <w:rFonts w:ascii="Arial" w:hAnsi="Arial" w:cs="Arial"/>
-        </w:rPr>
-        <w:t xml:space="preserve">To address these issues, this project introduces a secure communication framework. It combines Zero-Knowledge Proofs (ZKP) to authenticate users without sending passwords over the network, and on-device Artificial Intelligence (AI) to detect threats locally on the user's phone. This is the direction that this project is going. Its goal is to create a system that eliminates credential theft risks by verifying identity mathematically and uses lightweight AI to find anomalies without breaking user privacy. This project </w:t>
-      </w:r>
-      <w:r>
-        <w:rPr>
-          <w:rFonts w:ascii="Arial" w:hAnsi="Arial" w:cs="Arial"/>
-        </w:rPr>
-        <w:lastRenderedPageBreak/>
-        <w:t>mainly looks at the integration of the Groth16 ZKP protocol and TensorFlow Lite models for identifying behavioral anomalies in a mobile environment.</w:t>
+        <w:t>Security of private messaging apps poses a major hurdle in today's workplace talk. Firms</w:t>
+      </w:r>
+      <w:r>
+        <w:rPr>
+          <w:rFonts w:ascii="Arial" w:hAnsi="Arial" w:cs="Arial"/>
+        </w:rPr>
+        <w:t>,</w:t>
+      </w:r>
+      <w:r>
+        <w:rPr>
+          <w:rFonts w:ascii="Arial" w:hAnsi="Arial" w:cs="Arial"/>
+        </w:rPr>
+        <w:t xml:space="preserve"> particularly smaller </w:t>
+      </w:r>
+      <w:proofErr w:type="gramStart"/>
+      <w:r>
+        <w:rPr>
+          <w:rFonts w:ascii="Arial" w:hAnsi="Arial" w:cs="Arial"/>
+        </w:rPr>
+        <w:t>ones</w:t>
+      </w:r>
+      <w:proofErr w:type="gramEnd"/>
+      <w:r>
+        <w:rPr>
+          <w:rFonts w:ascii="Arial" w:hAnsi="Arial" w:cs="Arial"/>
+        </w:rPr>
+        <w:t xml:space="preserve"> </w:t>
+      </w:r>
+      <w:r>
+        <w:rPr>
+          <w:rFonts w:ascii="Arial" w:hAnsi="Arial" w:cs="Arial"/>
+        </w:rPr>
+        <w:t>lean on software such as Slack or Teams to stay connected throughout the day. Yet those services usually save login details on shared digital hubs, turning them into easy spots for hackers to strike. When a main database gets compromised, intruders might take password hashes or access keys, letting them pretend to be workers while gaining entry to private information. Instead of just forcing passwords, hackers now often steal entire sessions, just like we saw in big leaks lately.</w:t>
+      </w:r>
+    </w:p>
+    <w:p>
+      <w:pPr>
+        <w:spacing w:line="360" w:lineRule="auto"/>
+        <w:rPr>
+          <w:rFonts w:ascii="Arial" w:hAnsi="Arial" w:cs="Arial"/>
+        </w:rPr>
+      </w:pPr>
+    </w:p>
+    <w:p>
+      <w:pPr>
+        <w:spacing w:line="360" w:lineRule="auto"/>
+        <w:rPr>
+          <w:rFonts w:ascii="Arial" w:hAnsi="Arial" w:cs="Arial"/>
+        </w:rPr>
+      </w:pPr>
+      <w:r>
+        <w:rPr>
+          <w:rFonts w:ascii="Arial" w:hAnsi="Arial" w:cs="Arial"/>
+        </w:rPr>
+        <w:t xml:space="preserve">Nowadays, inside risks along with malware spreading become more common issues. Even though E2EE </w:t>
+      </w:r>
+      <w:proofErr w:type="gramStart"/>
+      <w:r>
+        <w:rPr>
+          <w:rFonts w:ascii="Arial" w:hAnsi="Arial" w:cs="Arial"/>
+        </w:rPr>
+        <w:t>guards</w:t>
+      </w:r>
+      <w:proofErr w:type="gramEnd"/>
+      <w:r>
+        <w:rPr>
+          <w:rFonts w:ascii="Arial" w:hAnsi="Arial" w:cs="Arial"/>
+        </w:rPr>
+        <w:t xml:space="preserve"> data during transport, security experts lose visibility. Scanners used on regular servers fail because they cannot access </w:t>
+      </w:r>
+      <w:proofErr w:type="gramStart"/>
+      <w:r>
+        <w:rPr>
+          <w:rFonts w:ascii="Arial" w:hAnsi="Arial" w:cs="Arial"/>
+        </w:rPr>
+        <w:t>contents</w:t>
+      </w:r>
+      <w:proofErr w:type="gramEnd"/>
+      <w:r>
+        <w:rPr>
+          <w:rFonts w:ascii="Arial" w:hAnsi="Arial" w:cs="Arial"/>
+        </w:rPr>
+        <w:t xml:space="preserve"> inside encrypted chats. That missing insight leaves defenses weakened. </w:t>
+      </w:r>
+      <w:proofErr w:type="gramStart"/>
+      <w:r>
+        <w:rPr>
+          <w:rFonts w:ascii="Arial" w:hAnsi="Arial" w:cs="Arial"/>
+        </w:rPr>
+        <w:t>So</w:t>
+      </w:r>
+      <w:proofErr w:type="gramEnd"/>
+      <w:r>
+        <w:rPr>
+          <w:rFonts w:ascii="Arial" w:hAnsi="Arial" w:cs="Arial"/>
+        </w:rPr>
+        <w:t xml:space="preserve"> someone on the inside, either acting badly or pressured, might pass dirty messages or downloads and those go right past what the server checks for.</w:t>
+      </w:r>
+    </w:p>
+    <w:p>
+      <w:pPr>
+        <w:spacing w:line="360" w:lineRule="auto"/>
+        <w:rPr>
+          <w:rFonts w:ascii="Arial" w:hAnsi="Arial" w:cs="Arial"/>
+        </w:rPr>
+      </w:pPr>
+    </w:p>
+    <w:p>
+      <w:pPr>
+        <w:spacing w:line="360" w:lineRule="auto"/>
+        <w:rPr>
+          <w:rFonts w:ascii="Arial" w:hAnsi="Arial" w:cs="Arial"/>
+        </w:rPr>
+      </w:pPr>
+      <w:r>
+        <w:rPr>
+          <w:rFonts w:ascii="Arial" w:hAnsi="Arial" w:cs="Arial"/>
+        </w:rPr>
+        <w:t>To address these issues, this project introduces a secure communication framework. It combines Zero-Knowledge Proofs (ZKP) to authenticate users without sending passwords over the network, and on-device Artificial Intelligence (AI) to detect threats locally on the user's phone. This is the direction that this project is going. Its goal is to create a system that eliminates credential theft risks by verifying identity mathematically and uses lightweight AI to find anomalies without breaking user privacy. This project mainly looks at the integration of the Groth16 ZKP protocol and TensorFlow Lite models for identifying behavioral anomalies in a mobile environment.</w:t>
       </w:r>
     </w:p>
     <w:p>
@@ -189,33 +256,21 @@
         <w:rPr>
           <w:rFonts w:ascii="Arial" w:hAnsi="Arial" w:cs="Arial"/>
         </w:rPr>
-        <w:t xml:space="preserve">Authentication in messaging systems has been studied in a number of different ways. Traditional methods rely on hashing and salting passwords stored in a central database. However, research shows that centralized storage remains a single point of failure. Attackers can exploit stolen session tokens to bypass Multi-Factor Authentication (MFA) and expose internal communications (Threat modeling for enterprise secure messaging applications, 2025). To solve this, researchers have looked at Zero-Knowledge Proofs (ZKPs). For example, </w:t>
-      </w:r>
-      <w:r>
-        <w:rPr>
-          <w:rFonts w:ascii="Arial" w:hAnsi="Arial" w:cs="Arial"/>
-        </w:rPr>
-        <w:t>enhancing</w:t>
-      </w:r>
-      <w:r>
-        <w:rPr>
-          <w:rFonts w:ascii="Arial" w:hAnsi="Arial" w:cs="Arial"/>
-        </w:rPr>
-        <w:t xml:space="preserve"> digital privacy: The application of zero-knowledge proofs in authentication systems (2024) proposes using zk-SNARKs to verify users without data transmission. This allows a user to prove they know a password without </w:t>
-      </w:r>
-      <w:proofErr w:type="gramStart"/>
-      <w:r>
-        <w:rPr>
-          <w:rFonts w:ascii="Arial" w:hAnsi="Arial" w:cs="Arial"/>
-        </w:rPr>
-        <w:t>actually revealing</w:t>
-      </w:r>
-      <w:proofErr w:type="gramEnd"/>
-      <w:r>
-        <w:rPr>
-          <w:rFonts w:ascii="Arial" w:hAnsi="Arial" w:cs="Arial"/>
-        </w:rPr>
-        <w:t xml:space="preserve"> it to the server.</w:t>
+        <w:t xml:space="preserve">In messaging setups, logging in gets explored through various means. Passwords often sit in one main storage spot, hashed and salted for safety. Yet findings point out flaws that central spot can crash everything if it fails. Session tokens in wrong hands might slip past Multi-Factor Authentication, letting attackers see private messages inside companies (Threat modeling for enterprise secure messaging applications, 2025). A fresh look at security could start with Zero-Knowledge Proofs. Backed by research from 2024 into how logins get verified, using </w:t>
+      </w:r>
+      <w:proofErr w:type="spellStart"/>
+      <w:r>
+        <w:rPr>
+          <w:rFonts w:ascii="Arial" w:hAnsi="Arial" w:cs="Arial"/>
+        </w:rPr>
+        <w:t>zk</w:t>
+      </w:r>
+      <w:proofErr w:type="spellEnd"/>
+      <w:r>
+        <w:rPr>
+          <w:rFonts w:ascii="Arial" w:hAnsi="Arial" w:cs="Arial"/>
+        </w:rPr>
+        <w:t>-SNARKs allows checks on who someone is without moving any personal details around. Rather than posting secrets out loud, a person might prove they know a password by demonstrating it without revealing the actual code to the server.</w:t>
       </w:r>
     </w:p>
     <w:p>
@@ -259,49 +314,29 @@
         <w:rPr>
           <w:rFonts w:ascii="Arial" w:hAnsi="Arial" w:cs="Arial"/>
         </w:rPr>
-        <w:t xml:space="preserve">Some research looks at things more generally by moving detection to the "edge" or the device itself. AI-driven smishing detection in Android devices using </w:t>
-      </w:r>
-      <w:r>
-        <w:rPr>
-          <w:rFonts w:ascii="Arial" w:hAnsi="Arial" w:cs="Arial"/>
-        </w:rPr>
-        <w:t>Tiny BERT</w:t>
-      </w:r>
-      <w:r>
-        <w:rPr>
-          <w:rFonts w:ascii="Arial" w:hAnsi="Arial" w:cs="Arial"/>
-        </w:rPr>
-        <w:t xml:space="preserve"> (2025) and PHILDER: Lightweight framework for intelligent phishing detection on resource-limited devices (2025) demonstrate that lightweight models can run effectively on smartphones. These studies show that high accuracy (96%+) can be achieved locally, </w:t>
-      </w:r>
-      <w:r>
-        <w:rPr>
-          <w:rFonts w:ascii="Arial" w:hAnsi="Arial" w:cs="Arial"/>
+        <w:t xml:space="preserve">Some research looks at things more generally by moving detection to </w:t>
+      </w:r>
+      <w:r>
+        <w:rPr>
+          <w:rFonts w:ascii="Arial" w:hAnsi="Arial" w:cs="Arial"/>
+        </w:rPr>
+        <w:t>the device’s edge or local level. Take AI-powered smishing spotting on Android phones - recent efforts like Tiny BERT (2025) and the PHILDER setup (2025) for low-end gadgets - they prove compact AI setups handle tasks well. Accuracy hits 96% or higher right there on the phone. That means less delay plus better control over personal data. Running things locally means stronger privacy and faster results. Still, nearly all current fixes aim at spotting fake texts or suspicious links instead of watching user actions live inside secure message chats.</w:t>
+      </w:r>
+    </w:p>
+    <w:p>
+      <w:pPr>
+        <w:spacing w:line="360" w:lineRule="auto"/>
+        <w:rPr>
+          <w:rFonts w:ascii="Arial" w:hAnsi="Arial" w:cs="Arial"/>
+        </w:rPr>
+      </w:pPr>
+      <w:r>
+        <w:rPr>
+          <w:rFonts w:ascii="Arial" w:hAnsi="Arial" w:cs="Arial"/>
+          <w:b/>
+          <w:bCs/>
         </w:rPr>
         <w:lastRenderedPageBreak/>
-        <w:t>preserving privacy and reducing latency. However, most of these solutions focus on SMS (smishing) or URL detection, rather than real-time behavioral analysis within an encrypted chat session.</w:t>
-      </w:r>
-    </w:p>
-    <w:p>
-      <w:pPr>
-        <w:spacing w:line="360" w:lineRule="auto"/>
-        <w:rPr>
-          <w:rFonts w:ascii="Arial" w:hAnsi="Arial" w:cs="Arial"/>
-        </w:rPr>
-      </w:pPr>
-    </w:p>
-    <w:p>
-      <w:pPr>
-        <w:spacing w:line="360" w:lineRule="auto"/>
-        <w:rPr>
-          <w:rFonts w:ascii="Arial" w:hAnsi="Arial" w:cs="Arial"/>
-        </w:rPr>
-      </w:pPr>
-      <w:r>
-        <w:rPr>
-          <w:rFonts w:ascii="Arial" w:hAnsi="Arial" w:cs="Arial"/>
-          <w:b/>
-          <w:bCs/>
-        </w:rPr>
         <w:t>Implications for this project:</w:t>
       </w:r>
     </w:p>
@@ -416,7 +451,7 @@
         <w:rPr>
           <w:rFonts w:ascii="Arial" w:hAnsi="Arial" w:cs="Arial"/>
         </w:rPr>
-        <w:t>Many organizations rely on platforms that store hashed credentials on their servers. Real-world incidents, such as the 2023 Slack data breach, demonstrate that attackers can exploit stolen session tokens or database leaks to access internal communications. Even with MFA, the underlying reliance on stored secrets makes the system vulnerable to data breaches (Threat modeling for enterprise secure messaging applications, 2025). This project addresses this problem by implementing Zero-Knowledge Proof authentication: the server never stores passwords or hashes, only mathematical commitments that are useless to an attacker.</w:t>
+        <w:t>Some companies use systems that hold hashed login details locally. Take what happened with Slack in 2023 - hackers used stolen tokens or exposed info inside company databases, letting them read work chats. Stored secrets, even with extra login steps, leave gaps when breaches occur (Threat modeling for enterprise secure messaging applications, 2025). This project tackles that issue using Zero-Knowledge Proof authentication - the server keeps no passwords, just math-based commitments that leave intruders empty-handed</w:t>
       </w:r>
     </w:p>
     <w:p>
@@ -445,39 +480,68 @@
           <w:b/>
           <w:bCs/>
         </w:rPr>
+        <w:t>End-to-End Encryption creates a "blind spot" for threat detection.</w:t>
+      </w:r>
+      <w:r>
+        <w:rPr>
+          <w:rFonts w:ascii="Arial" w:hAnsi="Arial" w:cs="Arial"/>
+        </w:rPr>
+        <w:t xml:space="preserve"> </w:t>
+      </w:r>
+    </w:p>
+    <w:p>
+      <w:pPr>
+        <w:spacing w:line="360" w:lineRule="auto"/>
+        <w:ind w:left="720"/>
+        <w:rPr>
+          <w:rFonts w:ascii="Arial" w:hAnsi="Arial" w:cs="Arial"/>
+        </w:rPr>
+      </w:pPr>
+      <w:r>
+        <w:rPr>
+          <w:rFonts w:ascii="Arial" w:hAnsi="Arial" w:cs="Arial"/>
+        </w:rPr>
+        <w:t xml:space="preserve">Even though scrambling messages </w:t>
+      </w:r>
+      <w:proofErr w:type="gramStart"/>
+      <w:r>
+        <w:rPr>
+          <w:rFonts w:ascii="Arial" w:hAnsi="Arial" w:cs="Arial"/>
+        </w:rPr>
+        <w:t>shields</w:t>
+      </w:r>
+      <w:proofErr w:type="gramEnd"/>
+      <w:r>
+        <w:rPr>
+          <w:rFonts w:ascii="Arial" w:hAnsi="Arial" w:cs="Arial"/>
+        </w:rPr>
+        <w:t xml:space="preserve"> them from outsiders, it also hides what servers can check for danger. Take 2025</w:t>
+      </w:r>
+      <w:r>
+        <w:rPr>
+          <w:rFonts w:ascii="Arial" w:hAnsi="Arial" w:cs="Arial"/>
+        </w:rPr>
+        <w:t>,</w:t>
+      </w:r>
+      <w:r>
+        <w:rPr>
+          <w:rFonts w:ascii="Arial" w:hAnsi="Arial" w:cs="Arial"/>
+        </w:rPr>
+        <w:t xml:space="preserve"> attackers slipped harmful code through Discord invite links buried in everyday talk (AI-driven smishing detection in Android devices, 2025). Right now, there’s no live system spotting hidden risks or odd behavior since the machine never reads the actual words being sent. Local processing now handles detection, shifting tasks to the user's device </w:t>
+      </w:r>
+      <w:r>
+        <w:rPr>
+          <w:rFonts w:ascii="Arial" w:hAnsi="Arial" w:cs="Arial"/>
+        </w:rPr>
         <w:lastRenderedPageBreak/>
-        <w:t>End-to-End Encryption creates a "blind spot" for threat detection.</w:t>
-      </w:r>
-      <w:r>
-        <w:rPr>
-          <w:rFonts w:ascii="Arial" w:hAnsi="Arial" w:cs="Arial"/>
-        </w:rPr>
-        <w:t xml:space="preserve"> </w:t>
-      </w:r>
-    </w:p>
-    <w:p>
-      <w:pPr>
-        <w:spacing w:line="360" w:lineRule="auto"/>
-        <w:ind w:left="720"/>
-        <w:rPr>
-          <w:rFonts w:ascii="Arial" w:hAnsi="Arial" w:cs="Arial"/>
-        </w:rPr>
-      </w:pPr>
-      <w:r>
-        <w:rPr>
-          <w:rFonts w:ascii="Arial" w:hAnsi="Arial" w:cs="Arial"/>
-        </w:rPr>
-        <w:t>While encryption secures message content from external eavesdropping, it simultaneously prevents servers from analyzing chats for threats. For instance, in 2025, attackers used Discord invite links to deliver malware undetected within normal chat flows (AI-driven smishing detection in Android devices, 2025). There is currently a lack of real-time detection for insider threats or malicious patterns because the server cannot "see" the message content. This project responds by moving the detection logic to the client device using on-device AI, allowing the system to identify risky behavior locally without breaking encryption keys.</w:t>
-      </w:r>
-    </w:p>
-    <w:p>
-      <w:pPr>
-        <w:pStyle w:val="Heading2"/>
-        <w:rPr>
-          <w:rFonts w:ascii="Arial" w:hAnsi="Arial" w:cs="Arial"/>
-          <w:b/>
-          <w:bCs/>
-          <w:color w:val="auto"/>
+        <w:t>through encrypted AI processing. Risk assessment occurs where data resides, skipping central hubs. Behavior analysis happens privately, maintaining control over sensitive information. Decryption is not required for insights, since evaluation takes place offline. Security stays intact because no cleartext data travels outside the endpoint. Performance improves since network traffic drops out of the loop. The shift keeps confidentiality without relying on optional trust platforms.</w:t>
+      </w:r>
+    </w:p>
+    <w:p>
+      <w:pPr>
+        <w:spacing w:line="360" w:lineRule="auto"/>
+        <w:rPr>
+          <w:rFonts w:ascii="Arial" w:hAnsi="Arial" w:cs="Arial"/>
         </w:rPr>
       </w:pPr>
     </w:p>
@@ -503,60 +567,22 @@
           <w:bCs/>
           <w:color w:val="auto"/>
         </w:rPr>
-        <w:t>Aim and Objectives</w:t>
-      </w:r>
-    </w:p>
-    <w:p>
-      <w:pPr>
-        <w:spacing w:line="360" w:lineRule="auto"/>
-        <w:ind w:firstLine="528"/>
-        <w:rPr>
-          <w:rFonts w:ascii="Arial" w:hAnsi="Arial" w:cs="Arial"/>
-        </w:rPr>
-      </w:pPr>
-      <w:r>
-        <w:rPr>
-          <w:rFonts w:ascii="Arial" w:hAnsi="Arial" w:cs="Arial"/>
-        </w:rPr>
-        <w:t xml:space="preserve">The </w:t>
-      </w:r>
-      <w:r>
-        <w:rPr>
-          <w:rFonts w:ascii="Arial" w:hAnsi="Arial" w:cs="Arial"/>
-          <w:b/>
-          <w:bCs/>
-        </w:rPr>
-        <w:t>aim</w:t>
-      </w:r>
-      <w:r>
-        <w:rPr>
-          <w:rFonts w:ascii="Arial" w:hAnsi="Arial" w:cs="Arial"/>
-        </w:rPr>
-        <w:t xml:space="preserve"> of this project is: </w:t>
-      </w:r>
-    </w:p>
-    <w:p>
-      <w:pPr>
-        <w:spacing w:line="360" w:lineRule="auto"/>
-        <w:ind w:left="720"/>
-        <w:rPr>
-          <w:rFonts w:ascii="Arial" w:hAnsi="Arial" w:cs="Arial"/>
-        </w:rPr>
-      </w:pPr>
-      <w:r>
-        <w:rPr>
-          <w:rFonts w:ascii="Arial" w:hAnsi="Arial" w:cs="Arial"/>
-        </w:rPr>
-        <w:t>To develop a secure internal chat application integrating Zero-Knowledge Proof (ZKP) authentication and on-device AI anomaly detection.</w:t>
-      </w:r>
-    </w:p>
-    <w:p>
-      <w:pPr>
-        <w:spacing w:line="360" w:lineRule="auto"/>
-        <w:rPr>
-          <w:rFonts w:ascii="Arial" w:hAnsi="Arial" w:cs="Arial"/>
-        </w:rPr>
-      </w:pPr>
+        <w:t>Objectives</w:t>
+      </w:r>
+    </w:p>
+    <w:p>
+      <w:pPr>
+        <w:spacing w:line="360" w:lineRule="auto"/>
+        <w:rPr>
+          <w:rFonts w:ascii="Arial" w:hAnsi="Arial" w:cs="Arial"/>
+        </w:rPr>
+      </w:pPr>
+      <w:r>
+        <w:rPr>
+          <w:rFonts w:ascii="Arial" w:hAnsi="Arial" w:cs="Arial"/>
+        </w:rPr>
+        <w:t>The aim of this project is to develop a secure internal chat application for SMEs that integrates Zero-Knowledge Proof (ZKP) authentication and on-device AI anomaly detection to eliminate credential theft and detect insider threats without compromising user privacy.</w:t>
+      </w:r>
     </w:p>
     <w:p>
       <w:pPr>
@@ -574,68 +600,214 @@
     </w:p>
     <w:p>
       <w:pPr>
-        <w:pStyle w:val="ListParagraph"/>
-        <w:numPr>
-          <w:ilvl w:val="0"/>
-          <w:numId w:val="3"/>
-        </w:numPr>
-        <w:spacing w:line="360" w:lineRule="auto"/>
-        <w:rPr>
-          <w:rFonts w:ascii="Arial" w:hAnsi="Arial" w:cs="Arial"/>
-        </w:rPr>
-      </w:pPr>
-      <w:r>
-        <w:rPr>
-          <w:rFonts w:ascii="Arial" w:hAnsi="Arial" w:cs="Arial"/>
-        </w:rPr>
-        <w:t>To study existing authentication and anomaly detection methods in internal messaging systems and identify their security limitations.</w:t>
-      </w:r>
-    </w:p>
-    <w:p>
-      <w:pPr>
-        <w:pStyle w:val="ListParagraph"/>
-        <w:numPr>
-          <w:ilvl w:val="0"/>
-          <w:numId w:val="3"/>
-        </w:numPr>
-        <w:spacing w:line="360" w:lineRule="auto"/>
-        <w:rPr>
-          <w:rFonts w:ascii="Arial" w:hAnsi="Arial" w:cs="Arial"/>
-        </w:rPr>
-      </w:pPr>
-      <w:r>
-        <w:rPr>
-          <w:rFonts w:ascii="Arial" w:hAnsi="Arial" w:cs="Arial"/>
-        </w:rPr>
-        <w:t>To develop a secure internal chat application integrating Zero-Knowledge Proof authentication and on-device AI anomaly detection.</w:t>
-      </w:r>
-    </w:p>
-    <w:p>
-      <w:pPr>
-        <w:pStyle w:val="ListParagraph"/>
-        <w:numPr>
-          <w:ilvl w:val="0"/>
-          <w:numId w:val="3"/>
-        </w:numPr>
-        <w:spacing w:line="360" w:lineRule="auto"/>
-        <w:rPr>
-          <w:rFonts w:ascii="Arial" w:hAnsi="Arial" w:cs="Arial"/>
-        </w:rPr>
-      </w:pPr>
-      <w:r>
-        <w:rPr>
-          <w:rFonts w:ascii="Arial" w:hAnsi="Arial" w:cs="Arial"/>
-        </w:rPr>
-        <w:t>To test the system’s effectiveness in preventing unauthorized access and detecting suspicious behavior without compromising privacy.</w:t>
-      </w:r>
-    </w:p>
-    <w:p>
-      <w:pPr>
-        <w:spacing w:line="360" w:lineRule="auto"/>
-        <w:rPr>
-          <w:rFonts w:ascii="Arial" w:hAnsi="Arial" w:cs="Arial"/>
-        </w:rPr>
-      </w:pPr>
+        <w:spacing w:line="360" w:lineRule="auto"/>
+        <w:rPr>
+          <w:rFonts w:ascii="Arial" w:hAnsi="Arial" w:cs="Arial"/>
+        </w:rPr>
+      </w:pPr>
+      <w:r>
+        <w:rPr>
+          <w:rFonts w:ascii="Arial" w:hAnsi="Arial" w:cs="Arial"/>
+          <w:b/>
+          <w:bCs/>
+        </w:rPr>
+        <w:t>1. To study existing authentication and anomaly detection methods in internal messaging systems and identify their security limitations.</w:t>
+      </w:r>
+    </w:p>
+    <w:p>
+      <w:pPr>
+        <w:spacing w:line="360" w:lineRule="auto"/>
+        <w:rPr>
+          <w:rFonts w:ascii="Arial" w:hAnsi="Arial" w:cs="Arial"/>
+        </w:rPr>
+      </w:pPr>
+      <w:r>
+        <w:rPr>
+          <w:rFonts w:ascii="Arial" w:hAnsi="Arial" w:cs="Arial"/>
+        </w:rPr>
+        <w:t xml:space="preserve">This involves investigating the security architecture of current End-to-End Encrypted (E2EE) platforms to understand why manual authentication ceremonies fail and how centralized credential storage creates single points of failure. Detailed research will be conducted on the mathematics of the </w:t>
+      </w:r>
+      <w:r>
+        <w:rPr>
+          <w:rFonts w:ascii="Arial" w:hAnsi="Arial" w:cs="Arial"/>
+          <w:b/>
+          <w:bCs/>
+        </w:rPr>
+        <w:t xml:space="preserve">Groth16 </w:t>
+      </w:r>
+      <w:proofErr w:type="spellStart"/>
+      <w:r>
+        <w:rPr>
+          <w:rFonts w:ascii="Arial" w:hAnsi="Arial" w:cs="Arial"/>
+          <w:b/>
+          <w:bCs/>
+        </w:rPr>
+        <w:t>zk</w:t>
+      </w:r>
+      <w:proofErr w:type="spellEnd"/>
+      <w:r>
+        <w:rPr>
+          <w:rFonts w:ascii="Arial" w:hAnsi="Arial" w:cs="Arial"/>
+          <w:b/>
+          <w:bCs/>
+        </w:rPr>
+        <w:t>-SNARK protocol</w:t>
+      </w:r>
+      <w:r>
+        <w:rPr>
+          <w:rFonts w:ascii="Arial" w:hAnsi="Arial" w:cs="Arial"/>
+        </w:rPr>
+        <w:t xml:space="preserve"> to understand how it allows for password-less verification. Furthermore, the study will analyze different </w:t>
+      </w:r>
+      <w:r>
+        <w:rPr>
+          <w:rFonts w:ascii="Arial" w:hAnsi="Arial" w:cs="Arial"/>
+          <w:b/>
+          <w:bCs/>
+        </w:rPr>
+        <w:t>Machine Learning architectures</w:t>
+      </w:r>
+      <w:r>
+        <w:rPr>
+          <w:rFonts w:ascii="Arial" w:hAnsi="Arial" w:cs="Arial"/>
+        </w:rPr>
+        <w:t>, specifically comparing Cloud-based detection versus Edge AI (On-Device) methods. This is crucial to identify how heavy models like Isolation Forests can be optimized for mobile processors (TensorFlow Lite) to detect behavioral anomalies such as phishing links or unusual login times without sending private data to a central server.</w:t>
+      </w:r>
+    </w:p>
+    <w:p>
+      <w:pPr>
+        <w:spacing w:line="360" w:lineRule="auto"/>
+        <w:rPr>
+          <w:rFonts w:ascii="Arial" w:hAnsi="Arial" w:cs="Arial"/>
+        </w:rPr>
+      </w:pPr>
+      <w:r>
+        <w:rPr>
+          <w:rFonts w:ascii="Arial" w:hAnsi="Arial" w:cs="Arial"/>
+          <w:b/>
+          <w:bCs/>
+        </w:rPr>
+        <w:t>2. To develop a secure internal chat application integrating Zero-Knowledge Proof authentication and on-device AI anomaly detection.</w:t>
+      </w:r>
+    </w:p>
+    <w:p>
+      <w:pPr>
+        <w:spacing w:line="360" w:lineRule="auto"/>
+        <w:rPr>
+          <w:rFonts w:ascii="Arial" w:hAnsi="Arial" w:cs="Arial"/>
+        </w:rPr>
+      </w:pPr>
+      <w:r>
+        <w:rPr>
+          <w:rFonts w:ascii="Arial" w:hAnsi="Arial" w:cs="Arial"/>
+        </w:rPr>
+        <w:lastRenderedPageBreak/>
+        <w:t xml:space="preserve">This means building a "Privacy-First" ecosystem through engineering, done via Rapid Application Development (RAD). Writing happens alongside custom cryptographic circuits built with </w:t>
+      </w:r>
+      <w:proofErr w:type="spellStart"/>
+      <w:r>
+        <w:rPr>
+          <w:rFonts w:ascii="Arial" w:hAnsi="Arial" w:cs="Arial"/>
+        </w:rPr>
+        <w:t>Circom</w:t>
+      </w:r>
+      <w:proofErr w:type="spellEnd"/>
+      <w:r>
+        <w:rPr>
+          <w:rFonts w:ascii="Arial" w:hAnsi="Arial" w:cs="Arial"/>
+        </w:rPr>
+        <w:t xml:space="preserve"> - proof creation runs on clients’ devices. Because of this setup, no passwords exit the user’s gadget during login attempts. At the same time, another task unfolds: teaching a TensorFlow Lite model until it fits within a Flutter mobile app. That model runs under its own logic, baked into the app’s structure. In operation, the system picks up user input as it happens, breaking down message details to work out a risk level on the fly - all without touching the AES-256 lock that guards data exchange. Real-time processing feeds into how tokens are split apart, keeping things local yet accurate.</w:t>
+      </w:r>
+    </w:p>
+    <w:p>
+      <w:pPr>
+        <w:spacing w:line="360" w:lineRule="auto"/>
+        <w:rPr>
+          <w:rFonts w:ascii="Arial" w:hAnsi="Arial" w:cs="Arial"/>
+        </w:rPr>
+      </w:pPr>
+      <w:r>
+        <w:rPr>
+          <w:rFonts w:ascii="Arial" w:hAnsi="Arial" w:cs="Arial"/>
+          <w:b/>
+          <w:bCs/>
+        </w:rPr>
+        <w:t xml:space="preserve">3. To test </w:t>
+      </w:r>
+      <w:proofErr w:type="gramStart"/>
+      <w:r>
+        <w:rPr>
+          <w:rFonts w:ascii="Arial" w:hAnsi="Arial" w:cs="Arial"/>
+          <w:b/>
+          <w:bCs/>
+        </w:rPr>
+        <w:t>the System</w:t>
+      </w:r>
+      <w:proofErr w:type="gramEnd"/>
+      <w:r>
+        <w:rPr>
+          <w:rFonts w:ascii="Arial" w:hAnsi="Arial" w:cs="Arial"/>
+          <w:b/>
+          <w:bCs/>
+        </w:rPr>
+        <w:t xml:space="preserve"> Functionality and Security Level effectiveness.</w:t>
+      </w:r>
+    </w:p>
+    <w:p>
+      <w:pPr>
+        <w:spacing w:line="360" w:lineRule="auto"/>
+        <w:rPr>
+          <w:rFonts w:ascii="Arial" w:hAnsi="Arial" w:cs="Arial"/>
+        </w:rPr>
+      </w:pPr>
+      <w:r>
+        <w:rPr>
+          <w:rFonts w:ascii="Arial" w:hAnsi="Arial" w:cs="Arial"/>
+        </w:rPr>
+        <w:t xml:space="preserve">This involves conducting a series of performance and security tests to benchmark the system against standard metrics. The testing phase will focus on three key areas: </w:t>
+      </w:r>
+      <w:r>
+        <w:rPr>
+          <w:rFonts w:ascii="Arial" w:hAnsi="Arial" w:cs="Arial"/>
+          <w:b/>
+          <w:bCs/>
+        </w:rPr>
+        <w:t>Authentication Latency</w:t>
+      </w:r>
+      <w:r>
+        <w:rPr>
+          <w:rFonts w:ascii="Arial" w:hAnsi="Arial" w:cs="Arial"/>
+        </w:rPr>
+        <w:t xml:space="preserve">, measuring the time required to generate and verify ZKP proofs on standard mobile hardware; </w:t>
+      </w:r>
+      <w:r>
+        <w:rPr>
+          <w:rFonts w:ascii="Arial" w:hAnsi="Arial" w:cs="Arial"/>
+          <w:b/>
+          <w:bCs/>
+        </w:rPr>
+        <w:t>Detection Accuracy</w:t>
+      </w:r>
+      <w:r>
+        <w:rPr>
+          <w:rFonts w:ascii="Arial" w:hAnsi="Arial" w:cs="Arial"/>
+        </w:rPr>
+        <w:t xml:space="preserve">, using datasets of known social engineering attacks to verify if the on-device AI correctly flags malicious content with minimal false positives; and </w:t>
+      </w:r>
+      <w:r>
+        <w:rPr>
+          <w:rFonts w:ascii="Arial" w:hAnsi="Arial" w:cs="Arial"/>
+          <w:b/>
+          <w:bCs/>
+        </w:rPr>
+        <w:t>Privacy Auditing</w:t>
+      </w:r>
+      <w:r>
+        <w:rPr>
+          <w:rFonts w:ascii="Arial" w:hAnsi="Arial" w:cs="Arial"/>
+        </w:rPr>
+        <w:t>, ensuring that even during a simulated server breach, no usable credentials or plaintext messages can be extracted from the database.</w:t>
+      </w:r>
     </w:p>
     <w:p>
       <w:pPr>
@@ -675,100 +847,430 @@
           <w:bCs/>
           <w:color w:val="auto"/>
         </w:rPr>
+        <w:t>Project Scope</w:t>
+      </w:r>
+    </w:p>
+    <w:p>
+      <w:pPr>
+        <w:spacing w:line="360" w:lineRule="auto"/>
+        <w:rPr>
+          <w:rFonts w:ascii="Arial" w:hAnsi="Arial" w:cs="Arial"/>
+        </w:rPr>
+      </w:pPr>
+      <w:r>
+        <w:rPr>
+          <w:rFonts w:ascii="Arial" w:hAnsi="Arial" w:cs="Arial"/>
+        </w:rPr>
+        <w:t>The scope of this project is designed to deliver a high-security communication tool tailored for professional environments. It encompasses the following key areas:</w:t>
+      </w:r>
+    </w:p>
+    <w:p>
+      <w:pPr>
+        <w:spacing w:line="360" w:lineRule="auto"/>
+        <w:rPr>
+          <w:rFonts w:ascii="Arial" w:hAnsi="Arial" w:cs="Arial"/>
+        </w:rPr>
+      </w:pPr>
+      <w:r>
+        <w:rPr>
+          <w:rFonts w:ascii="Arial" w:hAnsi="Arial" w:cs="Arial"/>
+          <w:b/>
+          <w:bCs/>
+        </w:rPr>
+        <w:t>Target Users</w:t>
+      </w:r>
+      <w:r>
+        <w:rPr>
+          <w:rFonts w:ascii="Arial" w:hAnsi="Arial" w:cs="Arial"/>
+        </w:rPr>
+        <w:t xml:space="preserve"> The </w:t>
+      </w:r>
+      <w:r>
+        <w:rPr>
+          <w:rFonts w:ascii="Arial" w:hAnsi="Arial" w:cs="Arial"/>
+          <w:b/>
+          <w:bCs/>
+        </w:rPr>
+        <w:t>target users</w:t>
+      </w:r>
+      <w:r>
+        <w:rPr>
+          <w:rFonts w:ascii="Arial" w:hAnsi="Arial" w:cs="Arial"/>
+        </w:rPr>
+        <w:t xml:space="preserve"> of this project are employees and decision-makers within </w:t>
+      </w:r>
+      <w:r>
+        <w:rPr>
+          <w:rFonts w:ascii="Arial" w:hAnsi="Arial" w:cs="Arial"/>
+          <w:b/>
+          <w:bCs/>
+        </w:rPr>
+        <w:t>Small and Medium Enterprises (SMEs)</w:t>
+      </w:r>
+      <w:r>
+        <w:rPr>
+          <w:rFonts w:ascii="Arial" w:hAnsi="Arial" w:cs="Arial"/>
+        </w:rPr>
+        <w:t xml:space="preserve"> who handle sensitive corporate data daily. This includes roles ranging from Finance and HR managers, who require strict confidentiality, to IT administrators managing internal security. By providing a tool that </w:t>
+      </w:r>
+      <w:r>
+        <w:rPr>
+          <w:rFonts w:ascii="Arial" w:hAnsi="Arial" w:cs="Arial"/>
+        </w:rPr>
         <w:lastRenderedPageBreak/>
-        <w:t>Scope of the Study</w:t>
-      </w:r>
-    </w:p>
-    <w:p>
-      <w:pPr>
-        <w:spacing w:line="360" w:lineRule="auto"/>
-        <w:rPr>
-          <w:rFonts w:ascii="Arial" w:hAnsi="Arial" w:cs="Arial"/>
-        </w:rPr>
-      </w:pPr>
-      <w:r>
-        <w:rPr>
-          <w:rFonts w:ascii="Arial" w:hAnsi="Arial" w:cs="Arial"/>
-        </w:rPr>
-        <w:t>The scope of this study is defined as follows:</w:t>
-      </w:r>
-    </w:p>
-    <w:p>
-      <w:pPr>
-        <w:pStyle w:val="ListParagraph"/>
-        <w:numPr>
-          <w:ilvl w:val="0"/>
-          <w:numId w:val="4"/>
-        </w:numPr>
-        <w:spacing w:line="360" w:lineRule="auto"/>
-        <w:rPr>
-          <w:rFonts w:ascii="Arial" w:hAnsi="Arial" w:cs="Arial"/>
-        </w:rPr>
-      </w:pPr>
-      <w:r>
-        <w:rPr>
-          <w:rFonts w:ascii="Arial" w:hAnsi="Arial" w:cs="Arial"/>
-        </w:rPr>
-        <w:t>Target User: The system is designed for employees in Small and Medium Enterprises (SMEs) who require secure internal collaboration.</w:t>
-      </w:r>
-    </w:p>
-    <w:p>
-      <w:pPr>
-        <w:pStyle w:val="ListParagraph"/>
-        <w:numPr>
-          <w:ilvl w:val="0"/>
-          <w:numId w:val="4"/>
-        </w:numPr>
-        <w:spacing w:line="360" w:lineRule="auto"/>
-        <w:rPr>
-          <w:rFonts w:ascii="Arial" w:hAnsi="Arial" w:cs="Arial"/>
-        </w:rPr>
-      </w:pPr>
-      <w:r>
-        <w:rPr>
-          <w:rFonts w:ascii="Arial" w:hAnsi="Arial" w:cs="Arial"/>
-        </w:rPr>
-        <w:t>System Functions: The project features two main components. First, ZKP Authentication, which allows password-less login using cryptographic circuits (Circom). Second, On-Device AI, which uses a TensorFlow Lite model to analyze message metadata and patterns (e.g., link frequency, timing) to detect anomalies.</w:t>
-      </w:r>
-    </w:p>
-    <w:p>
-      <w:pPr>
-        <w:pStyle w:val="ListParagraph"/>
-        <w:numPr>
-          <w:ilvl w:val="0"/>
-          <w:numId w:val="4"/>
-        </w:numPr>
-        <w:spacing w:line="360" w:lineRule="auto"/>
-        <w:rPr>
-          <w:rFonts w:ascii="Arial" w:hAnsi="Arial" w:cs="Arial"/>
-        </w:rPr>
-      </w:pPr>
-      <w:r>
-        <w:rPr>
-          <w:rFonts w:ascii="Arial" w:hAnsi="Arial" w:cs="Arial"/>
-        </w:rPr>
-        <w:t>Platform: The solution includes a mobile application developed in Flutter (Android focus) and a web interface built with Next.js. It uses a Node.js backend to verify proofs.</w:t>
-      </w:r>
-    </w:p>
-    <w:p>
-      <w:pPr>
-        <w:pStyle w:val="ListParagraph"/>
-        <w:numPr>
-          <w:ilvl w:val="0"/>
-          <w:numId w:val="4"/>
-        </w:numPr>
-        <w:spacing w:line="360" w:lineRule="auto"/>
-        <w:rPr>
-          <w:rFonts w:ascii="Arial" w:hAnsi="Arial" w:cs="Arial"/>
-        </w:rPr>
-      </w:pPr>
-      <w:r>
-        <w:rPr>
-          <w:rFonts w:ascii="Arial" w:hAnsi="Arial" w:cs="Arial"/>
-        </w:rPr>
-        <w:t>Security Elements: The security core relies on the Groth16 zk-SNARK protocol for authentication and AES-256 encryption for local storage</w:t>
-      </w:r>
-    </w:p>
+        <w:t xml:space="preserve">secures communication without requiring complex technical setups, the application aims to serve a </w:t>
+      </w:r>
+      <w:r>
+        <w:rPr>
+          <w:rFonts w:ascii="Arial" w:hAnsi="Arial" w:cs="Arial"/>
+          <w:b/>
+          <w:bCs/>
+        </w:rPr>
+        <w:t>diverse workforce</w:t>
+      </w:r>
+      <w:r>
+        <w:rPr>
+          <w:rFonts w:ascii="Arial" w:hAnsi="Arial" w:cs="Arial"/>
+        </w:rPr>
+        <w:t xml:space="preserve"> with varying levels of technical expertise, ensuring that security does not come at the cost of usability.</w:t>
+      </w:r>
+    </w:p>
+    <w:p>
+      <w:pPr>
+        <w:spacing w:line="360" w:lineRule="auto"/>
+        <w:rPr>
+          <w:rFonts w:ascii="Arial" w:hAnsi="Arial" w:cs="Arial"/>
+        </w:rPr>
+      </w:pPr>
+      <w:r>
+        <w:rPr>
+          <w:rFonts w:ascii="Arial" w:hAnsi="Arial" w:cs="Arial"/>
+          <w:b/>
+          <w:bCs/>
+        </w:rPr>
+        <w:t>Core System Functions</w:t>
+      </w:r>
+      <w:r>
+        <w:rPr>
+          <w:rFonts w:ascii="Arial" w:hAnsi="Arial" w:cs="Arial"/>
+        </w:rPr>
+        <w:t xml:space="preserve"> The application will encompass several critical </w:t>
+      </w:r>
+      <w:r>
+        <w:rPr>
+          <w:rFonts w:ascii="Arial" w:hAnsi="Arial" w:cs="Arial"/>
+          <w:b/>
+          <w:bCs/>
+        </w:rPr>
+        <w:t>system functions</w:t>
+      </w:r>
+      <w:r>
+        <w:rPr>
+          <w:rFonts w:ascii="Arial" w:hAnsi="Arial" w:cs="Arial"/>
+        </w:rPr>
+        <w:t xml:space="preserve"> to ensure robust security without compromising privacy. One of the primary functions is </w:t>
+      </w:r>
+      <w:r>
+        <w:rPr>
+          <w:rFonts w:ascii="Arial" w:hAnsi="Arial" w:cs="Arial"/>
+          <w:b/>
+          <w:bCs/>
+        </w:rPr>
+        <w:t>Zero-Knowledge Proof (ZKP) Authentication</w:t>
+      </w:r>
+      <w:r>
+        <w:rPr>
+          <w:rFonts w:ascii="Arial" w:hAnsi="Arial" w:cs="Arial"/>
+        </w:rPr>
+        <w:t xml:space="preserve">, where the system will mathematically verify a user's identity without ever transmitting or storing the actual password on the server. This function relies on the </w:t>
+      </w:r>
+      <w:r>
+        <w:rPr>
+          <w:rFonts w:ascii="Arial" w:hAnsi="Arial" w:cs="Arial"/>
+          <w:b/>
+          <w:bCs/>
+        </w:rPr>
+        <w:t>Groth16 protocol</w:t>
+      </w:r>
+      <w:r>
+        <w:rPr>
+          <w:rFonts w:ascii="Arial" w:hAnsi="Arial" w:cs="Arial"/>
+        </w:rPr>
+        <w:t xml:space="preserve"> to generate cryptographic </w:t>
+      </w:r>
+      <w:proofErr w:type="gramStart"/>
+      <w:r>
+        <w:rPr>
+          <w:rFonts w:ascii="Arial" w:hAnsi="Arial" w:cs="Arial"/>
+        </w:rPr>
+        <w:t>proofs</w:t>
+      </w:r>
+      <w:proofErr w:type="gramEnd"/>
+      <w:r>
+        <w:rPr>
+          <w:rFonts w:ascii="Arial" w:hAnsi="Arial" w:cs="Arial"/>
+        </w:rPr>
+        <w:t xml:space="preserve"> on the client side, ensuring that even if the server is compromised, no credentials can be stolen.</w:t>
+      </w:r>
+    </w:p>
+    <w:p>
+      <w:pPr>
+        <w:spacing w:line="360" w:lineRule="auto"/>
+        <w:rPr>
+          <w:rFonts w:ascii="Arial" w:hAnsi="Arial" w:cs="Arial"/>
+        </w:rPr>
+      </w:pPr>
+      <w:r>
+        <w:rPr>
+          <w:rFonts w:ascii="Arial" w:hAnsi="Arial" w:cs="Arial"/>
+        </w:rPr>
+        <w:t xml:space="preserve">In addition to secure login, the application features </w:t>
+      </w:r>
+      <w:r>
+        <w:rPr>
+          <w:rFonts w:ascii="Arial" w:hAnsi="Arial" w:cs="Arial"/>
+          <w:b/>
+          <w:bCs/>
+        </w:rPr>
+        <w:t>On-Device AI Anomaly Detection</w:t>
+      </w:r>
+      <w:r>
+        <w:rPr>
+          <w:rFonts w:ascii="Arial" w:hAnsi="Arial" w:cs="Arial"/>
+        </w:rPr>
+        <w:t xml:space="preserve">. Instead of sending messages to the cloud for scanning, the system will utilize an embedded </w:t>
+      </w:r>
+      <w:r>
+        <w:rPr>
+          <w:rFonts w:ascii="Arial" w:hAnsi="Arial" w:cs="Arial"/>
+          <w:b/>
+          <w:bCs/>
+        </w:rPr>
+        <w:t>TensorFlow Lite model</w:t>
+      </w:r>
+      <w:r>
+        <w:rPr>
+          <w:rFonts w:ascii="Arial" w:hAnsi="Arial" w:cs="Arial"/>
+        </w:rPr>
+        <w:t xml:space="preserve"> to scrutinize user inputs and message metadata in real-time. This analysis will be based on various indicators, such as </w:t>
+      </w:r>
+      <w:r>
+        <w:rPr>
+          <w:rFonts w:ascii="Arial" w:hAnsi="Arial" w:cs="Arial"/>
+          <w:b/>
+          <w:bCs/>
+        </w:rPr>
+        <w:t>suspicious URL patterns</w:t>
+      </w:r>
+      <w:r>
+        <w:rPr>
+          <w:rFonts w:ascii="Arial" w:hAnsi="Arial" w:cs="Arial"/>
+        </w:rPr>
+        <w:t>, abnormal typing cadence, or unusual login times. By examining these factors locally, the application can flag potential insider threats or social engineering attacks before the message is even encrypted.</w:t>
+      </w:r>
+    </w:p>
+    <w:p>
+      <w:pPr>
+        <w:spacing w:line="360" w:lineRule="auto"/>
+        <w:rPr>
+          <w:rFonts w:ascii="Arial" w:hAnsi="Arial" w:cs="Arial"/>
+        </w:rPr>
+      </w:pPr>
+      <w:r>
+        <w:rPr>
+          <w:rFonts w:ascii="Arial" w:hAnsi="Arial" w:cs="Arial"/>
+          <w:b/>
+          <w:bCs/>
+        </w:rPr>
+        <w:t>User Interface and Experience</w:t>
+      </w:r>
+      <w:r>
+        <w:rPr>
+          <w:rFonts w:ascii="Arial" w:hAnsi="Arial" w:cs="Arial"/>
+        </w:rPr>
+        <w:t xml:space="preserve"> Furthermore, the system will offer a </w:t>
+      </w:r>
+      <w:r>
+        <w:rPr>
+          <w:rFonts w:ascii="Arial" w:hAnsi="Arial" w:cs="Arial"/>
+          <w:b/>
+          <w:bCs/>
+        </w:rPr>
+        <w:t>user-friendly interface</w:t>
+      </w:r>
+      <w:r>
+        <w:rPr>
+          <w:rFonts w:ascii="Arial" w:hAnsi="Arial" w:cs="Arial"/>
+        </w:rPr>
+        <w:t xml:space="preserve"> developed using the </w:t>
+      </w:r>
+      <w:r>
+        <w:rPr>
+          <w:rFonts w:ascii="Arial" w:hAnsi="Arial" w:cs="Arial"/>
+          <w:b/>
+          <w:bCs/>
+        </w:rPr>
+        <w:t>Flutter framework</w:t>
+      </w:r>
+      <w:r>
+        <w:rPr>
+          <w:rFonts w:ascii="Arial" w:hAnsi="Arial" w:cs="Arial"/>
+        </w:rPr>
+        <w:t xml:space="preserve">. This ensures that users can easily navigate through the app, manage their encryption keys, and view security alerts without needing deep technical knowledge. The interface will include a </w:t>
+      </w:r>
+      <w:r>
+        <w:rPr>
+          <w:rFonts w:ascii="Arial" w:hAnsi="Arial" w:cs="Arial"/>
+          <w:b/>
+          <w:bCs/>
+        </w:rPr>
+        <w:t>real-time threat indicator</w:t>
+      </w:r>
+      <w:r>
+        <w:rPr>
+          <w:rFonts w:ascii="Arial" w:hAnsi="Arial" w:cs="Arial"/>
+        </w:rPr>
+        <w:t>, which provides immediate visual alerts (e.g., a red warning banner) to the user if the AI detects a high-risk action, empowering them to make informed decisions about sharing sensitive data.</w:t>
+      </w:r>
+    </w:p>
+    <w:p>
+      <w:pPr>
+        <w:spacing w:line="360" w:lineRule="auto"/>
+        <w:rPr>
+          <w:rFonts w:ascii="Arial" w:hAnsi="Arial" w:cs="Arial"/>
+        </w:rPr>
+      </w:pPr>
+      <w:r>
+        <w:rPr>
+          <w:rFonts w:ascii="Arial" w:hAnsi="Arial" w:cs="Arial"/>
+          <w:b/>
+          <w:bCs/>
+        </w:rPr>
+        <w:t>Development Environment and Tools</w:t>
+      </w:r>
+      <w:r>
+        <w:rPr>
+          <w:rFonts w:ascii="Arial" w:hAnsi="Arial" w:cs="Arial"/>
+        </w:rPr>
+        <w:t xml:space="preserve"> The project will be developed primarily for </w:t>
+      </w:r>
+      <w:r>
+        <w:rPr>
+          <w:rFonts w:ascii="Arial" w:hAnsi="Arial" w:cs="Arial"/>
+          <w:b/>
+          <w:bCs/>
+        </w:rPr>
+        <w:t>Android mobile devices</w:t>
+      </w:r>
+      <w:r>
+        <w:rPr>
+          <w:rFonts w:ascii="Arial" w:hAnsi="Arial" w:cs="Arial"/>
+        </w:rPr>
+        <w:t xml:space="preserve">, utilizing </w:t>
+      </w:r>
+      <w:r>
+        <w:rPr>
+          <w:rFonts w:ascii="Arial" w:hAnsi="Arial" w:cs="Arial"/>
+          <w:b/>
+          <w:bCs/>
+        </w:rPr>
+        <w:t>Visual Studio Code</w:t>
+      </w:r>
+      <w:r>
+        <w:rPr>
+          <w:rFonts w:ascii="Arial" w:hAnsi="Arial" w:cs="Arial"/>
+        </w:rPr>
+        <w:t xml:space="preserve"> and </w:t>
+      </w:r>
+      <w:r>
+        <w:rPr>
+          <w:rFonts w:ascii="Arial" w:hAnsi="Arial" w:cs="Arial"/>
+          <w:b/>
+          <w:bCs/>
+        </w:rPr>
+        <w:t>Android Studio</w:t>
+      </w:r>
+      <w:r>
+        <w:rPr>
+          <w:rFonts w:ascii="Arial" w:hAnsi="Arial" w:cs="Arial"/>
+        </w:rPr>
+        <w:t xml:space="preserve"> as the primary Integrated Development Environments (IDEs). The backend verification service will be built using </w:t>
+      </w:r>
+      <w:r>
+        <w:rPr>
+          <w:rFonts w:ascii="Arial" w:hAnsi="Arial" w:cs="Arial"/>
+          <w:b/>
+          <w:bCs/>
+        </w:rPr>
+        <w:t>Node.js</w:t>
+      </w:r>
+      <w:r>
+        <w:rPr>
+          <w:rFonts w:ascii="Arial" w:hAnsi="Arial" w:cs="Arial"/>
+        </w:rPr>
+        <w:t xml:space="preserve"> to handle ZKP proofs, while </w:t>
+      </w:r>
+      <w:proofErr w:type="spellStart"/>
+      <w:r>
+        <w:rPr>
+          <w:rFonts w:ascii="Arial" w:hAnsi="Arial" w:cs="Arial"/>
+          <w:b/>
+          <w:bCs/>
+        </w:rPr>
+        <w:t>Circom</w:t>
+      </w:r>
+      <w:proofErr w:type="spellEnd"/>
+      <w:r>
+        <w:rPr>
+          <w:rFonts w:ascii="Arial" w:hAnsi="Arial" w:cs="Arial"/>
+        </w:rPr>
+        <w:t xml:space="preserve"> will be used to design the cryptographic circuits. The application will be optimized for </w:t>
+      </w:r>
+      <w:r>
+        <w:rPr>
+          <w:rFonts w:ascii="Arial" w:hAnsi="Arial" w:cs="Arial"/>
+          <w:b/>
+          <w:bCs/>
+        </w:rPr>
+        <w:t>compatibility with standard mobile processors</w:t>
+      </w:r>
+      <w:r>
+        <w:rPr>
+          <w:rFonts w:ascii="Arial" w:hAnsi="Arial" w:cs="Arial"/>
+        </w:rPr>
+        <w:t xml:space="preserve">, ensuring that the heavy mathematical computations </w:t>
+      </w:r>
+      <w:r>
+        <w:rPr>
+          <w:rFonts w:ascii="Arial" w:hAnsi="Arial" w:cs="Arial"/>
+        </w:rPr>
+        <w:lastRenderedPageBreak/>
+        <w:t xml:space="preserve">required for ZKP and AI do not cause significant battery </w:t>
+      </w:r>
+      <w:proofErr w:type="gramStart"/>
+      <w:r>
+        <w:rPr>
+          <w:rFonts w:ascii="Arial" w:hAnsi="Arial" w:cs="Arial"/>
+        </w:rPr>
+        <w:t>drain</w:t>
+      </w:r>
+      <w:proofErr w:type="gramEnd"/>
+      <w:r>
+        <w:rPr>
+          <w:rFonts w:ascii="Arial" w:hAnsi="Arial" w:cs="Arial"/>
+        </w:rPr>
+        <w:t xml:space="preserve"> or latency for the end user.</w:t>
+      </w:r>
+    </w:p>
+    <w:p>
+      <w:pPr>
+        <w:spacing w:line="360" w:lineRule="auto"/>
+        <w:rPr>
+          <w:rFonts w:ascii="Arial" w:hAnsi="Arial" w:cs="Arial"/>
+        </w:rPr>
+      </w:pPr>
+    </w:p>
+    <w:p/>
     <w:p>
       <w:pPr>
         <w:pStyle w:val="Heading2"/>
@@ -821,129 +1323,148 @@
         <w:spacing w:line="360" w:lineRule="auto"/>
         <w:rPr>
           <w:rFonts w:ascii="Arial" w:hAnsi="Arial" w:cs="Arial"/>
-        </w:rPr>
-      </w:pPr>
-      <w:r>
-        <w:rPr>
-          <w:rFonts w:ascii="Arial" w:hAnsi="Arial" w:cs="Arial"/>
-        </w:rPr>
-        <w:t>This study is significant for several reasons:</w:t>
-      </w:r>
-    </w:p>
-    <w:p>
-      <w:pPr>
-        <w:pStyle w:val="ListParagraph"/>
-        <w:numPr>
-          <w:ilvl w:val="2"/>
-          <w:numId w:val="5"/>
-        </w:numPr>
-        <w:spacing w:line="360" w:lineRule="auto"/>
-        <w:rPr>
-          <w:rFonts w:ascii="Arial" w:hAnsi="Arial" w:cs="Arial"/>
-          <w:b/>
-          <w:bCs/>
-        </w:rPr>
-      </w:pPr>
-      <w:r>
-        <w:rPr>
-          <w:rFonts w:ascii="Arial" w:hAnsi="Arial" w:cs="Arial"/>
-          <w:b/>
-          <w:bCs/>
-        </w:rPr>
-        <w:t xml:space="preserve">Eliminates the risk of credential theft. </w:t>
-      </w:r>
-    </w:p>
-    <w:p>
-      <w:pPr>
-        <w:pStyle w:val="ListParagraph"/>
-        <w:spacing w:line="360" w:lineRule="auto"/>
-        <w:ind w:left="360"/>
-        <w:rPr>
-          <w:rFonts w:ascii="Arial" w:hAnsi="Arial" w:cs="Arial"/>
-        </w:rPr>
-      </w:pPr>
-      <w:r>
-        <w:rPr>
-          <w:rFonts w:ascii="Arial" w:hAnsi="Arial" w:cs="Arial"/>
-        </w:rPr>
-        <w:t>By implementing ZKP, this project proves that authentication can occur without the server ever knowing the user's password. This contributes to the field of "privacy-preserving authentication" and provides a blueprint for preventing database breaches.</w:t>
-      </w:r>
-    </w:p>
-    <w:p>
-      <w:pPr>
-        <w:pStyle w:val="ListParagraph"/>
-        <w:numPr>
-          <w:ilvl w:val="2"/>
-          <w:numId w:val="5"/>
-        </w:numPr>
-        <w:spacing w:line="360" w:lineRule="auto"/>
-        <w:rPr>
-          <w:rFonts w:ascii="Arial" w:hAnsi="Arial" w:cs="Arial"/>
-          <w:b/>
-          <w:bCs/>
-        </w:rPr>
-      </w:pPr>
-      <w:r>
-        <w:rPr>
-          <w:rFonts w:ascii="Arial" w:hAnsi="Arial" w:cs="Arial"/>
-          <w:b/>
-          <w:bCs/>
-        </w:rPr>
-        <w:t xml:space="preserve">Demonstrates privacy-preserving threat detection. </w:t>
-      </w:r>
-    </w:p>
-    <w:p>
-      <w:pPr>
-        <w:pStyle w:val="ListParagraph"/>
-        <w:spacing w:line="360" w:lineRule="auto"/>
-        <w:ind w:left="360"/>
-        <w:rPr>
-          <w:rFonts w:ascii="Arial" w:hAnsi="Arial" w:cs="Arial"/>
-        </w:rPr>
-      </w:pPr>
-      <w:r>
-        <w:rPr>
-          <w:rFonts w:ascii="Arial" w:hAnsi="Arial" w:cs="Arial"/>
-        </w:rPr>
-        <w:t>It shows that organizations do not have to choose between privacy (encryption) and security (threat detection). By utilizing Edge AI, the system detects malicious insiders locally, which is critical for complying with data privacy laws like GDPR.</w:t>
-      </w:r>
-    </w:p>
-    <w:p>
-      <w:pPr>
-        <w:pStyle w:val="ListParagraph"/>
-        <w:numPr>
-          <w:ilvl w:val="2"/>
-          <w:numId w:val="5"/>
-        </w:numPr>
-        <w:spacing w:line="360" w:lineRule="auto"/>
-        <w:rPr>
-          <w:rFonts w:ascii="Arial" w:hAnsi="Arial" w:cs="Arial"/>
-        </w:rPr>
-      </w:pPr>
-      <w:r>
-        <w:rPr>
-          <w:rFonts w:ascii="Arial" w:hAnsi="Arial" w:cs="Arial"/>
-          <w:b/>
-          <w:bCs/>
-        </w:rPr>
-        <w:t>Benchmarks High-Grade Security on Resource-Limited Hardware.</w:t>
-      </w:r>
-    </w:p>
-    <w:p>
-      <w:pPr>
-        <w:pStyle w:val="ListParagraph"/>
-        <w:spacing w:line="360" w:lineRule="auto"/>
-        <w:ind w:left="360"/>
-        <w:rPr>
-          <w:rFonts w:ascii="Arial" w:hAnsi="Arial" w:cs="Arial"/>
-        </w:rPr>
-      </w:pPr>
+          <w:b/>
+          <w:bCs/>
+        </w:rPr>
+      </w:pPr>
+    </w:p>
+    <w:p>
+      <w:pPr>
+        <w:spacing w:line="360" w:lineRule="auto"/>
+        <w:rPr>
+          <w:rFonts w:ascii="Arial" w:hAnsi="Arial" w:cs="Arial"/>
+        </w:rPr>
+      </w:pPr>
+      <w:r>
+        <w:rPr>
+          <w:rFonts w:ascii="Arial" w:hAnsi="Arial" w:cs="Arial"/>
+        </w:rPr>
+        <w:t xml:space="preserve">The significance of this study comes from the urgent need to solve the conflict between user privacy and system security. In the current digital landscape, Small and Medium Enterprises (SMEs) are often forced to </w:t>
+      </w:r>
+      <w:r>
+        <w:rPr>
+          <w:rFonts w:ascii="Arial" w:hAnsi="Arial" w:cs="Arial"/>
+        </w:rPr>
+        <w:t>choose</w:t>
+      </w:r>
+      <w:r>
+        <w:rPr>
+          <w:rFonts w:ascii="Arial" w:hAnsi="Arial" w:cs="Arial"/>
+        </w:rPr>
+        <w:t xml:space="preserve"> either they encrypt everything and lose the ability to spot insider threats, or they monitor everything and violate user privacy. This project is significant because it proposes a third </w:t>
+      </w:r>
+      <w:r>
+        <w:rPr>
+          <w:rFonts w:ascii="Arial" w:hAnsi="Arial" w:cs="Arial"/>
+        </w:rPr>
+        <w:t xml:space="preserve">option, </w:t>
+      </w:r>
+      <w:r>
+        <w:rPr>
+          <w:rFonts w:ascii="Arial" w:hAnsi="Arial" w:cs="Arial"/>
+        </w:rPr>
+        <w:t>using mathematics and local AI to achieve both at the same time.</w:t>
+      </w:r>
+    </w:p>
+    <w:p>
+      <w:pPr>
+        <w:spacing w:line="360" w:lineRule="auto"/>
+        <w:rPr>
+          <w:rFonts w:ascii="Arial" w:hAnsi="Arial" w:cs="Arial"/>
+        </w:rPr>
+      </w:pPr>
+      <w:r>
+        <w:rPr>
+          <w:rFonts w:ascii="Arial" w:hAnsi="Arial" w:cs="Arial"/>
+        </w:rPr>
+        <w:t>This study contributes to the field and benefits stakeholders in three specific ways:</w:t>
+      </w:r>
+    </w:p>
+    <w:p>
+      <w:pPr>
+        <w:spacing w:line="360" w:lineRule="auto"/>
+        <w:rPr>
+          <w:rFonts w:ascii="Arial" w:hAnsi="Arial" w:cs="Arial"/>
+        </w:rPr>
+      </w:pPr>
+      <w:r>
+        <w:rPr>
+          <w:rFonts w:ascii="Arial" w:hAnsi="Arial" w:cs="Arial"/>
+          <w:b/>
+          <w:bCs/>
+        </w:rPr>
+        <w:t>1. Eliminates the risk of credential theft.</w:t>
+      </w:r>
+      <w:r>
+        <w:rPr>
+          <w:rFonts w:ascii="Arial" w:hAnsi="Arial" w:cs="Arial"/>
+        </w:rPr>
+        <w:t xml:space="preserve"> One of the biggest issues in cybersecurity today is that servers hold too much sensitive data. If a database is hacked, passwords—even hashed ones—are at risk. This project is significant because it proves that authentication can happen without the server ever knowing the user's password. By implementing Zero-Knowledge Proofs (ZKP), this study provides a working blueprint for "password-less" security. It shows developers that it is possible to verify a user’s identity mathematically, meaning that even if the server is breached, there are no credentials for attackers to steal.</w:t>
+      </w:r>
+    </w:p>
+    <w:p>
+      <w:pPr>
+        <w:spacing w:line="360" w:lineRule="auto"/>
+        <w:rPr>
+          <w:rFonts w:ascii="Arial" w:hAnsi="Arial" w:cs="Arial"/>
+        </w:rPr>
+      </w:pPr>
+      <w:r>
+        <w:rPr>
+          <w:rFonts w:ascii="Arial" w:hAnsi="Arial" w:cs="Arial"/>
+          <w:b/>
+          <w:bCs/>
+        </w:rPr>
+        <w:t>2. Demonstrates privacy-preserving threat detection.</w:t>
+      </w:r>
+      <w:r>
+        <w:rPr>
+          <w:rFonts w:ascii="Arial" w:hAnsi="Arial" w:cs="Arial"/>
+        </w:rPr>
+        <w:t xml:space="preserve"> Currently, most "insider threat" detection tools require reading the messages employees send, which creates privacy concerns and compliance issues with laws like the PDPA or GDPR. This project is significant because it shifts the detection logic to the "Edge" (the user's phone). It demonstrates to business owners and security officers that they can detect malicious behavior—like someone sending phishing links—without ever decrypting </w:t>
+      </w:r>
+      <w:proofErr w:type="gramStart"/>
+      <w:r>
+        <w:rPr>
+          <w:rFonts w:ascii="Arial" w:hAnsi="Arial" w:cs="Arial"/>
+        </w:rPr>
+        <w:t>the private</w:t>
+      </w:r>
+      <w:proofErr w:type="gramEnd"/>
+      <w:r>
+        <w:rPr>
+          <w:rFonts w:ascii="Arial" w:hAnsi="Arial" w:cs="Arial"/>
+        </w:rPr>
+        <w:t xml:space="preserve"> </w:t>
+      </w:r>
       <w:r>
         <w:rPr>
           <w:rFonts w:ascii="Arial" w:hAnsi="Arial" w:cs="Arial"/>
         </w:rPr>
         <w:lastRenderedPageBreak/>
-        <w:t xml:space="preserve">This project demonstrates that enterprise-level protocols like </w:t>
+        <w:t>chat. This helps organizations maintain strict security standards while respecting the privacy rights of their staff.</w:t>
+      </w:r>
+    </w:p>
+    <w:p>
+      <w:pPr>
+        <w:spacing w:line="360" w:lineRule="auto"/>
+        <w:rPr>
+          <w:rFonts w:ascii="Arial" w:hAnsi="Arial" w:cs="Arial"/>
+        </w:rPr>
+      </w:pPr>
+      <w:r>
+        <w:rPr>
+          <w:rFonts w:ascii="Arial" w:hAnsi="Arial" w:cs="Arial"/>
+          <w:b/>
+          <w:bCs/>
+        </w:rPr>
+        <w:t>3. Benchmarks High-Grade Security on Resource-Limited Hardware.</w:t>
+      </w:r>
+      <w:r>
+        <w:rPr>
+          <w:rFonts w:ascii="Arial" w:hAnsi="Arial" w:cs="Arial"/>
+        </w:rPr>
+        <w:t xml:space="preserve"> There is a common belief that heavy cryptographic protocols like </w:t>
       </w:r>
       <w:proofErr w:type="spellStart"/>
       <w:r>
@@ -957,32 +1478,14 @@
         <w:rPr>
           <w:rFonts w:ascii="Arial" w:hAnsi="Arial" w:cs="Arial"/>
         </w:rPr>
-        <w:t>-SNARKs and AI anomaly detection can be successfully optimized for standard mobile processors. It provides a research benchmark for the feasibility of "Heavy Cryptography" on consumer-grade devices using open-source frameworks (</w:t>
-      </w:r>
-      <w:proofErr w:type="spellStart"/>
-      <w:r>
-        <w:rPr>
-          <w:rFonts w:ascii="Arial" w:hAnsi="Arial" w:cs="Arial"/>
-        </w:rPr>
-        <w:t>SnarkJS</w:t>
-      </w:r>
-      <w:proofErr w:type="spellEnd"/>
-      <w:r>
-        <w:rPr>
-          <w:rFonts w:ascii="Arial" w:hAnsi="Arial" w:cs="Arial"/>
-        </w:rPr>
-        <w:t xml:space="preserve"> and TensorFlow Lite).</w:t>
-      </w:r>
-    </w:p>
-    <w:p>
-      <w:pPr>
-        <w:pStyle w:val="ListParagraph"/>
-        <w:spacing w:line="360" w:lineRule="auto"/>
-        <w:ind w:left="360"/>
-        <w:rPr>
-          <w:rFonts w:ascii="Arial" w:hAnsi="Arial" w:cs="Arial"/>
-          <w:b/>
-          <w:bCs/>
+        <w:t>-SNARKs and AI models are too slow for standard mobile phones. This study challenges that assumption. By optimizing these technologies to run on a standard Android device, this project provides valuable data to the academic community regarding the limits of mobile hardware. It serves as a benchmark for future researchers, proving that consumer-grade devices are now powerful enough to handle enterprise-grade encryption and AI inference simultaneously without ruining the user experience.</w:t>
+      </w:r>
+    </w:p>
+    <w:p>
+      <w:pPr>
+        <w:spacing w:line="360" w:lineRule="auto"/>
+        <w:rPr>
+          <w:rFonts w:ascii="Arial" w:hAnsi="Arial" w:cs="Arial"/>
         </w:rPr>
       </w:pPr>
     </w:p>
@@ -1212,6 +1715,7 @@
         <w:rPr>
           <w:rFonts w:ascii="Arial" w:hAnsi="Arial" w:cs="Arial"/>
         </w:rPr>
+        <w:lastRenderedPageBreak/>
         <w:t>Discusses the main findings in relation to the project objectives. It reflects on limitations and suggests future work, such as expanding the AI model to detect complex social engineering attacks.</w:t>
       </w:r>
     </w:p>
@@ -1292,7 +1796,11 @@
         <w:t>LITERATURE REVIEW</w:t>
       </w:r>
     </w:p>
-    <w:p/>
+    <w:p>
+      <w:pPr>
+        <w:spacing w:line="360" w:lineRule="auto"/>
+      </w:pPr>
+    </w:p>
     <w:p>
       <w:pPr>
         <w:spacing w:line="360" w:lineRule="auto"/>
@@ -1310,40 +1818,34 @@
         </w:rPr>
         <w:t>2.1 Introduction</w:t>
       </w:r>
-    </w:p>
-    <w:p>
-      <w:pPr>
-        <w:spacing w:line="360" w:lineRule="auto"/>
-        <w:rPr>
-          <w:rFonts w:ascii="Arial" w:hAnsi="Arial" w:cs="Arial"/>
-        </w:rPr>
-      </w:pPr>
-      <w:r>
-        <w:rPr>
-          <w:rFonts w:ascii="Arial" w:hAnsi="Arial" w:cs="Arial"/>
-        </w:rPr>
-        <w:t xml:space="preserve">This chapter reviews the current state of research regarding secure messaging systems, authentication mechanisms, and anomaly detection. To provide a theoretical foundation for the </w:t>
-      </w:r>
-      <w:r>
-        <w:rPr>
-          <w:rFonts w:ascii="Arial" w:hAnsi="Arial" w:cs="Arial"/>
-          <w:i/>
-          <w:iCs/>
-        </w:rPr>
-        <w:t>SentriZK</w:t>
-      </w:r>
-      <w:r>
-        <w:rPr>
-          <w:rFonts w:ascii="Arial" w:hAnsi="Arial" w:cs="Arial"/>
-        </w:rPr>
-        <w:t xml:space="preserve"> project, the literature is analyzed in three distinct domains:</w:t>
+      <w:r>
+        <w:rPr>
+          <w:rFonts w:ascii="Arial" w:hAnsi="Arial" w:cs="Arial"/>
+          <w:b/>
+          <w:bCs/>
+        </w:rPr>
+        <w:tab/>
+      </w:r>
+    </w:p>
+    <w:p>
+      <w:pPr>
+        <w:spacing w:line="360" w:lineRule="auto"/>
+        <w:rPr>
+          <w:rFonts w:ascii="Arial" w:hAnsi="Arial" w:cs="Arial"/>
+        </w:rPr>
+      </w:pPr>
+      <w:r>
+        <w:rPr>
+          <w:rFonts w:ascii="Arial" w:hAnsi="Arial" w:cs="Arial"/>
+        </w:rPr>
+        <w:t>This chapter reviews the existing body of knowledge regarding secure communication systems, cryptographic authentication, and mobile anomaly detection. The objective is to establish a theoretical framework for the project by analyzing the strengths and limitations of current technologies. The review is categorized into three specific domains based on the project's core components:</w:t>
       </w:r>
     </w:p>
     <w:p>
       <w:pPr>
         <w:numPr>
           <w:ilvl w:val="0"/>
-          <w:numId w:val="9"/>
+          <w:numId w:val="43"/>
         </w:numPr>
         <w:spacing w:line="360" w:lineRule="auto"/>
         <w:rPr>
@@ -1356,20 +1858,20 @@
           <w:b/>
           <w:bCs/>
         </w:rPr>
-        <w:t>Secure Internal Messaging &amp; Insider Threats:</w:t>
-      </w:r>
-      <w:r>
-        <w:rPr>
-          <w:rFonts w:ascii="Arial" w:hAnsi="Arial" w:cs="Arial"/>
-        </w:rPr>
-        <w:t xml:space="preserve"> Examining the limitations of current End-to-End Encryption (E2EE) implementations and the rising challenge of malicious insiders.</w:t>
+        <w:t>Zero-Knowledge Proofs (Authentication):</w:t>
+      </w:r>
+      <w:r>
+        <w:rPr>
+          <w:rFonts w:ascii="Arial" w:hAnsi="Arial" w:cs="Arial"/>
+        </w:rPr>
+        <w:t xml:space="preserve"> An evaluation of privacy-preserving protocols that eliminate the need for password transmission.</w:t>
       </w:r>
     </w:p>
     <w:p>
       <w:pPr>
         <w:numPr>
           <w:ilvl w:val="0"/>
-          <w:numId w:val="9"/>
+          <w:numId w:val="43"/>
         </w:numPr>
         <w:spacing w:line="360" w:lineRule="auto"/>
         <w:rPr>
@@ -1382,20 +1884,20 @@
           <w:b/>
           <w:bCs/>
         </w:rPr>
-        <w:t>Zero-Knowledge Proofs (ZKP):</w:t>
-      </w:r>
-      <w:r>
-        <w:rPr>
-          <w:rFonts w:ascii="Arial" w:hAnsi="Arial" w:cs="Arial"/>
-        </w:rPr>
-        <w:t xml:space="preserve"> Evaluating the shift from password-based authentication to privacy-preserving cryptographic protocols like zk-SNARKs.</w:t>
+        <w:t>End-to-End Encryption (E2EE) Protocols:</w:t>
+      </w:r>
+      <w:r>
+        <w:rPr>
+          <w:rFonts w:ascii="Arial" w:hAnsi="Arial" w:cs="Arial"/>
+        </w:rPr>
+        <w:t xml:space="preserve"> An analysis of current secure messaging standards, focusing on authentication vulnerabilities, scalability, and the detection of insider threats.</w:t>
       </w:r>
     </w:p>
     <w:p>
       <w:pPr>
         <w:numPr>
           <w:ilvl w:val="0"/>
-          <w:numId w:val="9"/>
+          <w:numId w:val="43"/>
         </w:numPr>
         <w:spacing w:line="360" w:lineRule="auto"/>
         <w:rPr>
@@ -1414,935 +1916,1013 @@
         <w:rPr>
           <w:rFonts w:ascii="Arial" w:hAnsi="Arial" w:cs="Arial"/>
         </w:rPr>
-        <w:t xml:space="preserve"> Analyzing the feasibility of deploying machine learning models on resource-constrained mobile devices to detect threats without compromising privacy.</w:t>
-      </w:r>
-    </w:p>
-    <w:p>
-      <w:pPr>
-        <w:spacing w:line="360" w:lineRule="auto"/>
-        <w:rPr>
-          <w:rFonts w:ascii="Arial" w:hAnsi="Arial" w:cs="Arial"/>
-        </w:rPr>
-      </w:pPr>
-      <w:r>
-        <w:rPr>
-          <w:rFonts w:ascii="Arial" w:hAnsi="Arial" w:cs="Arial"/>
-        </w:rPr>
-        <w:t>The chapter concludes by identifying the research gaps that this project aims to address.</w:t>
-      </w:r>
-    </w:p>
-    <w:p>
-      <w:pPr>
-        <w:spacing w:line="360" w:lineRule="auto"/>
-        <w:rPr>
-          <w:rFonts w:ascii="Arial" w:hAnsi="Arial" w:cs="Arial"/>
-        </w:rPr>
-      </w:pPr>
-    </w:p>
-    <w:p>
-      <w:pPr>
-        <w:spacing w:line="360" w:lineRule="auto"/>
-        <w:rPr>
-          <w:rFonts w:ascii="Arial" w:hAnsi="Arial" w:cs="Arial"/>
-          <w:b/>
-          <w:bCs/>
-        </w:rPr>
-      </w:pPr>
-      <w:r>
-        <w:rPr>
-          <w:rFonts w:ascii="Arial" w:hAnsi="Arial" w:cs="Arial"/>
-          <w:b/>
-          <w:bCs/>
-        </w:rPr>
-        <w:t>2.2 Secure Internal Messaging and Insider Threats</w:t>
-      </w:r>
-    </w:p>
-    <w:p>
-      <w:pPr>
-        <w:spacing w:line="360" w:lineRule="auto"/>
-        <w:rPr>
-          <w:rFonts w:ascii="Arial" w:hAnsi="Arial" w:cs="Arial"/>
-        </w:rPr>
-      </w:pPr>
-      <w:r>
-        <w:rPr>
-          <w:rFonts w:ascii="Arial" w:hAnsi="Arial" w:cs="Arial"/>
-        </w:rPr>
-        <w:t xml:space="preserve">The security of internal communication platforms is a critical concern for Small and Medium Enterprises (SMEs). While encryption has become </w:t>
+        <w:t xml:space="preserve"> A review of machine learning techniques optimized for resource-constrained mobile environments to detect malicious behavior locally.</w:t>
+      </w:r>
+    </w:p>
+    <w:p>
+      <w:pPr>
+        <w:spacing w:line="360" w:lineRule="auto"/>
+        <w:rPr>
+          <w:rFonts w:ascii="Arial" w:hAnsi="Arial" w:cs="Arial"/>
+        </w:rPr>
+      </w:pPr>
+      <w:r>
+        <w:rPr>
+          <w:rFonts w:ascii="Arial" w:hAnsi="Arial" w:cs="Arial"/>
+        </w:rPr>
+        <w:t>The chapter concludes by synthesizing these domains to identify specific research gaps, highlighting the lack of integrated solutions in the current landscape.</w:t>
+      </w:r>
+    </w:p>
+    <w:p>
+      <w:pPr>
+        <w:spacing w:line="360" w:lineRule="auto"/>
+        <w:rPr>
+          <w:rFonts w:ascii="Arial" w:hAnsi="Arial" w:cs="Arial"/>
+        </w:rPr>
+      </w:pPr>
+    </w:p>
+    <w:p>
+      <w:pPr>
+        <w:spacing w:line="360" w:lineRule="auto"/>
+        <w:rPr>
+          <w:rFonts w:ascii="Arial" w:hAnsi="Arial" w:cs="Arial"/>
+          <w:b/>
+          <w:bCs/>
+        </w:rPr>
+      </w:pPr>
+      <w:r>
+        <w:rPr>
+          <w:rFonts w:ascii="Arial" w:hAnsi="Arial" w:cs="Arial"/>
+          <w:b/>
+          <w:bCs/>
+        </w:rPr>
+        <w:t xml:space="preserve">2.2 </w:t>
+      </w:r>
+      <w:r>
+        <w:rPr>
+          <w:rFonts w:ascii="Arial" w:hAnsi="Arial" w:cs="Arial"/>
+          <w:b/>
+          <w:bCs/>
+        </w:rPr>
+        <w:t>Overview of Secure Enterprise Messaging</w:t>
+      </w:r>
+    </w:p>
+    <w:p>
+      <w:pPr>
+        <w:spacing w:line="360" w:lineRule="auto"/>
+        <w:rPr>
+          <w:rFonts w:ascii="Arial" w:hAnsi="Arial" w:cs="Arial"/>
+        </w:rPr>
+      </w:pPr>
+      <w:r>
+        <w:rPr>
+          <w:rFonts w:ascii="Arial" w:hAnsi="Arial" w:cs="Arial"/>
+        </w:rPr>
+        <w:t>Before examining specific technological implementations, it is necessary to define the broader context of Secure Enterprise Messaging Systems. These are specialized communication platforms designed to facilitate internal collaboration while strictly maintaining data confidentiality, integrity, and availability. Unlike consumer-grade applications, enterprise systems must adhere to rigorous compliance standards and protect against industrial espionage.</w:t>
+      </w:r>
+    </w:p>
+    <w:p>
+      <w:pPr>
+        <w:spacing w:line="360" w:lineRule="auto"/>
+        <w:rPr>
+          <w:rFonts w:ascii="Arial" w:hAnsi="Arial" w:cs="Arial"/>
+        </w:rPr>
+      </w:pPr>
+    </w:p>
+    <w:p>
+      <w:pPr>
+        <w:spacing w:line="360" w:lineRule="auto"/>
+        <w:rPr>
+          <w:rFonts w:ascii="Arial" w:hAnsi="Arial" w:cs="Arial"/>
+        </w:rPr>
+      </w:pPr>
+      <w:r>
+        <w:rPr>
+          <w:rFonts w:ascii="Arial" w:hAnsi="Arial" w:cs="Arial"/>
+        </w:rPr>
+        <w:t xml:space="preserve">The defining feature of modern secure messaging is End-to-End Encryption (E2EE). In this model, cryptographic keys are generated and stored exclusively on the user's device (the endpoint). Messages are encrypted before they leave the sender’s device and remain encrypted until they reach the recipient, ensuring that service providers and network administrators cannot access the </w:t>
       </w:r>
       <w:proofErr w:type="gramStart"/>
       <w:r>
         <w:rPr>
           <w:rFonts w:ascii="Arial" w:hAnsi="Arial" w:cs="Arial"/>
         </w:rPr>
-        <w:t>a standard</w:t>
+        <w:t>plaintext</w:t>
       </w:r>
       <w:proofErr w:type="gramEnd"/>
       <w:r>
         <w:rPr>
           <w:rFonts w:ascii="Arial" w:hAnsi="Arial" w:cs="Arial"/>
         </w:rPr>
-        <w:t>, recent studies highlight significant vulnerabilities in how these systems handle user verification and threat monitoring.</w:t>
-      </w:r>
-    </w:p>
-    <w:p>
-      <w:pPr>
-        <w:spacing w:line="360" w:lineRule="auto"/>
-        <w:rPr>
-          <w:rFonts w:ascii="Arial" w:hAnsi="Arial" w:cs="Arial"/>
-        </w:rPr>
-      </w:pPr>
-    </w:p>
-    <w:p>
-      <w:pPr>
-        <w:spacing w:line="360" w:lineRule="auto"/>
-        <w:rPr>
-          <w:rFonts w:ascii="Arial" w:hAnsi="Arial" w:cs="Arial"/>
-        </w:rPr>
-      </w:pPr>
-    </w:p>
-    <w:p>
-      <w:pPr>
-        <w:spacing w:line="360" w:lineRule="auto"/>
-        <w:rPr>
-          <w:rFonts w:ascii="Arial" w:hAnsi="Arial" w:cs="Arial"/>
-          <w:b/>
-          <w:bCs/>
-        </w:rPr>
-      </w:pPr>
-      <w:r>
-        <w:rPr>
-          <w:rFonts w:ascii="Arial" w:hAnsi="Arial" w:cs="Arial"/>
-          <w:b/>
-          <w:bCs/>
-        </w:rPr>
-        <w:t>2.2.1 Vulnerabilities in E2EE Authentication</w:t>
-      </w:r>
-    </w:p>
-    <w:p>
-      <w:pPr>
-        <w:spacing w:line="360" w:lineRule="auto"/>
-        <w:rPr>
-          <w:rFonts w:ascii="Arial" w:hAnsi="Arial" w:cs="Arial"/>
-        </w:rPr>
-      </w:pPr>
-      <w:r>
-        <w:rPr>
-          <w:rFonts w:ascii="Arial" w:hAnsi="Arial" w:cs="Arial"/>
-        </w:rPr>
-        <w:t xml:space="preserve">End-to-End Encryption (E2EE) is widely regarded as the gold standard for data privacy. However, Alatawi and Saxena (2023), in their paper </w:t>
-      </w:r>
-      <w:r>
-        <w:rPr>
-          <w:rFonts w:ascii="Arial" w:hAnsi="Arial" w:cs="Arial"/>
-          <w:i/>
-          <w:iCs/>
-        </w:rPr>
-        <w:t>"SoK: An Analysis of End-to-End Encryption and Authentication Ceremonies in Secure Messaging Systems,"</w:t>
-      </w:r>
-      <w:r>
-        <w:rPr>
-          <w:rFonts w:ascii="Arial" w:hAnsi="Arial" w:cs="Arial"/>
-        </w:rPr>
-        <w:t xml:space="preserve"> argue that encryption alone is insufficient against active attacks. Their analysis of 17 popular messaging applications revealed that while "opportunistic" encryption protects against passive eavesdropping, it fails to prevent Man-in-the-Middle (MitM) attacks effectively.</w:t>
-      </w:r>
-    </w:p>
-    <w:p>
-      <w:pPr>
-        <w:spacing w:line="360" w:lineRule="auto"/>
-        <w:rPr>
-          <w:rFonts w:ascii="Arial" w:hAnsi="Arial" w:cs="Arial"/>
-        </w:rPr>
-      </w:pPr>
-      <w:r>
-        <w:rPr>
-          <w:rFonts w:ascii="Arial" w:hAnsi="Arial" w:cs="Arial"/>
-        </w:rPr>
-        <w:t>The primary weakness lies in "Authentication Ceremonies"</w:t>
-      </w:r>
-      <w:r>
-        <w:rPr>
-          <w:rFonts w:ascii="Arial" w:hAnsi="Arial" w:cs="Arial"/>
+        <w:t xml:space="preserve"> content. While E2EE provides robust protection against external interception, the literature reviewed in the following sections suggests that this architecture faces significant challenges regarding user authentication and internal threat monitoring.</w:t>
+      </w:r>
+    </w:p>
+    <w:p>
+      <w:pPr>
+        <w:spacing w:line="360" w:lineRule="auto"/>
+        <w:rPr>
+          <w:rFonts w:ascii="Arial" w:hAnsi="Arial" w:cs="Arial"/>
+        </w:rPr>
+      </w:pPr>
+    </w:p>
+    <w:p>
+      <w:pPr>
+        <w:spacing w:line="360" w:lineRule="auto"/>
+        <w:rPr>
+          <w:rFonts w:ascii="Arial" w:hAnsi="Arial" w:cs="Arial"/>
+          <w:b/>
+          <w:bCs/>
+        </w:rPr>
+      </w:pPr>
+      <w:r>
+        <w:rPr>
+          <w:rFonts w:ascii="Arial" w:hAnsi="Arial" w:cs="Arial"/>
+          <w:b/>
+          <w:bCs/>
+        </w:rPr>
+        <w:t>2.</w:t>
+      </w:r>
+      <w:r>
+        <w:rPr>
+          <w:rFonts w:ascii="Arial" w:hAnsi="Arial" w:cs="Arial"/>
+          <w:b/>
+          <w:bCs/>
+        </w:rPr>
+        <w:t>3</w:t>
+      </w:r>
+      <w:r>
+        <w:rPr>
+          <w:rFonts w:ascii="Arial" w:hAnsi="Arial" w:cs="Arial"/>
+          <w:b/>
+          <w:bCs/>
         </w:rPr>
         <w:t xml:space="preserve"> </w:t>
       </w:r>
       <w:r>
         <w:rPr>
           <w:rFonts w:ascii="Arial" w:hAnsi="Arial" w:cs="Arial"/>
-        </w:rPr>
-        <w:t xml:space="preserve">manual processes where users verify keys (e.g., scanning QR codes). The study found these ceremonies are often optional, hidden in sub-menus, and prone to human error. Users consistently fail to verify long hexadecimal strings correctly. As demonstrated by Alatawi and Saxena (2023), reliance on manual verification leaves major platforms vulnerable. This highlights the need for automated trust verification, a gap </w:t>
-      </w:r>
-      <w:r>
-        <w:rPr>
-          <w:rFonts w:ascii="Arial" w:hAnsi="Arial" w:cs="Arial"/>
-          <w:i/>
-          <w:iCs/>
-        </w:rPr>
-        <w:t>SentriZK</w:t>
-      </w:r>
-      <w:r>
-        <w:rPr>
-          <w:rFonts w:ascii="Arial" w:hAnsi="Arial" w:cs="Arial"/>
-        </w:rPr>
-        <w:t xml:space="preserve"> addresses by utilizing Zero-Knowledge Proofs to eliminate the burden of human verification.</w:t>
-      </w:r>
-    </w:p>
-    <w:p>
-      <w:pPr>
-        <w:spacing w:line="360" w:lineRule="auto"/>
-        <w:rPr>
-          <w:rFonts w:ascii="Arial" w:hAnsi="Arial" w:cs="Arial"/>
-        </w:rPr>
-      </w:pPr>
-    </w:p>
-    <w:p>
-      <w:pPr>
-        <w:spacing w:line="360" w:lineRule="auto"/>
-        <w:rPr>
-          <w:rFonts w:ascii="Arial" w:hAnsi="Arial" w:cs="Arial"/>
-          <w:b/>
-          <w:bCs/>
-        </w:rPr>
-      </w:pPr>
-      <w:r>
-        <w:rPr>
-          <w:rFonts w:ascii="Arial" w:hAnsi="Arial" w:cs="Arial"/>
-          <w:b/>
-          <w:bCs/>
-        </w:rPr>
-        <w:t>2.2.2 The Insider Threat Landscape</w:t>
-      </w:r>
-    </w:p>
-    <w:p>
-      <w:pPr>
-        <w:spacing w:line="360" w:lineRule="auto"/>
-        <w:rPr>
-          <w:rFonts w:ascii="Arial" w:hAnsi="Arial" w:cs="Arial"/>
-        </w:rPr>
-      </w:pPr>
-      <w:r>
-        <w:rPr>
-          <w:rFonts w:ascii="Arial" w:hAnsi="Arial" w:cs="Arial"/>
-        </w:rPr>
-        <w:t>While encryption protects data in transit, it creates a "blind spot" for detecting malicious activity originating from within the organization. Traditional firewalls and intrusion detection systems (IDS) focus on external threats, often missing employees who misuse their legitimate access.</w:t>
-      </w:r>
-    </w:p>
-    <w:p>
-      <w:pPr>
-        <w:spacing w:line="360" w:lineRule="auto"/>
-        <w:rPr>
-          <w:rFonts w:ascii="Arial" w:hAnsi="Arial" w:cs="Arial"/>
-        </w:rPr>
-      </w:pPr>
-      <w:r>
-        <w:rPr>
-          <w:rFonts w:ascii="Arial" w:hAnsi="Arial" w:cs="Arial"/>
-        </w:rPr>
-        <w:t xml:space="preserve">Several studies have addressed this specific issue. In </w:t>
-      </w:r>
-      <w:r>
-        <w:rPr>
-          <w:rFonts w:ascii="Arial" w:hAnsi="Arial" w:cs="Arial"/>
-          <w:i/>
-          <w:iCs/>
-        </w:rPr>
-        <w:t>"Insider Threat Detection and Secure Data Transfer Leveraging Bidirectional LSTM" (2025)</w:t>
-      </w:r>
-      <w:r>
-        <w:rPr>
-          <w:rFonts w:ascii="Arial" w:hAnsi="Arial" w:cs="Arial"/>
-        </w:rPr>
-        <w:t>, researchers proposed using Deep Learning, specifically Bidirectional Long Short-Term Memory (Bi-LSTM) networks. This method analyzes sequences of user behavior (forward and backward in time) rather than isolated events, achieving higher accuracy than standard machine learning models because it understands the "context" of user actions.</w:t>
-      </w:r>
-    </w:p>
-    <w:p>
-      <w:pPr>
-        <w:spacing w:line="360" w:lineRule="auto"/>
-        <w:rPr>
-          <w:rFonts w:ascii="Arial" w:hAnsi="Arial" w:cs="Arial"/>
-        </w:rPr>
-      </w:pPr>
+          <w:b/>
+          <w:bCs/>
+        </w:rPr>
+        <w:t>Zero-Knowledge Proofs (Authentication)</w:t>
+      </w:r>
+    </w:p>
+    <w:p>
+      <w:pPr>
+        <w:spacing w:line="360" w:lineRule="auto"/>
+        <w:rPr>
+          <w:rFonts w:ascii="Arial" w:hAnsi="Arial" w:cs="Arial"/>
+          <w:bCs/>
+        </w:rPr>
+      </w:pPr>
+      <w:r>
+        <w:rPr>
+          <w:rFonts w:ascii="Arial" w:hAnsi="Arial" w:cs="Arial"/>
+          <w:bCs/>
+        </w:rPr>
+        <w:t>To address the inherent risks of transmitting passwords or credentials over a network, researchers have extensively investigated Zero-Knowledge Proofs (ZKPs). These cryptographic protocols allow a "prover" to demonstrate knowledge of a secret to a "verifier" without ever revealing the secret itself.</w:t>
+      </w:r>
+    </w:p>
+    <w:p>
+      <w:pPr>
+        <w:spacing w:line="360" w:lineRule="auto"/>
+        <w:rPr>
+          <w:rFonts w:ascii="Arial" w:hAnsi="Arial" w:cs="Arial"/>
+        </w:rPr>
+      </w:pPr>
+    </w:p>
+    <w:p>
+      <w:pPr>
+        <w:spacing w:line="360" w:lineRule="auto"/>
+        <w:rPr>
+          <w:rFonts w:ascii="Arial" w:hAnsi="Arial" w:cs="Arial"/>
+          <w:b/>
+          <w:bCs/>
+        </w:rPr>
+      </w:pPr>
+      <w:r>
+        <w:rPr>
+          <w:rFonts w:ascii="Arial" w:hAnsi="Arial" w:cs="Arial"/>
+          <w:b/>
+          <w:bCs/>
+        </w:rPr>
+        <w:t>2.3.1 Privacy-Preserving Authentication</w:t>
+      </w:r>
+    </w:p>
+    <w:p>
+      <w:pPr>
+        <w:spacing w:line="360" w:lineRule="auto"/>
+        <w:rPr>
+          <w:rFonts w:ascii="Arial" w:hAnsi="Arial" w:cs="Arial"/>
+        </w:rPr>
+      </w:pPr>
+      <w:r>
+        <w:rPr>
+          <w:rFonts w:ascii="Arial" w:hAnsi="Arial" w:cs="Arial"/>
+        </w:rPr>
+        <w:t xml:space="preserve">The shift from traditional authentication to ZKP is driven by the need to eliminate shared secrets. Bhattacharya et al. (2024), in "Enhancing Digital Privacy: The Application of </w:t>
+      </w:r>
       <w:r>
         <w:rPr>
           <w:rFonts w:ascii="Arial" w:hAnsi="Arial" w:cs="Arial"/>
         </w:rPr>
         <w:lastRenderedPageBreak/>
-        <w:t xml:space="preserve">Complementing this, </w:t>
-      </w:r>
-      <w:r>
-        <w:rPr>
-          <w:rFonts w:ascii="Arial" w:hAnsi="Arial" w:cs="Arial"/>
-          <w:i/>
-          <w:iCs/>
-        </w:rPr>
-        <w:t>"A Review of Recent Advances, Challenges, and Opportunities in Malicious Insider Threat Detection Using Machine Learning Methods" (2024)</w:t>
-      </w:r>
-      <w:r>
-        <w:rPr>
-          <w:rFonts w:ascii="Arial" w:hAnsi="Arial" w:cs="Arial"/>
-        </w:rPr>
-        <w:t xml:space="preserve"> provided a systematic survey of ML techniques. The authors categorized dozens of papers and concluded that while Deep Learning is becoming the standard for high-dimensional data, it suffers from a lack of "explainability" and struggles with data imbalance (too few examples of actual attacks). This review justifies the need for pre-trained or specialized models to handle the nuanced nature of insider threats.</w:t>
-      </w:r>
-    </w:p>
-    <w:p>
-      <w:pPr>
-        <w:spacing w:line="360" w:lineRule="auto"/>
-        <w:rPr>
-          <w:rFonts w:ascii="Arial" w:hAnsi="Arial" w:cs="Arial"/>
-        </w:rPr>
-      </w:pPr>
-    </w:p>
-    <w:p>
-      <w:pPr>
-        <w:spacing w:line="360" w:lineRule="auto"/>
-        <w:rPr>
-          <w:rFonts w:ascii="Arial" w:hAnsi="Arial" w:cs="Arial"/>
-          <w:b/>
-          <w:bCs/>
-        </w:rPr>
-      </w:pPr>
-      <w:r>
-        <w:rPr>
-          <w:rFonts w:ascii="Arial" w:hAnsi="Arial" w:cs="Arial"/>
-          <w:b/>
-          <w:bCs/>
-        </w:rPr>
-        <w:t>2.2.3 Endpoint Vulnerabilities</w:t>
-      </w:r>
-    </w:p>
-    <w:p>
-      <w:pPr>
-        <w:spacing w:line="360" w:lineRule="auto"/>
-        <w:rPr>
-          <w:rFonts w:ascii="Arial" w:hAnsi="Arial" w:cs="Arial"/>
-        </w:rPr>
-      </w:pPr>
-      <w:r>
-        <w:rPr>
-          <w:rFonts w:ascii="Arial" w:hAnsi="Arial" w:cs="Arial"/>
-        </w:rPr>
-        <w:t xml:space="preserve">The importance of securing the endpoint (the user's device) was further emphasized in </w:t>
-      </w:r>
-      <w:r>
-        <w:rPr>
-          <w:rFonts w:ascii="Arial" w:hAnsi="Arial" w:cs="Arial"/>
-          <w:i/>
-          <w:iCs/>
-        </w:rPr>
-        <w:t>"Threat Modeling for Enterprise Secure Messaging Applications" (2025)</w:t>
-      </w:r>
-      <w:r>
-        <w:rPr>
-          <w:rFonts w:ascii="Arial" w:hAnsi="Arial" w:cs="Arial"/>
-        </w:rPr>
-        <w:t xml:space="preserve">. The authors used threat modeling frameworks (like STRIDE) to map architectures of apps such as Slack and Teams. They concluded that while the network layer is encrypted, the endpoint remains vulnerable to session hijacking and metadata analysis. Following this threat model analysis, </w:t>
-      </w:r>
-      <w:r>
-        <w:rPr>
-          <w:rFonts w:ascii="Arial" w:hAnsi="Arial" w:cs="Arial"/>
-          <w:i/>
-          <w:iCs/>
-        </w:rPr>
-        <w:t>SentriZK</w:t>
-      </w:r>
-      <w:r>
-        <w:rPr>
-          <w:rFonts w:ascii="Arial" w:hAnsi="Arial" w:cs="Arial"/>
-        </w:rPr>
-        <w:t xml:space="preserve"> focuses on securing the mobile app itself, moving the detection logic from the server to the client device.</w:t>
-      </w:r>
-    </w:p>
-    <w:p>
-      <w:pPr>
-        <w:spacing w:line="360" w:lineRule="auto"/>
-        <w:rPr>
-          <w:rFonts w:ascii="Arial" w:hAnsi="Arial" w:cs="Arial"/>
-        </w:rPr>
-      </w:pPr>
-    </w:p>
-    <w:p>
-      <w:pPr>
-        <w:spacing w:line="360" w:lineRule="auto"/>
-        <w:rPr>
-          <w:rFonts w:ascii="Arial" w:hAnsi="Arial" w:cs="Arial"/>
-          <w:b/>
-          <w:bCs/>
-        </w:rPr>
-      </w:pPr>
-      <w:r>
-        <w:rPr>
-          <w:rFonts w:ascii="Arial" w:hAnsi="Arial" w:cs="Arial"/>
-          <w:b/>
-          <w:bCs/>
-        </w:rPr>
-        <w:t>2.3 Zero-Knowledge Proofs (Authentication)</w:t>
-      </w:r>
-    </w:p>
-    <w:p>
-      <w:pPr>
-        <w:spacing w:line="360" w:lineRule="auto"/>
-        <w:rPr>
-          <w:rFonts w:ascii="Arial" w:hAnsi="Arial" w:cs="Arial"/>
-        </w:rPr>
-      </w:pPr>
-      <w:r>
-        <w:rPr>
-          <w:rFonts w:ascii="Arial" w:hAnsi="Arial" w:cs="Arial"/>
-        </w:rPr>
-        <w:t>To address the vulnerabilities of centralized credential storage, researchers have increasingly turned to Zero-Knowledge Proofs (ZKPs). ZKP allows a user to prove they know a secret (like a password) without revealing the secret itself to the server.</w:t>
-      </w:r>
-    </w:p>
-    <w:p>
-      <w:pPr>
-        <w:spacing w:line="360" w:lineRule="auto"/>
-        <w:rPr>
-          <w:rFonts w:ascii="Arial" w:hAnsi="Arial" w:cs="Arial"/>
-        </w:rPr>
-      </w:pPr>
-    </w:p>
-    <w:p>
-      <w:pPr>
-        <w:spacing w:line="360" w:lineRule="auto"/>
-        <w:rPr>
-          <w:rFonts w:ascii="Arial" w:hAnsi="Arial" w:cs="Arial"/>
-          <w:b/>
-          <w:bCs/>
-        </w:rPr>
-      </w:pPr>
-      <w:r>
-        <w:rPr>
-          <w:rFonts w:ascii="Arial" w:hAnsi="Arial" w:cs="Arial"/>
-          <w:b/>
-          <w:bCs/>
-        </w:rPr>
-        <w:t>2.3.1 Privacy-Preserving Authentication</w:t>
-      </w:r>
-    </w:p>
-    <w:p>
-      <w:pPr>
-        <w:spacing w:line="360" w:lineRule="auto"/>
-        <w:rPr>
-          <w:rFonts w:ascii="Arial" w:hAnsi="Arial" w:cs="Arial"/>
-        </w:rPr>
-      </w:pPr>
-      <w:r>
-        <w:rPr>
-          <w:rFonts w:ascii="Arial" w:hAnsi="Arial" w:cs="Arial"/>
-        </w:rPr>
-        <w:t xml:space="preserve">Bhattacharya et al. (2024), in </w:t>
-      </w:r>
-      <w:r>
-        <w:rPr>
-          <w:rFonts w:ascii="Arial" w:hAnsi="Arial" w:cs="Arial"/>
-          <w:i/>
-          <w:iCs/>
-        </w:rPr>
-        <w:t>"Enhancing Digital Privacy: The Application of Zero-Knowledge Proofs in Authentication Systems,"</w:t>
-      </w:r>
-      <w:r>
-        <w:rPr>
-          <w:rFonts w:ascii="Arial" w:hAnsi="Arial" w:cs="Arial"/>
-        </w:rPr>
-        <w:t xml:space="preserve"> conducted a comparative analysis between traditional password hashing and ZKP-based systems. Their findings confirm that ZKPs offer superior privacy by eliminating the transmission of credentials. The study distinguishes between zk-SNARKs (efficient, small proofs) and zk-STARKs </w:t>
+        <w:t xml:space="preserve">Zero-Knowledge Proofs in Authentication Systems," provided a comparative analysis between password hashing and ZKP-based systems. Their findings indicated that ZKPs offer superior privacy by completely avoiding credential transmission. The study distinguished between </w:t>
+      </w:r>
+      <w:proofErr w:type="spellStart"/>
+      <w:r>
+        <w:rPr>
+          <w:rFonts w:ascii="Arial" w:hAnsi="Arial" w:cs="Arial"/>
+        </w:rPr>
+        <w:t>zk</w:t>
+      </w:r>
+      <w:proofErr w:type="spellEnd"/>
+      <w:r>
+        <w:rPr>
+          <w:rFonts w:ascii="Arial" w:hAnsi="Arial" w:cs="Arial"/>
+        </w:rPr>
+        <w:t xml:space="preserve">-SNARKs (Zero-Knowledge Succinct Non-Interactive Argument of Knowledge), which are noted for their efficiency and small proof sizes, and </w:t>
+      </w:r>
+      <w:proofErr w:type="spellStart"/>
+      <w:r>
+        <w:rPr>
+          <w:rFonts w:ascii="Arial" w:hAnsi="Arial" w:cs="Arial"/>
+        </w:rPr>
+        <w:t>zk</w:t>
+      </w:r>
+      <w:proofErr w:type="spellEnd"/>
+      <w:r>
+        <w:rPr>
+          <w:rFonts w:ascii="Arial" w:hAnsi="Arial" w:cs="Arial"/>
+        </w:rPr>
+        <w:t xml:space="preserve">-STARKs, which offer quantum resistance but require larger proofs. The researchers concluded that while </w:t>
+      </w:r>
+      <w:proofErr w:type="spellStart"/>
+      <w:r>
+        <w:rPr>
+          <w:rFonts w:ascii="Arial" w:hAnsi="Arial" w:cs="Arial"/>
+        </w:rPr>
+        <w:t>zk</w:t>
+      </w:r>
+      <w:proofErr w:type="spellEnd"/>
+      <w:r>
+        <w:rPr>
+          <w:rFonts w:ascii="Arial" w:hAnsi="Arial" w:cs="Arial"/>
+        </w:rPr>
+        <w:t>-SNARKs are efficient, the complexity of implementation remains a barrier to widespread adoption.</w:t>
+      </w:r>
+    </w:p>
+    <w:p>
+      <w:pPr>
+        <w:spacing w:line="360" w:lineRule="auto"/>
+        <w:rPr>
+          <w:rFonts w:ascii="Arial" w:hAnsi="Arial" w:cs="Arial"/>
+        </w:rPr>
+      </w:pPr>
+    </w:p>
+    <w:p>
+      <w:pPr>
+        <w:spacing w:line="360" w:lineRule="auto"/>
+        <w:rPr>
+          <w:rFonts w:ascii="Arial" w:hAnsi="Arial" w:cs="Arial"/>
+          <w:b/>
+          <w:bCs/>
+        </w:rPr>
+      </w:pPr>
+      <w:r>
+        <w:rPr>
+          <w:rFonts w:ascii="Arial" w:hAnsi="Arial" w:cs="Arial"/>
+          <w:b/>
+          <w:bCs/>
+        </w:rPr>
+        <w:t>2.3.2 Feasibility on Resource-Constrained Devices</w:t>
+      </w:r>
+    </w:p>
+    <w:p>
+      <w:pPr>
+        <w:spacing w:line="360" w:lineRule="auto"/>
+        <w:rPr>
+          <w:rFonts w:ascii="Arial" w:hAnsi="Arial" w:cs="Arial"/>
+        </w:rPr>
+      </w:pPr>
+      <w:r>
+        <w:rPr>
+          <w:rFonts w:ascii="Arial" w:hAnsi="Arial" w:cs="Arial"/>
+        </w:rPr>
+        <w:t xml:space="preserve">A primary concern in the literature is whether mobile devices possess the computational power required for ZKP operations. A 2023 study, "A Survey on Zero-Knowledge Authentication for Internet of Things," addressed this by comparing various ZKP schemes on hardware with limited battery and processing power. The survey concluded that Non-Interactive Zero-Knowledge Proofs (NI-ZKP), specifically the Groth16 protocol, are highly efficient due to their minimal proof size. This </w:t>
+      </w:r>
+      <w:proofErr w:type="gramStart"/>
+      <w:r>
+        <w:rPr>
+          <w:rFonts w:ascii="Arial" w:hAnsi="Arial" w:cs="Arial"/>
+        </w:rPr>
+        <w:t>validates</w:t>
+      </w:r>
+      <w:proofErr w:type="gramEnd"/>
+      <w:r>
+        <w:rPr>
+          <w:rFonts w:ascii="Arial" w:hAnsi="Arial" w:cs="Arial"/>
+        </w:rPr>
+        <w:t xml:space="preserve"> </w:t>
+      </w:r>
+      <w:proofErr w:type="gramStart"/>
+      <w:r>
+        <w:rPr>
+          <w:rFonts w:ascii="Arial" w:hAnsi="Arial" w:cs="Arial"/>
+        </w:rPr>
+        <w:t>that protocols</w:t>
+      </w:r>
+      <w:proofErr w:type="gramEnd"/>
+      <w:r>
+        <w:rPr>
+          <w:rFonts w:ascii="Arial" w:hAnsi="Arial" w:cs="Arial"/>
+        </w:rPr>
+        <w:t xml:space="preserve"> originally designed for IoT sensors are computationally feasible for modern smartphones.</w:t>
+      </w:r>
+    </w:p>
+    <w:p>
+      <w:pPr>
+        <w:spacing w:line="360" w:lineRule="auto"/>
+        <w:rPr>
+          <w:rFonts w:ascii="Arial" w:hAnsi="Arial" w:cs="Arial"/>
+        </w:rPr>
+      </w:pPr>
+    </w:p>
+    <w:p>
+      <w:pPr>
+        <w:spacing w:line="360" w:lineRule="auto"/>
+        <w:rPr>
+          <w:rFonts w:ascii="Arial" w:hAnsi="Arial" w:cs="Arial"/>
+          <w:b/>
+          <w:bCs/>
+        </w:rPr>
+      </w:pPr>
+      <w:r>
+        <w:rPr>
+          <w:rFonts w:ascii="Arial" w:hAnsi="Arial" w:cs="Arial"/>
+          <w:b/>
+          <w:bCs/>
+        </w:rPr>
+        <w:t>2.3.3 Application in Identity and Data Integrity</w:t>
+      </w:r>
+    </w:p>
+    <w:p>
+      <w:pPr>
+        <w:spacing w:line="360" w:lineRule="auto"/>
+        <w:rPr>
+          <w:rFonts w:ascii="Arial" w:hAnsi="Arial" w:cs="Arial"/>
+        </w:rPr>
+      </w:pPr>
+      <w:r>
+        <w:rPr>
+          <w:rFonts w:ascii="Arial" w:hAnsi="Arial" w:cs="Arial"/>
+        </w:rPr>
+        <w:t xml:space="preserve">Beyond basic login, ZKPs have been applied to broader identity management. In "Privacy-Preserving Identity Management System on Blockchain Using </w:t>
+      </w:r>
+      <w:proofErr w:type="spellStart"/>
+      <w:r>
+        <w:rPr>
+          <w:rFonts w:ascii="Arial" w:hAnsi="Arial" w:cs="Arial"/>
+        </w:rPr>
+        <w:t>zk</w:t>
+      </w:r>
+      <w:proofErr w:type="spellEnd"/>
+      <w:r>
+        <w:rPr>
+          <w:rFonts w:ascii="Arial" w:hAnsi="Arial" w:cs="Arial"/>
+        </w:rPr>
+        <w:t>-SNARK" (2023), researchers developed a prototype using the Ethereum blockchain to demonstrate "Self-Sovereign Identity." They successfully verified user identities without storing personal data, though they noted that blockchain transaction fees (gas costs) presented a scalability bottleneck.</w:t>
+      </w:r>
+    </w:p>
+    <w:p>
+      <w:pPr>
+        <w:spacing w:line="360" w:lineRule="auto"/>
+        <w:rPr>
+          <w:rFonts w:ascii="Arial" w:hAnsi="Arial" w:cs="Arial"/>
+        </w:rPr>
+      </w:pPr>
+    </w:p>
+    <w:p>
+      <w:pPr>
+        <w:spacing w:line="360" w:lineRule="auto"/>
+        <w:rPr>
+          <w:rFonts w:ascii="Arial" w:hAnsi="Arial" w:cs="Arial"/>
+        </w:rPr>
+      </w:pPr>
+      <w:r>
+        <w:rPr>
+          <w:rFonts w:ascii="Arial" w:hAnsi="Arial" w:cs="Arial"/>
+        </w:rPr>
+        <w:t xml:space="preserve">Similarly, a 2025 study titled "A Secure Framework for Privacy-Preserving Analytics in Healthcare Records" utilized ZKP to verify sensitive medical data without exposing </w:t>
       </w:r>
       <w:r>
         <w:rPr>
           <w:rFonts w:ascii="Arial" w:hAnsi="Arial" w:cs="Arial"/>
         </w:rPr>
         <w:lastRenderedPageBreak/>
-        <w:t>(quantum-resistant but larger proofs). They emphasized that while ZKPs provide superior privacy, widespread adoption is hindered by complexity, recommending future work focus on wrapping these protocols in user-friendly interfaces</w:t>
-      </w:r>
-      <w:r>
-        <w:rPr>
-          <w:rFonts w:ascii="Arial" w:hAnsi="Arial" w:cs="Arial"/>
-        </w:rPr>
-        <w:t xml:space="preserve"> </w:t>
-      </w:r>
-      <w:r>
-        <w:rPr>
-          <w:rFonts w:ascii="Arial" w:hAnsi="Arial" w:cs="Arial"/>
-        </w:rPr>
-        <w:t xml:space="preserve">an approach adopted by </w:t>
-      </w:r>
-      <w:r>
-        <w:rPr>
-          <w:rFonts w:ascii="Arial" w:hAnsi="Arial" w:cs="Arial"/>
-          <w:i/>
-          <w:iCs/>
-        </w:rPr>
-        <w:t>SentriZK</w:t>
-      </w:r>
-      <w:r>
-        <w:rPr>
-          <w:rFonts w:ascii="Arial" w:hAnsi="Arial" w:cs="Arial"/>
-        </w:rPr>
-        <w:t>.</w:t>
-      </w:r>
-    </w:p>
-    <w:p>
-      <w:pPr>
-        <w:spacing w:line="360" w:lineRule="auto"/>
-        <w:rPr>
-          <w:rFonts w:ascii="Arial" w:hAnsi="Arial" w:cs="Arial"/>
-        </w:rPr>
-      </w:pPr>
-    </w:p>
-    <w:p>
-      <w:pPr>
-        <w:spacing w:line="360" w:lineRule="auto"/>
-        <w:rPr>
-          <w:rFonts w:ascii="Arial" w:hAnsi="Arial" w:cs="Arial"/>
-          <w:b/>
-          <w:bCs/>
-        </w:rPr>
-      </w:pPr>
-      <w:r>
-        <w:rPr>
-          <w:rFonts w:ascii="Arial" w:hAnsi="Arial" w:cs="Arial"/>
-          <w:b/>
-          <w:bCs/>
-        </w:rPr>
-        <w:t>2.3.2 ZKP in Resource-Constrained Environments</w:t>
-      </w:r>
-    </w:p>
-    <w:p>
-      <w:pPr>
-        <w:spacing w:line="360" w:lineRule="auto"/>
-        <w:rPr>
-          <w:rFonts w:ascii="Arial" w:hAnsi="Arial" w:cs="Arial"/>
-        </w:rPr>
-      </w:pPr>
-      <w:r>
-        <w:rPr>
-          <w:rFonts w:ascii="Arial" w:hAnsi="Arial" w:cs="Arial"/>
-        </w:rPr>
-        <w:t xml:space="preserve">A critical challenge for mobile implementations is the computational intensity of generating cryptographic proofs. However, </w:t>
-      </w:r>
-      <w:r>
-        <w:rPr>
-          <w:rFonts w:ascii="Arial" w:hAnsi="Arial" w:cs="Arial"/>
-          <w:i/>
-          <w:iCs/>
-        </w:rPr>
-        <w:t>"A Survey on Zero-Knowledge Authentication for Internet of Things" (2023)</w:t>
-      </w:r>
-      <w:r>
-        <w:rPr>
-          <w:rFonts w:ascii="Arial" w:hAnsi="Arial" w:cs="Arial"/>
-        </w:rPr>
-        <w:t xml:space="preserve"> validates the feasibility of ZKPs on weak devices. The survey found that Non-Interactive ZKPs (NI-ZKP), particularly the Groth16 protocol, are highly efficient due to their small proof size. Since mobile devices share similar resource constraints with IoT sensors, </w:t>
-      </w:r>
-      <w:r>
-        <w:rPr>
-          <w:rFonts w:ascii="Arial" w:hAnsi="Arial" w:cs="Arial"/>
-          <w:i/>
-          <w:iCs/>
-        </w:rPr>
-        <w:t>SentriZK</w:t>
-      </w:r>
-      <w:r>
-        <w:rPr>
-          <w:rFonts w:ascii="Arial" w:hAnsi="Arial" w:cs="Arial"/>
-        </w:rPr>
-        <w:t xml:space="preserve"> adopts these efficiency recommendations, utilizing Groth16 to minimize battery impact.</w:t>
-      </w:r>
-    </w:p>
-    <w:p>
-      <w:pPr>
-        <w:spacing w:line="360" w:lineRule="auto"/>
-        <w:rPr>
-          <w:rFonts w:ascii="Arial" w:hAnsi="Arial" w:cs="Arial"/>
-        </w:rPr>
-      </w:pPr>
-    </w:p>
-    <w:p>
-      <w:pPr>
-        <w:spacing w:line="360" w:lineRule="auto"/>
-        <w:rPr>
-          <w:rFonts w:ascii="Arial" w:hAnsi="Arial" w:cs="Arial"/>
-          <w:b/>
-          <w:bCs/>
-        </w:rPr>
-      </w:pPr>
-      <w:r>
-        <w:rPr>
-          <w:rFonts w:ascii="Arial" w:hAnsi="Arial" w:cs="Arial"/>
-          <w:b/>
-          <w:bCs/>
-        </w:rPr>
-        <w:t>2.3.3 Identity and Data Integrity</w:t>
-      </w:r>
-    </w:p>
-    <w:p>
-      <w:pPr>
-        <w:spacing w:line="360" w:lineRule="auto"/>
-        <w:rPr>
-          <w:rFonts w:ascii="Arial" w:hAnsi="Arial" w:cs="Arial"/>
-        </w:rPr>
-      </w:pPr>
-      <w:r>
-        <w:rPr>
-          <w:rFonts w:ascii="Arial" w:hAnsi="Arial" w:cs="Arial"/>
-        </w:rPr>
-        <w:t xml:space="preserve">The practical application of ZKP extends beyond basic login. In </w:t>
-      </w:r>
-      <w:r>
-        <w:rPr>
-          <w:rFonts w:ascii="Arial" w:hAnsi="Arial" w:cs="Arial"/>
-          <w:i/>
-          <w:iCs/>
-        </w:rPr>
-        <w:t>"Privacy-Preserving Identity Management System on Blockchain Using zk-SNARK" (2023)</w:t>
-      </w:r>
-      <w:r>
-        <w:rPr>
-          <w:rFonts w:ascii="Arial" w:hAnsi="Arial" w:cs="Arial"/>
-        </w:rPr>
-        <w:t xml:space="preserve">, researchers built a prototype using Ethereum and Circom. They successfully verified users without storing passwords, proving that "Self-Sovereign Identity" is possible. While their use of Blockchain incurred gas costs, the core ZKP implementation demonstrated absolute privacy preservation, a concept </w:t>
-      </w:r>
-      <w:r>
-        <w:rPr>
-          <w:rFonts w:ascii="Arial" w:hAnsi="Arial" w:cs="Arial"/>
-          <w:i/>
-          <w:iCs/>
-        </w:rPr>
-        <w:t>SentriZK</w:t>
-      </w:r>
-      <w:r>
-        <w:rPr>
-          <w:rFonts w:ascii="Arial" w:hAnsi="Arial" w:cs="Arial"/>
-        </w:rPr>
-        <w:t xml:space="preserve"> adapts for chat authentication.</w:t>
-      </w:r>
-    </w:p>
-    <w:p>
-      <w:pPr>
-        <w:spacing w:line="360" w:lineRule="auto"/>
-        <w:rPr>
-          <w:rFonts w:ascii="Arial" w:hAnsi="Arial" w:cs="Arial"/>
-        </w:rPr>
-      </w:pPr>
-      <w:r>
-        <w:rPr>
-          <w:rFonts w:ascii="Arial" w:hAnsi="Arial" w:cs="Arial"/>
-        </w:rPr>
-        <w:t xml:space="preserve">Similarly, </w:t>
-      </w:r>
-      <w:r>
-        <w:rPr>
-          <w:rFonts w:ascii="Arial" w:hAnsi="Arial" w:cs="Arial"/>
-          <w:i/>
-          <w:iCs/>
-        </w:rPr>
-        <w:t>"A Secure Framework for Privacy-Preserving Analytics in Healthcare Records Using Zero-Knowledge Proofs" (2025)</w:t>
-      </w:r>
-      <w:r>
-        <w:rPr>
-          <w:rFonts w:ascii="Arial" w:hAnsi="Arial" w:cs="Arial"/>
-        </w:rPr>
-        <w:t xml:space="preserve"> demonstrated a system where sensitive medical data could be verified for research without being exposed. This concept of "Auditability without Visibility" is directly applicable to secure messaging. It proves that a system can verify a user's authorization status without ever storing or seeing their credentials.</w:t>
-      </w:r>
-    </w:p>
-    <w:p>
-      <w:pPr>
-        <w:spacing w:line="360" w:lineRule="auto"/>
-        <w:rPr>
-          <w:rFonts w:ascii="Arial" w:hAnsi="Arial" w:cs="Arial"/>
-        </w:rPr>
-      </w:pPr>
-    </w:p>
-    <w:p>
-      <w:pPr>
-        <w:spacing w:line="360" w:lineRule="auto"/>
-        <w:rPr>
-          <w:rFonts w:ascii="Arial" w:hAnsi="Arial" w:cs="Arial"/>
-        </w:rPr>
-      </w:pPr>
-    </w:p>
-    <w:p>
-      <w:pPr>
-        <w:spacing w:line="360" w:lineRule="auto"/>
-        <w:rPr>
-          <w:rFonts w:ascii="Arial" w:hAnsi="Arial" w:cs="Arial"/>
-        </w:rPr>
-      </w:pPr>
-    </w:p>
-    <w:p>
-      <w:pPr>
-        <w:spacing w:line="360" w:lineRule="auto"/>
-        <w:rPr>
-          <w:rFonts w:ascii="Arial" w:hAnsi="Arial" w:cs="Arial"/>
-          <w:b/>
-          <w:bCs/>
-        </w:rPr>
-      </w:pPr>
-      <w:r>
-        <w:rPr>
-          <w:rFonts w:ascii="Arial" w:hAnsi="Arial" w:cs="Arial"/>
-          <w:b/>
-          <w:bCs/>
-        </w:rPr>
-        <w:t>2.4 On-Device AI Anomaly Detection</w:t>
-      </w:r>
-    </w:p>
-    <w:p>
-      <w:pPr>
-        <w:spacing w:line="360" w:lineRule="auto"/>
-        <w:rPr>
-          <w:rFonts w:ascii="Arial" w:hAnsi="Arial" w:cs="Arial"/>
-        </w:rPr>
-      </w:pPr>
-      <w:r>
-        <w:rPr>
-          <w:rFonts w:ascii="Arial" w:hAnsi="Arial" w:cs="Arial"/>
-        </w:rPr>
-        <w:t>The final component of the proposed framework is the ability to detect threats locally on the device, bypassing the need for server-side scanning of decrypted messages.</w:t>
-      </w:r>
-    </w:p>
-    <w:p>
-      <w:pPr>
-        <w:spacing w:line="360" w:lineRule="auto"/>
-        <w:rPr>
-          <w:rFonts w:ascii="Arial" w:hAnsi="Arial" w:cs="Arial"/>
-        </w:rPr>
-      </w:pPr>
-    </w:p>
-    <w:p>
-      <w:pPr>
-        <w:spacing w:line="360" w:lineRule="auto"/>
-        <w:rPr>
-          <w:rFonts w:ascii="Arial" w:hAnsi="Arial" w:cs="Arial"/>
-          <w:b/>
-          <w:bCs/>
-        </w:rPr>
-      </w:pPr>
-      <w:r>
-        <w:rPr>
-          <w:rFonts w:ascii="Arial" w:hAnsi="Arial" w:cs="Arial"/>
-          <w:b/>
-          <w:bCs/>
-        </w:rPr>
-        <w:t>2.4.1 Shift from Cloud to Edge AI</w:t>
-      </w:r>
-    </w:p>
-    <w:p>
-      <w:pPr>
-        <w:spacing w:line="360" w:lineRule="auto"/>
-        <w:rPr>
-          <w:rFonts w:ascii="Arial" w:hAnsi="Arial" w:cs="Arial"/>
-        </w:rPr>
-      </w:pPr>
-      <w:r>
-        <w:rPr>
-          <w:rFonts w:ascii="Arial" w:hAnsi="Arial" w:cs="Arial"/>
-        </w:rPr>
-        <w:t xml:space="preserve">Natha et al. (2022), in </w:t>
-      </w:r>
-      <w:r>
-        <w:rPr>
-          <w:rFonts w:ascii="Arial" w:hAnsi="Arial" w:cs="Arial"/>
-          <w:i/>
-          <w:iCs/>
-        </w:rPr>
-        <w:t>"A Systematic Review of Anomaly detection using Machine and Deep Learning Techniques,"</w:t>
-      </w:r>
-      <w:r>
-        <w:rPr>
-          <w:rFonts w:ascii="Arial" w:hAnsi="Arial" w:cs="Arial"/>
-        </w:rPr>
-        <w:t xml:space="preserve"> highlighted that while traditional machine learning (like SVM) is faster, it often underfits complex, noisy real-world data. Deep Learning is required for high accuracy but traditionally relies on cloud computing.</w:t>
-      </w:r>
-    </w:p>
-    <w:p>
-      <w:pPr>
-        <w:spacing w:line="360" w:lineRule="auto"/>
-        <w:rPr>
-          <w:rFonts w:ascii="Arial" w:hAnsi="Arial" w:cs="Arial"/>
-        </w:rPr>
-      </w:pPr>
-      <w:r>
-        <w:rPr>
-          <w:rFonts w:ascii="Arial" w:hAnsi="Arial" w:cs="Arial"/>
-        </w:rPr>
-        <w:t xml:space="preserve">However, recent advancements have made "Edge AI" viable. The paper </w:t>
-      </w:r>
-      <w:r>
-        <w:rPr>
-          <w:rFonts w:ascii="Arial" w:hAnsi="Arial" w:cs="Arial"/>
-          <w:i/>
-          <w:iCs/>
-        </w:rPr>
-        <w:t>"PHILDER: Lightweight Framework for Intelligent Phishing Detection on Resource-Limited Devices" (2025)</w:t>
-      </w:r>
-      <w:r>
-        <w:rPr>
-          <w:rFonts w:ascii="Arial" w:hAnsi="Arial" w:cs="Arial"/>
-        </w:rPr>
-        <w:t xml:space="preserve"> demonstrated a compressed Deep Learning model capable of running on ARM-based mobile processors. They achieved over 90% accuracy in detecting phishing URLs with less than 100ms latency. This validates the architectural decision of </w:t>
-      </w:r>
-      <w:r>
-        <w:rPr>
-          <w:rFonts w:ascii="Arial" w:hAnsi="Arial" w:cs="Arial"/>
-          <w:i/>
-          <w:iCs/>
-        </w:rPr>
-        <w:t>SentriZK</w:t>
-      </w:r>
-      <w:r>
-        <w:rPr>
-          <w:rFonts w:ascii="Arial" w:hAnsi="Arial" w:cs="Arial"/>
-        </w:rPr>
-        <w:t xml:space="preserve"> to deploy models locally, eliminating the latency and privacy risks associated with cloud-based scanning.</w:t>
-      </w:r>
-    </w:p>
-    <w:p>
-      <w:pPr>
-        <w:spacing w:line="360" w:lineRule="auto"/>
-        <w:rPr>
-          <w:rFonts w:ascii="Arial" w:hAnsi="Arial" w:cs="Arial"/>
-        </w:rPr>
-      </w:pPr>
-    </w:p>
-    <w:p>
-      <w:pPr>
-        <w:spacing w:line="360" w:lineRule="auto"/>
-        <w:rPr>
-          <w:rFonts w:ascii="Arial" w:hAnsi="Arial" w:cs="Arial"/>
-          <w:b/>
-          <w:bCs/>
-        </w:rPr>
-      </w:pPr>
-      <w:r>
-        <w:rPr>
-          <w:rFonts w:ascii="Arial" w:hAnsi="Arial" w:cs="Arial"/>
-          <w:b/>
-          <w:bCs/>
-        </w:rPr>
-        <w:t>2.4.2 Optimization for Mobile Architecture</w:t>
-      </w:r>
-    </w:p>
-    <w:p>
-      <w:pPr>
-        <w:spacing w:line="360" w:lineRule="auto"/>
-        <w:rPr>
-          <w:rFonts w:ascii="Arial" w:hAnsi="Arial" w:cs="Arial"/>
-        </w:rPr>
-      </w:pPr>
-      <w:r>
-        <w:rPr>
-          <w:rFonts w:ascii="Arial" w:hAnsi="Arial" w:cs="Arial"/>
-        </w:rPr>
-        <w:t xml:space="preserve">Further supporting this approach, Gaurav et al. (2025) presented </w:t>
-      </w:r>
-      <w:r>
-        <w:rPr>
-          <w:rFonts w:ascii="Arial" w:hAnsi="Arial" w:cs="Arial"/>
-          <w:i/>
-          <w:iCs/>
-        </w:rPr>
-        <w:t>"AI-Driven Smishing Detection in Android Devices Using TinyBERT and Aquila Optimization."</w:t>
-      </w:r>
-      <w:r>
-        <w:rPr>
-          <w:rFonts w:ascii="Arial" w:hAnsi="Arial" w:cs="Arial"/>
-        </w:rPr>
-        <w:t xml:space="preserve"> By using a transformer model optimized for Android (TinyBERT), they achieved 96.81% accuracy, significantly outperforming traditional models like Random Forest on mobile hardware. This proves that heavy models can be distilled for mobile use without a drastic loss in accuracy.</w:t>
-      </w:r>
-    </w:p>
-    <w:p>
-      <w:pPr>
-        <w:spacing w:line="360" w:lineRule="auto"/>
-        <w:rPr>
-          <w:rFonts w:ascii="Arial" w:hAnsi="Arial" w:cs="Arial"/>
-        </w:rPr>
-      </w:pPr>
-      <w:r>
-        <w:rPr>
-          <w:rFonts w:ascii="Arial" w:hAnsi="Arial" w:cs="Arial"/>
-        </w:rPr>
-        <w:t xml:space="preserve">Additionally, </w:t>
-      </w:r>
-      <w:r>
-        <w:rPr>
-          <w:rFonts w:ascii="Arial" w:hAnsi="Arial" w:cs="Arial"/>
-          <w:i/>
-          <w:iCs/>
-        </w:rPr>
-        <w:t>"Phishing Detection System Through Hybrid Machine Learning Based on URL" (2023)</w:t>
-      </w:r>
-      <w:r>
-        <w:rPr>
-          <w:rFonts w:ascii="Arial" w:hAnsi="Arial" w:cs="Arial"/>
-        </w:rPr>
-        <w:t xml:space="preserve"> explored combining different algorithms to improve detection. Their hybrid </w:t>
+        <w:t xml:space="preserve">patient records. This demonstrated the concept of "Auditability without </w:t>
+      </w:r>
+      <w:proofErr w:type="gramStart"/>
+      <w:r>
+        <w:rPr>
+          <w:rFonts w:ascii="Arial" w:hAnsi="Arial" w:cs="Arial"/>
+        </w:rPr>
+        <w:t>Visibility"—</w:t>
+      </w:r>
+      <w:proofErr w:type="gramEnd"/>
+      <w:r>
+        <w:rPr>
+          <w:rFonts w:ascii="Arial" w:hAnsi="Arial" w:cs="Arial"/>
+        </w:rPr>
+        <w:t>proving that a system can verify a user's authorization status or data validity without ever viewing the underlying sensitive information.</w:t>
+      </w:r>
+    </w:p>
+    <w:p>
+      <w:pPr>
+        <w:spacing w:line="360" w:lineRule="auto"/>
+        <w:rPr>
+          <w:rFonts w:ascii="Arial" w:hAnsi="Arial" w:cs="Arial"/>
+        </w:rPr>
+      </w:pPr>
+    </w:p>
+    <w:p>
+      <w:pPr>
+        <w:spacing w:line="360" w:lineRule="auto"/>
+        <w:rPr>
+          <w:rFonts w:ascii="Arial" w:hAnsi="Arial" w:cs="Arial"/>
+        </w:rPr>
+      </w:pPr>
+    </w:p>
+    <w:p>
+      <w:pPr>
+        <w:spacing w:line="360" w:lineRule="auto"/>
+        <w:rPr>
+          <w:rFonts w:ascii="Arial" w:hAnsi="Arial" w:cs="Arial"/>
+          <w:b/>
+          <w:bCs/>
+        </w:rPr>
+      </w:pPr>
+      <w:r>
+        <w:rPr>
+          <w:rFonts w:ascii="Arial" w:hAnsi="Arial" w:cs="Arial"/>
+          <w:b/>
+          <w:bCs/>
+        </w:rPr>
+        <w:t>2.4 End-to-End Encryption (E2EE) Protocols</w:t>
+      </w:r>
+    </w:p>
+    <w:p>
+      <w:pPr>
+        <w:spacing w:line="360" w:lineRule="auto"/>
+        <w:rPr>
+          <w:rFonts w:ascii="Arial" w:hAnsi="Arial" w:cs="Arial"/>
+        </w:rPr>
+      </w:pPr>
+      <w:r>
+        <w:rPr>
+          <w:rFonts w:ascii="Arial" w:hAnsi="Arial" w:cs="Arial"/>
+        </w:rPr>
+        <w:t>While ZKP addresses authentication privacy, the integrity of the messaging channel itself relies on End-to-End Encryption protocols. Current literature highlights that while the encryption mathematics are sound, the implementation and surrounding processes are vulnerable.</w:t>
+      </w:r>
+    </w:p>
+    <w:p>
+      <w:pPr>
+        <w:spacing w:line="360" w:lineRule="auto"/>
+        <w:rPr>
+          <w:rFonts w:ascii="Arial" w:hAnsi="Arial" w:cs="Arial"/>
+        </w:rPr>
+      </w:pPr>
+    </w:p>
+    <w:p>
+      <w:pPr>
+        <w:spacing w:line="360" w:lineRule="auto"/>
+        <w:rPr>
+          <w:rFonts w:ascii="Arial" w:hAnsi="Arial" w:cs="Arial"/>
+          <w:b/>
+          <w:bCs/>
+        </w:rPr>
+      </w:pPr>
+      <w:r>
+        <w:rPr>
+          <w:rFonts w:ascii="Arial" w:hAnsi="Arial" w:cs="Arial"/>
+          <w:b/>
+          <w:bCs/>
+        </w:rPr>
+        <w:t>2.4.1 Vulnerabilities in Authentication Ceremonies</w:t>
+      </w:r>
+    </w:p>
+    <w:p>
+      <w:pPr>
+        <w:spacing w:line="360" w:lineRule="auto"/>
+        <w:rPr>
+          <w:rFonts w:ascii="Arial" w:hAnsi="Arial" w:cs="Arial"/>
+        </w:rPr>
+      </w:pPr>
+      <w:r>
+        <w:rPr>
+          <w:rFonts w:ascii="Arial" w:hAnsi="Arial" w:cs="Arial"/>
+        </w:rPr>
+        <w:t xml:space="preserve">A significant weakness in E2EE systems is the method used to verify that encryption keys belong to the intended user. </w:t>
+      </w:r>
+      <w:proofErr w:type="spellStart"/>
+      <w:r>
+        <w:rPr>
+          <w:rFonts w:ascii="Arial" w:hAnsi="Arial" w:cs="Arial"/>
+        </w:rPr>
+        <w:t>Alatawi</w:t>
+      </w:r>
+      <w:proofErr w:type="spellEnd"/>
+      <w:r>
+        <w:rPr>
+          <w:rFonts w:ascii="Arial" w:hAnsi="Arial" w:cs="Arial"/>
+        </w:rPr>
+        <w:t xml:space="preserve"> and Saxena (2023), in "</w:t>
+      </w:r>
+      <w:proofErr w:type="spellStart"/>
+      <w:r>
+        <w:rPr>
+          <w:rFonts w:ascii="Arial" w:hAnsi="Arial" w:cs="Arial"/>
+        </w:rPr>
+        <w:t>SoK</w:t>
+      </w:r>
+      <w:proofErr w:type="spellEnd"/>
+      <w:r>
+        <w:rPr>
+          <w:rFonts w:ascii="Arial" w:hAnsi="Arial" w:cs="Arial"/>
+        </w:rPr>
+        <w:t>: An Analysis of End-to-End Encryption and Authentication Ceremonies," analyzed 17 popular messaging applications. They found that while "opportunistic" encryption protects against passive eavesdropping, it fails against active Man-in-the-Middle (MitM) attacks because users neglect manual "Authentication Ceremonies" (e.g., scanning QR codes). The study identified human error in verifying long hexadecimal strings as a critical vulnerability, suggesting that manual verification is functionally broken.</w:t>
+      </w:r>
+    </w:p>
+    <w:p>
+      <w:pPr>
+        <w:spacing w:line="360" w:lineRule="auto"/>
+        <w:rPr>
+          <w:rFonts w:ascii="Arial" w:hAnsi="Arial" w:cs="Arial"/>
+          <w:b/>
+          <w:bCs/>
+        </w:rPr>
+      </w:pPr>
+    </w:p>
+    <w:p>
+      <w:pPr>
+        <w:spacing w:line="360" w:lineRule="auto"/>
+        <w:rPr>
+          <w:rFonts w:ascii="Arial" w:hAnsi="Arial" w:cs="Arial"/>
+          <w:b/>
+          <w:bCs/>
+        </w:rPr>
+      </w:pPr>
+      <w:r>
+        <w:rPr>
+          <w:rFonts w:ascii="Arial" w:hAnsi="Arial" w:cs="Arial"/>
+          <w:b/>
+          <w:bCs/>
+        </w:rPr>
+        <w:t>2.4.2 The Insider Threat Landscape</w:t>
+      </w:r>
+    </w:p>
+    <w:p>
+      <w:pPr>
+        <w:spacing w:line="360" w:lineRule="auto"/>
+        <w:rPr>
+          <w:rFonts w:ascii="Arial" w:hAnsi="Arial" w:cs="Arial"/>
+        </w:rPr>
+      </w:pPr>
+      <w:r>
+        <w:rPr>
+          <w:rFonts w:ascii="Arial" w:hAnsi="Arial" w:cs="Arial"/>
+        </w:rPr>
+        <w:t xml:space="preserve">Encryption creates a "blind spot" for monitoring malicious activity originating from authorized users. In "Insider Threat Detection and Secure Data Transfer Leveraging Bidirectional LSTM" (2025), researchers proposed using </w:t>
+      </w:r>
+      <w:r>
+        <w:rPr>
+          <w:rFonts w:ascii="Arial" w:hAnsi="Arial" w:cs="Arial"/>
+          <w:b/>
+          <w:bCs/>
+        </w:rPr>
+        <w:t>Bidirectional Long Short-Term Memory (Bi-LSTM)</w:t>
+      </w:r>
+      <w:r>
+        <w:rPr>
+          <w:rFonts w:ascii="Arial" w:hAnsi="Arial" w:cs="Arial"/>
+        </w:rPr>
+        <w:t xml:space="preserve"> networks to analyze user behavior patterns. They found that </w:t>
       </w:r>
       <w:r>
         <w:rPr>
           <w:rFonts w:ascii="Arial" w:hAnsi="Arial" w:cs="Arial"/>
         </w:rPr>
         <w:lastRenderedPageBreak/>
-        <w:t xml:space="preserve">model experiment showed that combining "shallow" learning (Random Forest) with "deep" learning features extracted lexical patterns (like URL length and special characters) more effectively than single models. Drawing on these feature extraction techniques, </w:t>
-      </w:r>
-      <w:r>
-        <w:rPr>
-          <w:rFonts w:ascii="Arial" w:hAnsi="Arial" w:cs="Arial"/>
-          <w:i/>
-          <w:iCs/>
-        </w:rPr>
-        <w:t>SentriZK</w:t>
-      </w:r>
-      <w:r>
-        <w:rPr>
-          <w:rFonts w:ascii="Arial" w:hAnsi="Arial" w:cs="Arial"/>
-        </w:rPr>
-        <w:t xml:space="preserve"> utilizes TensorFlow Lite to analyze lexical patterns and behavioral metadata directly on the user's phone.</w:t>
-      </w:r>
-    </w:p>
-    <w:p>
-      <w:pPr>
-        <w:spacing w:line="360" w:lineRule="auto"/>
-        <w:rPr>
-          <w:rFonts w:ascii="Arial" w:hAnsi="Arial" w:cs="Arial"/>
-        </w:rPr>
-      </w:pPr>
-    </w:p>
-    <w:p>
-      <w:pPr>
-        <w:spacing w:line="360" w:lineRule="auto"/>
-        <w:rPr>
-          <w:rFonts w:ascii="Arial" w:hAnsi="Arial" w:cs="Arial"/>
-          <w:b/>
-          <w:bCs/>
-        </w:rPr>
-      </w:pPr>
-      <w:r>
-        <w:rPr>
-          <w:rFonts w:ascii="Arial" w:hAnsi="Arial" w:cs="Arial"/>
-          <w:b/>
-          <w:bCs/>
-        </w:rPr>
-        <w:t>2.5 Summary and Research Gap</w:t>
-      </w:r>
-    </w:p>
-    <w:p>
-      <w:pPr>
-        <w:spacing w:line="360" w:lineRule="auto"/>
-        <w:rPr>
-          <w:rFonts w:ascii="Arial" w:hAnsi="Arial" w:cs="Arial"/>
-        </w:rPr>
-      </w:pPr>
-      <w:r>
-        <w:rPr>
-          <w:rFonts w:ascii="Arial" w:hAnsi="Arial" w:cs="Arial"/>
-        </w:rPr>
+        <w:t>analyzing the sequence of actions (forward and backward in time) provided higher accuracy in detecting insiders than looking at isolated events.</w:t>
+      </w:r>
+    </w:p>
+    <w:p>
+      <w:pPr>
+        <w:spacing w:line="360" w:lineRule="auto"/>
+        <w:rPr>
+          <w:rFonts w:ascii="Arial" w:hAnsi="Arial" w:cs="Arial"/>
+        </w:rPr>
+      </w:pPr>
+    </w:p>
+    <w:p>
+      <w:pPr>
+        <w:spacing w:line="360" w:lineRule="auto"/>
+        <w:rPr>
+          <w:rFonts w:ascii="Arial" w:hAnsi="Arial" w:cs="Arial"/>
+        </w:rPr>
+      </w:pPr>
+      <w:r>
+        <w:rPr>
+          <w:rFonts w:ascii="Arial" w:hAnsi="Arial" w:cs="Arial"/>
+        </w:rPr>
+        <w:t>However, a 2024 systematic review titled "A Review of Recent Advances in Malicious Insider Threat Detection" noted limitations in using Deep Learning for this purpose. The authors highlighted that while Deep Learning handles high-dimensional data well, it suffers from a lack of "explainability" and struggles with data imbalance, as actual insider attacks are rare compared to normal traffic.</w:t>
+      </w:r>
+    </w:p>
+    <w:p>
+      <w:pPr>
+        <w:spacing w:line="360" w:lineRule="auto"/>
+        <w:rPr>
+          <w:rFonts w:ascii="Arial" w:hAnsi="Arial" w:cs="Arial"/>
+          <w:b/>
+          <w:bCs/>
+        </w:rPr>
+      </w:pPr>
+    </w:p>
+    <w:p>
+      <w:pPr>
+        <w:spacing w:line="360" w:lineRule="auto"/>
+        <w:rPr>
+          <w:rFonts w:ascii="Arial" w:hAnsi="Arial" w:cs="Arial"/>
+          <w:b/>
+          <w:bCs/>
+        </w:rPr>
+      </w:pPr>
+      <w:r>
+        <w:rPr>
+          <w:rFonts w:ascii="Arial" w:hAnsi="Arial" w:cs="Arial"/>
+          <w:b/>
+          <w:bCs/>
+        </w:rPr>
+        <w:t>2.4.3 Architecture and Scalability</w:t>
+      </w:r>
+    </w:p>
+    <w:p>
+      <w:pPr>
+        <w:spacing w:line="360" w:lineRule="auto"/>
+        <w:rPr>
+          <w:rFonts w:ascii="Arial" w:hAnsi="Arial" w:cs="Arial"/>
+        </w:rPr>
+      </w:pPr>
+      <w:r>
+        <w:rPr>
+          <w:rFonts w:ascii="Arial" w:hAnsi="Arial" w:cs="Arial"/>
+        </w:rPr>
+        <w:t>The underlying architecture of E2EE systems is also a subject of active research. In "Threat Modeling for Enterprise Secure Messaging Applications" (2025), authors used STRIDE threat modeling to identify that while the network layer is encrypted, endpoints remain vulnerable to metadata analysis and session hijacking. Additionally, practical implementation remains complex; a 2025 study on "Implementation of Secure E2EE Chat Application in Microservice Architecture" demonstrated a framework using AES-256 and Diffie-Hellman but relied on standard architectures that do not account for post-quantum threats.</w:t>
+      </w:r>
+    </w:p>
+    <w:p>
+      <w:pPr>
+        <w:spacing w:line="360" w:lineRule="auto"/>
+        <w:rPr>
+          <w:rFonts w:ascii="Arial" w:hAnsi="Arial" w:cs="Arial"/>
+        </w:rPr>
+      </w:pPr>
+      <w:r>
+        <w:rPr>
+          <w:rFonts w:ascii="Arial" w:hAnsi="Arial" w:cs="Arial"/>
+        </w:rPr>
+        <w:t xml:space="preserve">Finally, scalability remains a challenge. Barnes et al. (2023) discussed the </w:t>
+      </w:r>
+      <w:r>
+        <w:rPr>
+          <w:rFonts w:ascii="Arial" w:hAnsi="Arial" w:cs="Arial"/>
+          <w:b/>
+          <w:bCs/>
+        </w:rPr>
+        <w:t>Messaging Layer Security (MLS) Protocol (RFC 9420)</w:t>
+      </w:r>
+      <w:r>
+        <w:rPr>
+          <w:rFonts w:ascii="Arial" w:hAnsi="Arial" w:cs="Arial"/>
+        </w:rPr>
+        <w:t xml:space="preserve">, noting that traditional protocols like the Double Ratchet scale linearly (O(n)), causing latency in large groups. They introduced </w:t>
+      </w:r>
+      <w:proofErr w:type="spellStart"/>
+      <w:r>
+        <w:rPr>
+          <w:rFonts w:ascii="Arial" w:hAnsi="Arial" w:cs="Arial"/>
+          <w:b/>
+          <w:bCs/>
+        </w:rPr>
+        <w:t>TreeKEM</w:t>
+      </w:r>
+      <w:proofErr w:type="spellEnd"/>
+      <w:r>
+        <w:rPr>
+          <w:rFonts w:ascii="Arial" w:hAnsi="Arial" w:cs="Arial"/>
+        </w:rPr>
+        <w:t>, which uses binary trees to reduce re-keying costs to logarithmic time (</w:t>
+      </w:r>
+      <w:proofErr w:type="gramStart"/>
+      <w:r>
+        <w:rPr>
+          <w:rFonts w:ascii="Arial" w:hAnsi="Arial" w:cs="Arial"/>
+        </w:rPr>
+        <w:t>O(</w:t>
+      </w:r>
+      <w:proofErr w:type="gramEnd"/>
+      <w:r>
+        <w:rPr>
+          <w:rFonts w:ascii="Arial" w:hAnsi="Arial" w:cs="Arial"/>
+        </w:rPr>
+        <w:t>log n)), proving that E2EE can be scaled efficiently if modern protocols are adopted.</w:t>
+      </w:r>
+    </w:p>
+    <w:p>
+      <w:pPr>
+        <w:spacing w:line="360" w:lineRule="auto"/>
+        <w:rPr>
+          <w:rFonts w:ascii="Arial" w:hAnsi="Arial" w:cs="Arial"/>
+        </w:rPr>
+      </w:pPr>
+    </w:p>
+    <w:p>
+      <w:pPr>
+        <w:spacing w:line="360" w:lineRule="auto"/>
+        <w:rPr>
+          <w:rFonts w:ascii="Arial" w:hAnsi="Arial" w:cs="Arial"/>
+          <w:b/>
+          <w:bCs/>
+        </w:rPr>
+      </w:pPr>
+      <w:r>
+        <w:rPr>
+          <w:rFonts w:ascii="Arial" w:hAnsi="Arial" w:cs="Arial"/>
+          <w:b/>
+          <w:bCs/>
+        </w:rPr>
+        <w:t>2.5 On-Device AI Anomaly Detection</w:t>
+      </w:r>
+    </w:p>
+    <w:p>
+      <w:pPr>
+        <w:spacing w:line="360" w:lineRule="auto"/>
+        <w:rPr>
+          <w:rFonts w:ascii="Arial" w:hAnsi="Arial" w:cs="Arial"/>
+        </w:rPr>
+      </w:pPr>
+      <w:r>
+        <w:rPr>
+          <w:rFonts w:ascii="Arial" w:hAnsi="Arial" w:cs="Arial"/>
+        </w:rPr>
+        <w:t xml:space="preserve">The final domain </w:t>
+      </w:r>
+      <w:proofErr w:type="gramStart"/>
+      <w:r>
+        <w:rPr>
+          <w:rFonts w:ascii="Arial" w:hAnsi="Arial" w:cs="Arial"/>
+        </w:rPr>
+        <w:t>reviewed</w:t>
+      </w:r>
+      <w:proofErr w:type="gramEnd"/>
+      <w:r>
+        <w:rPr>
+          <w:rFonts w:ascii="Arial" w:hAnsi="Arial" w:cs="Arial"/>
+        </w:rPr>
+        <w:t xml:space="preserve"> concerns the detection of the insider threats mentioned in Section 2.4 without compromising the privacy guarantees of E2EE. This requires moving analysis from the cloud to the device (Edge AI).</w:t>
+      </w:r>
+    </w:p>
+    <w:p>
+      <w:pPr>
+        <w:spacing w:line="360" w:lineRule="auto"/>
+        <w:rPr>
+          <w:rFonts w:ascii="Arial" w:hAnsi="Arial" w:cs="Arial"/>
+          <w:b/>
+          <w:bCs/>
+        </w:rPr>
+      </w:pPr>
+      <w:r>
+        <w:rPr>
+          <w:rFonts w:ascii="Arial" w:hAnsi="Arial" w:cs="Arial"/>
+          <w:b/>
+          <w:bCs/>
+        </w:rPr>
+        <w:lastRenderedPageBreak/>
+        <w:t>2.5.1 The Shift to Edge Computing</w:t>
+      </w:r>
+    </w:p>
+    <w:p>
+      <w:pPr>
+        <w:spacing w:line="360" w:lineRule="auto"/>
+        <w:rPr>
+          <w:rFonts w:ascii="Arial" w:hAnsi="Arial" w:cs="Arial"/>
+        </w:rPr>
+      </w:pPr>
+      <w:r>
+        <w:rPr>
+          <w:rFonts w:ascii="Arial" w:hAnsi="Arial" w:cs="Arial"/>
+        </w:rPr>
+        <w:t xml:space="preserve">Natha et al. (2022), in "A Systematic Review of Anomaly detection using Machine and Deep Learning Techniques," highlighted that traditional Machine Learning (like SVM) often underfits complex real-world data, necessitating Deep Learning. Traditionally, Deep Learning required cloud resources, which </w:t>
+      </w:r>
+      <w:proofErr w:type="gramStart"/>
+      <w:r>
+        <w:rPr>
+          <w:rFonts w:ascii="Arial" w:hAnsi="Arial" w:cs="Arial"/>
+        </w:rPr>
+        <w:t>poses</w:t>
+      </w:r>
+      <w:proofErr w:type="gramEnd"/>
+      <w:r>
+        <w:rPr>
+          <w:rFonts w:ascii="Arial" w:hAnsi="Arial" w:cs="Arial"/>
+        </w:rPr>
+        <w:t xml:space="preserve"> privacy risks.</w:t>
+      </w:r>
+    </w:p>
+    <w:p>
+      <w:pPr>
+        <w:spacing w:line="360" w:lineRule="auto"/>
+        <w:rPr>
+          <w:rFonts w:ascii="Arial" w:hAnsi="Arial" w:cs="Arial"/>
+        </w:rPr>
+      </w:pPr>
+      <w:r>
+        <w:rPr>
+          <w:rFonts w:ascii="Arial" w:hAnsi="Arial" w:cs="Arial"/>
+        </w:rPr>
+        <w:t>However, recent advancements have made on-device detection viable. The paper "PHILDER: Lightweight Framework for Intelligent Phishing Detection on Resource-Limited Devices" (2025) demonstrated a compressed Deep Learning model running on ARM-based mobile processors. The researchers achieved over 90% accuracy in detecting threats with less than 100ms latency, proving that heavy cloud servers are not strictly necessary for effective detection.</w:t>
+      </w:r>
+    </w:p>
+    <w:p>
+      <w:pPr>
+        <w:spacing w:line="360" w:lineRule="auto"/>
+        <w:rPr>
+          <w:rFonts w:ascii="Arial" w:hAnsi="Arial" w:cs="Arial"/>
+        </w:rPr>
+      </w:pPr>
+    </w:p>
+    <w:p>
+      <w:pPr>
+        <w:spacing w:line="360" w:lineRule="auto"/>
+        <w:rPr>
+          <w:rFonts w:ascii="Arial" w:hAnsi="Arial" w:cs="Arial"/>
+          <w:b/>
+          <w:bCs/>
+        </w:rPr>
+      </w:pPr>
+      <w:r>
+        <w:rPr>
+          <w:rFonts w:ascii="Arial" w:hAnsi="Arial" w:cs="Arial"/>
+          <w:b/>
+          <w:bCs/>
+        </w:rPr>
+        <w:t>2.5.2 Mobile Optimization Techniques</w:t>
+      </w:r>
+    </w:p>
+    <w:p>
+      <w:pPr>
+        <w:spacing w:line="360" w:lineRule="auto"/>
+        <w:rPr>
+          <w:rFonts w:ascii="Arial" w:hAnsi="Arial" w:cs="Arial"/>
+        </w:rPr>
+      </w:pPr>
+      <w:r>
+        <w:rPr>
+          <w:rFonts w:ascii="Arial" w:hAnsi="Arial" w:cs="Arial"/>
+        </w:rPr>
+        <w:t xml:space="preserve">Supporting this shift, Gaurav et al. (2025) presented "AI-Driven Smishing Detection in Android Devices Using </w:t>
+      </w:r>
+      <w:proofErr w:type="spellStart"/>
+      <w:r>
+        <w:rPr>
+          <w:rFonts w:ascii="Arial" w:hAnsi="Arial" w:cs="Arial"/>
+        </w:rPr>
+        <w:t>TinyBERT</w:t>
+      </w:r>
+      <w:proofErr w:type="spellEnd"/>
+      <w:r>
+        <w:rPr>
+          <w:rFonts w:ascii="Arial" w:hAnsi="Arial" w:cs="Arial"/>
+        </w:rPr>
+        <w:t xml:space="preserve">." By utilizing a </w:t>
+      </w:r>
+      <w:proofErr w:type="spellStart"/>
+      <w:r>
+        <w:rPr>
+          <w:rFonts w:ascii="Arial" w:hAnsi="Arial" w:cs="Arial"/>
+          <w:b/>
+          <w:bCs/>
+        </w:rPr>
+        <w:t>TinyBERT</w:t>
+      </w:r>
+      <w:proofErr w:type="spellEnd"/>
+      <w:r>
+        <w:rPr>
+          <w:rFonts w:ascii="Arial" w:hAnsi="Arial" w:cs="Arial"/>
+        </w:rPr>
+        <w:t xml:space="preserve"> transformer model optimized for Android, they achieved 96.81% accuracy, significantly outperforming traditional models like Random Forest. This validates that complex transformer models can be distilled for mobile use.</w:t>
+      </w:r>
+    </w:p>
+    <w:p>
+      <w:pPr>
+        <w:spacing w:line="360" w:lineRule="auto"/>
+        <w:rPr>
+          <w:rFonts w:ascii="Arial" w:hAnsi="Arial" w:cs="Arial"/>
+        </w:rPr>
+      </w:pPr>
+      <w:r>
+        <w:rPr>
+          <w:rFonts w:ascii="Arial" w:hAnsi="Arial" w:cs="Arial"/>
+        </w:rPr>
+        <w:t>Furthermore, a 2023 study on "Phishing Detection System Through Hybrid Machine Learning" explored combining algorithms. Their hybrid approach showed that combining "shallow" learning (Random Forest) with "deep" learning features allowed for better extraction of lexical patterns (such as URL length or character randomness) than using a single model alone.</w:t>
+      </w:r>
+    </w:p>
+    <w:p>
+      <w:pPr>
+        <w:spacing w:line="360" w:lineRule="auto"/>
+        <w:rPr>
+          <w:rFonts w:ascii="Arial" w:hAnsi="Arial" w:cs="Arial"/>
+        </w:rPr>
+      </w:pPr>
+    </w:p>
+    <w:p>
+      <w:pPr>
+        <w:spacing w:line="360" w:lineRule="auto"/>
+        <w:rPr>
+          <w:rFonts w:ascii="Arial" w:hAnsi="Arial" w:cs="Arial"/>
+        </w:rPr>
+      </w:pPr>
+    </w:p>
+    <w:p>
+      <w:pPr>
+        <w:spacing w:line="360" w:lineRule="auto"/>
+        <w:rPr>
+          <w:rFonts w:ascii="Arial" w:hAnsi="Arial" w:cs="Arial"/>
+          <w:b/>
+          <w:bCs/>
+        </w:rPr>
+      </w:pPr>
+      <w:r>
+        <w:rPr>
+          <w:rFonts w:ascii="Arial" w:hAnsi="Arial" w:cs="Arial"/>
+          <w:b/>
+          <w:bCs/>
+        </w:rPr>
+        <w:t>2.</w:t>
+      </w:r>
+      <w:r>
+        <w:rPr>
+          <w:rFonts w:ascii="Arial" w:hAnsi="Arial" w:cs="Arial"/>
+          <w:b/>
+          <w:bCs/>
+        </w:rPr>
+        <w:t>6</w:t>
+      </w:r>
+      <w:r>
+        <w:rPr>
+          <w:rFonts w:ascii="Arial" w:hAnsi="Arial" w:cs="Arial"/>
+          <w:b/>
+          <w:bCs/>
+        </w:rPr>
+        <w:t xml:space="preserve"> Summary and Research Gap</w:t>
+      </w:r>
+    </w:p>
+    <w:p>
+      <w:pPr>
+        <w:spacing w:line="360" w:lineRule="auto"/>
+        <w:rPr>
+          <w:rFonts w:ascii="Arial" w:hAnsi="Arial" w:cs="Arial"/>
+        </w:rPr>
+      </w:pPr>
+      <w:r>
+        <w:rPr>
+          <w:rFonts w:ascii="Arial" w:hAnsi="Arial" w:cs="Arial"/>
+        </w:rPr>
+        <w:lastRenderedPageBreak/>
         <w:t>The review of existing literature reveals specific strengths in individual technologies but a distinct gap in their integration for SME communication tools.</w:t>
+      </w:r>
+    </w:p>
+    <w:p>
+      <w:pPr>
+        <w:spacing w:line="360" w:lineRule="auto"/>
+        <w:rPr>
+          <w:rFonts w:ascii="Arial" w:hAnsi="Arial" w:cs="Arial"/>
+        </w:rPr>
+      </w:pPr>
+      <w:r>
+        <w:rPr>
+          <w:rFonts w:ascii="Arial" w:hAnsi="Arial" w:cs="Arial"/>
+          <w:b/>
+          <w:bCs/>
+        </w:rPr>
+        <w:t>Summary of Existing Literature:</w:t>
       </w:r>
     </w:p>
     <w:p>
       <w:pPr>
         <w:numPr>
           <w:ilvl w:val="0"/>
-          <w:numId w:val="10"/>
+          <w:numId w:val="44"/>
         </w:numPr>
         <w:spacing w:line="360" w:lineRule="auto"/>
         <w:rPr>
@@ -2355,20 +2935,34 @@
           <w:b/>
           <w:bCs/>
         </w:rPr>
-        <w:t>Authentication Gap:</w:t>
-      </w:r>
-      <w:r>
-        <w:rPr>
-          <w:rFonts w:ascii="Arial" w:hAnsi="Arial" w:cs="Arial"/>
-        </w:rPr>
-        <w:t xml:space="preserve"> While Alatawi and Saxena (2023) proved that manual authentication ceremonies in E2EE apps are failing, ZKP solutions (Bhattacharya et al., 2024; IoT Survey, 2023) are largely restricted to theoretical Blockchain or IoT studies, rarely applied to standard chat applications.</w:t>
+        <w:t>Authentication:</w:t>
+      </w:r>
+      <w:r>
+        <w:rPr>
+          <w:rFonts w:ascii="Arial" w:hAnsi="Arial" w:cs="Arial"/>
+        </w:rPr>
+        <w:t xml:space="preserve"> Research has proven that manual verification in E2EE is prone to failure (</w:t>
+      </w:r>
+      <w:proofErr w:type="spellStart"/>
+      <w:r>
+        <w:rPr>
+          <w:rFonts w:ascii="Arial" w:hAnsi="Arial" w:cs="Arial"/>
+        </w:rPr>
+        <w:t>Alatawi</w:t>
+      </w:r>
+      <w:proofErr w:type="spellEnd"/>
+      <w:r>
+        <w:rPr>
+          <w:rFonts w:ascii="Arial" w:hAnsi="Arial" w:cs="Arial"/>
+        </w:rPr>
+        <w:t xml:space="preserve"> &amp; Saxena, 2023), and while ZKP solutions exist (Bhattacharya et al., 2024), they are primarily applied to Blockchain or IoT contexts rather than standard communication apps.</w:t>
       </w:r>
     </w:p>
     <w:p>
       <w:pPr>
         <w:numPr>
           <w:ilvl w:val="0"/>
-          <w:numId w:val="10"/>
+          <w:numId w:val="44"/>
         </w:numPr>
         <w:spacing w:line="360" w:lineRule="auto"/>
         <w:rPr>
@@ -2381,43 +2975,89 @@
           <w:b/>
           <w:bCs/>
         </w:rPr>
-        <w:t>Detection Gap:</w:t>
-      </w:r>
-      <w:r>
-        <w:rPr>
-          <w:rFonts w:ascii="Arial" w:hAnsi="Arial" w:cs="Arial"/>
-        </w:rPr>
-        <w:t xml:space="preserve"> While Deep Learning is effective for insider threat detection (Bi-LSTM papers), it is traditionally server-dependent. Conversely, mobile-optimized AI (TinyBERT/PHILDER) is currently focused heavily on SMS/Phishing rather than real-time behavioral anomalies within encrypted chat sessions.</w:t>
-      </w:r>
-    </w:p>
-    <w:p>
-      <w:pPr>
-        <w:spacing w:line="360" w:lineRule="auto"/>
-        <w:rPr>
-          <w:rFonts w:ascii="Arial" w:hAnsi="Arial" w:cs="Arial"/>
-        </w:rPr>
-      </w:pPr>
-    </w:p>
-    <w:p>
-      <w:pPr>
-        <w:spacing w:line="360" w:lineRule="auto"/>
-        <w:rPr>
-          <w:rFonts w:ascii="Arial" w:hAnsi="Arial" w:cs="Arial"/>
-        </w:rPr>
-      </w:pPr>
-      <w:r>
-        <w:rPr>
-          <w:rFonts w:ascii="Arial" w:hAnsi="Arial" w:cs="Arial"/>
-          <w:b/>
-          <w:bCs/>
-        </w:rPr>
-        <w:t>Conclusion:</w:t>
-      </w:r>
-      <w:r>
-        <w:rPr>
-          <w:rFonts w:ascii="Arial" w:hAnsi="Arial" w:cs="Arial"/>
-        </w:rPr>
-        <w:t xml:space="preserve"> There is a lack of a unified framework that combines </w:t>
+        <w:t>Encryption &amp; Threats:</w:t>
+      </w:r>
+      <w:r>
+        <w:rPr>
+          <w:rFonts w:ascii="Arial" w:hAnsi="Arial" w:cs="Arial"/>
+        </w:rPr>
+        <w:t xml:space="preserve"> While E2EE protects against external threats, it blinds organizations to </w:t>
+      </w:r>
+      <w:proofErr w:type="gramStart"/>
+      <w:r>
+        <w:rPr>
+          <w:rFonts w:ascii="Arial" w:hAnsi="Arial" w:cs="Arial"/>
+        </w:rPr>
+        <w:t>internal malicious</w:t>
+      </w:r>
+      <w:proofErr w:type="gramEnd"/>
+      <w:r>
+        <w:rPr>
+          <w:rFonts w:ascii="Arial" w:hAnsi="Arial" w:cs="Arial"/>
+        </w:rPr>
+        <w:t xml:space="preserve"> actors. Deep Learning is effective for detecting these insider threats (Bi-LSTM papers), but most proposed solutions rely on centralized traffic analysis, which breaks the privacy model of E2EE.</w:t>
+      </w:r>
+    </w:p>
+    <w:p>
+      <w:pPr>
+        <w:numPr>
+          <w:ilvl w:val="0"/>
+          <w:numId w:val="44"/>
+        </w:numPr>
+        <w:spacing w:line="360" w:lineRule="auto"/>
+        <w:rPr>
+          <w:rFonts w:ascii="Arial" w:hAnsi="Arial" w:cs="Arial"/>
+        </w:rPr>
+      </w:pPr>
+      <w:r>
+        <w:rPr>
+          <w:rFonts w:ascii="Arial" w:hAnsi="Arial" w:cs="Arial"/>
+          <w:b/>
+          <w:bCs/>
+        </w:rPr>
+        <w:t>Detection:</w:t>
+      </w:r>
+      <w:r>
+        <w:rPr>
+          <w:rFonts w:ascii="Arial" w:hAnsi="Arial" w:cs="Arial"/>
+        </w:rPr>
+        <w:t xml:space="preserve"> Mobile AI (</w:t>
+      </w:r>
+      <w:proofErr w:type="spellStart"/>
+      <w:r>
+        <w:rPr>
+          <w:rFonts w:ascii="Arial" w:hAnsi="Arial" w:cs="Arial"/>
+        </w:rPr>
+        <w:t>TinyBERT</w:t>
+      </w:r>
+      <w:proofErr w:type="spellEnd"/>
+      <w:r>
+        <w:rPr>
+          <w:rFonts w:ascii="Arial" w:hAnsi="Arial" w:cs="Arial"/>
+        </w:rPr>
+        <w:t>, PHILDER) has been proven effective for specific tasks like SMS phishing, but there is a lack of research on applying these on-device models to monitor behavioral anomalies within an encrypted session in real-time.</w:t>
+      </w:r>
+    </w:p>
+    <w:p>
+      <w:pPr>
+        <w:spacing w:line="360" w:lineRule="auto"/>
+        <w:rPr>
+          <w:rFonts w:ascii="Arial" w:hAnsi="Arial" w:cs="Arial"/>
+        </w:rPr>
+      </w:pPr>
+      <w:r>
+        <w:rPr>
+          <w:rFonts w:ascii="Arial" w:hAnsi="Arial" w:cs="Arial"/>
+          <w:b/>
+          <w:bCs/>
+        </w:rPr>
+        <w:t>Identified Gap:</w:t>
+      </w:r>
+      <w:r>
+        <w:rPr>
+          <w:rFonts w:ascii="Arial" w:hAnsi="Arial" w:cs="Arial"/>
+        </w:rPr>
+        <w:t xml:space="preserve"> There is currently no unified framework that combines </w:t>
       </w:r>
       <w:r>
         <w:rPr>
@@ -2431,7 +3071,7 @@
         <w:rPr>
           <w:rFonts w:ascii="Arial" w:hAnsi="Arial" w:cs="Arial"/>
         </w:rPr>
-        <w:t xml:space="preserve"> for secure authentication with </w:t>
+        <w:t xml:space="preserve"> for automated, private authentication with </w:t>
       </w:r>
       <w:r>
         <w:rPr>
@@ -2445,30 +3085,125 @@
         <w:rPr>
           <w:rFonts w:ascii="Arial" w:hAnsi="Arial" w:cs="Arial"/>
         </w:rPr>
-        <w:t xml:space="preserve"> for behavioral anomaly detection in a mobile messaging environment. Existing solutions force a trade-off: either encrypt data and lose visibility on threats, or scan for threats and compromise privacy. </w:t>
-      </w:r>
-      <w:r>
-        <w:rPr>
-          <w:rFonts w:ascii="Arial" w:hAnsi="Arial" w:cs="Arial"/>
-          <w:i/>
-          <w:iCs/>
-        </w:rPr>
-        <w:t>SentriZK</w:t>
-      </w:r>
-      <w:r>
-        <w:rPr>
-          <w:rFonts w:ascii="Arial" w:hAnsi="Arial" w:cs="Arial"/>
-        </w:rPr>
-        <w:t xml:space="preserve"> aims to bridge this gap by integrating Groth16 zk-SNARKs and TensorFlow Lite to provide a secure, private, and intelligent messaging solution for SMEs.</w:t>
-      </w:r>
-    </w:p>
-    <w:p>
-      <w:pPr>
-        <w:spacing w:line="360" w:lineRule="auto"/>
-        <w:rPr>
-          <w:rFonts w:ascii="Arial" w:hAnsi="Arial" w:cs="Arial"/>
-        </w:rPr>
-      </w:pPr>
+        <w:t xml:space="preserve"> for behavioral anomaly detection. Existing solutions force a trade-off: organizations must either encrypt data and lose visibility on threats, or decrypt data for scanning and compromise user privacy.</w:t>
+      </w:r>
+    </w:p>
+    <w:p>
+      <w:pPr>
+        <w:spacing w:line="360" w:lineRule="auto"/>
+        <w:rPr>
+          <w:rFonts w:ascii="Arial" w:hAnsi="Arial" w:cs="Arial"/>
+        </w:rPr>
+      </w:pPr>
+    </w:p>
+    <w:p>
+      <w:pPr>
+        <w:spacing w:line="360" w:lineRule="auto"/>
+        <w:rPr>
+          <w:rFonts w:ascii="Arial" w:hAnsi="Arial" w:cs="Arial"/>
+        </w:rPr>
+      </w:pPr>
+      <w:r>
+        <w:rPr>
+          <w:rFonts w:ascii="Arial" w:hAnsi="Arial" w:cs="Arial"/>
+          <w:b/>
+          <w:bCs/>
+        </w:rPr>
+        <w:t>2.7 Conclusion</w:t>
+      </w:r>
+      <w:r>
+        <w:rPr>
+          <w:rFonts w:ascii="Arial" w:hAnsi="Arial" w:cs="Arial"/>
+        </w:rPr>
+        <w:t xml:space="preserve"> </w:t>
+      </w:r>
+    </w:p>
+    <w:p>
+      <w:pPr>
+        <w:spacing w:line="360" w:lineRule="auto"/>
+        <w:rPr>
+          <w:rFonts w:ascii="Arial" w:hAnsi="Arial" w:cs="Arial"/>
+        </w:rPr>
+      </w:pPr>
+      <w:r>
+        <w:rPr>
+          <w:rFonts w:ascii="Arial" w:hAnsi="Arial" w:cs="Arial"/>
+        </w:rPr>
+        <w:t xml:space="preserve">This chapter has presented a critical review of the existing literature related to secure messaging, cryptographic authentication, and mobile anomaly detection. The analysis highlighted three key findings: firstly, that current End-to-End Encryption (E2EE) implementations are vulnerable due to reliance on manual user verification; secondly, that Zero-Knowledge Proofs (ZKPs) offer a viable solution for privacy-preserving authentication but are rarely applied to standard chat applications; and thirdly, that </w:t>
+      </w:r>
+      <w:r>
+        <w:rPr>
+          <w:rFonts w:ascii="Arial" w:hAnsi="Arial" w:cs="Arial"/>
+        </w:rPr>
+        <w:lastRenderedPageBreak/>
+        <w:t>advances in Edge AI have made it possible to run sophisticated threat detection models directly on mobile devices.</w:t>
+      </w:r>
+    </w:p>
+    <w:p>
+      <w:pPr>
+        <w:spacing w:line="360" w:lineRule="auto"/>
+        <w:rPr>
+          <w:rFonts w:ascii="Arial" w:hAnsi="Arial" w:cs="Arial"/>
+        </w:rPr>
+      </w:pPr>
+      <w:r>
+        <w:rPr>
+          <w:rFonts w:ascii="Arial" w:hAnsi="Arial" w:cs="Arial"/>
+        </w:rPr>
+        <w:t xml:space="preserve">The review confirms that while the individual technologies required to secure SME communications exist, they lack </w:t>
+      </w:r>
+      <w:proofErr w:type="gramStart"/>
+      <w:r>
+        <w:rPr>
+          <w:rFonts w:ascii="Arial" w:hAnsi="Arial" w:cs="Arial"/>
+        </w:rPr>
+        <w:t>a unified</w:t>
+      </w:r>
+      <w:proofErr w:type="gramEnd"/>
+      <w:r>
+        <w:rPr>
+          <w:rFonts w:ascii="Arial" w:hAnsi="Arial" w:cs="Arial"/>
+        </w:rPr>
+        <w:t xml:space="preserve"> integration. The research gaps identified in this chapter</w:t>
+      </w:r>
+      <w:r>
+        <w:rPr>
+          <w:rFonts w:ascii="Arial" w:hAnsi="Arial" w:cs="Arial"/>
+        </w:rPr>
+        <w:t xml:space="preserve"> </w:t>
+      </w:r>
+      <w:r>
+        <w:rPr>
+          <w:rFonts w:ascii="Arial" w:hAnsi="Arial" w:cs="Arial"/>
+        </w:rPr>
+        <w:t>specifically the absence of automated trust verification and local behavioral monitoring</w:t>
+      </w:r>
+      <w:r>
+        <w:rPr>
+          <w:rFonts w:ascii="Arial" w:hAnsi="Arial" w:cs="Arial"/>
+        </w:rPr>
+        <w:t xml:space="preserve"> </w:t>
+      </w:r>
+      <w:r>
+        <w:rPr>
+          <w:rFonts w:ascii="Arial" w:hAnsi="Arial" w:cs="Arial"/>
+        </w:rPr>
+        <w:t xml:space="preserve">serve as the primary motivation for this project. These theoretical findings will guide the system design and development approach, which are detailed in the following chapter, </w:t>
+      </w:r>
+      <w:r>
+        <w:rPr>
+          <w:rFonts w:ascii="Arial" w:hAnsi="Arial" w:cs="Arial"/>
+          <w:b/>
+          <w:bCs/>
+        </w:rPr>
+        <w:t>Chapter 3: Methodology</w:t>
+      </w:r>
+      <w:r>
+        <w:rPr>
+          <w:rFonts w:ascii="Arial" w:hAnsi="Arial" w:cs="Arial"/>
+        </w:rPr>
+        <w:t>.</w:t>
+      </w:r>
     </w:p>
     <w:p>
       <w:pPr>
@@ -2587,7 +3322,14 @@
         <w:rPr>
           <w:rFonts w:ascii="Arial" w:hAnsi="Arial" w:cs="Arial"/>
         </w:rPr>
-        <w:t xml:space="preserve">After that, the chapter explains the specific activities done in each phase of the development, such as gathering requirements and designing the system prototypes. It also presents the detailed technical design of the system, which includes the System Architecture Diagram, Flow Chart, Activity Diagram, Sitemap, and Threat Model Diagram. These diagrams are used to visualize how the system functions and secures user data. Finally, the chapter outlines the hardware and software requirements, the budget and costing, and the project planning schedule to ensure the project is completed on </w:t>
+        <w:t xml:space="preserve">After that, the chapter explains the specific activities done in each phase of the development, such as gathering requirements and designing the system prototypes. It also presents the detailed technical design of the system, which includes the System Architecture Diagram, Flow Chart, Activity Diagram, Sitemap, and Threat Model Diagram. These diagrams are used to visualize how the system functions and secures </w:t>
+      </w:r>
+      <w:r>
+        <w:rPr>
+          <w:rFonts w:ascii="Arial" w:hAnsi="Arial" w:cs="Arial"/>
+        </w:rPr>
+        <w:lastRenderedPageBreak/>
+        <w:t xml:space="preserve">user data. Finally, the chapter outlines the hardware and software requirements, the budget and costing, and the project planning schedule to ensure the project is completed on </w:t>
       </w:r>
       <w:r>
         <w:rPr>
@@ -2645,14 +3387,7 @@
         <w:rPr>
           <w:rFonts w:ascii="Arial" w:hAnsi="Arial" w:cs="Arial"/>
         </w:rPr>
-        <w:t xml:space="preserve">The Software Development Life Cycle (SDLC) refers to a collection of methodologies that outline the process of developing software applications. Choosing an appropriate SDLC model is crucial to the success of a project, as it influences how requirements are identified, how the system is designed, and how testing is performed. For this project, </w:t>
-      </w:r>
-      <w:r>
-        <w:rPr>
-          <w:rFonts w:ascii="Arial" w:hAnsi="Arial" w:cs="Arial"/>
-        </w:rPr>
-        <w:lastRenderedPageBreak/>
-        <w:t>three development methodologies were evaluated to determine the most suitable approach: the Waterfall Model, the Agile Model, and Rapid Application Development (RAD).</w:t>
+        <w:t>The Software Development Life Cycle (SDLC) refers to a collection of methodologies that outline the process of developing software applications. Choosing an appropriate SDLC model is crucial to the success of a project, as it influences how requirements are identified, how the system is designed, and how testing is performed. For this project, three development methodologies were evaluated to determine the most suitable approach: the Waterfall Model, the Agile Model, and Rapid Application Development (RAD).</w:t>
       </w:r>
     </w:p>
     <w:p>
@@ -4011,7 +4746,7 @@
         </w:rPr>
         <w:lastRenderedPageBreak/>
         <w:drawing>
-          <wp:inline distT="0" distB="0" distL="0" distR="0" wp14:anchorId="03F6A903" wp14:editId="4B0D54C1">
+          <wp:inline distT="0" distB="0" distL="0" distR="0" wp14:anchorId="03F6A903" wp14:editId="557EC2C9">
             <wp:extent cx="5943600" cy="3032125"/>
             <wp:effectExtent l="0" t="0" r="0" b="0"/>
             <wp:docPr id="573649057" name="Picture 6" descr="A screenshot of a computer screen"/>
@@ -4295,7 +5030,7 @@
           <w:noProof/>
         </w:rPr>
         <w:drawing>
-          <wp:anchor distT="0" distB="0" distL="114300" distR="114300" simplePos="0" relativeHeight="251660288" behindDoc="0" locked="0" layoutInCell="1" allowOverlap="1" wp14:anchorId="2EC6287C" wp14:editId="38DE8FF0">
+          <wp:anchor distT="0" distB="0" distL="114300" distR="114300" simplePos="0" relativeHeight="251660288" behindDoc="0" locked="0" layoutInCell="1" allowOverlap="1" wp14:anchorId="2EC6287C" wp14:editId="5F8C5815">
             <wp:simplePos x="0" y="0"/>
             <wp:positionH relativeFrom="column">
               <wp:posOffset>-180975</wp:posOffset>
@@ -4352,7 +5087,7 @@
         <mc:AlternateContent>
           <mc:Choice Requires="wps">
             <w:drawing>
-              <wp:anchor distT="0" distB="0" distL="114300" distR="114300" simplePos="0" relativeHeight="251657215" behindDoc="0" locked="0" layoutInCell="1" allowOverlap="1" wp14:anchorId="194E87D9" wp14:editId="03480C10">
+              <wp:anchor distT="0" distB="0" distL="114300" distR="114300" simplePos="0" relativeHeight="251657215" behindDoc="0" locked="0" layoutInCell="1" allowOverlap="1" wp14:anchorId="194E87D9" wp14:editId="607AA019">
                 <wp:simplePos x="0" y="0"/>
                 <wp:positionH relativeFrom="margin">
                   <wp:align>center</wp:align>
@@ -4408,7 +5143,7 @@
           </mc:Choice>
           <mc:Fallback>
             <w:pict>
-              <v:rect w14:anchorId="7019E46E" id="Rectangle 8" o:spid="_x0000_s1026" style="position:absolute;margin-left:0;margin-top:-4.85pt;width:531pt;height:361.5pt;z-index:251657215;visibility:visible;mso-wrap-style:square;mso-wrap-distance-left:9pt;mso-wrap-distance-top:0;mso-wrap-distance-right:9pt;mso-wrap-distance-bottom:0;mso-position-horizontal:center;mso-position-horizontal-relative:margin;mso-position-vertical:absolute;mso-position-vertical-relative:text;v-text-anchor:middle" o:gfxdata="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" fillcolor="black [3200]" strokecolor="black [480]" strokeweight="1pt">
+              <v:rect w14:anchorId="49E50090" id="Rectangle 8" o:spid="_x0000_s1026" style="position:absolute;margin-left:0;margin-top:-4.85pt;width:531pt;height:361.5pt;z-index:251657215;visibility:visible;mso-wrap-style:square;mso-wrap-distance-left:9pt;mso-wrap-distance-top:0;mso-wrap-distance-right:9pt;mso-wrap-distance-bottom:0;mso-position-horizontal:center;mso-position-horizontal-relative:margin;mso-position-vertical:absolute;mso-position-vertical-relative:text;v-text-anchor:middle" o:gfxdata="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" fillcolor="black [3200]" strokecolor="black [480]" strokeweight="1pt">
                 <w10:wrap anchorx="margin"/>
               </v:rect>
             </w:pict>
@@ -6746,6 +7481,155 @@
 <file path=word/numbering.xml><?xml version="1.0" encoding="utf-8"?>
 <w:numbering xmlns:wpc="http://schemas.microsoft.com/office/word/2010/wordprocessingCanvas" xmlns:cx="http://schemas.microsoft.com/office/drawing/2014/chartex" xmlns:cx1="http://schemas.microsoft.com/office/drawing/2015/9/8/chartex" xmlns:cx2="http://schemas.microsoft.com/office/drawing/2015/10/21/chartex" xmlns:cx3="http://schemas.microsoft.com/office/drawing/2016/5/9/chartex" xmlns:cx4="http://schemas.microsoft.com/office/drawing/2016/5/10/chartex" xmlns:cx5="http://schemas.microsoft.com/office/drawing/2016/5/11/chartex" xmlns:cx6="http://schemas.microsoft.com/office/drawing/2016/5/12/chartex" xmlns:cx7="http://schemas.microsoft.com/office/drawing/2016/5/13/chartex" xmlns:cx8="http://schemas.microsoft.com/office/drawing/2016/5/14/chartex" xmlns:mc="http://schemas.openxmlformats.org/markup-compatibility/2006" xmlns:aink="http://schemas.microsoft.com/office/drawing/2016/ink" xmlns:am3d="http://schemas.microsoft.com/office/drawing/2017/model3d" xmlns:o="urn:schemas-microsoft-com:office:office" xmlns:oel="http://schemas.microsoft.com/office/2019/extlst" xmlns:r="http://schemas.openxmlformats.org/officeDocument/2006/relationships" xmlns:m="http://schemas.openxmlformats.org/officeDocument/2006/math" xmlns:v="urn:schemas-microsoft-com:vml" xmlns:wp14="http://schemas.microsoft.com/office/word/2010/wordprocessingDrawing" xmlns:wp="http://schemas.openxmlformats.org/drawingml/2006/wordprocessingDrawing" xmlns:w10="urn:schemas-microsoft-com:office:word" xmlns:w="http://schemas.openxmlformats.org/wordprocessingml/2006/main" xmlns:w14="http://schemas.microsoft.com/office/word/2010/wordml" xmlns:w15="http://schemas.microsoft.com/office/word/2012/wordml" xmlns:w16cex="http://schemas.microsoft.com/office/word/2018/wordml/cex" xmlns:w16cid="http://schemas.microsoft.com/office/word/2016/wordml/cid" xmlns:w16="http://schemas.microsoft.com/office/word/2018/wordml" xmlns:w16du="http://schemas.microsoft.com/office/word/2023/wordml/word16du" xmlns:w16sdtdh="http://schemas.microsoft.com/office/word/2020/wordml/sdtdatahash" xmlns:w16sdtfl="http://schemas.microsoft.com/office/word/2024/wordml/sdtformatlock" xmlns:w16se="http://schemas.microsoft.com/office/word/2015/wordml/symex" xmlns:wpg="http://schemas.microsoft.com/office/word/2010/wordprocessingGroup" xmlns:wpi="http://schemas.microsoft.com/office/word/2010/wordprocessingInk" xmlns:wne="http://schemas.microsoft.com/office/word/2006/wordml" xmlns:wps="http://schemas.microsoft.com/office/word/2010/wordprocessingShape" mc:Ignorable="w14 w15 w16se w16cid w16 w16cex w16sdtdh w16sdtfl w16du wp14">
   <w:abstractNum w:abstractNumId="0" w15:restartNumberingAfterBreak="0">
+    <w:nsid w:val="01640BB4"/>
+    <w:multiLevelType w:val="multilevel"/>
+    <w:tmpl w:val="6AF22558"/>
+    <w:lvl w:ilvl="0">
+      <w:start w:val="1"/>
+      <w:numFmt w:val="bullet"/>
+      <w:lvlText w:val=""/>
+      <w:lvlJc w:val="left"/>
+      <w:pPr>
+        <w:tabs>
+          <w:tab w:val="num" w:pos="720"/>
+        </w:tabs>
+        <w:ind w:left="720" w:hanging="360"/>
+      </w:pPr>
+      <w:rPr>
+        <w:rFonts w:ascii="Symbol" w:hAnsi="Symbol" w:hint="default"/>
+        <w:sz w:val="20"/>
+      </w:rPr>
+    </w:lvl>
+    <w:lvl w:ilvl="1" w:tentative="1">
+      <w:start w:val="1"/>
+      <w:numFmt w:val="bullet"/>
+      <w:lvlText w:val="o"/>
+      <w:lvlJc w:val="left"/>
+      <w:pPr>
+        <w:tabs>
+          <w:tab w:val="num" w:pos="1440"/>
+        </w:tabs>
+        <w:ind w:left="1440" w:hanging="360"/>
+      </w:pPr>
+      <w:rPr>
+        <w:rFonts w:ascii="Courier New" w:hAnsi="Courier New" w:hint="default"/>
+        <w:sz w:val="20"/>
+      </w:rPr>
+    </w:lvl>
+    <w:lvl w:ilvl="2" w:tentative="1">
+      <w:start w:val="1"/>
+      <w:numFmt w:val="bullet"/>
+      <w:lvlText w:val=""/>
+      <w:lvlJc w:val="left"/>
+      <w:pPr>
+        <w:tabs>
+          <w:tab w:val="num" w:pos="2160"/>
+        </w:tabs>
+        <w:ind w:left="2160" w:hanging="360"/>
+      </w:pPr>
+      <w:rPr>
+        <w:rFonts w:ascii="Wingdings" w:hAnsi="Wingdings" w:hint="default"/>
+        <w:sz w:val="20"/>
+      </w:rPr>
+    </w:lvl>
+    <w:lvl w:ilvl="3" w:tentative="1">
+      <w:start w:val="1"/>
+      <w:numFmt w:val="bullet"/>
+      <w:lvlText w:val=""/>
+      <w:lvlJc w:val="left"/>
+      <w:pPr>
+        <w:tabs>
+          <w:tab w:val="num" w:pos="2880"/>
+        </w:tabs>
+        <w:ind w:left="2880" w:hanging="360"/>
+      </w:pPr>
+      <w:rPr>
+        <w:rFonts w:ascii="Wingdings" w:hAnsi="Wingdings" w:hint="default"/>
+        <w:sz w:val="20"/>
+      </w:rPr>
+    </w:lvl>
+    <w:lvl w:ilvl="4" w:tentative="1">
+      <w:start w:val="1"/>
+      <w:numFmt w:val="bullet"/>
+      <w:lvlText w:val=""/>
+      <w:lvlJc w:val="left"/>
+      <w:pPr>
+        <w:tabs>
+          <w:tab w:val="num" w:pos="3600"/>
+        </w:tabs>
+        <w:ind w:left="3600" w:hanging="360"/>
+      </w:pPr>
+      <w:rPr>
+        <w:rFonts w:ascii="Wingdings" w:hAnsi="Wingdings" w:hint="default"/>
+        <w:sz w:val="20"/>
+      </w:rPr>
+    </w:lvl>
+    <w:lvl w:ilvl="5" w:tentative="1">
+      <w:start w:val="1"/>
+      <w:numFmt w:val="bullet"/>
+      <w:lvlText w:val=""/>
+      <w:lvlJc w:val="left"/>
+      <w:pPr>
+        <w:tabs>
+          <w:tab w:val="num" w:pos="4320"/>
+        </w:tabs>
+        <w:ind w:left="4320" w:hanging="360"/>
+      </w:pPr>
+      <w:rPr>
+        <w:rFonts w:ascii="Wingdings" w:hAnsi="Wingdings" w:hint="default"/>
+        <w:sz w:val="20"/>
+      </w:rPr>
+    </w:lvl>
+    <w:lvl w:ilvl="6" w:tentative="1">
+      <w:start w:val="1"/>
+      <w:numFmt w:val="bullet"/>
+      <w:lvlText w:val=""/>
+      <w:lvlJc w:val="left"/>
+      <w:pPr>
+        <w:tabs>
+          <w:tab w:val="num" w:pos="5040"/>
+        </w:tabs>
+        <w:ind w:left="5040" w:hanging="360"/>
+      </w:pPr>
+      <w:rPr>
+        <w:rFonts w:ascii="Wingdings" w:hAnsi="Wingdings" w:hint="default"/>
+        <w:sz w:val="20"/>
+      </w:rPr>
+    </w:lvl>
+    <w:lvl w:ilvl="7" w:tentative="1">
+      <w:start w:val="1"/>
+      <w:numFmt w:val="bullet"/>
+      <w:lvlText w:val=""/>
+      <w:lvlJc w:val="left"/>
+      <w:pPr>
+        <w:tabs>
+          <w:tab w:val="num" w:pos="5760"/>
+        </w:tabs>
+        <w:ind w:left="5760" w:hanging="360"/>
+      </w:pPr>
+      <w:rPr>
+        <w:rFonts w:ascii="Wingdings" w:hAnsi="Wingdings" w:hint="default"/>
+        <w:sz w:val="20"/>
+      </w:rPr>
+    </w:lvl>
+    <w:lvl w:ilvl="8" w:tentative="1">
+      <w:start w:val="1"/>
+      <w:numFmt w:val="bullet"/>
+      <w:lvlText w:val=""/>
+      <w:lvlJc w:val="left"/>
+      <w:pPr>
+        <w:tabs>
+          <w:tab w:val="num" w:pos="6480"/>
+        </w:tabs>
+        <w:ind w:left="6480" w:hanging="360"/>
+      </w:pPr>
+      <w:rPr>
+        <w:rFonts w:ascii="Wingdings" w:hAnsi="Wingdings" w:hint="default"/>
+        <w:sz w:val="20"/>
+      </w:rPr>
+    </w:lvl>
+  </w:abstractNum>
+  <w:abstractNum w:abstractNumId="1" w15:restartNumberingAfterBreak="0">
     <w:nsid w:val="027A3613"/>
     <w:multiLevelType w:val="multilevel"/>
     <w:tmpl w:val="6AE8E1BC"/>
@@ -6894,7 +7778,7 @@
       </w:rPr>
     </w:lvl>
   </w:abstractNum>
-  <w:abstractNum w:abstractNumId="1" w15:restartNumberingAfterBreak="0">
+  <w:abstractNum w:abstractNumId="2" w15:restartNumberingAfterBreak="0">
     <w:nsid w:val="03E33C5B"/>
     <w:multiLevelType w:val="multilevel"/>
     <w:tmpl w:val="57FE0F6C"/>
@@ -7043,7 +7927,7 @@
       </w:rPr>
     </w:lvl>
   </w:abstractNum>
-  <w:abstractNum w:abstractNumId="2" w15:restartNumberingAfterBreak="0">
+  <w:abstractNum w:abstractNumId="3" w15:restartNumberingAfterBreak="0">
     <w:nsid w:val="046B3ADA"/>
     <w:multiLevelType w:val="multilevel"/>
     <w:tmpl w:val="ECBECD7E"/>
@@ -7192,7 +8076,7 @@
       </w:rPr>
     </w:lvl>
   </w:abstractNum>
-  <w:abstractNum w:abstractNumId="3" w15:restartNumberingAfterBreak="0">
+  <w:abstractNum w:abstractNumId="4" w15:restartNumberingAfterBreak="0">
     <w:nsid w:val="05CA453D"/>
     <w:multiLevelType w:val="multilevel"/>
     <w:tmpl w:val="1F52FEE8"/>
@@ -7305,7 +8189,7 @@
       </w:rPr>
     </w:lvl>
   </w:abstractNum>
-  <w:abstractNum w:abstractNumId="4" w15:restartNumberingAfterBreak="0">
+  <w:abstractNum w:abstractNumId="5" w15:restartNumberingAfterBreak="0">
     <w:nsid w:val="07561952"/>
     <w:multiLevelType w:val="multilevel"/>
     <w:tmpl w:val="1A6632FA"/>
@@ -7454,7 +8338,7 @@
       </w:rPr>
     </w:lvl>
   </w:abstractNum>
-  <w:abstractNum w:abstractNumId="5" w15:restartNumberingAfterBreak="0">
+  <w:abstractNum w:abstractNumId="6" w15:restartNumberingAfterBreak="0">
     <w:nsid w:val="078D4B9B"/>
     <w:multiLevelType w:val="multilevel"/>
     <w:tmpl w:val="56D0E850"/>
@@ -7603,7 +8487,7 @@
       </w:rPr>
     </w:lvl>
   </w:abstractNum>
-  <w:abstractNum w:abstractNumId="6" w15:restartNumberingAfterBreak="0">
+  <w:abstractNum w:abstractNumId="7" w15:restartNumberingAfterBreak="0">
     <w:nsid w:val="0B5155B6"/>
     <w:multiLevelType w:val="hybridMultilevel"/>
     <w:tmpl w:val="F552E1F6"/>
@@ -7693,7 +8577,7 @@
       </w:pPr>
     </w:lvl>
   </w:abstractNum>
-  <w:abstractNum w:abstractNumId="7" w15:restartNumberingAfterBreak="0">
+  <w:abstractNum w:abstractNumId="8" w15:restartNumberingAfterBreak="0">
     <w:nsid w:val="0FCD59BF"/>
     <w:multiLevelType w:val="hybridMultilevel"/>
     <w:tmpl w:val="0FD269C0"/>
@@ -7807,7 +8691,7 @@
       </w:rPr>
     </w:lvl>
   </w:abstractNum>
-  <w:abstractNum w:abstractNumId="8" w15:restartNumberingAfterBreak="0">
+  <w:abstractNum w:abstractNumId="9" w15:restartNumberingAfterBreak="0">
     <w:nsid w:val="1C7C0AE7"/>
     <w:multiLevelType w:val="multilevel"/>
     <w:tmpl w:val="FFB44B82"/>
@@ -7920,7 +8804,7 @@
       </w:pPr>
     </w:lvl>
   </w:abstractNum>
-  <w:abstractNum w:abstractNumId="9" w15:restartNumberingAfterBreak="0">
+  <w:abstractNum w:abstractNumId="10" w15:restartNumberingAfterBreak="0">
     <w:nsid w:val="1F6E6393"/>
     <w:multiLevelType w:val="multilevel"/>
     <w:tmpl w:val="6636B452"/>
@@ -8030,7 +8914,7 @@
       </w:rPr>
     </w:lvl>
   </w:abstractNum>
-  <w:abstractNum w:abstractNumId="10" w15:restartNumberingAfterBreak="0">
+  <w:abstractNum w:abstractNumId="11" w15:restartNumberingAfterBreak="0">
     <w:nsid w:val="25B36A92"/>
     <w:multiLevelType w:val="hybridMultilevel"/>
     <w:tmpl w:val="6EB0EE82"/>
@@ -8143,7 +9027,7 @@
       </w:rPr>
     </w:lvl>
   </w:abstractNum>
-  <w:abstractNum w:abstractNumId="11" w15:restartNumberingAfterBreak="0">
+  <w:abstractNum w:abstractNumId="12" w15:restartNumberingAfterBreak="0">
     <w:nsid w:val="262B7DBD"/>
     <w:multiLevelType w:val="hybridMultilevel"/>
     <w:tmpl w:val="CEC60150"/>
@@ -8256,7 +9140,7 @@
       </w:rPr>
     </w:lvl>
   </w:abstractNum>
-  <w:abstractNum w:abstractNumId="12" w15:restartNumberingAfterBreak="0">
+  <w:abstractNum w:abstractNumId="13" w15:restartNumberingAfterBreak="0">
     <w:nsid w:val="27B46C10"/>
     <w:multiLevelType w:val="multilevel"/>
     <w:tmpl w:val="EBCC7DB0"/>
@@ -8405,7 +9289,7 @@
       </w:rPr>
     </w:lvl>
   </w:abstractNum>
-  <w:abstractNum w:abstractNumId="13" w15:restartNumberingAfterBreak="0">
+  <w:abstractNum w:abstractNumId="14" w15:restartNumberingAfterBreak="0">
     <w:nsid w:val="299A4095"/>
     <w:multiLevelType w:val="multilevel"/>
     <w:tmpl w:val="ADF88108"/>
@@ -8554,7 +9438,7 @@
       </w:rPr>
     </w:lvl>
   </w:abstractNum>
-  <w:abstractNum w:abstractNumId="14" w15:restartNumberingAfterBreak="0">
+  <w:abstractNum w:abstractNumId="15" w15:restartNumberingAfterBreak="0">
     <w:nsid w:val="2B075B54"/>
     <w:multiLevelType w:val="multilevel"/>
     <w:tmpl w:val="E48A250E"/>
@@ -8703,7 +9587,7 @@
       </w:rPr>
     </w:lvl>
   </w:abstractNum>
-  <w:abstractNum w:abstractNumId="15" w15:restartNumberingAfterBreak="0">
+  <w:abstractNum w:abstractNumId="16" w15:restartNumberingAfterBreak="0">
     <w:nsid w:val="33335930"/>
     <w:multiLevelType w:val="multilevel"/>
     <w:tmpl w:val="BC90753A"/>
@@ -8852,7 +9736,7 @@
       </w:rPr>
     </w:lvl>
   </w:abstractNum>
-  <w:abstractNum w:abstractNumId="16" w15:restartNumberingAfterBreak="0">
+  <w:abstractNum w:abstractNumId="17" w15:restartNumberingAfterBreak="0">
     <w:nsid w:val="3B6A185A"/>
     <w:multiLevelType w:val="multilevel"/>
     <w:tmpl w:val="D5129832"/>
@@ -9001,7 +9885,7 @@
       </w:rPr>
     </w:lvl>
   </w:abstractNum>
-  <w:abstractNum w:abstractNumId="17" w15:restartNumberingAfterBreak="0">
+  <w:abstractNum w:abstractNumId="18" w15:restartNumberingAfterBreak="0">
     <w:nsid w:val="3B7544F7"/>
     <w:multiLevelType w:val="multilevel"/>
     <w:tmpl w:val="190AD7D0"/>
@@ -9150,7 +10034,7 @@
       </w:rPr>
     </w:lvl>
   </w:abstractNum>
-  <w:abstractNum w:abstractNumId="18" w15:restartNumberingAfterBreak="0">
+  <w:abstractNum w:abstractNumId="19" w15:restartNumberingAfterBreak="0">
     <w:nsid w:val="3EE4667F"/>
     <w:multiLevelType w:val="multilevel"/>
     <w:tmpl w:val="A5A05E0E"/>
@@ -9299,7 +10183,7 @@
       </w:rPr>
     </w:lvl>
   </w:abstractNum>
-  <w:abstractNum w:abstractNumId="19" w15:restartNumberingAfterBreak="0">
+  <w:abstractNum w:abstractNumId="20" w15:restartNumberingAfterBreak="0">
     <w:nsid w:val="420578DB"/>
     <w:multiLevelType w:val="hybridMultilevel"/>
     <w:tmpl w:val="6BBA156E"/>
@@ -9385,7 +10269,7 @@
       </w:pPr>
     </w:lvl>
   </w:abstractNum>
-  <w:abstractNum w:abstractNumId="20" w15:restartNumberingAfterBreak="0">
+  <w:abstractNum w:abstractNumId="21" w15:restartNumberingAfterBreak="0">
     <w:nsid w:val="435025E1"/>
     <w:multiLevelType w:val="hybridMultilevel"/>
     <w:tmpl w:val="B372AC66"/>
@@ -9498,7 +10382,7 @@
       </w:rPr>
     </w:lvl>
   </w:abstractNum>
-  <w:abstractNum w:abstractNumId="21" w15:restartNumberingAfterBreak="0">
+  <w:abstractNum w:abstractNumId="22" w15:restartNumberingAfterBreak="0">
     <w:nsid w:val="45866578"/>
     <w:multiLevelType w:val="multilevel"/>
     <w:tmpl w:val="DE72758E"/>
@@ -9647,7 +10531,7 @@
       </w:rPr>
     </w:lvl>
   </w:abstractNum>
-  <w:abstractNum w:abstractNumId="22" w15:restartNumberingAfterBreak="0">
+  <w:abstractNum w:abstractNumId="23" w15:restartNumberingAfterBreak="0">
     <w:nsid w:val="47780687"/>
     <w:multiLevelType w:val="multilevel"/>
     <w:tmpl w:val="58062EAE"/>
@@ -9796,7 +10680,7 @@
       </w:rPr>
     </w:lvl>
   </w:abstractNum>
-  <w:abstractNum w:abstractNumId="23" w15:restartNumberingAfterBreak="0">
+  <w:abstractNum w:abstractNumId="24" w15:restartNumberingAfterBreak="0">
     <w:nsid w:val="4C437148"/>
     <w:multiLevelType w:val="hybridMultilevel"/>
     <w:tmpl w:val="63088B1E"/>
@@ -9909,7 +10793,7 @@
       </w:rPr>
     </w:lvl>
   </w:abstractNum>
-  <w:abstractNum w:abstractNumId="24" w15:restartNumberingAfterBreak="0">
+  <w:abstractNum w:abstractNumId="25" w15:restartNumberingAfterBreak="0">
     <w:nsid w:val="4F6470C3"/>
     <w:multiLevelType w:val="multilevel"/>
     <w:tmpl w:val="5560D8E4"/>
@@ -10054,7 +10938,7 @@
       </w:rPr>
     </w:lvl>
   </w:abstractNum>
-  <w:abstractNum w:abstractNumId="25" w15:restartNumberingAfterBreak="0">
+  <w:abstractNum w:abstractNumId="26" w15:restartNumberingAfterBreak="0">
     <w:nsid w:val="504A7838"/>
     <w:multiLevelType w:val="multilevel"/>
     <w:tmpl w:val="90F47674"/>
@@ -10167,7 +11051,7 @@
       </w:pPr>
     </w:lvl>
   </w:abstractNum>
-  <w:abstractNum w:abstractNumId="26" w15:restartNumberingAfterBreak="0">
+  <w:abstractNum w:abstractNumId="27" w15:restartNumberingAfterBreak="0">
     <w:nsid w:val="50C15572"/>
     <w:multiLevelType w:val="multilevel"/>
     <w:tmpl w:val="5AF85BAE"/>
@@ -10284,7 +11168,7 @@
       </w:pPr>
     </w:lvl>
   </w:abstractNum>
-  <w:abstractNum w:abstractNumId="27" w15:restartNumberingAfterBreak="0">
+  <w:abstractNum w:abstractNumId="28" w15:restartNumberingAfterBreak="0">
     <w:nsid w:val="554804DD"/>
     <w:multiLevelType w:val="multilevel"/>
     <w:tmpl w:val="8DC89790"/>
@@ -10429,7 +11313,7 @@
       </w:rPr>
     </w:lvl>
   </w:abstractNum>
-  <w:abstractNum w:abstractNumId="28" w15:restartNumberingAfterBreak="0">
+  <w:abstractNum w:abstractNumId="29" w15:restartNumberingAfterBreak="0">
     <w:nsid w:val="58C96EE8"/>
     <w:multiLevelType w:val="multilevel"/>
     <w:tmpl w:val="329CFC80"/>
@@ -10578,7 +11462,7 @@
       </w:rPr>
     </w:lvl>
   </w:abstractNum>
-  <w:abstractNum w:abstractNumId="29" w15:restartNumberingAfterBreak="0">
+  <w:abstractNum w:abstractNumId="30" w15:restartNumberingAfterBreak="0">
     <w:nsid w:val="5A524C01"/>
     <w:multiLevelType w:val="multilevel"/>
     <w:tmpl w:val="285E0278"/>
@@ -10727,7 +11611,7 @@
       </w:rPr>
     </w:lvl>
   </w:abstractNum>
-  <w:abstractNum w:abstractNumId="30" w15:restartNumberingAfterBreak="0">
+  <w:abstractNum w:abstractNumId="31" w15:restartNumberingAfterBreak="0">
     <w:nsid w:val="5DE44A80"/>
     <w:multiLevelType w:val="multilevel"/>
     <w:tmpl w:val="8E4219FC"/>
@@ -10876,7 +11760,7 @@
       </w:rPr>
     </w:lvl>
   </w:abstractNum>
-  <w:abstractNum w:abstractNumId="31" w15:restartNumberingAfterBreak="0">
+  <w:abstractNum w:abstractNumId="32" w15:restartNumberingAfterBreak="0">
     <w:nsid w:val="5E0A5EF6"/>
     <w:multiLevelType w:val="multilevel"/>
     <w:tmpl w:val="A1E8BEBE"/>
@@ -11022,7 +11906,7 @@
       </w:rPr>
     </w:lvl>
   </w:abstractNum>
-  <w:abstractNum w:abstractNumId="32" w15:restartNumberingAfterBreak="0">
+  <w:abstractNum w:abstractNumId="33" w15:restartNumberingAfterBreak="0">
     <w:nsid w:val="64525B87"/>
     <w:multiLevelType w:val="hybridMultilevel"/>
     <w:tmpl w:val="3D32252A"/>
@@ -11135,7 +12019,7 @@
       </w:rPr>
     </w:lvl>
   </w:abstractNum>
-  <w:abstractNum w:abstractNumId="33" w15:restartNumberingAfterBreak="0">
+  <w:abstractNum w:abstractNumId="34" w15:restartNumberingAfterBreak="0">
     <w:nsid w:val="651776DD"/>
     <w:multiLevelType w:val="hybridMultilevel"/>
     <w:tmpl w:val="63DA2664"/>
@@ -11249,7 +12133,7 @@
       </w:rPr>
     </w:lvl>
   </w:abstractNum>
-  <w:abstractNum w:abstractNumId="34" w15:restartNumberingAfterBreak="0">
+  <w:abstractNum w:abstractNumId="35" w15:restartNumberingAfterBreak="0">
     <w:nsid w:val="6A8E1259"/>
     <w:multiLevelType w:val="multilevel"/>
     <w:tmpl w:val="4126A8C2"/>
@@ -11398,7 +12282,7 @@
       </w:rPr>
     </w:lvl>
   </w:abstractNum>
-  <w:abstractNum w:abstractNumId="35" w15:restartNumberingAfterBreak="0">
+  <w:abstractNum w:abstractNumId="36" w15:restartNumberingAfterBreak="0">
     <w:nsid w:val="6EA46BF3"/>
     <w:multiLevelType w:val="multilevel"/>
     <w:tmpl w:val="24E4C6B0"/>
@@ -11547,7 +12431,7 @@
       </w:rPr>
     </w:lvl>
   </w:abstractNum>
-  <w:abstractNum w:abstractNumId="36" w15:restartNumberingAfterBreak="0">
+  <w:abstractNum w:abstractNumId="37" w15:restartNumberingAfterBreak="0">
     <w:nsid w:val="6F8B05CB"/>
     <w:multiLevelType w:val="multilevel"/>
     <w:tmpl w:val="D8109F6E"/>
@@ -11660,7 +12544,156 @@
       </w:pPr>
     </w:lvl>
   </w:abstractNum>
-  <w:abstractNum w:abstractNumId="37" w15:restartNumberingAfterBreak="0">
+  <w:abstractNum w:abstractNumId="38" w15:restartNumberingAfterBreak="0">
+    <w:nsid w:val="709A0585"/>
+    <w:multiLevelType w:val="multilevel"/>
+    <w:tmpl w:val="C9869342"/>
+    <w:lvl w:ilvl="0">
+      <w:start w:val="1"/>
+      <w:numFmt w:val="bullet"/>
+      <w:lvlText w:val=""/>
+      <w:lvlJc w:val="left"/>
+      <w:pPr>
+        <w:tabs>
+          <w:tab w:val="num" w:pos="720"/>
+        </w:tabs>
+        <w:ind w:left="720" w:hanging="360"/>
+      </w:pPr>
+      <w:rPr>
+        <w:rFonts w:ascii="Symbol" w:hAnsi="Symbol" w:hint="default"/>
+        <w:sz w:val="20"/>
+      </w:rPr>
+    </w:lvl>
+    <w:lvl w:ilvl="1" w:tentative="1">
+      <w:start w:val="1"/>
+      <w:numFmt w:val="bullet"/>
+      <w:lvlText w:val="o"/>
+      <w:lvlJc w:val="left"/>
+      <w:pPr>
+        <w:tabs>
+          <w:tab w:val="num" w:pos="1440"/>
+        </w:tabs>
+        <w:ind w:left="1440" w:hanging="360"/>
+      </w:pPr>
+      <w:rPr>
+        <w:rFonts w:ascii="Courier New" w:hAnsi="Courier New" w:hint="default"/>
+        <w:sz w:val="20"/>
+      </w:rPr>
+    </w:lvl>
+    <w:lvl w:ilvl="2" w:tentative="1">
+      <w:start w:val="1"/>
+      <w:numFmt w:val="bullet"/>
+      <w:lvlText w:val=""/>
+      <w:lvlJc w:val="left"/>
+      <w:pPr>
+        <w:tabs>
+          <w:tab w:val="num" w:pos="2160"/>
+        </w:tabs>
+        <w:ind w:left="2160" w:hanging="360"/>
+      </w:pPr>
+      <w:rPr>
+        <w:rFonts w:ascii="Wingdings" w:hAnsi="Wingdings" w:hint="default"/>
+        <w:sz w:val="20"/>
+      </w:rPr>
+    </w:lvl>
+    <w:lvl w:ilvl="3" w:tentative="1">
+      <w:start w:val="1"/>
+      <w:numFmt w:val="bullet"/>
+      <w:lvlText w:val=""/>
+      <w:lvlJc w:val="left"/>
+      <w:pPr>
+        <w:tabs>
+          <w:tab w:val="num" w:pos="2880"/>
+        </w:tabs>
+        <w:ind w:left="2880" w:hanging="360"/>
+      </w:pPr>
+      <w:rPr>
+        <w:rFonts w:ascii="Wingdings" w:hAnsi="Wingdings" w:hint="default"/>
+        <w:sz w:val="20"/>
+      </w:rPr>
+    </w:lvl>
+    <w:lvl w:ilvl="4" w:tentative="1">
+      <w:start w:val="1"/>
+      <w:numFmt w:val="bullet"/>
+      <w:lvlText w:val=""/>
+      <w:lvlJc w:val="left"/>
+      <w:pPr>
+        <w:tabs>
+          <w:tab w:val="num" w:pos="3600"/>
+        </w:tabs>
+        <w:ind w:left="3600" w:hanging="360"/>
+      </w:pPr>
+      <w:rPr>
+        <w:rFonts w:ascii="Wingdings" w:hAnsi="Wingdings" w:hint="default"/>
+        <w:sz w:val="20"/>
+      </w:rPr>
+    </w:lvl>
+    <w:lvl w:ilvl="5" w:tentative="1">
+      <w:start w:val="1"/>
+      <w:numFmt w:val="bullet"/>
+      <w:lvlText w:val=""/>
+      <w:lvlJc w:val="left"/>
+      <w:pPr>
+        <w:tabs>
+          <w:tab w:val="num" w:pos="4320"/>
+        </w:tabs>
+        <w:ind w:left="4320" w:hanging="360"/>
+      </w:pPr>
+      <w:rPr>
+        <w:rFonts w:ascii="Wingdings" w:hAnsi="Wingdings" w:hint="default"/>
+        <w:sz w:val="20"/>
+      </w:rPr>
+    </w:lvl>
+    <w:lvl w:ilvl="6" w:tentative="1">
+      <w:start w:val="1"/>
+      <w:numFmt w:val="bullet"/>
+      <w:lvlText w:val=""/>
+      <w:lvlJc w:val="left"/>
+      <w:pPr>
+        <w:tabs>
+          <w:tab w:val="num" w:pos="5040"/>
+        </w:tabs>
+        <w:ind w:left="5040" w:hanging="360"/>
+      </w:pPr>
+      <w:rPr>
+        <w:rFonts w:ascii="Wingdings" w:hAnsi="Wingdings" w:hint="default"/>
+        <w:sz w:val="20"/>
+      </w:rPr>
+    </w:lvl>
+    <w:lvl w:ilvl="7" w:tentative="1">
+      <w:start w:val="1"/>
+      <w:numFmt w:val="bullet"/>
+      <w:lvlText w:val=""/>
+      <w:lvlJc w:val="left"/>
+      <w:pPr>
+        <w:tabs>
+          <w:tab w:val="num" w:pos="5760"/>
+        </w:tabs>
+        <w:ind w:left="5760" w:hanging="360"/>
+      </w:pPr>
+      <w:rPr>
+        <w:rFonts w:ascii="Wingdings" w:hAnsi="Wingdings" w:hint="default"/>
+        <w:sz w:val="20"/>
+      </w:rPr>
+    </w:lvl>
+    <w:lvl w:ilvl="8" w:tentative="1">
+      <w:start w:val="1"/>
+      <w:numFmt w:val="bullet"/>
+      <w:lvlText w:val=""/>
+      <w:lvlJc w:val="left"/>
+      <w:pPr>
+        <w:tabs>
+          <w:tab w:val="num" w:pos="6480"/>
+        </w:tabs>
+        <w:ind w:left="6480" w:hanging="360"/>
+      </w:pPr>
+      <w:rPr>
+        <w:rFonts w:ascii="Wingdings" w:hAnsi="Wingdings" w:hint="default"/>
+        <w:sz w:val="20"/>
+      </w:rPr>
+    </w:lvl>
+  </w:abstractNum>
+  <w:abstractNum w:abstractNumId="39" w15:restartNumberingAfterBreak="0">
     <w:nsid w:val="72DD66D9"/>
     <w:multiLevelType w:val="multilevel"/>
     <w:tmpl w:val="CA6640D8"/>
@@ -11773,7 +12806,7 @@
       </w:pPr>
     </w:lvl>
   </w:abstractNum>
-  <w:abstractNum w:abstractNumId="38" w15:restartNumberingAfterBreak="0">
+  <w:abstractNum w:abstractNumId="40" w15:restartNumberingAfterBreak="0">
     <w:nsid w:val="764C0FC4"/>
     <w:multiLevelType w:val="multilevel"/>
     <w:tmpl w:val="16A652D0"/>
@@ -11886,7 +12919,7 @@
       </w:pPr>
     </w:lvl>
   </w:abstractNum>
-  <w:abstractNum w:abstractNumId="39" w15:restartNumberingAfterBreak="0">
+  <w:abstractNum w:abstractNumId="41" w15:restartNumberingAfterBreak="0">
     <w:nsid w:val="7A5322FC"/>
     <w:multiLevelType w:val="multilevel"/>
     <w:tmpl w:val="97C4E85E"/>
@@ -11999,7 +13032,7 @@
       </w:pPr>
     </w:lvl>
   </w:abstractNum>
-  <w:abstractNum w:abstractNumId="40" w15:restartNumberingAfterBreak="0">
+  <w:abstractNum w:abstractNumId="42" w15:restartNumberingAfterBreak="0">
     <w:nsid w:val="7F971D73"/>
     <w:multiLevelType w:val="multilevel"/>
     <w:tmpl w:val="FA508268"/>
@@ -12148,7 +13181,7 @@
       </w:rPr>
     </w:lvl>
   </w:abstractNum>
-  <w:abstractNum w:abstractNumId="41" w15:restartNumberingAfterBreak="0">
+  <w:abstractNum w:abstractNumId="43" w15:restartNumberingAfterBreak="0">
     <w:nsid w:val="7FAA6304"/>
     <w:multiLevelType w:val="multilevel"/>
     <w:tmpl w:val="975E6EAE"/>
@@ -12298,130 +13331,136 @@
     </w:lvl>
   </w:abstractNum>
   <w:num w:numId="1" w16cid:durableId="1792548442">
+    <w:abstractNumId w:val="4"/>
+  </w:num>
+  <w:num w:numId="2" w16cid:durableId="885802013">
+    <w:abstractNumId w:val="32"/>
+  </w:num>
+  <w:num w:numId="3" w16cid:durableId="2090033940">
+    <w:abstractNumId w:val="20"/>
+  </w:num>
+  <w:num w:numId="4" w16cid:durableId="179897294">
+    <w:abstractNumId w:val="11"/>
+  </w:num>
+  <w:num w:numId="5" w16cid:durableId="941840374">
+    <w:abstractNumId w:val="10"/>
+  </w:num>
+  <w:num w:numId="6" w16cid:durableId="1228145484">
+    <w:abstractNumId w:val="12"/>
+  </w:num>
+  <w:num w:numId="7" w16cid:durableId="619998457">
+    <w:abstractNumId w:val="9"/>
+  </w:num>
+  <w:num w:numId="8" w16cid:durableId="1605919402">
+    <w:abstractNumId w:val="26"/>
+  </w:num>
+  <w:num w:numId="9" w16cid:durableId="47993447">
+    <w:abstractNumId w:val="39"/>
+  </w:num>
+  <w:num w:numId="10" w16cid:durableId="847019638">
+    <w:abstractNumId w:val="40"/>
+  </w:num>
+  <w:num w:numId="11" w16cid:durableId="1508786412">
+    <w:abstractNumId w:val="37"/>
+  </w:num>
+  <w:num w:numId="12" w16cid:durableId="659192386">
+    <w:abstractNumId w:val="29"/>
+  </w:num>
+  <w:num w:numId="13" w16cid:durableId="2147164673">
+    <w:abstractNumId w:val="6"/>
+  </w:num>
+  <w:num w:numId="14" w16cid:durableId="2095855817">
+    <w:abstractNumId w:val="18"/>
+  </w:num>
+  <w:num w:numId="15" w16cid:durableId="1837720053">
+    <w:abstractNumId w:val="15"/>
+  </w:num>
+  <w:num w:numId="16" w16cid:durableId="1386372614">
+    <w:abstractNumId w:val="19"/>
+  </w:num>
+  <w:num w:numId="17" w16cid:durableId="995259442">
+    <w:abstractNumId w:val="27"/>
+  </w:num>
+  <w:num w:numId="18" w16cid:durableId="1998459646">
+    <w:abstractNumId w:val="41"/>
+  </w:num>
+  <w:num w:numId="19" w16cid:durableId="575626314">
+    <w:abstractNumId w:val="31"/>
+  </w:num>
+  <w:num w:numId="20" w16cid:durableId="93482261">
+    <w:abstractNumId w:val="28"/>
+  </w:num>
+  <w:num w:numId="21" w16cid:durableId="546533731">
+    <w:abstractNumId w:val="42"/>
+  </w:num>
+  <w:num w:numId="22" w16cid:durableId="699862888">
+    <w:abstractNumId w:val="17"/>
+  </w:num>
+  <w:num w:numId="23" w16cid:durableId="1800414490">
+    <w:abstractNumId w:val="16"/>
+  </w:num>
+  <w:num w:numId="24" w16cid:durableId="701320795">
+    <w:abstractNumId w:val="24"/>
+  </w:num>
+  <w:num w:numId="25" w16cid:durableId="1024357608">
+    <w:abstractNumId w:val="21"/>
+  </w:num>
+  <w:num w:numId="26" w16cid:durableId="2049674">
+    <w:abstractNumId w:val="30"/>
+  </w:num>
+  <w:num w:numId="27" w16cid:durableId="1137184905">
+    <w:abstractNumId w:val="14"/>
+  </w:num>
+  <w:num w:numId="28" w16cid:durableId="1017998617">
+    <w:abstractNumId w:val="43"/>
+  </w:num>
+  <w:num w:numId="29" w16cid:durableId="1503278735">
+    <w:abstractNumId w:val="7"/>
+  </w:num>
+  <w:num w:numId="30" w16cid:durableId="915163199">
+    <w:abstractNumId w:val="33"/>
+  </w:num>
+  <w:num w:numId="31" w16cid:durableId="1091468857">
+    <w:abstractNumId w:val="34"/>
+  </w:num>
+  <w:num w:numId="32" w16cid:durableId="1131628224">
+    <w:abstractNumId w:val="8"/>
+  </w:num>
+  <w:num w:numId="33" w16cid:durableId="362904672">
+    <w:abstractNumId w:val="5"/>
+  </w:num>
+  <w:num w:numId="34" w16cid:durableId="649015568">
+    <w:abstractNumId w:val="25"/>
+  </w:num>
+  <w:num w:numId="35" w16cid:durableId="1701738275">
+    <w:abstractNumId w:val="36"/>
+  </w:num>
+  <w:num w:numId="36" w16cid:durableId="541135855">
+    <w:abstractNumId w:val="22"/>
+  </w:num>
+  <w:num w:numId="37" w16cid:durableId="1226069449">
+    <w:abstractNumId w:val="35"/>
+  </w:num>
+  <w:num w:numId="38" w16cid:durableId="362902522">
+    <w:abstractNumId w:val="23"/>
+  </w:num>
+  <w:num w:numId="39" w16cid:durableId="1358850521">
+    <w:abstractNumId w:val="1"/>
+  </w:num>
+  <w:num w:numId="40" w16cid:durableId="48653226">
     <w:abstractNumId w:val="3"/>
   </w:num>
-  <w:num w:numId="2" w16cid:durableId="885802013">
-    <w:abstractNumId w:val="31"/>
-  </w:num>
-  <w:num w:numId="3" w16cid:durableId="2090033940">
-    <w:abstractNumId w:val="19"/>
-  </w:num>
-  <w:num w:numId="4" w16cid:durableId="179897294">
-    <w:abstractNumId w:val="10"/>
-  </w:num>
-  <w:num w:numId="5" w16cid:durableId="941840374">
-    <w:abstractNumId w:val="9"/>
-  </w:num>
-  <w:num w:numId="6" w16cid:durableId="1228145484">
-    <w:abstractNumId w:val="11"/>
-  </w:num>
-  <w:num w:numId="7" w16cid:durableId="619998457">
-    <w:abstractNumId w:val="8"/>
-  </w:num>
-  <w:num w:numId="8" w16cid:durableId="1605919402">
-    <w:abstractNumId w:val="25"/>
-  </w:num>
-  <w:num w:numId="9" w16cid:durableId="47993447">
-    <w:abstractNumId w:val="37"/>
-  </w:num>
-  <w:num w:numId="10" w16cid:durableId="847019638">
-    <w:abstractNumId w:val="38"/>
-  </w:num>
-  <w:num w:numId="11" w16cid:durableId="1508786412">
-    <w:abstractNumId w:val="36"/>
-  </w:num>
-  <w:num w:numId="12" w16cid:durableId="659192386">
-    <w:abstractNumId w:val="28"/>
-  </w:num>
-  <w:num w:numId="13" w16cid:durableId="2147164673">
-    <w:abstractNumId w:val="5"/>
-  </w:num>
-  <w:num w:numId="14" w16cid:durableId="2095855817">
-    <w:abstractNumId w:val="17"/>
-  </w:num>
-  <w:num w:numId="15" w16cid:durableId="1837720053">
-    <w:abstractNumId w:val="14"/>
-  </w:num>
-  <w:num w:numId="16" w16cid:durableId="1386372614">
-    <w:abstractNumId w:val="18"/>
-  </w:num>
-  <w:num w:numId="17" w16cid:durableId="995259442">
-    <w:abstractNumId w:val="26"/>
-  </w:num>
-  <w:num w:numId="18" w16cid:durableId="1998459646">
-    <w:abstractNumId w:val="39"/>
-  </w:num>
-  <w:num w:numId="19" w16cid:durableId="575626314">
-    <w:abstractNumId w:val="30"/>
-  </w:num>
-  <w:num w:numId="20" w16cid:durableId="93482261">
-    <w:abstractNumId w:val="27"/>
-  </w:num>
-  <w:num w:numId="21" w16cid:durableId="546533731">
-    <w:abstractNumId w:val="40"/>
-  </w:num>
-  <w:num w:numId="22" w16cid:durableId="699862888">
-    <w:abstractNumId w:val="16"/>
-  </w:num>
-  <w:num w:numId="23" w16cid:durableId="1800414490">
-    <w:abstractNumId w:val="15"/>
-  </w:num>
-  <w:num w:numId="24" w16cid:durableId="701320795">
-    <w:abstractNumId w:val="23"/>
-  </w:num>
-  <w:num w:numId="25" w16cid:durableId="1024357608">
-    <w:abstractNumId w:val="20"/>
-  </w:num>
-  <w:num w:numId="26" w16cid:durableId="2049674">
-    <w:abstractNumId w:val="29"/>
-  </w:num>
-  <w:num w:numId="27" w16cid:durableId="1137184905">
+  <w:num w:numId="41" w16cid:durableId="416757884">
     <w:abstractNumId w:val="13"/>
   </w:num>
-  <w:num w:numId="28" w16cid:durableId="1017998617">
-    <w:abstractNumId w:val="41"/>
+  <w:num w:numId="42" w16cid:durableId="32579297">
+    <w:abstractNumId w:val="2"/>
   </w:num>
-  <w:num w:numId="29" w16cid:durableId="1503278735">
-    <w:abstractNumId w:val="6"/>
-  </w:num>
-  <w:num w:numId="30" w16cid:durableId="915163199">
-    <w:abstractNumId w:val="32"/>
-  </w:num>
-  <w:num w:numId="31" w16cid:durableId="1091468857">
-    <w:abstractNumId w:val="33"/>
-  </w:num>
-  <w:num w:numId="32" w16cid:durableId="1131628224">
-    <w:abstractNumId w:val="7"/>
-  </w:num>
-  <w:num w:numId="33" w16cid:durableId="362904672">
-    <w:abstractNumId w:val="4"/>
-  </w:num>
-  <w:num w:numId="34" w16cid:durableId="649015568">
-    <w:abstractNumId w:val="24"/>
-  </w:num>
-  <w:num w:numId="35" w16cid:durableId="1701738275">
-    <w:abstractNumId w:val="35"/>
-  </w:num>
-  <w:num w:numId="36" w16cid:durableId="541135855">
-    <w:abstractNumId w:val="21"/>
-  </w:num>
-  <w:num w:numId="37" w16cid:durableId="1226069449">
-    <w:abstractNumId w:val="34"/>
-  </w:num>
-  <w:num w:numId="38" w16cid:durableId="362902522">
-    <w:abstractNumId w:val="22"/>
-  </w:num>
-  <w:num w:numId="39" w16cid:durableId="1358850521">
+  <w:num w:numId="43" w16cid:durableId="2033729027">
     <w:abstractNumId w:val="0"/>
   </w:num>
-  <w:num w:numId="40" w16cid:durableId="48653226">
-    <w:abstractNumId w:val="2"/>
-  </w:num>
-  <w:num w:numId="41" w16cid:durableId="416757884">
-    <w:abstractNumId w:val="12"/>
-  </w:num>
-  <w:num w:numId="42" w16cid:durableId="32579297">
-    <w:abstractNumId w:val="1"/>
+  <w:num w:numId="44" w16cid:durableId="1868717873">
+    <w:abstractNumId w:val="38"/>
   </w:num>
 </w:numbering>
 </file>
@@ -13404,6 +14443,17 @@
       </w:tcPr>
     </w:tblStylePr>
   </w:style>
+  <w:style w:type="paragraph" w:styleId="NormalWeb">
+    <w:name w:val="Normal (Web)"/>
+    <w:basedOn w:val="Normal"/>
+    <w:uiPriority w:val="99"/>
+    <w:semiHidden/>
+    <w:unhideWhenUsed/>
+    <w:rsid w:val="00FC7110"/>
+    <w:rPr>
+      <w:rFonts w:ascii="Times New Roman" w:hAnsi="Times New Roman" w:cs="Times New Roman"/>
+    </w:rPr>
+  </w:style>
 </w:styles>
 </file>
 

</xml_diff>